<commit_message>
Commit user stories/aplicação scrum
</commit_message>
<xml_diff>
--- a/MDS-2026-Relatorio.docx
+++ b/MDS-2026-Relatorio.docx
@@ -5919,11 +5919,13 @@
               <w:jc w:val="center"/>
               <w:cnfStyle w:val="100000000000" w:firstRow="1" w:lastRow="0" w:firstColumn="0" w:lastColumn="0" w:oddVBand="0" w:evenVBand="0" w:oddHBand="0" w:evenHBand="0" w:firstRowFirstColumn="0" w:firstRowLastColumn="0" w:lastRowFirstColumn="0" w:lastRowLastColumn="0"/>
             </w:pPr>
-            <w:r>
-              <w:rPr>
-                <w:highlight w:val="yellow"/>
-              </w:rPr>
-              <w:t>Sistema 1</w:t>
+            <w:proofErr w:type="spellStart"/>
+            <w:r>
+              <w:t>Bring</w:t>
+            </w:r>
+            <w:proofErr w:type="spellEnd"/>
+            <w:r>
+              <w:t>!</w:t>
             </w:r>
           </w:p>
         </w:tc>
@@ -5936,12 +5938,11 @@
               <w:jc w:val="center"/>
               <w:cnfStyle w:val="100000000000" w:firstRow="1" w:lastRow="0" w:firstColumn="0" w:lastColumn="0" w:oddVBand="0" w:evenVBand="0" w:oddHBand="0" w:evenHBand="0" w:firstRowFirstColumn="0" w:firstRowLastColumn="0" w:lastRowFirstColumn="0" w:lastRowLastColumn="0"/>
             </w:pPr>
-            <w:r>
-              <w:rPr>
-                <w:highlight w:val="yellow"/>
-              </w:rPr>
-              <w:t>Sistema 2</w:t>
-            </w:r>
+            <w:proofErr w:type="spellStart"/>
+            <w:r>
+              <w:t>Listonic</w:t>
+            </w:r>
+            <w:proofErr w:type="spellEnd"/>
           </w:p>
         </w:tc>
         <w:tc>
@@ -7347,6 +7348,9 @@
               <w:jc w:val="left"/>
               <w:cnfStyle w:val="000000100000" w:firstRow="0" w:lastRow="0" w:firstColumn="0" w:lastColumn="0" w:oddVBand="0" w:evenVBand="0" w:oddHBand="1" w:evenHBand="0" w:firstRowFirstColumn="0" w:firstRowLastColumn="0" w:lastRowFirstColumn="0" w:lastRowLastColumn="0"/>
             </w:pPr>
+            <w:r>
+              <w:t>Utilizadores</w:t>
+            </w:r>
           </w:p>
         </w:tc>
         <w:tc>
@@ -7365,7 +7369,7 @@
               <w:cnfStyle w:val="000000100000" w:firstRow="0" w:lastRow="0" w:firstColumn="0" w:lastColumn="0" w:oddVBand="0" w:evenVBand="0" w:oddHBand="1" w:evenHBand="0" w:firstRowFirstColumn="0" w:firstRowLastColumn="0" w:lastRowFirstColumn="0" w:lastRowLastColumn="0"/>
             </w:pPr>
             <w:r>
-              <w:t>....</w:t>
+              <w:t>Utilizar a aplicação para gerir as compras e orçamentos.</w:t>
             </w:r>
           </w:p>
           <w:p>
@@ -7380,7 +7384,7 @@
               <w:cnfStyle w:val="000000100000" w:firstRow="0" w:lastRow="0" w:firstColumn="0" w:lastColumn="0" w:oddVBand="0" w:evenVBand="0" w:oddHBand="1" w:evenHBand="0" w:firstRowFirstColumn="0" w:firstRowLastColumn="0" w:lastRowFirstColumn="0" w:lastRowLastColumn="0"/>
             </w:pPr>
             <w:r>
-              <w:t>...</w:t>
+              <w:t>Verificar se a aplicação responde às suas necessidades.</w:t>
             </w:r>
           </w:p>
         </w:tc>
@@ -7411,6 +7415,9 @@
               <w:jc w:val="left"/>
               <w:cnfStyle w:val="000000000000" w:firstRow="0" w:lastRow="0" w:firstColumn="0" w:lastColumn="0" w:oddVBand="0" w:evenVBand="0" w:oddHBand="0" w:evenHBand="0" w:firstRowFirstColumn="0" w:firstRowLastColumn="0" w:lastRowFirstColumn="0" w:lastRowLastColumn="0"/>
             </w:pPr>
+            <w:r>
+              <w:t>Cliente fictício</w:t>
+            </w:r>
           </w:p>
         </w:tc>
         <w:tc>
@@ -7429,7 +7436,7 @@
               <w:cnfStyle w:val="000000000000" w:firstRow="0" w:lastRow="0" w:firstColumn="0" w:lastColumn="0" w:oddVBand="0" w:evenVBand="0" w:oddHBand="0" w:evenHBand="0" w:firstRowFirstColumn="0" w:firstRowLastColumn="0" w:lastRowFirstColumn="0" w:lastRowLastColumn="0"/>
             </w:pPr>
             <w:r>
-              <w:t>....</w:t>
+              <w:t>Definir requisitos e priorizá-los.</w:t>
             </w:r>
           </w:p>
           <w:p>
@@ -7444,7 +7451,7 @@
               <w:cnfStyle w:val="000000000000" w:firstRow="0" w:lastRow="0" w:firstColumn="0" w:lastColumn="0" w:oddVBand="0" w:evenVBand="0" w:oddHBand="0" w:evenHBand="0" w:firstRowFirstColumn="0" w:firstRowLastColumn="0" w:lastRowFirstColumn="0" w:lastRowLastColumn="0"/>
             </w:pPr>
             <w:r>
-              <w:t>....</w:t>
+              <w:t>Esclarecer dúvidas sobre o produto</w:t>
             </w:r>
           </w:p>
         </w:tc>
@@ -7478,6 +7485,9 @@
               <w:jc w:val="left"/>
               <w:cnfStyle w:val="000000100000" w:firstRow="0" w:lastRow="0" w:firstColumn="0" w:lastColumn="0" w:oddVBand="0" w:evenVBand="0" w:oddHBand="1" w:evenHBand="0" w:firstRowFirstColumn="0" w:firstRowLastColumn="0" w:lastRowFirstColumn="0" w:lastRowLastColumn="0"/>
             </w:pPr>
+            <w:r>
+              <w:t>Professor Davide</w:t>
+            </w:r>
           </w:p>
         </w:tc>
         <w:tc>
@@ -7496,7 +7506,7 @@
               <w:cnfStyle w:val="000000100000" w:firstRow="0" w:lastRow="0" w:firstColumn="0" w:lastColumn="0" w:oddVBand="0" w:evenVBand="0" w:oddHBand="1" w:evenHBand="0" w:firstRowFirstColumn="0" w:firstRowLastColumn="0" w:lastRowFirstColumn="0" w:lastRowLastColumn="0"/>
             </w:pPr>
             <w:r>
-              <w:t>....</w:t>
+              <w:t>Garantir aplicação da metodologia SCRUM.</w:t>
             </w:r>
           </w:p>
           <w:p>
@@ -7509,9 +7519,78 @@
               <w:ind w:left="470" w:hanging="357"/>
               <w:contextualSpacing w:val="0"/>
               <w:cnfStyle w:val="000000100000" w:firstRow="0" w:lastRow="0" w:firstColumn="0" w:lastColumn="0" w:oddVBand="0" w:evenVBand="0" w:oddHBand="1" w:evenHBand="0" w:firstRowFirstColumn="0" w:firstRowLastColumn="0" w:lastRowFirstColumn="0" w:lastRowLastColumn="0"/>
-            </w:pPr>
-            <w:r>
-              <w:t>.....</w:t>
+              <w:rPr>
+                <w:lang w:val="en-US"/>
+              </w:rPr>
+            </w:pPr>
+            <w:proofErr w:type="spellStart"/>
+            <w:r>
+              <w:rPr>
+                <w:lang w:val="en-US"/>
+              </w:rPr>
+              <w:t>Apoiar</w:t>
+            </w:r>
+            <w:proofErr w:type="spellEnd"/>
+            <w:r>
+              <w:rPr>
+                <w:lang w:val="en-US"/>
+              </w:rPr>
+              <w:t xml:space="preserve"> sprint planning e W</w:t>
+            </w:r>
+            <w:r>
+              <w:rPr>
+                <w:lang w:val="en-US"/>
+              </w:rPr>
+              <w:t>eekly SCRUM.</w:t>
+            </w:r>
+          </w:p>
+          <w:p>
+            <w:pPr>
+              <w:pStyle w:val="PargrafodaLista"/>
+              <w:numPr>
+                <w:ilvl w:val="0"/>
+                <w:numId w:val="4"/>
+              </w:numPr>
+              <w:ind w:left="470" w:hanging="357"/>
+              <w:contextualSpacing w:val="0"/>
+              <w:cnfStyle w:val="000000100000" w:firstRow="0" w:lastRow="0" w:firstColumn="0" w:lastColumn="0" w:oddVBand="0" w:evenVBand="0" w:oddHBand="1" w:evenHBand="0" w:firstRowFirstColumn="0" w:firstRowLastColumn="0" w:lastRowFirstColumn="0" w:lastRowLastColumn="0"/>
+              <w:rPr>
+                <w:lang w:val="en-US"/>
+              </w:rPr>
+            </w:pPr>
+            <w:r>
+              <w:rPr>
+                <w:lang w:val="en-US"/>
+              </w:rPr>
+              <w:t xml:space="preserve">Remover </w:t>
+            </w:r>
+            <w:proofErr w:type="spellStart"/>
+            <w:r>
+              <w:rPr>
+                <w:lang w:val="en-US"/>
+              </w:rPr>
+              <w:t>impedimentos</w:t>
+            </w:r>
+            <w:proofErr w:type="spellEnd"/>
+            <w:r>
+              <w:rPr>
+                <w:lang w:val="en-US"/>
+              </w:rPr>
+              <w:t xml:space="preserve"> da </w:t>
+            </w:r>
+            <w:proofErr w:type="spellStart"/>
+            <w:r>
+              <w:rPr>
+                <w:lang w:val="en-US"/>
+              </w:rPr>
+              <w:t>equipa</w:t>
+            </w:r>
+            <w:proofErr w:type="spellEnd"/>
+            <w:r>
+              <w:rPr>
+                <w:lang w:val="en-US"/>
+              </w:rPr>
+              <w:t>.</w:t>
             </w:r>
           </w:p>
         </w:tc>
@@ -7542,6 +7621,14 @@
               <w:jc w:val="left"/>
               <w:cnfStyle w:val="000000000000" w:firstRow="0" w:lastRow="0" w:firstColumn="0" w:lastColumn="0" w:oddVBand="0" w:evenVBand="0" w:oddHBand="0" w:evenHBand="0" w:firstRowFirstColumn="0" w:firstRowLastColumn="0" w:lastRowFirstColumn="0" w:lastRowLastColumn="0"/>
             </w:pPr>
+            <w:r>
+              <w:t xml:space="preserve">Kelly Ferreira, Bianca Maluf, João </w:t>
+            </w:r>
+            <w:proofErr w:type="spellStart"/>
+            <w:r>
+              <w:t>Moreiro</w:t>
+            </w:r>
+            <w:proofErr w:type="spellEnd"/>
           </w:p>
         </w:tc>
         <w:tc>
@@ -7560,7 +7647,7 @@
               <w:cnfStyle w:val="000000000000" w:firstRow="0" w:lastRow="0" w:firstColumn="0" w:lastColumn="0" w:oddVBand="0" w:evenVBand="0" w:oddHBand="0" w:evenHBand="0" w:firstRowFirstColumn="0" w:firstRowLastColumn="0" w:lastRowFirstColumn="0" w:lastRowLastColumn="0"/>
             </w:pPr>
             <w:r>
-              <w:t>.....</w:t>
+              <w:t>Analisar requisitos.</w:t>
             </w:r>
           </w:p>
           <w:p>
@@ -7575,7 +7662,52 @@
               <w:cnfStyle w:val="000000000000" w:firstRow="0" w:lastRow="0" w:firstColumn="0" w:lastColumn="0" w:oddVBand="0" w:evenVBand="0" w:oddHBand="0" w:evenHBand="0" w:firstRowFirstColumn="0" w:firstRowLastColumn="0" w:lastRowFirstColumn="0" w:lastRowLastColumn="0"/>
             </w:pPr>
             <w:r>
-              <w:t>....</w:t>
+              <w:t>Desenvolver a aplicação.</w:t>
+            </w:r>
+          </w:p>
+          <w:p>
+            <w:pPr>
+              <w:pStyle w:val="PargrafodaLista"/>
+              <w:numPr>
+                <w:ilvl w:val="0"/>
+                <w:numId w:val="4"/>
+              </w:numPr>
+              <w:ind w:left="470" w:hanging="357"/>
+              <w:contextualSpacing w:val="0"/>
+              <w:cnfStyle w:val="000000000000" w:firstRow="0" w:lastRow="0" w:firstColumn="0" w:lastColumn="0" w:oddVBand="0" w:evenVBand="0" w:oddHBand="0" w:evenHBand="0" w:firstRowFirstColumn="0" w:firstRowLastColumn="0" w:lastRowFirstColumn="0" w:lastRowLastColumn="0"/>
+            </w:pPr>
+            <w:r>
+              <w:t>Implementar funcionalidades.</w:t>
+            </w:r>
+          </w:p>
+          <w:p>
+            <w:pPr>
+              <w:pStyle w:val="PargrafodaLista"/>
+              <w:numPr>
+                <w:ilvl w:val="0"/>
+                <w:numId w:val="4"/>
+              </w:numPr>
+              <w:ind w:left="470" w:hanging="357"/>
+              <w:contextualSpacing w:val="0"/>
+              <w:cnfStyle w:val="000000000000" w:firstRow="0" w:lastRow="0" w:firstColumn="0" w:lastColumn="0" w:oddVBand="0" w:evenVBand="0" w:oddHBand="0" w:evenHBand="0" w:firstRowFirstColumn="0" w:firstRowLastColumn="0" w:lastRowFirstColumn="0" w:lastRowLastColumn="0"/>
+            </w:pPr>
+            <w:r>
+              <w:t>Testar e corrigir erros.</w:t>
+            </w:r>
+          </w:p>
+          <w:p>
+            <w:pPr>
+              <w:pStyle w:val="PargrafodaLista"/>
+              <w:numPr>
+                <w:ilvl w:val="0"/>
+                <w:numId w:val="4"/>
+              </w:numPr>
+              <w:ind w:left="470" w:hanging="357"/>
+              <w:contextualSpacing w:val="0"/>
+              <w:cnfStyle w:val="000000000000" w:firstRow="0" w:lastRow="0" w:firstColumn="0" w:lastColumn="0" w:oddVBand="0" w:evenVBand="0" w:oddHBand="0" w:evenHBand="0" w:firstRowFirstColumn="0" w:firstRowLastColumn="0" w:lastRowFirstColumn="0" w:lastRowLastColumn="0"/>
+            </w:pPr>
+            <w:r>
+              <w:t>Atualizar a documentação.</w:t>
             </w:r>
           </w:p>
         </w:tc>
@@ -7740,6 +7872,7 @@
         <w:rPr>
           <w:highlight w:val="yellow"/>
         </w:rPr>
+        <w:lastRenderedPageBreak/>
         <w:t>(Como um &lt;função&gt;, eu quero &lt;objetivo/desejo&gt; para que &lt;benefício&gt;)</w:t>
       </w:r>
     </w:p>
@@ -7833,7 +7966,6 @@
         <w:rPr>
           <w:highlight w:val="yellow"/>
         </w:rPr>
-        <w:lastRenderedPageBreak/>
         <w:t>“Como [persona],” – Para quem estamos a construir isto? Não estamos atrás de um título de trabalho, estamos atrás da persona da pessoa. Entendemos como a pessoa funciona, como pensa e como se sente.</w:t>
       </w:r>
     </w:p>
@@ -8055,7 +8187,14 @@
                 <w:b w:val="0"/>
                 <w:bCs w:val="0"/>
               </w:rPr>
-              <w:t>A conta do usuário deve existir.</w:t>
+              <w:t>A conta do usuário deve existir</w:t>
+            </w:r>
+            <w:r>
+              <w:rPr>
+                <w:b w:val="0"/>
+                <w:bCs w:val="0"/>
+              </w:rPr>
+              <w:t>;</w:t>
             </w:r>
           </w:p>
           <w:p>
@@ -8077,7 +8216,14 @@
                 <w:b w:val="0"/>
                 <w:bCs w:val="0"/>
               </w:rPr>
-              <w:t>A palavra-passe deve estar correta.</w:t>
+              <w:t>A palavra-passe deve estar correta</w:t>
+            </w:r>
+            <w:r>
+              <w:rPr>
+                <w:b w:val="0"/>
+                <w:bCs w:val="0"/>
+              </w:rPr>
+              <w:t>;</w:t>
             </w:r>
           </w:p>
           <w:p>
@@ -8202,16 +8348,23 @@
               <w:rPr>
                 <w:b w:val="0"/>
                 <w:bCs w:val="0"/>
-                <w:highlight w:val="yellow"/>
-              </w:rPr>
-            </w:pPr>
-            <w:r>
-              <w:rPr>
-                <w:b w:val="0"/>
-                <w:bCs w:val="0"/>
-                <w:highlight w:val="yellow"/>
-              </w:rPr>
-              <w:t>Os campos nome, morada, contato e NIF têm de ser obrigatoriamente preenchidos</w:t>
+              </w:rPr>
+            </w:pPr>
+            <w:proofErr w:type="spellStart"/>
+            <w:r>
+              <w:rPr>
+                <w:b w:val="0"/>
+                <w:bCs w:val="0"/>
+              </w:rPr>
+              <w:t>Username</w:t>
+            </w:r>
+            <w:proofErr w:type="spellEnd"/>
+            <w:r>
+              <w:rPr>
+                <w:b w:val="0"/>
+                <w:bCs w:val="0"/>
+              </w:rPr>
+              <w:t xml:space="preserve"> obrigatório;</w:t>
             </w:r>
           </w:p>
           <w:p>
@@ -8232,9 +8385,30 @@
               <w:rPr>
                 <w:b w:val="0"/>
                 <w:bCs w:val="0"/>
-                <w:highlight w:val="yellow"/>
-              </w:rPr>
-              <w:t>Não pode haver um cliente com o mesmo NIF</w:t>
+              </w:rPr>
+              <w:t>Password obrigatória;</w:t>
+            </w:r>
+          </w:p>
+          <w:p>
+            <w:pPr>
+              <w:pStyle w:val="PargrafodaLista"/>
+              <w:numPr>
+                <w:ilvl w:val="0"/>
+                <w:numId w:val="5"/>
+              </w:numPr>
+              <w:ind w:left="527" w:hanging="357"/>
+              <w:contextualSpacing w:val="0"/>
+              <w:rPr>
+                <w:b w:val="0"/>
+                <w:bCs w:val="0"/>
+              </w:rPr>
+            </w:pPr>
+            <w:r>
+              <w:rPr>
+                <w:b w:val="0"/>
+                <w:bCs w:val="0"/>
+              </w:rPr>
+              <w:t>Guardar na base de dados.</w:t>
             </w:r>
           </w:p>
         </w:tc>
@@ -8273,7 +8447,7 @@
                 <w:b w:val="0"/>
                 <w:bCs w:val="0"/>
               </w:rPr>
-              <w:t>Editar perfil</w:t>
+              <w:t>Consultar tipos de artigo</w:t>
             </w:r>
           </w:p>
         </w:tc>
@@ -8333,7 +8507,7 @@
                 <w:b w:val="0"/>
                 <w:bCs w:val="0"/>
               </w:rPr>
-              <w:t>editar o meu perfil para poder atualizar a minha informação quando necessário.</w:t>
+              <w:t>visualizar os tipos de artigo para gerir a organização dos mesmos.</w:t>
             </w:r>
           </w:p>
           <w:p>
@@ -8353,6 +8527,30 @@
               </w:numPr>
               <w:contextualSpacing w:val="0"/>
             </w:pPr>
+            <w:r>
+              <w:rPr>
+                <w:b w:val="0"/>
+                <w:bCs w:val="0"/>
+              </w:rPr>
+              <w:t>Deve existir uma lista com todos os tipos;</w:t>
+            </w:r>
+          </w:p>
+          <w:p>
+            <w:pPr>
+              <w:pStyle w:val="PargrafodaLista"/>
+              <w:numPr>
+                <w:ilvl w:val="0"/>
+                <w:numId w:val="7"/>
+              </w:numPr>
+              <w:contextualSpacing w:val="0"/>
+            </w:pPr>
+            <w:r>
+              <w:rPr>
+                <w:b w:val="0"/>
+                <w:bCs w:val="0"/>
+              </w:rPr>
+              <w:t>Deve ser possível pesquisar tipos.</w:t>
+            </w:r>
           </w:p>
         </w:tc>
       </w:tr>
@@ -8470,6 +8668,30 @@
               </w:numPr>
               <w:contextualSpacing w:val="0"/>
             </w:pPr>
+            <w:r>
+              <w:rPr>
+                <w:b w:val="0"/>
+                <w:bCs w:val="0"/>
+              </w:rPr>
+              <w:t>O utilizador que cria a lista deve ficar registado;</w:t>
+            </w:r>
+          </w:p>
+          <w:p>
+            <w:pPr>
+              <w:pStyle w:val="PargrafodaLista"/>
+              <w:numPr>
+                <w:ilvl w:val="0"/>
+                <w:numId w:val="6"/>
+              </w:numPr>
+              <w:contextualSpacing w:val="0"/>
+            </w:pPr>
+            <w:r>
+              <w:rPr>
+                <w:b w:val="0"/>
+                <w:bCs w:val="0"/>
+              </w:rPr>
+              <w:t>Deve ser possível adicionar itens previstos.</w:t>
+            </w:r>
           </w:p>
         </w:tc>
       </w:tr>
@@ -8550,6 +8772,7 @@
               </w:rPr>
             </w:pPr>
             <w:r>
+              <w:lastRenderedPageBreak/>
               <w:t>Descrição:</w:t>
             </w:r>
             <w:r>
@@ -8580,6 +8803,30 @@
               </w:numPr>
               <w:contextualSpacing w:val="0"/>
             </w:pPr>
+            <w:r>
+              <w:rPr>
+                <w:b w:val="0"/>
+                <w:bCs w:val="0"/>
+              </w:rPr>
+              <w:t>Apenas compras abertas podem ser editadas;</w:t>
+            </w:r>
+          </w:p>
+          <w:p>
+            <w:pPr>
+              <w:pStyle w:val="PargrafodaLista"/>
+              <w:numPr>
+                <w:ilvl w:val="0"/>
+                <w:numId w:val="6"/>
+              </w:numPr>
+              <w:contextualSpacing w:val="0"/>
+            </w:pPr>
+            <w:r>
+              <w:rPr>
+                <w:b w:val="0"/>
+                <w:bCs w:val="0"/>
+              </w:rPr>
+              <w:t>Deve ser possível adicionar e remover artigos.</w:t>
+            </w:r>
           </w:p>
         </w:tc>
       </w:tr>
@@ -8682,6 +8929,45 @@
                 <w:numId w:val="6"/>
               </w:numPr>
             </w:pPr>
+            <w:r>
+              <w:rPr>
+                <w:b w:val="0"/>
+                <w:bCs w:val="0"/>
+              </w:rPr>
+              <w:t>Existir apenas um orçamento por mês;</w:t>
+            </w:r>
+          </w:p>
+          <w:p>
+            <w:pPr>
+              <w:pStyle w:val="PargrafodaLista"/>
+              <w:numPr>
+                <w:ilvl w:val="0"/>
+                <w:numId w:val="6"/>
+              </w:numPr>
+            </w:pPr>
+            <w:r>
+              <w:rPr>
+                <w:b w:val="0"/>
+                <w:bCs w:val="0"/>
+              </w:rPr>
+              <w:t>Deve ter um valor maior a zero;</w:t>
+            </w:r>
+          </w:p>
+          <w:p>
+            <w:pPr>
+              <w:pStyle w:val="PargrafodaLista"/>
+              <w:numPr>
+                <w:ilvl w:val="0"/>
+                <w:numId w:val="6"/>
+              </w:numPr>
+            </w:pPr>
+            <w:r>
+              <w:rPr>
+                <w:b w:val="0"/>
+                <w:bCs w:val="0"/>
+              </w:rPr>
+              <w:t>Deve mostrar registo de quem criou e alterou.</w:t>
+            </w:r>
           </w:p>
         </w:tc>
         <w:tc>
@@ -9341,6 +9627,7 @@
               <w:rPr>
                 <w:noProof/>
               </w:rPr>
+              <w:lastRenderedPageBreak/>
               <w:drawing>
                 <wp:inline distT="0" distB="0" distL="0" distR="0" wp14:anchorId="08DD57DF" wp14:editId="2E80B405">
                   <wp:extent cx="6120130" cy="1844040"/>
@@ -9518,7 +9805,6 @@
                 <w:bCs w:val="0"/>
                 <w:u w:val="single"/>
               </w:rPr>
-              <w:lastRenderedPageBreak/>
               <w:t>O que fez na semana anterior</w:t>
             </w:r>
             <w:r>
@@ -9613,6 +9899,59 @@
               <w:t>Stories</w:t>
             </w:r>
             <w:proofErr w:type="spellEnd"/>
+            <w:r>
+              <w:rPr>
+                <w:b w:val="0"/>
+                <w:bCs w:val="0"/>
+              </w:rPr>
+              <w:t xml:space="preserve">, </w:t>
+            </w:r>
+            <w:r>
+              <w:rPr>
+                <w:b w:val="0"/>
+                <w:bCs w:val="0"/>
+              </w:rPr>
+              <w:t xml:space="preserve">Aplicação </w:t>
+            </w:r>
+            <w:proofErr w:type="spellStart"/>
+            <w:r>
+              <w:rPr>
+                <w:b w:val="0"/>
+                <w:bCs w:val="0"/>
+              </w:rPr>
+              <w:t>Scrum</w:t>
+            </w:r>
+            <w:proofErr w:type="spellEnd"/>
+            <w:r>
+              <w:rPr>
+                <w:b w:val="0"/>
+                <w:bCs w:val="0"/>
+              </w:rPr>
+              <w:t>,</w:t>
+            </w:r>
+            <w:r>
+              <w:rPr>
+                <w:b w:val="0"/>
+                <w:bCs w:val="0"/>
+              </w:rPr>
+              <w:t xml:space="preserve"> </w:t>
+            </w:r>
+            <w:proofErr w:type="spellStart"/>
+            <w:r>
+              <w:rPr>
+                <w:b w:val="0"/>
+                <w:bCs w:val="0"/>
+              </w:rPr>
+              <w:t>mockups</w:t>
+            </w:r>
+            <w:proofErr w:type="spellEnd"/>
+            <w:r>
+              <w:rPr>
+                <w:b w:val="0"/>
+                <w:bCs w:val="0"/>
+              </w:rPr>
+              <w:t>, wireframe</w:t>
+            </w:r>
           </w:p>
           <w:p>
             <w:pPr>
@@ -9648,23 +9987,7 @@
                 <w:b w:val="0"/>
                 <w:bCs w:val="0"/>
               </w:rPr>
-              <w:t xml:space="preserve"> Aplicação </w:t>
-            </w:r>
-            <w:proofErr w:type="spellStart"/>
-            <w:r>
-              <w:rPr>
-                <w:b w:val="0"/>
-                <w:bCs w:val="0"/>
-              </w:rPr>
-              <w:t>Scrum</w:t>
-            </w:r>
-            <w:proofErr w:type="spellEnd"/>
-            <w:r>
-              <w:rPr>
-                <w:b w:val="0"/>
-                <w:bCs w:val="0"/>
-              </w:rPr>
-              <w:t>, Especificação do Sistema</w:t>
+              <w:t xml:space="preserve"> </w:t>
             </w:r>
           </w:p>
           <w:p>
@@ -10205,6 +10528,7 @@
               <w:rPr>
                 <w:highlight w:val="yellow"/>
               </w:rPr>
+              <w:lastRenderedPageBreak/>
               <w:t>&lt;nome do membro 3 da equipa&gt;</w:t>
             </w:r>
           </w:p>
@@ -20444,6 +20768,15 @@
 </file>
 
 <file path=customXml/item1.xml><?xml version="1.0" encoding="utf-8"?>
+<?mso-contentType ?>
+<FormTemplates xmlns="http://schemas.microsoft.com/sharepoint/v3/contenttype/forms">
+  <Display>DocumentLibraryForm</Display>
+  <Edit>DocumentLibraryForm</Edit>
+  <New>DocumentLibraryForm</New>
+</FormTemplates>
+</file>
+
+<file path=customXml/item2.xml><?xml version="1.0" encoding="utf-8"?>
 <ct:contentTypeSchema xmlns:ct="http://schemas.microsoft.com/office/2006/metadata/contentType" xmlns:ma="http://schemas.microsoft.com/office/2006/metadata/properties/metaAttributes" ct:_="" ma:_="" ma:contentTypeName="Documento" ma:contentTypeID="0x0101003F8ECAAF88AFCB4AB1D806FDE394FD03" ma:contentTypeVersion="12" ma:contentTypeDescription="Criar um novo documento." ma:contentTypeScope="" ma:versionID="541e5482cd22746a72c07b4578302587">
   <xsd:schema xmlns:xsd="http://www.w3.org/2001/XMLSchema" xmlns:xs="http://www.w3.org/2001/XMLSchema" xmlns:p="http://schemas.microsoft.com/office/2006/metadata/properties" xmlns:ns2="52a6887f-9537-4a34-8793-b765f13d0873" xmlns:ns3="fa1ba186-cf14-4658-82ff-4e1486731960" targetNamespace="http://schemas.microsoft.com/office/2006/metadata/properties" ma:root="true" ma:fieldsID="4badabe4fa58f02b4fe1f9c3f11ac53e" ns2:_="" ns3:_="">
     <xsd:import namespace="52a6887f-9537-4a34-8793-b765f13d0873"/>
@@ -20644,16 +20977,11 @@
 </ct:contentTypeSchema>
 </file>
 
-<file path=customXml/item2.xml><?xml version="1.0" encoding="utf-8"?>
-<?mso-contentType ?>
-<FormTemplates xmlns="http://schemas.microsoft.com/sharepoint/v3/contenttype/forms">
-  <Display>DocumentLibraryForm</Display>
-  <Edit>DocumentLibraryForm</Edit>
-  <New>DocumentLibraryForm</New>
-</FormTemplates>
+<file path=customXml/item3.xml><?xml version="1.0" encoding="utf-8"?>
+<b:Sources xmlns:b="http://schemas.openxmlformats.org/officeDocument/2006/bibliography" xmlns="http://schemas.openxmlformats.org/officeDocument/2006/bibliography" SelectedStyle="\APASixthEditionOfficeOnline.xsl" StyleName="APA" Version="6"/>
 </file>
 
-<file path=customXml/item3.xml><?xml version="1.0" encoding="utf-8"?>
+<file path=customXml/item4.xml><?xml version="1.0" encoding="utf-8"?>
 <p:properties xmlns:p="http://schemas.microsoft.com/office/2006/metadata/properties" xmlns:xsi="http://www.w3.org/2001/XMLSchema-instance" xmlns:pc="http://schemas.microsoft.com/office/infopath/2007/PartnerControls">
   <documentManagement>
     <TaxCatchAll xmlns="fa1ba186-cf14-4658-82ff-4e1486731960" xsi:nil="true"/>
@@ -20664,11 +20992,15 @@
 </p:properties>
 </file>
 
-<file path=customXml/item4.xml><?xml version="1.0" encoding="utf-8"?>
-<b:Sources xmlns:b="http://schemas.openxmlformats.org/officeDocument/2006/bibliography" xmlns="http://schemas.openxmlformats.org/officeDocument/2006/bibliography" SelectedStyle="\APASixthEditionOfficeOnline.xsl" StyleName="APA" Version="6"/>
+<file path=customXml/itemProps1.xml><?xml version="1.0" encoding="utf-8"?>
+<ds:datastoreItem xmlns:ds="http://schemas.openxmlformats.org/officeDocument/2006/customXml" ds:itemID="{990C7B0B-29F8-4472-849D-8AEB923CF9C9}">
+  <ds:schemaRefs>
+    <ds:schemaRef ds:uri="http://schemas.microsoft.com/sharepoint/v3/contenttype/forms"/>
+  </ds:schemaRefs>
+</ds:datastoreItem>
 </file>
 
-<file path=customXml/itemProps1.xml><?xml version="1.0" encoding="utf-8"?>
+<file path=customXml/itemProps2.xml><?xml version="1.0" encoding="utf-8"?>
 <ds:datastoreItem xmlns:ds="http://schemas.openxmlformats.org/officeDocument/2006/customXml" ds:itemID="{B04309D4-A979-44A4-8B48-1DFD9E70F312}">
   <ds:schemaRefs>
     <ds:schemaRef ds:uri="http://schemas.microsoft.com/office/2006/metadata/contentType"/>
@@ -20687,15 +21019,15 @@
 </ds:datastoreItem>
 </file>
 
-<file path=customXml/itemProps2.xml><?xml version="1.0" encoding="utf-8"?>
-<ds:datastoreItem xmlns:ds="http://schemas.openxmlformats.org/officeDocument/2006/customXml" ds:itemID="{990C7B0B-29F8-4472-849D-8AEB923CF9C9}">
+<file path=customXml/itemProps3.xml><?xml version="1.0" encoding="utf-8"?>
+<ds:datastoreItem xmlns:ds="http://schemas.openxmlformats.org/officeDocument/2006/customXml" ds:itemID="{34E35503-31BE-4C22-8EB5-1B8C3DFFC716}">
   <ds:schemaRefs>
-    <ds:schemaRef ds:uri="http://schemas.microsoft.com/sharepoint/v3/contenttype/forms"/>
+    <ds:schemaRef ds:uri="http://schemas.openxmlformats.org/officeDocument/2006/bibliography"/>
   </ds:schemaRefs>
 </ds:datastoreItem>
 </file>
 
-<file path=customXml/itemProps3.xml><?xml version="1.0" encoding="utf-8"?>
+<file path=customXml/itemProps4.xml><?xml version="1.0" encoding="utf-8"?>
 <ds:datastoreItem xmlns:ds="http://schemas.openxmlformats.org/officeDocument/2006/customXml" ds:itemID="{B0D02839-B28B-4402-A79D-B0CCDC274F38}">
   <ds:schemaRefs>
     <ds:schemaRef ds:uri="http://schemas.microsoft.com/office/2006/metadata/properties"/>
@@ -20704,12 +21036,4 @@
     <ds:schemaRef ds:uri="52a6887f-9537-4a34-8793-b765f13d0873"/>
   </ds:schemaRefs>
 </ds:datastoreItem>
-</file>
-
-<file path=customXml/itemProps4.xml><?xml version="1.0" encoding="utf-8"?>
-<ds:datastoreItem xmlns:ds="http://schemas.openxmlformats.org/officeDocument/2006/customXml" ds:itemID="{34E35503-31BE-4C22-8EB5-1B8C3DFFC716}">
-  <ds:schemaRefs>
-    <ds:schemaRef ds:uri="http://schemas.openxmlformats.org/officeDocument/2006/bibliography"/>
-  </ds:schemaRefs>
-</ds:datastoreItem>
 </file>
</xml_diff>

<commit_message>
commit introduções analise concorrencial
</commit_message>
<xml_diff>
--- a/MDS-2026-Relatorio.docx
+++ b/MDS-2026-Relatorio.docx
@@ -1,6 +1,6 @@
 
 <file path=word/document.xml><?xml version="1.0" encoding="utf-8"?>
-<w:document xmlns:wpc="http://schemas.microsoft.com/office/word/2010/wordprocessingCanvas" xmlns:cx="http://schemas.microsoft.com/office/drawing/2014/chartex" xmlns:cx1="http://schemas.microsoft.com/office/drawing/2015/9/8/chartex" xmlns:cx2="http://schemas.microsoft.com/office/drawing/2015/10/21/chartex" xmlns:cx3="http://schemas.microsoft.com/office/drawing/2016/5/9/chartex" xmlns:cx4="http://schemas.microsoft.com/office/drawing/2016/5/10/chartex" xmlns:cx5="http://schemas.microsoft.com/office/drawing/2016/5/11/chartex" xmlns:cx6="http://schemas.microsoft.com/office/drawing/2016/5/12/chartex" xmlns:cx7="http://schemas.microsoft.com/office/drawing/2016/5/13/chartex" xmlns:cx8="http://schemas.microsoft.com/office/drawing/2016/5/14/chartex" xmlns:mc="http://schemas.openxmlformats.org/markup-compatibility/2006" xmlns:aink="http://schemas.microsoft.com/office/drawing/2016/ink" xmlns:am3d="http://schemas.microsoft.com/office/drawing/2017/model3d" xmlns:o="urn:schemas-microsoft-com:office:office" xmlns:oel="http://schemas.microsoft.com/office/2019/extlst" xmlns:r="http://schemas.openxmlformats.org/officeDocument/2006/relationships" xmlns:m="http://schemas.openxmlformats.org/officeDocument/2006/math" xmlns:v="urn:schemas-microsoft-com:vml" xmlns:wp14="http://schemas.microsoft.com/office/word/2010/wordprocessingDrawing" xmlns:wp="http://schemas.openxmlformats.org/drawingml/2006/wordprocessingDrawing" xmlns:w10="urn:schemas-microsoft-com:office:word" xmlns:w="http://schemas.openxmlformats.org/wordprocessingml/2006/main" xmlns:w14="http://schemas.microsoft.com/office/word/2010/wordml" xmlns:w15="http://schemas.microsoft.com/office/word/2012/wordml" xmlns:w16cex="http://schemas.microsoft.com/office/word/2018/wordml/cex" xmlns:w16cid="http://schemas.microsoft.com/office/word/2016/wordml/cid" xmlns:w16="http://schemas.microsoft.com/office/word/2018/wordml" xmlns:w16du="http://schemas.microsoft.com/office/word/2023/wordml/word16du" xmlns:w16sdtdh="http://schemas.microsoft.com/office/word/2020/wordml/sdtdatahash" xmlns:w16sdtfl="http://schemas.microsoft.com/office/word/2024/wordml/sdtformatlock" xmlns:w16se="http://schemas.microsoft.com/office/word/2015/wordml/symex" xmlns:wpg="http://schemas.microsoft.com/office/word/2010/wordprocessingGroup" xmlns:wpi="http://schemas.microsoft.com/office/word/2010/wordprocessingInk" xmlns:wne="http://schemas.microsoft.com/office/word/2006/wordml" xmlns:wps="http://schemas.microsoft.com/office/word/2010/wordprocessingShape" mc:Ignorable="w14 w15 w16se w16cid w16 w16cex w16sdtdh w16sdtfl w16du wp14">
+<w:document xmlns:wpc="http://schemas.microsoft.com/office/word/2010/wordprocessingCanvas" xmlns:cx="http://schemas.microsoft.com/office/drawing/2014/chartex" xmlns:cx1="http://schemas.microsoft.com/office/drawing/2015/9/8/chartex" xmlns:cx2="http://schemas.microsoft.com/office/drawing/2015/10/21/chartex" xmlns:cx3="http://schemas.microsoft.com/office/drawing/2016/5/9/chartex" xmlns:cx4="http://schemas.microsoft.com/office/drawing/2016/5/10/chartex" xmlns:cx5="http://schemas.microsoft.com/office/drawing/2016/5/11/chartex" xmlns:cx6="http://schemas.microsoft.com/office/drawing/2016/5/12/chartex" xmlns:cx7="http://schemas.microsoft.com/office/drawing/2016/5/13/chartex" xmlns:cx8="http://schemas.microsoft.com/office/drawing/2016/5/14/chartex" xmlns:mc="http://schemas.openxmlformats.org/markup-compatibility/2006" xmlns:aink="http://schemas.microsoft.com/office/drawing/2016/ink" xmlns:am3d="http://schemas.microsoft.com/office/drawing/2017/model3d" xmlns:o="urn:schemas-microsoft-com:office:office" xmlns:oel="http://schemas.microsoft.com/office/2019/extlst" xmlns:r="http://schemas.openxmlformats.org/officeDocument/2006/relationships" xmlns:m="http://schemas.openxmlformats.org/officeDocument/2006/math" xmlns:v="urn:schemas-microsoft-com:vml" xmlns:wp14="http://schemas.microsoft.com/office/word/2010/wordprocessingDrawing" xmlns:wp="http://schemas.openxmlformats.org/drawingml/2006/wordprocessingDrawing" xmlns:w10="urn:schemas-microsoft-com:office:word" xmlns:w="http://schemas.openxmlformats.org/wordprocessingml/2006/main" xmlns:w14="http://schemas.microsoft.com/office/word/2010/wordml" xmlns:w15="http://schemas.microsoft.com/office/word/2012/wordml" xmlns:w16cex="http://schemas.microsoft.com/office/word/2018/wordml/cex" xmlns:w16cid="http://schemas.microsoft.com/office/word/2016/wordml/cid" xmlns:w16="http://schemas.microsoft.com/office/word/2018/wordml" xmlns:w16sdtdh="http://schemas.microsoft.com/office/word/2020/wordml/sdtdatahash" xmlns:w16se="http://schemas.microsoft.com/office/word/2015/wordml/symex" xmlns:wpg="http://schemas.microsoft.com/office/word/2010/wordprocessingGroup" xmlns:wpi="http://schemas.microsoft.com/office/word/2010/wordprocessingInk" xmlns:wne="http://schemas.microsoft.com/office/word/2006/wordml" xmlns:wps="http://schemas.microsoft.com/office/word/2010/wordprocessingShape" mc:Ignorable="w14 w15 w16se w16cid w16 w16cex w16sdtdh wp14">
   <w:body>
     <w:tbl>
       <w:tblPr>
@@ -866,9 +866,10 @@
             </w:r>
             <w:r>
               <w:rPr>
-                <w:highlight w:val="yellow"/>
-              </w:rPr>
-              <w:t>22222222</w:t>
+                <w:b/>
+                <w:bCs/>
+              </w:rPr>
+              <w:t>2025187039</w:t>
             </w:r>
           </w:p>
         </w:tc>
@@ -885,15 +886,9 @@
           <w:p>
             <w:pPr>
               <w:jc w:val="left"/>
-              <w:rPr>
-                <w:highlight w:val="yellow"/>
-              </w:rPr>
-            </w:pPr>
-            <w:r>
-              <w:rPr>
-                <w:highlight w:val="yellow"/>
-              </w:rPr>
-              <w:t>&lt;Nome do aluno&gt;</w:t>
+            </w:pPr>
+            <w:r>
+              <w:t>João Moreira</w:t>
             </w:r>
           </w:p>
         </w:tc>
@@ -4013,6 +4008,105 @@
     </w:p>
     <w:p>
       <w:pPr>
+        <w:rPr>
+          <w:noProof/>
+        </w:rPr>
+      </w:pPr>
+      <w:r>
+        <w:rPr>
+          <w:noProof/>
+        </w:rPr>
+        <w:t>O presente relatório foi desenvolvido na disciplina de MDS junto com o projeto que tem como objetivo criar uma aplicação para ajudar as pessoas a gerir o seu orçamento familiar, planear compras e controlar os artigos domésticos.</w:t>
+      </w:r>
+    </w:p>
+    <w:p>
+      <w:pPr>
+        <w:rPr>
+          <w:noProof/>
+        </w:rPr>
+      </w:pPr>
+      <w:r>
+        <w:rPr>
+          <w:noProof/>
+        </w:rPr>
+        <w:t xml:space="preserve"> Este relatório tem como objetivo mostrar como desenvolvemos o projeto, desde a análise de outras aplicações semelhantes até ao levantamento de requisitos, planeamento de aplicação e escolha da metodologia de desenvolvimento. Sabendo que o projeto de MDS está diretamente ligado ao projeto de DA, na disciplina de DA fizemos uma análise de mercado, o que nos permitiu ver o que já existia, quais eram as vantagens e desvantagens e onde podia melhorar, sendo esta análise fundamental para perceber o que os utilizadores precisam e que funcionalidades a aplicação deve ter. Sendo a ligação entre DA e MDS a forma como ligamos as informações obtidas nos dois projetos, sendo DA mais focada em análise funcional e conceptual da aplicação, enquanto em MDS focamos mais na gestão do projeto, planeamento do desenvolvimento e aplicação de metodologias ágeis. </w:t>
+      </w:r>
+    </w:p>
+    <w:p>
+      <w:pPr>
+        <w:rPr>
+          <w:noProof/>
+        </w:rPr>
+      </w:pPr>
+      <w:r>
+        <w:rPr>
+          <w:noProof/>
+        </w:rPr>
+        <w:t>O nosso projeto foi dividido em várias fases, começando por analisar os requisitos e estudar o mercado, depois planear a aplicação e definir as funcionalidades principais, depois desenvolvemos a solução e fizemos testes, sendo o objetivo final criar uma aplicação simples, intuitiva e funcional que ajude as pessoas a gerirem melhor as suas finanças.</w:t>
+      </w:r>
+    </w:p>
+    <w:p>
+      <w:pPr>
+        <w:rPr>
+          <w:noProof/>
+        </w:rPr>
+      </w:pPr>
+      <w:r>
+        <w:rPr>
+          <w:noProof/>
+        </w:rPr>
+        <w:t xml:space="preserve">A equipa responsável pelo desenvolvimento deste projeto é formado por: </w:t>
+      </w:r>
+    </w:p>
+    <w:p>
+      <w:pPr>
+        <w:rPr>
+          <w:noProof/>
+        </w:rPr>
+      </w:pPr>
+      <w:r>
+        <w:rPr>
+          <w:noProof/>
+        </w:rPr>
+        <w:t>João Moreira</w:t>
+      </w:r>
+    </w:p>
+    <w:p>
+      <w:pPr>
+        <w:rPr>
+          <w:noProof/>
+        </w:rPr>
+      </w:pPr>
+      <w:r>
+        <w:rPr>
+          <w:noProof/>
+        </w:rPr>
+        <w:t>Kelly Ferreira</w:t>
+      </w:r>
+    </w:p>
+    <w:p>
+      <w:pPr>
+        <w:rPr>
+          <w:noProof/>
+        </w:rPr>
+      </w:pPr>
+      <w:r>
+        <w:rPr>
+          <w:noProof/>
+        </w:rPr>
+        <w:t xml:space="preserve">Bianca  </w:t>
+      </w:r>
+    </w:p>
+    <w:p>
+      <w:pPr>
+        <w:rPr>
+          <w:noProof/>
+          <w:highlight w:val="yellow"/>
+        </w:rPr>
+      </w:pPr>
+    </w:p>
+    <w:p>
+      <w:pPr>
         <w:pStyle w:val="PargrafodaLista"/>
         <w:numPr>
           <w:ilvl w:val="0"/>
@@ -4486,14 +4580,27 @@
       <w:r>
         <w:t xml:space="preserve">Tabela </w:t>
       </w:r>
-      <w:fldSimple w:instr=" SEQ Tabela \* ARABIC ">
-        <w:r>
-          <w:rPr>
-            <w:noProof/>
-          </w:rPr>
-          <w:t>1</w:t>
-        </w:r>
-      </w:fldSimple>
+      <w:r>
+        <w:fldChar w:fldCharType="begin"/>
+      </w:r>
+      <w:r>
+        <w:instrText xml:space="preserve"> SEQ Tabela \* ARABIC </w:instrText>
+      </w:r>
+      <w:r>
+        <w:fldChar w:fldCharType="separate"/>
+      </w:r>
+      <w:r>
+        <w:rPr>
+          <w:noProof/>
+        </w:rPr>
+        <w:t>1</w:t>
+      </w:r>
+      <w:r>
+        <w:rPr>
+          <w:noProof/>
+        </w:rPr>
+        <w:fldChar w:fldCharType="end"/>
+      </w:r>
       <w:r>
         <w:t xml:space="preserve"> – Descrição do </w:t>
       </w:r>
@@ -5019,14 +5126,27 @@
       <w:r>
         <w:t xml:space="preserve">Tabela </w:t>
       </w:r>
-      <w:fldSimple w:instr=" SEQ Tabela \* ARABIC ">
-        <w:r>
-          <w:rPr>
-            <w:noProof/>
-          </w:rPr>
-          <w:t>2</w:t>
-        </w:r>
-      </w:fldSimple>
+      <w:r>
+        <w:fldChar w:fldCharType="begin"/>
+      </w:r>
+      <w:r>
+        <w:instrText xml:space="preserve"> SEQ Tabela \* ARABIC </w:instrText>
+      </w:r>
+      <w:r>
+        <w:fldChar w:fldCharType="separate"/>
+      </w:r>
+      <w:r>
+        <w:rPr>
+          <w:noProof/>
+        </w:rPr>
+        <w:t>2</w:t>
+      </w:r>
+      <w:r>
+        <w:rPr>
+          <w:noProof/>
+        </w:rPr>
+        <w:fldChar w:fldCharType="end"/>
+      </w:r>
       <w:r>
         <w:t xml:space="preserve"> – Descrição do </w:t>
       </w:r>
@@ -5444,14 +5564,27 @@
         <w:lastRenderedPageBreak/>
         <w:t xml:space="preserve">Tabela </w:t>
       </w:r>
-      <w:fldSimple w:instr=" SEQ Tabela \* ARABIC ">
-        <w:r>
-          <w:rPr>
-            <w:noProof/>
-          </w:rPr>
-          <w:t>3</w:t>
-        </w:r>
-      </w:fldSimple>
+      <w:r>
+        <w:fldChar w:fldCharType="begin"/>
+      </w:r>
+      <w:r>
+        <w:instrText xml:space="preserve"> SEQ Tabela \* ARABIC </w:instrText>
+      </w:r>
+      <w:r>
+        <w:fldChar w:fldCharType="separate"/>
+      </w:r>
+      <w:r>
+        <w:rPr>
+          <w:noProof/>
+        </w:rPr>
+        <w:t>3</w:t>
+      </w:r>
+      <w:r>
+        <w:rPr>
+          <w:noProof/>
+        </w:rPr>
+        <w:fldChar w:fldCharType="end"/>
+      </w:r>
       <w:r>
         <w:t xml:space="preserve"> – Descrição do </w:t>
       </w:r>
@@ -5499,10 +5632,10 @@
                 <w:noProof/>
               </w:rPr>
               <w:drawing>
-                <wp:inline distT="0" distB="0" distL="0" distR="0" wp14:anchorId="0B7AD73E" wp14:editId="02A02D16">
-                  <wp:extent cx="4368800" cy="2265539"/>
-                  <wp:effectExtent l="0" t="0" r="0" b="0"/>
-                  <wp:docPr id="13" name="Picture 13" descr="Graphical user interface, application, Teams&#10;&#10;Description automatically generated"/>
+                <wp:inline distT="0" distB="0" distL="0" distR="0" wp14:anchorId="0B7AD73E" wp14:editId="5A5ECFE8">
+                  <wp:extent cx="4394605" cy="2003014"/>
+                  <wp:effectExtent l="0" t="0" r="6350" b="0"/>
+                  <wp:docPr id="13" name="Picture 13"/>
                   <wp:cNvGraphicFramePr>
                     <a:graphicFrameLocks xmlns:a="http://schemas.openxmlformats.org/drawingml/2006/main" noChangeAspect="1"/>
                   </wp:cNvGraphicFramePr>
@@ -5510,11 +5643,17 @@
                     <a:graphicData uri="http://schemas.openxmlformats.org/drawingml/2006/picture">
                       <pic:pic xmlns:pic="http://schemas.openxmlformats.org/drawingml/2006/picture">
                         <pic:nvPicPr>
-                          <pic:cNvPr id="13" name="Picture 13" descr="Graphical user interface, application, Teams&#10;&#10;Description automatically generated"/>
+                          <pic:cNvPr id="13" name="Picture 13"/>
                           <pic:cNvPicPr/>
                         </pic:nvPicPr>
                         <pic:blipFill>
-                          <a:blip r:embed="rId16"/>
+                          <a:blip r:embed="rId16" cstate="print">
+                            <a:extLst>
+                              <a:ext uri="{28A0092B-C50C-407E-A947-70E740481C1C}">
+                                <a14:useLocalDpi xmlns:a14="http://schemas.microsoft.com/office/drawing/2010/main" val="0"/>
+                              </a:ext>
+                            </a:extLst>
+                          </a:blip>
                           <a:stretch>
                             <a:fillRect/>
                           </a:stretch>
@@ -5522,7 +5661,7 @@
                         <pic:spPr>
                           <a:xfrm>
                             <a:off x="0" y="0"/>
-                            <a:ext cx="4394605" cy="2278921"/>
+                            <a:ext cx="4394605" cy="2003014"/>
                           </a:xfrm>
                           <a:prstGeom prst="rect">
                             <a:avLst/>
@@ -5596,12 +5735,11 @@
                 <w:highlight w:val="yellow"/>
               </w:rPr>
             </w:pPr>
-            <w:r>
-              <w:rPr>
-                <w:highlight w:val="yellow"/>
-              </w:rPr>
-              <w:t>&lt;nome do website/aplicação&gt;</w:t>
-            </w:r>
+            <w:proofErr w:type="spellStart"/>
+            <w:r>
+              <w:t>HomeBudget</w:t>
+            </w:r>
+            <w:proofErr w:type="spellEnd"/>
           </w:p>
         </w:tc>
       </w:tr>
@@ -5642,10 +5780,7 @@
               <w:cnfStyle w:val="000000000000" w:firstRow="0" w:lastRow="0" w:firstColumn="0" w:lastColumn="0" w:oddVBand="0" w:evenVBand="0" w:oddHBand="0" w:evenHBand="0" w:firstRowFirstColumn="0" w:firstRowLastColumn="0" w:lastRowFirstColumn="0" w:lastRowLastColumn="0"/>
             </w:pPr>
             <w:r>
-              <w:rPr>
-                <w:highlight w:val="yellow"/>
-              </w:rPr>
-              <w:t>&lt;link do website/aplicação&gt;</w:t>
+              <w:t>https://www.anishu.com/homebudget.html</w:t>
             </w:r>
           </w:p>
         </w:tc>
@@ -5690,10 +5825,27 @@
               <w:cnfStyle w:val="000000100000" w:firstRow="0" w:lastRow="0" w:firstColumn="0" w:lastColumn="0" w:oddVBand="0" w:evenVBand="0" w:oddHBand="1" w:evenHBand="0" w:firstRowFirstColumn="0" w:firstRowLastColumn="0" w:lastRowFirstColumn="0" w:lastRowLastColumn="0"/>
             </w:pPr>
             <w:r>
-              <w:rPr>
-                <w:highlight w:val="yellow"/>
-              </w:rPr>
-              <w:t>&lt;descrição detalhada do website/aplicação&gt;</w:t>
+              <w:t xml:space="preserve">A aplicação </w:t>
+            </w:r>
+            <w:proofErr w:type="spellStart"/>
+            <w:r>
+              <w:t>HomeBudget</w:t>
+            </w:r>
+            <w:proofErr w:type="spellEnd"/>
+            <w:r>
+              <w:t xml:space="preserve"> tem como objetivo de conseguir ajudar a controlar despesas, contas </w:t>
+            </w:r>
+            <w:r>
+              <w:t>bancárias,</w:t>
+            </w:r>
+            <w:r>
+              <w:t xml:space="preserve"> orçamentos e gastos </w:t>
+            </w:r>
+            <w:r>
+              <w:t>domésticos</w:t>
+            </w:r>
+            <w:r>
+              <w:t>. Incluindo uma opção de sincronização entre vários dispositivos o que permite a visualização em tempo real dos movimentos financeiros dos dipositivos sincronizados</w:t>
             </w:r>
           </w:p>
         </w:tc>
@@ -5735,10 +5887,19 @@
               <w:cnfStyle w:val="000000000000" w:firstRow="0" w:lastRow="0" w:firstColumn="0" w:lastColumn="0" w:oddVBand="0" w:evenVBand="0" w:oddHBand="0" w:evenHBand="0" w:firstRowFirstColumn="0" w:firstRowLastColumn="0" w:lastRowFirstColumn="0" w:lastRowLastColumn="0"/>
             </w:pPr>
             <w:r>
-              <w:rPr>
-                <w:highlight w:val="yellow"/>
-              </w:rPr>
-              <w:t>&lt;vantagens do website/aplicação&gt;</w:t>
+              <w:t>Simplicidade na usagem, gestão completa do orçamento, relatórios e gráficos financeiros detalhados, s</w:t>
+            </w:r>
+            <w:r>
+              <w:t>incronização entre vários dispositivos e utilizadores</w:t>
+            </w:r>
+            <w:r>
+              <w:t xml:space="preserve">, acompanhamento de </w:t>
+            </w:r>
+            <w:r>
+              <w:t>receitas, despesas e saldos</w:t>
+            </w:r>
+            <w:r>
+              <w:t>.</w:t>
             </w:r>
           </w:p>
         </w:tc>
@@ -5783,10 +5944,19 @@
               <w:cnfStyle w:val="000000100000" w:firstRow="0" w:lastRow="0" w:firstColumn="0" w:lastColumn="0" w:oddVBand="0" w:evenVBand="0" w:oddHBand="1" w:evenHBand="0" w:firstRowFirstColumn="0" w:firstRowLastColumn="0" w:lastRowFirstColumn="0" w:lastRowLastColumn="0"/>
             </w:pPr>
             <w:r>
-              <w:rPr>
-                <w:highlight w:val="yellow"/>
-              </w:rPr>
-              <w:t>&lt;desvantagens do website/aplicação&gt;</w:t>
+              <w:t>Algumas funcionalidades requerem pagamento, não possui f</w:t>
+            </w:r>
+            <w:r>
+              <w:t>uncionalidades avançadas de inteligência artificial</w:t>
+            </w:r>
+            <w:r>
+              <w:t xml:space="preserve">, gestão limitada de </w:t>
+            </w:r>
+            <w:r>
+              <w:t>inventário doméstico e artigos comprados</w:t>
+            </w:r>
+            <w:r>
+              <w:t>.</w:t>
             </w:r>
           </w:p>
         </w:tc>
@@ -5828,10 +5998,42 @@
               <w:cnfStyle w:val="000000000000" w:firstRow="0" w:lastRow="0" w:firstColumn="0" w:lastColumn="0" w:oddVBand="0" w:evenVBand="0" w:oddHBand="0" w:evenHBand="0" w:firstRowFirstColumn="0" w:firstRowLastColumn="0" w:lastRowFirstColumn="0" w:lastRowLastColumn="0"/>
             </w:pPr>
             <w:r>
-              <w:rPr>
-                <w:highlight w:val="yellow"/>
-              </w:rPr>
-              <w:t>&lt;funcionalidades que possam faltar ao website/aplicação&gt;</w:t>
+              <w:t>Sistema de previsão de compras e gastos futuros</w:t>
+            </w:r>
+            <w:r>
+              <w:t>, s</w:t>
+            </w:r>
+            <w:r>
+              <w:t>ugestões financeiras baseadas em inteligência artificial</w:t>
+            </w:r>
+            <w:r>
+              <w:t>, i</w:t>
+            </w:r>
+            <w:r>
+              <w:t>ntegração mais avançada com bancos e serviços financeiros</w:t>
+            </w:r>
+            <w:r>
+              <w:t>, g</w:t>
+            </w:r>
+            <w:r>
+              <w:t>estão detalhada de artigos comprados, planeados e não planeados</w:t>
+            </w:r>
+            <w:r>
+              <w:t xml:space="preserve">, </w:t>
+            </w:r>
+            <w:proofErr w:type="spellStart"/>
+            <w:r>
+              <w:t>d</w:t>
+            </w:r>
+            <w:r>
+              <w:t>ashboard</w:t>
+            </w:r>
+            <w:proofErr w:type="spellEnd"/>
+            <w:r>
+              <w:t xml:space="preserve"> moderna e mais interativa</w:t>
+            </w:r>
+            <w:r>
+              <w:t>.</w:t>
             </w:r>
           </w:p>
         </w:tc>
@@ -5867,14 +6069,27 @@
       <w:r>
         <w:t xml:space="preserve">Tabela </w:t>
       </w:r>
-      <w:fldSimple w:instr=" SEQ Tabela \* ARABIC ">
-        <w:r>
-          <w:rPr>
-            <w:noProof/>
-          </w:rPr>
-          <w:t>4</w:t>
-        </w:r>
-      </w:fldSimple>
+      <w:r>
+        <w:fldChar w:fldCharType="begin"/>
+      </w:r>
+      <w:r>
+        <w:instrText xml:space="preserve"> SEQ Tabela \* ARABIC </w:instrText>
+      </w:r>
+      <w:r>
+        <w:fldChar w:fldCharType="separate"/>
+      </w:r>
+      <w:r>
+        <w:rPr>
+          <w:noProof/>
+        </w:rPr>
+        <w:t>4</w:t>
+      </w:r>
+      <w:r>
+        <w:rPr>
+          <w:noProof/>
+        </w:rPr>
+        <w:fldChar w:fldCharType="end"/>
+      </w:r>
       <w:r>
         <w:t xml:space="preserve"> – Resumo das características dos Sistemas concorrenciais</w:t>
       </w:r>
@@ -6500,7 +6715,6 @@
         <w:rPr>
           <w:highlight w:val="yellow"/>
         </w:rPr>
-        <w:lastRenderedPageBreak/>
         <w:t>Porque é que foram escolhidos estes 3 sistemas no meio de tantos outros</w:t>
       </w:r>
     </w:p>
@@ -6754,14 +6968,27 @@
       <w:r>
         <w:t xml:space="preserve">Figura </w:t>
       </w:r>
-      <w:fldSimple w:instr=" SEQ Figura \* ARABIC ">
-        <w:r>
-          <w:rPr>
-            <w:noProof/>
-          </w:rPr>
-          <w:t>1</w:t>
-        </w:r>
-      </w:fldSimple>
+      <w:r>
+        <w:fldChar w:fldCharType="begin"/>
+      </w:r>
+      <w:r>
+        <w:instrText xml:space="preserve"> SEQ Figura \* ARABIC </w:instrText>
+      </w:r>
+      <w:r>
+        <w:fldChar w:fldCharType="separate"/>
+      </w:r>
+      <w:r>
+        <w:rPr>
+          <w:noProof/>
+        </w:rPr>
+        <w:t>1</w:t>
+      </w:r>
+      <w:r>
+        <w:rPr>
+          <w:noProof/>
+        </w:rPr>
+        <w:fldChar w:fldCharType="end"/>
+      </w:r>
       <w:r>
         <w:t xml:space="preserve"> – </w:t>
       </w:r>
@@ -6927,14 +7154,27 @@
       <w:r>
         <w:t xml:space="preserve">Figura </w:t>
       </w:r>
-      <w:fldSimple w:instr=" SEQ Figura \* ARABIC ">
-        <w:r>
-          <w:rPr>
-            <w:noProof/>
-          </w:rPr>
-          <w:t>2</w:t>
-        </w:r>
-      </w:fldSimple>
+      <w:r>
+        <w:fldChar w:fldCharType="begin"/>
+      </w:r>
+      <w:r>
+        <w:instrText xml:space="preserve"> SEQ Figura \* ARABIC </w:instrText>
+      </w:r>
+      <w:r>
+        <w:fldChar w:fldCharType="separate"/>
+      </w:r>
+      <w:r>
+        <w:rPr>
+          <w:noProof/>
+        </w:rPr>
+        <w:t>2</w:t>
+      </w:r>
+      <w:r>
+        <w:rPr>
+          <w:noProof/>
+        </w:rPr>
+        <w:fldChar w:fldCharType="end"/>
+      </w:r>
       <w:r>
         <w:t xml:space="preserve"> – Diagrama de classes </w:t>
       </w:r>
@@ -7344,14 +7584,27 @@
       <w:r>
         <w:t xml:space="preserve">Tabela </w:t>
       </w:r>
-      <w:fldSimple w:instr=" SEQ Tabela \* ARABIC ">
-        <w:r>
-          <w:rPr>
-            <w:noProof/>
-          </w:rPr>
-          <w:t>5</w:t>
-        </w:r>
-      </w:fldSimple>
+      <w:r>
+        <w:fldChar w:fldCharType="begin"/>
+      </w:r>
+      <w:r>
+        <w:instrText xml:space="preserve"> SEQ Tabela \* ARABIC </w:instrText>
+      </w:r>
+      <w:r>
+        <w:fldChar w:fldCharType="separate"/>
+      </w:r>
+      <w:r>
+        <w:rPr>
+          <w:noProof/>
+        </w:rPr>
+        <w:t>5</w:t>
+      </w:r>
+      <w:r>
+        <w:rPr>
+          <w:noProof/>
+        </w:rPr>
+        <w:fldChar w:fldCharType="end"/>
+      </w:r>
       <w:r>
         <w:t xml:space="preserve"> – Identificação e funções dos </w:t>
       </w:r>
@@ -7577,13 +7830,8 @@
             </w:r>
             <w:proofErr w:type="spellEnd"/>
             <w:r>
-              <w:t xml:space="preserve"> </w:t>
-            </w:r>
-            <w:proofErr w:type="spellStart"/>
-            <w:r>
-              <w:t>Master</w:t>
-            </w:r>
-            <w:proofErr w:type="spellEnd"/>
+              <w:t xml:space="preserve"> Master</w:t>
+            </w:r>
           </w:p>
         </w:tc>
         <w:tc>
@@ -7830,8 +8078,13 @@
         <w:pStyle w:val="Ttulo2"/>
       </w:pPr>
       <w:bookmarkStart w:id="23" w:name="_Toc227748429"/>
-      <w:r>
-        <w:t xml:space="preserve">User </w:t>
+      <w:proofErr w:type="spellStart"/>
+      <w:r>
+        <w:t>User</w:t>
+      </w:r>
+      <w:proofErr w:type="spellEnd"/>
+      <w:r>
+        <w:t xml:space="preserve"> </w:t>
       </w:r>
       <w:proofErr w:type="spellStart"/>
       <w:r>
@@ -7851,7 +8104,21 @@
         <w:rPr>
           <w:highlight w:val="yellow"/>
         </w:rPr>
-        <w:t xml:space="preserve">especificados os requisitos funcionais do ponto de vista do utilizador sob forma de User </w:t>
+        <w:t xml:space="preserve">especificados os requisitos funcionais do ponto de vista do utilizador sob forma de </w:t>
+      </w:r>
+      <w:proofErr w:type="spellStart"/>
+      <w:r>
+        <w:rPr>
+          <w:highlight w:val="yellow"/>
+        </w:rPr>
+        <w:t>User</w:t>
+      </w:r>
+      <w:proofErr w:type="spellEnd"/>
+      <w:r>
+        <w:rPr>
+          <w:highlight w:val="yellow"/>
+        </w:rPr>
+        <w:t xml:space="preserve"> </w:t>
       </w:r>
       <w:proofErr w:type="spellStart"/>
       <w:r>
@@ -9427,7 +9694,21 @@
         <w:rPr>
           <w:highlight w:val="yellow"/>
         </w:rPr>
-        <w:t xml:space="preserve"> ou Bug. User </w:t>
+        <w:t xml:space="preserve"> ou Bug. </w:t>
+      </w:r>
+      <w:proofErr w:type="spellStart"/>
+      <w:r>
+        <w:rPr>
+          <w:highlight w:val="yellow"/>
+        </w:rPr>
+        <w:t>User</w:t>
+      </w:r>
+      <w:proofErr w:type="spellEnd"/>
+      <w:r>
+        <w:rPr>
+          <w:highlight w:val="yellow"/>
+        </w:rPr>
+        <w:t xml:space="preserve"> </w:t>
       </w:r>
       <w:proofErr w:type="spellStart"/>
       <w:r>
@@ -9993,12 +10274,21 @@
               </w:rPr>
               <w:t xml:space="preserve">: </w:t>
             </w:r>
-            <w:r>
-              <w:rPr>
-                <w:b w:val="0"/>
-                <w:bCs w:val="0"/>
-              </w:rPr>
-              <w:t xml:space="preserve">User </w:t>
+            <w:proofErr w:type="spellStart"/>
+            <w:r>
+              <w:rPr>
+                <w:b w:val="0"/>
+                <w:bCs w:val="0"/>
+              </w:rPr>
+              <w:t>User</w:t>
+            </w:r>
+            <w:proofErr w:type="spellEnd"/>
+            <w:r>
+              <w:rPr>
+                <w:b w:val="0"/>
+                <w:bCs w:val="0"/>
+              </w:rPr>
+              <w:t xml:space="preserve"> </w:t>
             </w:r>
             <w:proofErr w:type="spellStart"/>
             <w:r>
@@ -15108,7 +15398,7 @@
 </file>
 
 <file path=word/endnotes.xml><?xml version="1.0" encoding="utf-8"?>
-<w:endnotes xmlns:wpc="http://schemas.microsoft.com/office/word/2010/wordprocessingCanvas" xmlns:cx="http://schemas.microsoft.com/office/drawing/2014/chartex" xmlns:cx1="http://schemas.microsoft.com/office/drawing/2015/9/8/chartex" xmlns:cx2="http://schemas.microsoft.com/office/drawing/2015/10/21/chartex" xmlns:cx3="http://schemas.microsoft.com/office/drawing/2016/5/9/chartex" xmlns:cx4="http://schemas.microsoft.com/office/drawing/2016/5/10/chartex" xmlns:cx5="http://schemas.microsoft.com/office/drawing/2016/5/11/chartex" xmlns:cx6="http://schemas.microsoft.com/office/drawing/2016/5/12/chartex" xmlns:cx7="http://schemas.microsoft.com/office/drawing/2016/5/13/chartex" xmlns:cx8="http://schemas.microsoft.com/office/drawing/2016/5/14/chartex" xmlns:mc="http://schemas.openxmlformats.org/markup-compatibility/2006" xmlns:aink="http://schemas.microsoft.com/office/drawing/2016/ink" xmlns:am3d="http://schemas.microsoft.com/office/drawing/2017/model3d" xmlns:o="urn:schemas-microsoft-com:office:office" xmlns:oel="http://schemas.microsoft.com/office/2019/extlst" xmlns:r="http://schemas.openxmlformats.org/officeDocument/2006/relationships" xmlns:m="http://schemas.openxmlformats.org/officeDocument/2006/math" xmlns:v="urn:schemas-microsoft-com:vml" xmlns:wp14="http://schemas.microsoft.com/office/word/2010/wordprocessingDrawing" xmlns:wp="http://schemas.openxmlformats.org/drawingml/2006/wordprocessingDrawing" xmlns:w10="urn:schemas-microsoft-com:office:word" xmlns:w="http://schemas.openxmlformats.org/wordprocessingml/2006/main" xmlns:w14="http://schemas.microsoft.com/office/word/2010/wordml" xmlns:w15="http://schemas.microsoft.com/office/word/2012/wordml" xmlns:w16cex="http://schemas.microsoft.com/office/word/2018/wordml/cex" xmlns:w16cid="http://schemas.microsoft.com/office/word/2016/wordml/cid" xmlns:w16="http://schemas.microsoft.com/office/word/2018/wordml" xmlns:w16du="http://schemas.microsoft.com/office/word/2023/wordml/word16du" xmlns:w16sdtdh="http://schemas.microsoft.com/office/word/2020/wordml/sdtdatahash" xmlns:w16sdtfl="http://schemas.microsoft.com/office/word/2024/wordml/sdtformatlock" xmlns:w16se="http://schemas.microsoft.com/office/word/2015/wordml/symex" xmlns:wpg="http://schemas.microsoft.com/office/word/2010/wordprocessingGroup" xmlns:wpi="http://schemas.microsoft.com/office/word/2010/wordprocessingInk" xmlns:wne="http://schemas.microsoft.com/office/word/2006/wordml" xmlns:wps="http://schemas.microsoft.com/office/word/2010/wordprocessingShape" mc:Ignorable="w14 w15 w16se w16cid w16 w16cex w16sdtdh w16sdtfl w16du wp14">
+<w:endnotes xmlns:wpc="http://schemas.microsoft.com/office/word/2010/wordprocessingCanvas" xmlns:cx="http://schemas.microsoft.com/office/drawing/2014/chartex" xmlns:cx1="http://schemas.microsoft.com/office/drawing/2015/9/8/chartex" xmlns:cx2="http://schemas.microsoft.com/office/drawing/2015/10/21/chartex" xmlns:cx3="http://schemas.microsoft.com/office/drawing/2016/5/9/chartex" xmlns:cx4="http://schemas.microsoft.com/office/drawing/2016/5/10/chartex" xmlns:cx5="http://schemas.microsoft.com/office/drawing/2016/5/11/chartex" xmlns:cx6="http://schemas.microsoft.com/office/drawing/2016/5/12/chartex" xmlns:cx7="http://schemas.microsoft.com/office/drawing/2016/5/13/chartex" xmlns:cx8="http://schemas.microsoft.com/office/drawing/2016/5/14/chartex" xmlns:mc="http://schemas.openxmlformats.org/markup-compatibility/2006" xmlns:aink="http://schemas.microsoft.com/office/drawing/2016/ink" xmlns:am3d="http://schemas.microsoft.com/office/drawing/2017/model3d" xmlns:o="urn:schemas-microsoft-com:office:office" xmlns:oel="http://schemas.microsoft.com/office/2019/extlst" xmlns:r="http://schemas.openxmlformats.org/officeDocument/2006/relationships" xmlns:m="http://schemas.openxmlformats.org/officeDocument/2006/math" xmlns:v="urn:schemas-microsoft-com:vml" xmlns:wp14="http://schemas.microsoft.com/office/word/2010/wordprocessingDrawing" xmlns:wp="http://schemas.openxmlformats.org/drawingml/2006/wordprocessingDrawing" xmlns:w10="urn:schemas-microsoft-com:office:word" xmlns:w="http://schemas.openxmlformats.org/wordprocessingml/2006/main" xmlns:w14="http://schemas.microsoft.com/office/word/2010/wordml" xmlns:w15="http://schemas.microsoft.com/office/word/2012/wordml" xmlns:w16cex="http://schemas.microsoft.com/office/word/2018/wordml/cex" xmlns:w16cid="http://schemas.microsoft.com/office/word/2016/wordml/cid" xmlns:w16="http://schemas.microsoft.com/office/word/2018/wordml" xmlns:w16sdtdh="http://schemas.microsoft.com/office/word/2020/wordml/sdtdatahash" xmlns:w16se="http://schemas.microsoft.com/office/word/2015/wordml/symex" xmlns:wpg="http://schemas.microsoft.com/office/word/2010/wordprocessingGroup" xmlns:wpi="http://schemas.microsoft.com/office/word/2010/wordprocessingInk" xmlns:wne="http://schemas.microsoft.com/office/word/2006/wordml" xmlns:wps="http://schemas.microsoft.com/office/word/2010/wordprocessingShape" mc:Ignorable="w14 w15 w16se w16cid w16 w16cex w16sdtdh wp14">
   <w:endnote w:type="separator" w:id="-1">
     <w:p>
       <w:r>
@@ -15127,7 +15417,7 @@
 </file>
 
 <file path=word/footer1.xml><?xml version="1.0" encoding="utf-8"?>
-<w:ftr xmlns:wpc="http://schemas.microsoft.com/office/word/2010/wordprocessingCanvas" xmlns:cx="http://schemas.microsoft.com/office/drawing/2014/chartex" xmlns:cx1="http://schemas.microsoft.com/office/drawing/2015/9/8/chartex" xmlns:cx2="http://schemas.microsoft.com/office/drawing/2015/10/21/chartex" xmlns:cx3="http://schemas.microsoft.com/office/drawing/2016/5/9/chartex" xmlns:cx4="http://schemas.microsoft.com/office/drawing/2016/5/10/chartex" xmlns:cx5="http://schemas.microsoft.com/office/drawing/2016/5/11/chartex" xmlns:cx6="http://schemas.microsoft.com/office/drawing/2016/5/12/chartex" xmlns:cx7="http://schemas.microsoft.com/office/drawing/2016/5/13/chartex" xmlns:cx8="http://schemas.microsoft.com/office/drawing/2016/5/14/chartex" xmlns:mc="http://schemas.openxmlformats.org/markup-compatibility/2006" xmlns:aink="http://schemas.microsoft.com/office/drawing/2016/ink" xmlns:am3d="http://schemas.microsoft.com/office/drawing/2017/model3d" xmlns:o="urn:schemas-microsoft-com:office:office" xmlns:oel="http://schemas.microsoft.com/office/2019/extlst" xmlns:r="http://schemas.openxmlformats.org/officeDocument/2006/relationships" xmlns:m="http://schemas.openxmlformats.org/officeDocument/2006/math" xmlns:v="urn:schemas-microsoft-com:vml" xmlns:wp14="http://schemas.microsoft.com/office/word/2010/wordprocessingDrawing" xmlns:wp="http://schemas.openxmlformats.org/drawingml/2006/wordprocessingDrawing" xmlns:w10="urn:schemas-microsoft-com:office:word" xmlns:w="http://schemas.openxmlformats.org/wordprocessingml/2006/main" xmlns:w14="http://schemas.microsoft.com/office/word/2010/wordml" xmlns:w15="http://schemas.microsoft.com/office/word/2012/wordml" xmlns:w16cex="http://schemas.microsoft.com/office/word/2018/wordml/cex" xmlns:w16cid="http://schemas.microsoft.com/office/word/2016/wordml/cid" xmlns:w16="http://schemas.microsoft.com/office/word/2018/wordml" xmlns:w16du="http://schemas.microsoft.com/office/word/2023/wordml/word16du" xmlns:w16sdtdh="http://schemas.microsoft.com/office/word/2020/wordml/sdtdatahash" xmlns:w16sdtfl="http://schemas.microsoft.com/office/word/2024/wordml/sdtformatlock" xmlns:w16se="http://schemas.microsoft.com/office/word/2015/wordml/symex" xmlns:wpg="http://schemas.microsoft.com/office/word/2010/wordprocessingGroup" xmlns:wpi="http://schemas.microsoft.com/office/word/2010/wordprocessingInk" xmlns:wne="http://schemas.microsoft.com/office/word/2006/wordml" xmlns:wps="http://schemas.microsoft.com/office/word/2010/wordprocessingShape" mc:Ignorable="w14 w15 w16se w16cid w16 w16cex w16sdtdh w16sdtfl w16du wp14">
+<w:ftr xmlns:wpc="http://schemas.microsoft.com/office/word/2010/wordprocessingCanvas" xmlns:cx="http://schemas.microsoft.com/office/drawing/2014/chartex" xmlns:cx1="http://schemas.microsoft.com/office/drawing/2015/9/8/chartex" xmlns:cx2="http://schemas.microsoft.com/office/drawing/2015/10/21/chartex" xmlns:cx3="http://schemas.microsoft.com/office/drawing/2016/5/9/chartex" xmlns:cx4="http://schemas.microsoft.com/office/drawing/2016/5/10/chartex" xmlns:cx5="http://schemas.microsoft.com/office/drawing/2016/5/11/chartex" xmlns:cx6="http://schemas.microsoft.com/office/drawing/2016/5/12/chartex" xmlns:cx7="http://schemas.microsoft.com/office/drawing/2016/5/13/chartex" xmlns:cx8="http://schemas.microsoft.com/office/drawing/2016/5/14/chartex" xmlns:mc="http://schemas.openxmlformats.org/markup-compatibility/2006" xmlns:aink="http://schemas.microsoft.com/office/drawing/2016/ink" xmlns:am3d="http://schemas.microsoft.com/office/drawing/2017/model3d" xmlns:o="urn:schemas-microsoft-com:office:office" xmlns:oel="http://schemas.microsoft.com/office/2019/extlst" xmlns:r="http://schemas.openxmlformats.org/officeDocument/2006/relationships" xmlns:m="http://schemas.openxmlformats.org/officeDocument/2006/math" xmlns:v="urn:schemas-microsoft-com:vml" xmlns:wp14="http://schemas.microsoft.com/office/word/2010/wordprocessingDrawing" xmlns:wp="http://schemas.openxmlformats.org/drawingml/2006/wordprocessingDrawing" xmlns:w10="urn:schemas-microsoft-com:office:word" xmlns:w="http://schemas.openxmlformats.org/wordprocessingml/2006/main" xmlns:w14="http://schemas.microsoft.com/office/word/2010/wordml" xmlns:w15="http://schemas.microsoft.com/office/word/2012/wordml" xmlns:w16cex="http://schemas.microsoft.com/office/word/2018/wordml/cex" xmlns:w16cid="http://schemas.microsoft.com/office/word/2016/wordml/cid" xmlns:w16="http://schemas.microsoft.com/office/word/2018/wordml" xmlns:w16sdtdh="http://schemas.microsoft.com/office/word/2020/wordml/sdtdatahash" xmlns:w16se="http://schemas.microsoft.com/office/word/2015/wordml/symex" xmlns:wpg="http://schemas.microsoft.com/office/word/2010/wordprocessingGroup" xmlns:wpi="http://schemas.microsoft.com/office/word/2010/wordprocessingInk" xmlns:wne="http://schemas.microsoft.com/office/word/2006/wordml" xmlns:wps="http://schemas.microsoft.com/office/word/2010/wordprocessingShape" mc:Ignorable="w14 w15 w16se w16cid w16 w16cex w16sdtdh wp14">
   <w:p>
     <w:pPr>
       <w:pStyle w:val="Rodap"/>
@@ -15191,7 +15481,7 @@
 </file>
 
 <file path=word/footer2.xml><?xml version="1.0" encoding="utf-8"?>
-<w:ftr xmlns:wpc="http://schemas.microsoft.com/office/word/2010/wordprocessingCanvas" xmlns:cx="http://schemas.microsoft.com/office/drawing/2014/chartex" xmlns:cx1="http://schemas.microsoft.com/office/drawing/2015/9/8/chartex" xmlns:cx2="http://schemas.microsoft.com/office/drawing/2015/10/21/chartex" xmlns:cx3="http://schemas.microsoft.com/office/drawing/2016/5/9/chartex" xmlns:cx4="http://schemas.microsoft.com/office/drawing/2016/5/10/chartex" xmlns:cx5="http://schemas.microsoft.com/office/drawing/2016/5/11/chartex" xmlns:cx6="http://schemas.microsoft.com/office/drawing/2016/5/12/chartex" xmlns:cx7="http://schemas.microsoft.com/office/drawing/2016/5/13/chartex" xmlns:cx8="http://schemas.microsoft.com/office/drawing/2016/5/14/chartex" xmlns:mc="http://schemas.openxmlformats.org/markup-compatibility/2006" xmlns:aink="http://schemas.microsoft.com/office/drawing/2016/ink" xmlns:am3d="http://schemas.microsoft.com/office/drawing/2017/model3d" xmlns:o="urn:schemas-microsoft-com:office:office" xmlns:oel="http://schemas.microsoft.com/office/2019/extlst" xmlns:r="http://schemas.openxmlformats.org/officeDocument/2006/relationships" xmlns:m="http://schemas.openxmlformats.org/officeDocument/2006/math" xmlns:v="urn:schemas-microsoft-com:vml" xmlns:wp14="http://schemas.microsoft.com/office/word/2010/wordprocessingDrawing" xmlns:wp="http://schemas.openxmlformats.org/drawingml/2006/wordprocessingDrawing" xmlns:w10="urn:schemas-microsoft-com:office:word" xmlns:w="http://schemas.openxmlformats.org/wordprocessingml/2006/main" xmlns:w14="http://schemas.microsoft.com/office/word/2010/wordml" xmlns:w15="http://schemas.microsoft.com/office/word/2012/wordml" xmlns:w16cex="http://schemas.microsoft.com/office/word/2018/wordml/cex" xmlns:w16cid="http://schemas.microsoft.com/office/word/2016/wordml/cid" xmlns:w16="http://schemas.microsoft.com/office/word/2018/wordml" xmlns:w16du="http://schemas.microsoft.com/office/word/2023/wordml/word16du" xmlns:w16sdtdh="http://schemas.microsoft.com/office/word/2020/wordml/sdtdatahash" xmlns:w16sdtfl="http://schemas.microsoft.com/office/word/2024/wordml/sdtformatlock" xmlns:w16se="http://schemas.microsoft.com/office/word/2015/wordml/symex" xmlns:wpg="http://schemas.microsoft.com/office/word/2010/wordprocessingGroup" xmlns:wpi="http://schemas.microsoft.com/office/word/2010/wordprocessingInk" xmlns:wne="http://schemas.microsoft.com/office/word/2006/wordml" xmlns:wps="http://schemas.microsoft.com/office/word/2010/wordprocessingShape" mc:Ignorable="w14 w15 w16se w16cid w16 w16cex w16sdtdh w16sdtfl w16du wp14">
+<w:ftr xmlns:wpc="http://schemas.microsoft.com/office/word/2010/wordprocessingCanvas" xmlns:cx="http://schemas.microsoft.com/office/drawing/2014/chartex" xmlns:cx1="http://schemas.microsoft.com/office/drawing/2015/9/8/chartex" xmlns:cx2="http://schemas.microsoft.com/office/drawing/2015/10/21/chartex" xmlns:cx3="http://schemas.microsoft.com/office/drawing/2016/5/9/chartex" xmlns:cx4="http://schemas.microsoft.com/office/drawing/2016/5/10/chartex" xmlns:cx5="http://schemas.microsoft.com/office/drawing/2016/5/11/chartex" xmlns:cx6="http://schemas.microsoft.com/office/drawing/2016/5/12/chartex" xmlns:cx7="http://schemas.microsoft.com/office/drawing/2016/5/13/chartex" xmlns:cx8="http://schemas.microsoft.com/office/drawing/2016/5/14/chartex" xmlns:mc="http://schemas.openxmlformats.org/markup-compatibility/2006" xmlns:aink="http://schemas.microsoft.com/office/drawing/2016/ink" xmlns:am3d="http://schemas.microsoft.com/office/drawing/2017/model3d" xmlns:o="urn:schemas-microsoft-com:office:office" xmlns:oel="http://schemas.microsoft.com/office/2019/extlst" xmlns:r="http://schemas.openxmlformats.org/officeDocument/2006/relationships" xmlns:m="http://schemas.openxmlformats.org/officeDocument/2006/math" xmlns:v="urn:schemas-microsoft-com:vml" xmlns:wp14="http://schemas.microsoft.com/office/word/2010/wordprocessingDrawing" xmlns:wp="http://schemas.openxmlformats.org/drawingml/2006/wordprocessingDrawing" xmlns:w10="urn:schemas-microsoft-com:office:word" xmlns:w="http://schemas.openxmlformats.org/wordprocessingml/2006/main" xmlns:w14="http://schemas.microsoft.com/office/word/2010/wordml" xmlns:w15="http://schemas.microsoft.com/office/word/2012/wordml" xmlns:w16cex="http://schemas.microsoft.com/office/word/2018/wordml/cex" xmlns:w16cid="http://schemas.microsoft.com/office/word/2016/wordml/cid" xmlns:w16="http://schemas.microsoft.com/office/word/2018/wordml" xmlns:w16sdtdh="http://schemas.microsoft.com/office/word/2020/wordml/sdtdatahash" xmlns:w16se="http://schemas.microsoft.com/office/word/2015/wordml/symex" xmlns:wpg="http://schemas.microsoft.com/office/word/2010/wordprocessingGroup" xmlns:wpi="http://schemas.microsoft.com/office/word/2010/wordprocessingInk" xmlns:wne="http://schemas.microsoft.com/office/word/2006/wordml" xmlns:wps="http://schemas.microsoft.com/office/word/2010/wordprocessingShape" mc:Ignorable="w14 w15 w16se w16cid w16 w16cex w16sdtdh wp14">
   <w:sdt>
     <w:sdtPr>
       <w:id w:val="2071930181"/>
@@ -15377,7 +15667,7 @@
 </file>
 
 <file path=word/footnotes.xml><?xml version="1.0" encoding="utf-8"?>
-<w:footnotes xmlns:wpc="http://schemas.microsoft.com/office/word/2010/wordprocessingCanvas" xmlns:cx="http://schemas.microsoft.com/office/drawing/2014/chartex" xmlns:cx1="http://schemas.microsoft.com/office/drawing/2015/9/8/chartex" xmlns:cx2="http://schemas.microsoft.com/office/drawing/2015/10/21/chartex" xmlns:cx3="http://schemas.microsoft.com/office/drawing/2016/5/9/chartex" xmlns:cx4="http://schemas.microsoft.com/office/drawing/2016/5/10/chartex" xmlns:cx5="http://schemas.microsoft.com/office/drawing/2016/5/11/chartex" xmlns:cx6="http://schemas.microsoft.com/office/drawing/2016/5/12/chartex" xmlns:cx7="http://schemas.microsoft.com/office/drawing/2016/5/13/chartex" xmlns:cx8="http://schemas.microsoft.com/office/drawing/2016/5/14/chartex" xmlns:mc="http://schemas.openxmlformats.org/markup-compatibility/2006" xmlns:aink="http://schemas.microsoft.com/office/drawing/2016/ink" xmlns:am3d="http://schemas.microsoft.com/office/drawing/2017/model3d" xmlns:o="urn:schemas-microsoft-com:office:office" xmlns:oel="http://schemas.microsoft.com/office/2019/extlst" xmlns:r="http://schemas.openxmlformats.org/officeDocument/2006/relationships" xmlns:m="http://schemas.openxmlformats.org/officeDocument/2006/math" xmlns:v="urn:schemas-microsoft-com:vml" xmlns:wp14="http://schemas.microsoft.com/office/word/2010/wordprocessingDrawing" xmlns:wp="http://schemas.openxmlformats.org/drawingml/2006/wordprocessingDrawing" xmlns:w10="urn:schemas-microsoft-com:office:word" xmlns:w="http://schemas.openxmlformats.org/wordprocessingml/2006/main" xmlns:w14="http://schemas.microsoft.com/office/word/2010/wordml" xmlns:w15="http://schemas.microsoft.com/office/word/2012/wordml" xmlns:w16cex="http://schemas.microsoft.com/office/word/2018/wordml/cex" xmlns:w16cid="http://schemas.microsoft.com/office/word/2016/wordml/cid" xmlns:w16="http://schemas.microsoft.com/office/word/2018/wordml" xmlns:w16du="http://schemas.microsoft.com/office/word/2023/wordml/word16du" xmlns:w16sdtdh="http://schemas.microsoft.com/office/word/2020/wordml/sdtdatahash" xmlns:w16sdtfl="http://schemas.microsoft.com/office/word/2024/wordml/sdtformatlock" xmlns:w16se="http://schemas.microsoft.com/office/word/2015/wordml/symex" xmlns:wpg="http://schemas.microsoft.com/office/word/2010/wordprocessingGroup" xmlns:wpi="http://schemas.microsoft.com/office/word/2010/wordprocessingInk" xmlns:wne="http://schemas.microsoft.com/office/word/2006/wordml" xmlns:wps="http://schemas.microsoft.com/office/word/2010/wordprocessingShape" mc:Ignorable="w14 w15 w16se w16cid w16 w16cex w16sdtdh w16sdtfl w16du wp14">
+<w:footnotes xmlns:wpc="http://schemas.microsoft.com/office/word/2010/wordprocessingCanvas" xmlns:cx="http://schemas.microsoft.com/office/drawing/2014/chartex" xmlns:cx1="http://schemas.microsoft.com/office/drawing/2015/9/8/chartex" xmlns:cx2="http://schemas.microsoft.com/office/drawing/2015/10/21/chartex" xmlns:cx3="http://schemas.microsoft.com/office/drawing/2016/5/9/chartex" xmlns:cx4="http://schemas.microsoft.com/office/drawing/2016/5/10/chartex" xmlns:cx5="http://schemas.microsoft.com/office/drawing/2016/5/11/chartex" xmlns:cx6="http://schemas.microsoft.com/office/drawing/2016/5/12/chartex" xmlns:cx7="http://schemas.microsoft.com/office/drawing/2016/5/13/chartex" xmlns:cx8="http://schemas.microsoft.com/office/drawing/2016/5/14/chartex" xmlns:mc="http://schemas.openxmlformats.org/markup-compatibility/2006" xmlns:aink="http://schemas.microsoft.com/office/drawing/2016/ink" xmlns:am3d="http://schemas.microsoft.com/office/drawing/2017/model3d" xmlns:o="urn:schemas-microsoft-com:office:office" xmlns:oel="http://schemas.microsoft.com/office/2019/extlst" xmlns:r="http://schemas.openxmlformats.org/officeDocument/2006/relationships" xmlns:m="http://schemas.openxmlformats.org/officeDocument/2006/math" xmlns:v="urn:schemas-microsoft-com:vml" xmlns:wp14="http://schemas.microsoft.com/office/word/2010/wordprocessingDrawing" xmlns:wp="http://schemas.openxmlformats.org/drawingml/2006/wordprocessingDrawing" xmlns:w10="urn:schemas-microsoft-com:office:word" xmlns:w="http://schemas.openxmlformats.org/wordprocessingml/2006/main" xmlns:w14="http://schemas.microsoft.com/office/word/2010/wordml" xmlns:w15="http://schemas.microsoft.com/office/word/2012/wordml" xmlns:w16cex="http://schemas.microsoft.com/office/word/2018/wordml/cex" xmlns:w16cid="http://schemas.microsoft.com/office/word/2016/wordml/cid" xmlns:w16="http://schemas.microsoft.com/office/word/2018/wordml" xmlns:w16sdtdh="http://schemas.microsoft.com/office/word/2020/wordml/sdtdatahash" xmlns:w16se="http://schemas.microsoft.com/office/word/2015/wordml/symex" xmlns:wpg="http://schemas.microsoft.com/office/word/2010/wordprocessingGroup" xmlns:wpi="http://schemas.microsoft.com/office/word/2010/wordprocessingInk" xmlns:wne="http://schemas.microsoft.com/office/word/2006/wordml" xmlns:wps="http://schemas.microsoft.com/office/word/2010/wordprocessingShape" mc:Ignorable="w14 w15 w16se w16cid w16 w16cex w16sdtdh wp14">
   <w:footnote w:type="separator" w:id="-1">
     <w:p>
       <w:r>
@@ -15396,7 +15686,7 @@
 </file>
 
 <file path=word/header1.xml><?xml version="1.0" encoding="utf-8"?>
-<w:hdr xmlns:wpc="http://schemas.microsoft.com/office/word/2010/wordprocessingCanvas" xmlns:cx="http://schemas.microsoft.com/office/drawing/2014/chartex" xmlns:cx1="http://schemas.microsoft.com/office/drawing/2015/9/8/chartex" xmlns:cx2="http://schemas.microsoft.com/office/drawing/2015/10/21/chartex" xmlns:cx3="http://schemas.microsoft.com/office/drawing/2016/5/9/chartex" xmlns:cx4="http://schemas.microsoft.com/office/drawing/2016/5/10/chartex" xmlns:cx5="http://schemas.microsoft.com/office/drawing/2016/5/11/chartex" xmlns:cx6="http://schemas.microsoft.com/office/drawing/2016/5/12/chartex" xmlns:cx7="http://schemas.microsoft.com/office/drawing/2016/5/13/chartex" xmlns:cx8="http://schemas.microsoft.com/office/drawing/2016/5/14/chartex" xmlns:mc="http://schemas.openxmlformats.org/markup-compatibility/2006" xmlns:aink="http://schemas.microsoft.com/office/drawing/2016/ink" xmlns:am3d="http://schemas.microsoft.com/office/drawing/2017/model3d" xmlns:o="urn:schemas-microsoft-com:office:office" xmlns:oel="http://schemas.microsoft.com/office/2019/extlst" xmlns:r="http://schemas.openxmlformats.org/officeDocument/2006/relationships" xmlns:m="http://schemas.openxmlformats.org/officeDocument/2006/math" xmlns:v="urn:schemas-microsoft-com:vml" xmlns:wp14="http://schemas.microsoft.com/office/word/2010/wordprocessingDrawing" xmlns:wp="http://schemas.openxmlformats.org/drawingml/2006/wordprocessingDrawing" xmlns:w10="urn:schemas-microsoft-com:office:word" xmlns:w="http://schemas.openxmlformats.org/wordprocessingml/2006/main" xmlns:w14="http://schemas.microsoft.com/office/word/2010/wordml" xmlns:w15="http://schemas.microsoft.com/office/word/2012/wordml" xmlns:w16cex="http://schemas.microsoft.com/office/word/2018/wordml/cex" xmlns:w16cid="http://schemas.microsoft.com/office/word/2016/wordml/cid" xmlns:w16="http://schemas.microsoft.com/office/word/2018/wordml" xmlns:w16du="http://schemas.microsoft.com/office/word/2023/wordml/word16du" xmlns:w16sdtdh="http://schemas.microsoft.com/office/word/2020/wordml/sdtdatahash" xmlns:w16sdtfl="http://schemas.microsoft.com/office/word/2024/wordml/sdtformatlock" xmlns:w16se="http://schemas.microsoft.com/office/word/2015/wordml/symex" xmlns:wpg="http://schemas.microsoft.com/office/word/2010/wordprocessingGroup" xmlns:wpi="http://schemas.microsoft.com/office/word/2010/wordprocessingInk" xmlns:wne="http://schemas.microsoft.com/office/word/2006/wordml" xmlns:wps="http://schemas.microsoft.com/office/word/2010/wordprocessingShape" mc:Ignorable="w14 w15 w16se w16cid w16 w16cex w16sdtdh w16sdtfl w16du wp14">
+<w:hdr xmlns:wpc="http://schemas.microsoft.com/office/word/2010/wordprocessingCanvas" xmlns:cx="http://schemas.microsoft.com/office/drawing/2014/chartex" xmlns:cx1="http://schemas.microsoft.com/office/drawing/2015/9/8/chartex" xmlns:cx2="http://schemas.microsoft.com/office/drawing/2015/10/21/chartex" xmlns:cx3="http://schemas.microsoft.com/office/drawing/2016/5/9/chartex" xmlns:cx4="http://schemas.microsoft.com/office/drawing/2016/5/10/chartex" xmlns:cx5="http://schemas.microsoft.com/office/drawing/2016/5/11/chartex" xmlns:cx6="http://schemas.microsoft.com/office/drawing/2016/5/12/chartex" xmlns:cx7="http://schemas.microsoft.com/office/drawing/2016/5/13/chartex" xmlns:cx8="http://schemas.microsoft.com/office/drawing/2016/5/14/chartex" xmlns:mc="http://schemas.openxmlformats.org/markup-compatibility/2006" xmlns:aink="http://schemas.microsoft.com/office/drawing/2016/ink" xmlns:am3d="http://schemas.microsoft.com/office/drawing/2017/model3d" xmlns:o="urn:schemas-microsoft-com:office:office" xmlns:oel="http://schemas.microsoft.com/office/2019/extlst" xmlns:r="http://schemas.openxmlformats.org/officeDocument/2006/relationships" xmlns:m="http://schemas.openxmlformats.org/officeDocument/2006/math" xmlns:v="urn:schemas-microsoft-com:vml" xmlns:wp14="http://schemas.microsoft.com/office/word/2010/wordprocessingDrawing" xmlns:wp="http://schemas.openxmlformats.org/drawingml/2006/wordprocessingDrawing" xmlns:w10="urn:schemas-microsoft-com:office:word" xmlns:w="http://schemas.openxmlformats.org/wordprocessingml/2006/main" xmlns:w14="http://schemas.microsoft.com/office/word/2010/wordml" xmlns:w15="http://schemas.microsoft.com/office/word/2012/wordml" xmlns:w16cex="http://schemas.microsoft.com/office/word/2018/wordml/cex" xmlns:w16cid="http://schemas.microsoft.com/office/word/2016/wordml/cid" xmlns:w16="http://schemas.microsoft.com/office/word/2018/wordml" xmlns:w16sdtdh="http://schemas.microsoft.com/office/word/2020/wordml/sdtdatahash" xmlns:w16se="http://schemas.microsoft.com/office/word/2015/wordml/symex" xmlns:wpg="http://schemas.microsoft.com/office/word/2010/wordprocessingGroup" xmlns:wpi="http://schemas.microsoft.com/office/word/2010/wordprocessingInk" xmlns:wne="http://schemas.microsoft.com/office/word/2006/wordml" xmlns:wps="http://schemas.microsoft.com/office/word/2010/wordprocessingShape" mc:Ignorable="w14 w15 w16se w16cid w16 w16cex w16sdtdh wp14">
   <w:p>
     <w:pPr>
       <w:pStyle w:val="Cabealho"/>
@@ -15406,7 +15696,7 @@
 </file>
 
 <file path=word/numbering.xml><?xml version="1.0" encoding="utf-8"?>
-<w:numbering xmlns:wpc="http://schemas.microsoft.com/office/word/2010/wordprocessingCanvas" xmlns:cx="http://schemas.microsoft.com/office/drawing/2014/chartex" xmlns:cx1="http://schemas.microsoft.com/office/drawing/2015/9/8/chartex" xmlns:cx2="http://schemas.microsoft.com/office/drawing/2015/10/21/chartex" xmlns:cx3="http://schemas.microsoft.com/office/drawing/2016/5/9/chartex" xmlns:cx4="http://schemas.microsoft.com/office/drawing/2016/5/10/chartex" xmlns:cx5="http://schemas.microsoft.com/office/drawing/2016/5/11/chartex" xmlns:cx6="http://schemas.microsoft.com/office/drawing/2016/5/12/chartex" xmlns:cx7="http://schemas.microsoft.com/office/drawing/2016/5/13/chartex" xmlns:cx8="http://schemas.microsoft.com/office/drawing/2016/5/14/chartex" xmlns:mc="http://schemas.openxmlformats.org/markup-compatibility/2006" xmlns:aink="http://schemas.microsoft.com/office/drawing/2016/ink" xmlns:am3d="http://schemas.microsoft.com/office/drawing/2017/model3d" xmlns:o="urn:schemas-microsoft-com:office:office" xmlns:oel="http://schemas.microsoft.com/office/2019/extlst" xmlns:r="http://schemas.openxmlformats.org/officeDocument/2006/relationships" xmlns:m="http://schemas.openxmlformats.org/officeDocument/2006/math" xmlns:v="urn:schemas-microsoft-com:vml" xmlns:wp14="http://schemas.microsoft.com/office/word/2010/wordprocessingDrawing" xmlns:wp="http://schemas.openxmlformats.org/drawingml/2006/wordprocessingDrawing" xmlns:w10="urn:schemas-microsoft-com:office:word" xmlns:w="http://schemas.openxmlformats.org/wordprocessingml/2006/main" xmlns:w14="http://schemas.microsoft.com/office/word/2010/wordml" xmlns:w15="http://schemas.microsoft.com/office/word/2012/wordml" xmlns:w16cex="http://schemas.microsoft.com/office/word/2018/wordml/cex" xmlns:w16cid="http://schemas.microsoft.com/office/word/2016/wordml/cid" xmlns:w16="http://schemas.microsoft.com/office/word/2018/wordml" xmlns:w16du="http://schemas.microsoft.com/office/word/2023/wordml/word16du" xmlns:w16sdtdh="http://schemas.microsoft.com/office/word/2020/wordml/sdtdatahash" xmlns:w16sdtfl="http://schemas.microsoft.com/office/word/2024/wordml/sdtformatlock" xmlns:w16se="http://schemas.microsoft.com/office/word/2015/wordml/symex" xmlns:wpg="http://schemas.microsoft.com/office/word/2010/wordprocessingGroup" xmlns:wpi="http://schemas.microsoft.com/office/word/2010/wordprocessingInk" xmlns:wne="http://schemas.microsoft.com/office/word/2006/wordml" xmlns:wps="http://schemas.microsoft.com/office/word/2010/wordprocessingShape" mc:Ignorable="w14 w15 w16se w16cid w16 w16cex w16sdtdh w16sdtfl w16du wp14">
+<w:numbering xmlns:wpc="http://schemas.microsoft.com/office/word/2010/wordprocessingCanvas" xmlns:cx="http://schemas.microsoft.com/office/drawing/2014/chartex" xmlns:cx1="http://schemas.microsoft.com/office/drawing/2015/9/8/chartex" xmlns:cx2="http://schemas.microsoft.com/office/drawing/2015/10/21/chartex" xmlns:cx3="http://schemas.microsoft.com/office/drawing/2016/5/9/chartex" xmlns:cx4="http://schemas.microsoft.com/office/drawing/2016/5/10/chartex" xmlns:cx5="http://schemas.microsoft.com/office/drawing/2016/5/11/chartex" xmlns:cx6="http://schemas.microsoft.com/office/drawing/2016/5/12/chartex" xmlns:cx7="http://schemas.microsoft.com/office/drawing/2016/5/13/chartex" xmlns:cx8="http://schemas.microsoft.com/office/drawing/2016/5/14/chartex" xmlns:mc="http://schemas.openxmlformats.org/markup-compatibility/2006" xmlns:aink="http://schemas.microsoft.com/office/drawing/2016/ink" xmlns:am3d="http://schemas.microsoft.com/office/drawing/2017/model3d" xmlns:o="urn:schemas-microsoft-com:office:office" xmlns:oel="http://schemas.microsoft.com/office/2019/extlst" xmlns:r="http://schemas.openxmlformats.org/officeDocument/2006/relationships" xmlns:m="http://schemas.openxmlformats.org/officeDocument/2006/math" xmlns:v="urn:schemas-microsoft-com:vml" xmlns:wp14="http://schemas.microsoft.com/office/word/2010/wordprocessingDrawing" xmlns:wp="http://schemas.openxmlformats.org/drawingml/2006/wordprocessingDrawing" xmlns:w10="urn:schemas-microsoft-com:office:word" xmlns:w="http://schemas.openxmlformats.org/wordprocessingml/2006/main" xmlns:w14="http://schemas.microsoft.com/office/word/2010/wordml" xmlns:w15="http://schemas.microsoft.com/office/word/2012/wordml" xmlns:w16cex="http://schemas.microsoft.com/office/word/2018/wordml/cex" xmlns:w16cid="http://schemas.microsoft.com/office/word/2016/wordml/cid" xmlns:w16="http://schemas.microsoft.com/office/word/2018/wordml" xmlns:w16sdtdh="http://schemas.microsoft.com/office/word/2020/wordml/sdtdatahash" xmlns:w16se="http://schemas.microsoft.com/office/word/2015/wordml/symex" xmlns:wpg="http://schemas.microsoft.com/office/word/2010/wordprocessingGroup" xmlns:wpi="http://schemas.microsoft.com/office/word/2010/wordprocessingInk" xmlns:wne="http://schemas.microsoft.com/office/word/2006/wordml" xmlns:wps="http://schemas.microsoft.com/office/word/2010/wordprocessingShape" mc:Ignorable="w14 w15 w16se w16cid w16 w16cex w16sdtdh wp14">
   <w:abstractNum w:abstractNumId="0" w15:restartNumberingAfterBreak="0">
     <w:nsid w:val="033B1D64"/>
     <w:multiLevelType w:val="hybridMultilevel"/>
@@ -18723,7 +19013,7 @@
 </file>
 
 <file path=word/styles.xml><?xml version="1.0" encoding="utf-8"?>
-<w:styles xmlns:mc="http://schemas.openxmlformats.org/markup-compatibility/2006" xmlns:r="http://schemas.openxmlformats.org/officeDocument/2006/relationships" xmlns:w="http://schemas.openxmlformats.org/wordprocessingml/2006/main" xmlns:w14="http://schemas.microsoft.com/office/word/2010/wordml" xmlns:w15="http://schemas.microsoft.com/office/word/2012/wordml" xmlns:w16cex="http://schemas.microsoft.com/office/word/2018/wordml/cex" xmlns:w16cid="http://schemas.microsoft.com/office/word/2016/wordml/cid" xmlns:w16="http://schemas.microsoft.com/office/word/2018/wordml" xmlns:w16du="http://schemas.microsoft.com/office/word/2023/wordml/word16du" xmlns:w16sdtdh="http://schemas.microsoft.com/office/word/2020/wordml/sdtdatahash" xmlns:w16sdtfl="http://schemas.microsoft.com/office/word/2024/wordml/sdtformatlock" xmlns:w16se="http://schemas.microsoft.com/office/word/2015/wordml/symex" mc:Ignorable="w14 w15 w16se w16cid w16 w16cex w16sdtdh w16sdtfl w16du">
+<w:styles xmlns:mc="http://schemas.openxmlformats.org/markup-compatibility/2006" xmlns:r="http://schemas.openxmlformats.org/officeDocument/2006/relationships" xmlns:w="http://schemas.openxmlformats.org/wordprocessingml/2006/main" xmlns:w14="http://schemas.microsoft.com/office/word/2010/wordml" xmlns:w15="http://schemas.microsoft.com/office/word/2012/wordml" xmlns:w16cex="http://schemas.microsoft.com/office/word/2018/wordml/cex" xmlns:w16cid="http://schemas.microsoft.com/office/word/2016/wordml/cid" xmlns:w16="http://schemas.microsoft.com/office/word/2018/wordml" xmlns:w16sdtdh="http://schemas.microsoft.com/office/word/2020/wordml/sdtdatahash" xmlns:w16se="http://schemas.microsoft.com/office/word/2015/wordml/symex" mc:Ignorable="w14 w15 w16se w16cid w16 w16cex w16sdtdh">
   <w:docDefaults>
     <w:rPrDefault>
       <w:rPr>
@@ -20864,6 +21154,26 @@
 </file>
 
 <file path=customXml/item1.xml><?xml version="1.0" encoding="utf-8"?>
+<p:properties xmlns:p="http://schemas.microsoft.com/office/2006/metadata/properties" xmlns:xsi="http://www.w3.org/2001/XMLSchema-instance" xmlns:pc="http://schemas.microsoft.com/office/infopath/2007/PartnerControls">
+  <documentManagement>
+    <TaxCatchAll xmlns="fa1ba186-cf14-4658-82ff-4e1486731960" xsi:nil="true"/>
+    <lcf76f155ced4ddcb4097134ff3c332f xmlns="52a6887f-9537-4a34-8793-b765f13d0873">
+      <Terms xmlns="http://schemas.microsoft.com/office/infopath/2007/PartnerControls"/>
+    </lcf76f155ced4ddcb4097134ff3c332f>
+  </documentManagement>
+</p:properties>
+</file>
+
+<file path=customXml/item2.xml><?xml version="1.0" encoding="utf-8"?>
+<?mso-contentType ?>
+<FormTemplates xmlns="http://schemas.microsoft.com/sharepoint/v3/contenttype/forms">
+  <Display>DocumentLibraryForm</Display>
+  <Edit>DocumentLibraryForm</Edit>
+  <New>DocumentLibraryForm</New>
+</FormTemplates>
+</file>
+
+<file path=customXml/item3.xml><?xml version="1.0" encoding="utf-8"?>
 <ct:contentTypeSchema xmlns:ct="http://schemas.microsoft.com/office/2006/metadata/contentType" xmlns:ma="http://schemas.microsoft.com/office/2006/metadata/properties/metaAttributes" ct:_="" ma:_="" ma:contentTypeName="Documento" ma:contentTypeID="0x0101003F8ECAAF88AFCB4AB1D806FDE394FD03" ma:contentTypeVersion="12" ma:contentTypeDescription="Criar um novo documento." ma:contentTypeScope="" ma:versionID="541e5482cd22746a72c07b4578302587">
   <xsd:schema xmlns:xsd="http://www.w3.org/2001/XMLSchema" xmlns:xs="http://www.w3.org/2001/XMLSchema" xmlns:p="http://schemas.microsoft.com/office/2006/metadata/properties" xmlns:ns2="52a6887f-9537-4a34-8793-b765f13d0873" xmlns:ns3="fa1ba186-cf14-4658-82ff-4e1486731960" targetNamespace="http://schemas.microsoft.com/office/2006/metadata/properties" ma:root="true" ma:fieldsID="4badabe4fa58f02b4fe1f9c3f11ac53e" ns2:_="" ns3:_="">
     <xsd:import namespace="52a6887f-9537-4a34-8793-b765f13d0873"/>
@@ -21064,31 +21374,30 @@
 </ct:contentTypeSchema>
 </file>
 
-<file path=customXml/item2.xml><?xml version="1.0" encoding="utf-8"?>
-<?mso-contentType ?>
-<FormTemplates xmlns="http://schemas.microsoft.com/sharepoint/v3/contenttype/forms">
-  <Display>DocumentLibraryForm</Display>
-  <Edit>DocumentLibraryForm</Edit>
-  <New>DocumentLibraryForm</New>
-</FormTemplates>
-</file>
-
-<file path=customXml/item3.xml><?xml version="1.0" encoding="utf-8"?>
-<p:properties xmlns:p="http://schemas.microsoft.com/office/2006/metadata/properties" xmlns:xsi="http://www.w3.org/2001/XMLSchema-instance" xmlns:pc="http://schemas.microsoft.com/office/infopath/2007/PartnerControls">
-  <documentManagement>
-    <TaxCatchAll xmlns="fa1ba186-cf14-4658-82ff-4e1486731960" xsi:nil="true"/>
-    <lcf76f155ced4ddcb4097134ff3c332f xmlns="52a6887f-9537-4a34-8793-b765f13d0873">
-      <Terms xmlns="http://schemas.microsoft.com/office/infopath/2007/PartnerControls"/>
-    </lcf76f155ced4ddcb4097134ff3c332f>
-  </documentManagement>
-</p:properties>
-</file>
-
 <file path=customXml/item4.xml><?xml version="1.0" encoding="utf-8"?>
 <b:Sources xmlns:b="http://schemas.openxmlformats.org/officeDocument/2006/bibliography" xmlns="http://schemas.openxmlformats.org/officeDocument/2006/bibliography" SelectedStyle="\APASixthEditionOfficeOnline.xsl" StyleName="APA" Version="6"/>
 </file>
 
 <file path=customXml/itemProps1.xml><?xml version="1.0" encoding="utf-8"?>
+<ds:datastoreItem xmlns:ds="http://schemas.openxmlformats.org/officeDocument/2006/customXml" ds:itemID="{B0D02839-B28B-4402-A79D-B0CCDC274F38}">
+  <ds:schemaRefs>
+    <ds:schemaRef ds:uri="http://schemas.microsoft.com/office/2006/metadata/properties"/>
+    <ds:schemaRef ds:uri="http://schemas.microsoft.com/office/infopath/2007/PartnerControls"/>
+    <ds:schemaRef ds:uri="fa1ba186-cf14-4658-82ff-4e1486731960"/>
+    <ds:schemaRef ds:uri="52a6887f-9537-4a34-8793-b765f13d0873"/>
+  </ds:schemaRefs>
+</ds:datastoreItem>
+</file>
+
+<file path=customXml/itemProps2.xml><?xml version="1.0" encoding="utf-8"?>
+<ds:datastoreItem xmlns:ds="http://schemas.openxmlformats.org/officeDocument/2006/customXml" ds:itemID="{990C7B0B-29F8-4472-849D-8AEB923CF9C9}">
+  <ds:schemaRefs>
+    <ds:schemaRef ds:uri="http://schemas.microsoft.com/sharepoint/v3/contenttype/forms"/>
+  </ds:schemaRefs>
+</ds:datastoreItem>
+</file>
+
+<file path=customXml/itemProps3.xml><?xml version="1.0" encoding="utf-8"?>
 <ds:datastoreItem xmlns:ds="http://schemas.openxmlformats.org/officeDocument/2006/customXml" ds:itemID="{B04309D4-A979-44A4-8B48-1DFD9E70F312}">
   <ds:schemaRefs>
     <ds:schemaRef ds:uri="http://schemas.microsoft.com/office/2006/metadata/contentType"/>
@@ -21107,25 +21416,6 @@
 </ds:datastoreItem>
 </file>
 
-<file path=customXml/itemProps2.xml><?xml version="1.0" encoding="utf-8"?>
-<ds:datastoreItem xmlns:ds="http://schemas.openxmlformats.org/officeDocument/2006/customXml" ds:itemID="{990C7B0B-29F8-4472-849D-8AEB923CF9C9}">
-  <ds:schemaRefs>
-    <ds:schemaRef ds:uri="http://schemas.microsoft.com/sharepoint/v3/contenttype/forms"/>
-  </ds:schemaRefs>
-</ds:datastoreItem>
-</file>
-
-<file path=customXml/itemProps3.xml><?xml version="1.0" encoding="utf-8"?>
-<ds:datastoreItem xmlns:ds="http://schemas.openxmlformats.org/officeDocument/2006/customXml" ds:itemID="{B0D02839-B28B-4402-A79D-B0CCDC274F38}">
-  <ds:schemaRefs>
-    <ds:schemaRef ds:uri="http://schemas.microsoft.com/office/2006/metadata/properties"/>
-    <ds:schemaRef ds:uri="http://schemas.microsoft.com/office/infopath/2007/PartnerControls"/>
-    <ds:schemaRef ds:uri="fa1ba186-cf14-4658-82ff-4e1486731960"/>
-    <ds:schemaRef ds:uri="52a6887f-9537-4a34-8793-b765f13d0873"/>
-  </ds:schemaRefs>
-</ds:datastoreItem>
-</file>
-
 <file path=customXml/itemProps4.xml><?xml version="1.0" encoding="utf-8"?>
 <ds:datastoreItem xmlns:ds="http://schemas.openxmlformats.org/officeDocument/2006/customXml" ds:itemID="{34E35503-31BE-4C22-8EB5-1B8C3DFFC716}">
   <ds:schemaRefs>

</xml_diff>

<commit_message>
Especificação do sistema, Comparação do sistema
</commit_message>
<xml_diff>
--- a/MDS-2026-Relatorio.docx
+++ b/MDS-2026-Relatorio.docx
@@ -1,6 +1,6 @@
 
 <file path=word/document.xml><?xml version="1.0" encoding="utf-8"?>
-<w:document xmlns:wpc="http://schemas.microsoft.com/office/word/2010/wordprocessingCanvas" xmlns:cx="http://schemas.microsoft.com/office/drawing/2014/chartex" xmlns:cx1="http://schemas.microsoft.com/office/drawing/2015/9/8/chartex" xmlns:cx2="http://schemas.microsoft.com/office/drawing/2015/10/21/chartex" xmlns:cx3="http://schemas.microsoft.com/office/drawing/2016/5/9/chartex" xmlns:cx4="http://schemas.microsoft.com/office/drawing/2016/5/10/chartex" xmlns:cx5="http://schemas.microsoft.com/office/drawing/2016/5/11/chartex" xmlns:cx6="http://schemas.microsoft.com/office/drawing/2016/5/12/chartex" xmlns:cx7="http://schemas.microsoft.com/office/drawing/2016/5/13/chartex" xmlns:cx8="http://schemas.microsoft.com/office/drawing/2016/5/14/chartex" xmlns:mc="http://schemas.openxmlformats.org/markup-compatibility/2006" xmlns:aink="http://schemas.microsoft.com/office/drawing/2016/ink" xmlns:am3d="http://schemas.microsoft.com/office/drawing/2017/model3d" xmlns:o="urn:schemas-microsoft-com:office:office" xmlns:oel="http://schemas.microsoft.com/office/2019/extlst" xmlns:r="http://schemas.openxmlformats.org/officeDocument/2006/relationships" xmlns:m="http://schemas.openxmlformats.org/officeDocument/2006/math" xmlns:v="urn:schemas-microsoft-com:vml" xmlns:wp14="http://schemas.microsoft.com/office/word/2010/wordprocessingDrawing" xmlns:wp="http://schemas.openxmlformats.org/drawingml/2006/wordprocessingDrawing" xmlns:w10="urn:schemas-microsoft-com:office:word" xmlns:w="http://schemas.openxmlformats.org/wordprocessingml/2006/main" xmlns:w14="http://schemas.microsoft.com/office/word/2010/wordml" xmlns:w15="http://schemas.microsoft.com/office/word/2012/wordml" xmlns:w16cex="http://schemas.microsoft.com/office/word/2018/wordml/cex" xmlns:w16cid="http://schemas.microsoft.com/office/word/2016/wordml/cid" xmlns:w16="http://schemas.microsoft.com/office/word/2018/wordml" xmlns:w16du="http://schemas.microsoft.com/office/word/2023/wordml/word16du" xmlns:w16sdtdh="http://schemas.microsoft.com/office/word/2020/wordml/sdtdatahash" xmlns:w16sdtfl="http://schemas.microsoft.com/office/word/2024/wordml/sdtformatlock" xmlns:w16se="http://schemas.microsoft.com/office/word/2015/wordml/symex" xmlns:wpg="http://schemas.microsoft.com/office/word/2010/wordprocessingGroup" xmlns:wpi="http://schemas.microsoft.com/office/word/2010/wordprocessingInk" xmlns:wne="http://schemas.microsoft.com/office/word/2006/wordml" xmlns:wps="http://schemas.microsoft.com/office/word/2010/wordprocessingShape" mc:Ignorable="w14 w15 w16se w16cid w16 w16cex w16sdtdh w16sdtfl w16du wp14">
+<w:document xmlns:wpc="http://schemas.microsoft.com/office/word/2010/wordprocessingCanvas" xmlns:cx="http://schemas.microsoft.com/office/drawing/2014/chartex" xmlns:cx1="http://schemas.microsoft.com/office/drawing/2015/9/8/chartex" xmlns:cx2="http://schemas.microsoft.com/office/drawing/2015/10/21/chartex" xmlns:cx3="http://schemas.microsoft.com/office/drawing/2016/5/9/chartex" xmlns:cx4="http://schemas.microsoft.com/office/drawing/2016/5/10/chartex" xmlns:cx5="http://schemas.microsoft.com/office/drawing/2016/5/11/chartex" xmlns:cx6="http://schemas.microsoft.com/office/drawing/2016/5/12/chartex" xmlns:cx7="http://schemas.microsoft.com/office/drawing/2016/5/13/chartex" xmlns:cx8="http://schemas.microsoft.com/office/drawing/2016/5/14/chartex" xmlns:mc="http://schemas.openxmlformats.org/markup-compatibility/2006" xmlns:aink="http://schemas.microsoft.com/office/drawing/2016/ink" xmlns:am3d="http://schemas.microsoft.com/office/drawing/2017/model3d" xmlns:o="urn:schemas-microsoft-com:office:office" xmlns:oel="http://schemas.microsoft.com/office/2019/extlst" xmlns:r="http://schemas.openxmlformats.org/officeDocument/2006/relationships" xmlns:m="http://schemas.openxmlformats.org/officeDocument/2006/math" xmlns:v="urn:schemas-microsoft-com:vml" xmlns:wp14="http://schemas.microsoft.com/office/word/2010/wordprocessingDrawing" xmlns:wp="http://schemas.openxmlformats.org/drawingml/2006/wordprocessingDrawing" xmlns:w10="urn:schemas-microsoft-com:office:word" xmlns:w="http://schemas.openxmlformats.org/wordprocessingml/2006/main" xmlns:w14="http://schemas.microsoft.com/office/word/2010/wordml" xmlns:w15="http://schemas.microsoft.com/office/word/2012/wordml" xmlns:w16cex="http://schemas.microsoft.com/office/word/2018/wordml/cex" xmlns:w16cid="http://schemas.microsoft.com/office/word/2016/wordml/cid" xmlns:w16="http://schemas.microsoft.com/office/word/2018/wordml" xmlns:w16sdtdh="http://schemas.microsoft.com/office/word/2020/wordml/sdtdatahash" xmlns:w16se="http://schemas.microsoft.com/office/word/2015/wordml/symex" xmlns:wpg="http://schemas.microsoft.com/office/word/2010/wordprocessingGroup" xmlns:wpi="http://schemas.microsoft.com/office/word/2010/wordprocessingInk" xmlns:wne="http://schemas.microsoft.com/office/word/2006/wordml" xmlns:wps="http://schemas.microsoft.com/office/word/2010/wordprocessingShape" mc:Ignorable="w14 w15 w16se w16cid w16 w16cex w16sdtdh wp14">
   <w:body>
     <w:tbl>
       <w:tblPr>
@@ -97,15 +97,7 @@
               <w:jc w:val="center"/>
             </w:pPr>
             <w:r>
-              <w:t xml:space="preserve">Curso de </w:t>
-            </w:r>
-            <w:proofErr w:type="spellStart"/>
-            <w:r>
-              <w:t>TeSP</w:t>
-            </w:r>
-            <w:proofErr w:type="spellEnd"/>
-            <w:r>
-              <w:t xml:space="preserve"> em </w:t>
+              <w:t xml:space="preserve">Curso de TeSP em </w:t>
             </w:r>
             <w:r>
               <w:br/>
@@ -4333,174 +4325,167 @@
     </w:p>
     <w:p>
       <w:r>
-        <w:rPr>
-          <w:highlight w:val="yellow"/>
-        </w:rPr>
-        <w:t>Nest</w:t>
-      </w:r>
-      <w:r>
-        <w:rPr>
-          <w:highlight w:val="yellow"/>
-        </w:rPr>
-        <w:t>e capítulo</w:t>
-      </w:r>
-      <w:r>
-        <w:rPr>
-          <w:highlight w:val="yellow"/>
-        </w:rPr>
-        <w:t>...</w:t>
-      </w:r>
-      <w:r>
-        <w:t xml:space="preserve"> </w:t>
-      </w:r>
-      <w:r>
-        <w:rPr>
-          <w:highlight w:val="yellow"/>
-        </w:rPr>
-        <w:t>&lt;parágrafo introdutório&gt;</w:t>
+        <w:t xml:space="preserve">Neste capítulo, vamos falar sobre o sistema que desenvolvemos. </w:t>
+      </w:r>
+      <w:r>
+        <w:t>O objetivo principal é</w:t>
+      </w:r>
+      <w:r>
+        <w:t xml:space="preserve"> ajudar as pessoas a gerir melhor as compras em casa, a organizar listas de compras e a controlar melhor o orçamento familiar de uma forma simples e fácil de usar.</w:t>
       </w:r>
     </w:p>
     <w:p>
-      <w:pPr>
-        <w:rPr>
-          <w:highlight w:val="yellow"/>
-        </w:rPr>
-      </w:pPr>
-      <w:r>
-        <w:rPr>
-          <w:highlight w:val="yellow"/>
-        </w:rPr>
-        <w:t>&lt;</w:t>
-      </w:r>
-      <w:r>
-        <w:rPr>
-          <w:highlight w:val="yellow"/>
-        </w:rPr>
-        <w:t>Descrever</w:t>
-      </w:r>
-      <w:r>
-        <w:rPr>
-          <w:highlight w:val="yellow"/>
-        </w:rPr>
-        <w:t>:</w:t>
-      </w:r>
-      <w:r>
-        <w:rPr>
-          <w:highlight w:val="yellow"/>
-        </w:rPr>
-        <w:t xml:space="preserve"> </w:t>
+      <w:r>
+        <w:t>Este sistema junta diversas funcionalidades importantes, como planear compras, controlar despesas e organizar artigos domésticos, para ajudar as pessoas a gerir melhor o seu dinheiro do dia a dia.</w:t>
       </w:r>
     </w:p>
     <w:p>
-      <w:pPr>
-        <w:rPr>
-          <w:highlight w:val="yellow"/>
-        </w:rPr>
-      </w:pPr>
-      <w:r>
-        <w:rPr>
-          <w:highlight w:val="yellow"/>
-        </w:rPr>
-        <w:t xml:space="preserve">- </w:t>
-      </w:r>
-      <w:proofErr w:type="gramStart"/>
-      <w:r>
-        <w:rPr>
-          <w:highlight w:val="yellow"/>
-        </w:rPr>
-        <w:t>descrição</w:t>
-      </w:r>
-      <w:proofErr w:type="gramEnd"/>
-      <w:r>
-        <w:rPr>
-          <w:highlight w:val="yellow"/>
-        </w:rPr>
-        <w:t xml:space="preserve"> geral do sistema, ou seja, </w:t>
-      </w:r>
-      <w:r>
-        <w:rPr>
-          <w:highlight w:val="yellow"/>
-        </w:rPr>
-        <w:t>os objetivos do sistema a desenvolver</w:t>
-      </w:r>
-      <w:r>
-        <w:rPr>
-          <w:highlight w:val="yellow"/>
-        </w:rPr>
-        <w:t xml:space="preserve"> (</w:t>
-      </w:r>
-      <w:r>
-        <w:rPr>
-          <w:highlight w:val="yellow"/>
-        </w:rPr>
-        <w:t>as necessidades do utilizador de forma geral</w:t>
-      </w:r>
-      <w:r>
-        <w:rPr>
-          <w:highlight w:val="yellow"/>
-        </w:rPr>
-        <w:t>)</w:t>
+      <w:r>
+        <w:t xml:space="preserve">Diversas pessoas </w:t>
+      </w:r>
+      <w:r>
+        <w:t>têm</w:t>
+      </w:r>
+      <w:r>
+        <w:t xml:space="preserve"> dificuldade em controlar os gastos mensais e em organizar as compras de forma eficiente. O que pode levar a desperdícios, como compras desnecessárias, o que pode levar a problemas financeiros. Sendo o objetivo do nosso sistema ajudar a resolver tais problemas, oferecendo ferramentas práticas para ajudar as pessoas a gerir melhor as suas finanças. </w:t>
       </w:r>
     </w:p>
     <w:p>
       <w:r>
-        <w:rPr>
-          <w:highlight w:val="yellow"/>
-        </w:rPr>
-        <w:t xml:space="preserve">- </w:t>
-      </w:r>
-      <w:proofErr w:type="gramStart"/>
-      <w:r>
-        <w:rPr>
-          <w:highlight w:val="yellow"/>
-        </w:rPr>
-        <w:t>o</w:t>
-      </w:r>
-      <w:proofErr w:type="gramEnd"/>
-      <w:r>
-        <w:rPr>
-          <w:highlight w:val="yellow"/>
-        </w:rPr>
-        <w:t xml:space="preserve"> problema que o sistema pretende resolver e identificar os principais </w:t>
-      </w:r>
-      <w:proofErr w:type="spellStart"/>
-      <w:r>
-        <w:rPr>
-          <w:highlight w:val="yellow"/>
-        </w:rPr>
-        <w:t>stakeholders</w:t>
-      </w:r>
-      <w:proofErr w:type="spellEnd"/>
-      <w:r>
-        <w:rPr>
-          <w:highlight w:val="yellow"/>
-        </w:rPr>
-        <w:t> (pessoas, grupos ou entidades com interesse direto no sistema</w:t>
+        <w:t>Os principais stakeholders do sistema são os utilizadores da aplicação, a equipa de desenvolvimento e os docentes responsáveis pelo acompanhamento do projeto.</w:t>
       </w:r>
     </w:p>
     <w:p>
       <w:r>
+        <w:t>O sistema deve ter um impacto positivo na organização financeira pessoal e familiar dos utilizadores. Ajudando as pessoas a terem um melhor controlo dos seus gastos, o que pode ajudar a reduzir desperdícios e a melhorar a gestão do orçamento mensal. No entanto, para pessoas que podem ter difícil acesso a internet se ficarem dependentes deste sistema para gerir o seu orçamento podem ter problemas considerando que algumas funcionalidades precisam de acesso a internet.</w:t>
+      </w:r>
+    </w:p>
+    <w:p>
+      <w:r>
+        <w:rPr>
+          <w:highlight w:val="yellow"/>
+        </w:rPr>
+        <w:t>Nest</w:t>
+      </w:r>
+      <w:r>
+        <w:rPr>
+          <w:highlight w:val="yellow"/>
+        </w:rPr>
+        <w:t>e capítulo</w:t>
+      </w:r>
+      <w:r>
+        <w:rPr>
+          <w:highlight w:val="yellow"/>
+        </w:rPr>
+        <w:t>...</w:t>
+      </w:r>
+      <w:r>
+        <w:t xml:space="preserve"> </w:t>
+      </w:r>
+      <w:r>
+        <w:rPr>
+          <w:highlight w:val="yellow"/>
+        </w:rPr>
+        <w:t>&lt;parágrafo introdutório&gt;</w:t>
+      </w:r>
+    </w:p>
+    <w:p>
+      <w:pPr>
+        <w:rPr>
+          <w:highlight w:val="yellow"/>
+        </w:rPr>
+      </w:pPr>
+      <w:r>
+        <w:rPr>
+          <w:highlight w:val="yellow"/>
+        </w:rPr>
+        <w:t>&lt;</w:t>
+      </w:r>
+      <w:r>
+        <w:rPr>
+          <w:highlight w:val="yellow"/>
+        </w:rPr>
+        <w:t>Descrever</w:t>
+      </w:r>
+      <w:r>
+        <w:rPr>
+          <w:highlight w:val="yellow"/>
+        </w:rPr>
+        <w:t>:</w:t>
+      </w:r>
+      <w:r>
+        <w:rPr>
+          <w:highlight w:val="yellow"/>
+        </w:rPr>
+        <w:t xml:space="preserve"> </w:t>
+      </w:r>
+    </w:p>
+    <w:p>
+      <w:pPr>
+        <w:rPr>
+          <w:highlight w:val="yellow"/>
+        </w:rPr>
+      </w:pPr>
+      <w:r>
+        <w:rPr>
+          <w:highlight w:val="yellow"/>
+        </w:rPr>
+        <w:t xml:space="preserve">- descrição geral do sistema, ou seja, </w:t>
+      </w:r>
+      <w:r>
+        <w:rPr>
+          <w:highlight w:val="yellow"/>
+        </w:rPr>
+        <w:t>os objetivos do sistema a desenvolver</w:t>
+      </w:r>
+      <w:r>
+        <w:rPr>
+          <w:highlight w:val="yellow"/>
+        </w:rPr>
+        <w:t xml:space="preserve"> (</w:t>
+      </w:r>
+      <w:r>
+        <w:rPr>
+          <w:highlight w:val="yellow"/>
+        </w:rPr>
+        <w:t>as necessidades do utilizador de forma geral</w:t>
+      </w:r>
+      <w:r>
+        <w:rPr>
+          <w:highlight w:val="yellow"/>
+        </w:rPr>
+        <w:t>)</w:t>
+      </w:r>
+    </w:p>
+    <w:p>
+      <w:r>
+        <w:rPr>
+          <w:highlight w:val="yellow"/>
+        </w:rPr>
         <w:t xml:space="preserve">- </w:t>
       </w:r>
-      <w:proofErr w:type="gramStart"/>
       <w:r>
         <w:rPr>
           <w:highlight w:val="yellow"/>
         </w:rPr>
+        <w:t>o problema que o sistema pretende resolver e identificar os principais stakeholders (pessoas, grupos ou entidades com interesse direto no sistema</w:t>
+      </w:r>
+    </w:p>
+    <w:p>
+      <w:r>
+        <w:t xml:space="preserve">- </w:t>
+      </w:r>
+      <w:r>
+        <w:rPr>
+          <w:highlight w:val="yellow"/>
+        </w:rPr>
         <w:t>i</w:t>
       </w:r>
       <w:r>
         <w:rPr>
           <w:highlight w:val="yellow"/>
         </w:rPr>
-        <w:t>mpactos</w:t>
-      </w:r>
-      <w:proofErr w:type="gramEnd"/>
-      <w:r>
-        <w:rPr>
-          <w:highlight w:val="yellow"/>
-        </w:rPr>
-        <w:t xml:space="preserve"> positivos e negativos do sistema a desenvolver</w:t>
+        <w:t>mpactos positivos e negativos do sistema a desenvolver</w:t>
       </w:r>
       <w:r>
         <w:rPr>
@@ -4557,13 +4542,8 @@
       <w:pPr>
         <w:pStyle w:val="Ttulo3"/>
       </w:pPr>
-      <w:proofErr w:type="spellStart"/>
-      <w:r>
-        <w:t>Bring</w:t>
-      </w:r>
-      <w:proofErr w:type="spellEnd"/>
-      <w:r>
-        <w:t xml:space="preserve">! Lista de Compras </w:t>
+      <w:r>
+        <w:t xml:space="preserve">Bring! Lista de Compras </w:t>
       </w:r>
     </w:p>
     <w:p>
@@ -4581,16 +4561,30 @@
       </w:pPr>
       <w:bookmarkStart w:id="6" w:name="_Toc227746391"/>
       <w:r>
+        <w:lastRenderedPageBreak/>
         <w:t xml:space="preserve">Tabela </w:t>
       </w:r>
-      <w:fldSimple w:instr=" SEQ Tabela \* ARABIC ">
-        <w:r>
-          <w:rPr>
-            <w:noProof/>
-          </w:rPr>
-          <w:t>1</w:t>
-        </w:r>
-      </w:fldSimple>
+      <w:r>
+        <w:fldChar w:fldCharType="begin"/>
+      </w:r>
+      <w:r>
+        <w:instrText xml:space="preserve"> SEQ Tabela \* ARABIC </w:instrText>
+      </w:r>
+      <w:r>
+        <w:fldChar w:fldCharType="separate"/>
+      </w:r>
+      <w:r>
+        <w:rPr>
+          <w:noProof/>
+        </w:rPr>
+        <w:t>1</w:t>
+      </w:r>
+      <w:r>
+        <w:rPr>
+          <w:noProof/>
+        </w:rPr>
+        <w:fldChar w:fldCharType="end"/>
+      </w:r>
       <w:r>
         <w:t xml:space="preserve"> – Descrição do </w:t>
       </w:r>
@@ -4733,13 +4727,8 @@
                 <w:highlight w:val="yellow"/>
               </w:rPr>
             </w:pPr>
-            <w:proofErr w:type="spellStart"/>
-            <w:r>
-              <w:t>Bring</w:t>
-            </w:r>
-            <w:proofErr w:type="spellEnd"/>
-            <w:r>
-              <w:t>!</w:t>
+            <w:r>
+              <w:t>Bring!</w:t>
             </w:r>
           </w:p>
         </w:tc>
@@ -4834,13 +4823,8 @@
               <w:jc w:val="left"/>
               <w:cnfStyle w:val="000000100000" w:firstRow="0" w:lastRow="0" w:firstColumn="0" w:lastColumn="0" w:oddVBand="0" w:evenVBand="0" w:oddHBand="1" w:evenHBand="0" w:firstRowFirstColumn="0" w:firstRowLastColumn="0" w:lastRowFirstColumn="0" w:lastRowLastColumn="0"/>
             </w:pPr>
-            <w:proofErr w:type="spellStart"/>
-            <w:r>
-              <w:t>Bring</w:t>
-            </w:r>
-            <w:proofErr w:type="spellEnd"/>
-            <w:r>
-              <w:t>! É uma aplicação de lista de compras gratuita que permite criar e compartilhar</w:t>
+            <w:r>
+              <w:t>Bring! É uma aplicação de lista de compras gratuita que permite criar e compartilhar</w:t>
             </w:r>
             <w:r>
               <w:t>,</w:t>
@@ -4968,7 +4952,6 @@
                 <w:i w:val="0"/>
                 <w:iCs w:val="0"/>
               </w:rPr>
-              <w:lastRenderedPageBreak/>
               <w:t>Desvantagens:</w:t>
             </w:r>
           </w:p>
@@ -5103,6 +5086,7 @@
         <w:pStyle w:val="Ttulo3"/>
       </w:pPr>
       <w:r>
+        <w:lastRenderedPageBreak/>
         <w:t>Listonic</w:t>
       </w:r>
     </w:p>
@@ -5116,23 +5100,34 @@
       <w:r>
         <w:t xml:space="preserve">Tabela </w:t>
       </w:r>
-      <w:fldSimple w:instr=" SEQ Tabela \* ARABIC ">
-        <w:r>
-          <w:rPr>
-            <w:noProof/>
-          </w:rPr>
-          <w:t>2</w:t>
-        </w:r>
-      </w:fldSimple>
+      <w:r>
+        <w:fldChar w:fldCharType="begin"/>
+      </w:r>
+      <w:r>
+        <w:instrText xml:space="preserve"> SEQ Tabela \* ARABIC </w:instrText>
+      </w:r>
+      <w:r>
+        <w:fldChar w:fldCharType="separate"/>
+      </w:r>
+      <w:r>
+        <w:rPr>
+          <w:noProof/>
+        </w:rPr>
+        <w:t>2</w:t>
+      </w:r>
+      <w:r>
+        <w:rPr>
+          <w:noProof/>
+        </w:rPr>
+        <w:fldChar w:fldCharType="end"/>
+      </w:r>
       <w:r>
         <w:t xml:space="preserve"> – Descrição do </w:t>
       </w:r>
       <w:bookmarkEnd w:id="7"/>
-      <w:proofErr w:type="spellStart"/>
       <w:r>
         <w:t>Listonic</w:t>
       </w:r>
-      <w:proofErr w:type="spellEnd"/>
     </w:p>
     <w:tbl>
       <w:tblPr>
@@ -5259,11 +5254,9 @@
                 <w:highlight w:val="yellow"/>
               </w:rPr>
             </w:pPr>
-            <w:proofErr w:type="spellStart"/>
             <w:r>
               <w:t>Listonic</w:t>
             </w:r>
-            <w:proofErr w:type="spellEnd"/>
           </w:p>
         </w:tc>
       </w:tr>
@@ -5352,15 +5345,7 @@
               <w:t>A aplicação do</w:t>
             </w:r>
             <w:r>
-              <w:t xml:space="preserve"> </w:t>
-            </w:r>
-            <w:proofErr w:type="spellStart"/>
-            <w:r>
-              <w:t>Listonic</w:t>
-            </w:r>
-            <w:proofErr w:type="spellEnd"/>
-            <w:r>
-              <w:t xml:space="preserve"> ajuda-o a poupar dinheiro e tempo, tornando o planeamento de compras rápido e organizado.</w:t>
+              <w:t xml:space="preserve"> Listonic ajuda-o a poupar dinheiro e tempo, tornando o planeamento de compras rápido e organizado.</w:t>
             </w:r>
           </w:p>
         </w:tc>
@@ -5501,11 +5486,9 @@
       <w:pPr>
         <w:pStyle w:val="Ttulo3"/>
       </w:pPr>
-      <w:proofErr w:type="spellStart"/>
       <w:r>
         <w:t>HomeBudget</w:t>
       </w:r>
-      <w:proofErr w:type="spellEnd"/>
     </w:p>
     <w:p>
       <w:r>
@@ -5526,23 +5509,34 @@
         <w:lastRenderedPageBreak/>
         <w:t xml:space="preserve">Tabela </w:t>
       </w:r>
-      <w:fldSimple w:instr=" SEQ Tabela \* ARABIC ">
-        <w:r>
-          <w:rPr>
-            <w:noProof/>
-          </w:rPr>
-          <w:t>3</w:t>
-        </w:r>
-      </w:fldSimple>
+      <w:r>
+        <w:fldChar w:fldCharType="begin"/>
+      </w:r>
+      <w:r>
+        <w:instrText xml:space="preserve"> SEQ Tabela \* ARABIC </w:instrText>
+      </w:r>
+      <w:r>
+        <w:fldChar w:fldCharType="separate"/>
+      </w:r>
+      <w:r>
+        <w:rPr>
+          <w:noProof/>
+        </w:rPr>
+        <w:t>3</w:t>
+      </w:r>
+      <w:r>
+        <w:rPr>
+          <w:noProof/>
+        </w:rPr>
+        <w:fldChar w:fldCharType="end"/>
+      </w:r>
       <w:r>
         <w:t xml:space="preserve"> – Descrição do </w:t>
       </w:r>
       <w:bookmarkEnd w:id="8"/>
-      <w:proofErr w:type="spellStart"/>
       <w:r>
         <w:t>HomeBudget</w:t>
       </w:r>
-      <w:proofErr w:type="spellEnd"/>
     </w:p>
     <w:tbl>
       <w:tblPr>
@@ -5675,11 +5669,9 @@
                 <w:highlight w:val="yellow"/>
               </w:rPr>
             </w:pPr>
-            <w:proofErr w:type="spellStart"/>
             <w:r>
               <w:t>HomeBudget</w:t>
             </w:r>
-            <w:proofErr w:type="spellEnd"/>
           </w:p>
         </w:tc>
       </w:tr>
@@ -5765,15 +5757,7 @@
               <w:cnfStyle w:val="000000100000" w:firstRow="0" w:lastRow="0" w:firstColumn="0" w:lastColumn="0" w:oddVBand="0" w:evenVBand="0" w:oddHBand="1" w:evenHBand="0" w:firstRowFirstColumn="0" w:firstRowLastColumn="0" w:lastRowFirstColumn="0" w:lastRowLastColumn="0"/>
             </w:pPr>
             <w:r>
-              <w:t xml:space="preserve">A aplicação </w:t>
-            </w:r>
-            <w:proofErr w:type="spellStart"/>
-            <w:r>
-              <w:t>HomeBudget</w:t>
-            </w:r>
-            <w:proofErr w:type="spellEnd"/>
-            <w:r>
-              <w:t xml:space="preserve"> tem como objetivo de conseguir ajudar a controlar despesas, contas </w:t>
+              <w:t xml:space="preserve">A aplicação HomeBudget tem como objetivo de conseguir ajudar a controlar despesas, contas </w:t>
             </w:r>
             <w:r>
               <w:t>bancárias,</w:t>
@@ -5959,18 +5943,10 @@
               <w:t>estão detalhada de artigos comprados, planeados e não planeados</w:t>
             </w:r>
             <w:r>
-              <w:t xml:space="preserve">, </w:t>
-            </w:r>
-            <w:proofErr w:type="spellStart"/>
-            <w:r>
-              <w:t>d</w:t>
-            </w:r>
-            <w:r>
-              <w:t>ashboard</w:t>
-            </w:r>
-            <w:proofErr w:type="spellEnd"/>
-            <w:r>
-              <w:t xml:space="preserve"> moderna e mais interativa</w:t>
+              <w:t>, d</w:t>
+            </w:r>
+            <w:r>
+              <w:t>ashboard moderna e mais interativa</w:t>
             </w:r>
             <w:r>
               <w:t>.</w:t>
@@ -5992,10 +5968,10 @@
     </w:p>
     <w:p>
       <w:r>
-        <w:rPr>
-          <w:highlight w:val="yellow"/>
-        </w:rPr>
-        <w:t>De seguida...</w:t>
+        <w:t>De seguida</w:t>
+      </w:r>
+      <w:r>
+        <w:t>, é apresentada uma tabela que compara as principais características e funcionalidades dos sistemas analisados. O que permite identificar os pontos fortes e limitações de cada aplicação.</w:t>
       </w:r>
     </w:p>
     <w:p/>
@@ -6009,14 +5985,27 @@
       <w:r>
         <w:t xml:space="preserve">Tabela </w:t>
       </w:r>
-      <w:fldSimple w:instr=" SEQ Tabela \* ARABIC ">
-        <w:r>
-          <w:rPr>
-            <w:noProof/>
-          </w:rPr>
-          <w:t>4</w:t>
-        </w:r>
-      </w:fldSimple>
+      <w:r>
+        <w:fldChar w:fldCharType="begin"/>
+      </w:r>
+      <w:r>
+        <w:instrText xml:space="preserve"> SEQ Tabela \* ARABIC </w:instrText>
+      </w:r>
+      <w:r>
+        <w:fldChar w:fldCharType="separate"/>
+      </w:r>
+      <w:r>
+        <w:rPr>
+          <w:noProof/>
+        </w:rPr>
+        <w:t>4</w:t>
+      </w:r>
+      <w:r>
+        <w:rPr>
+          <w:noProof/>
+        </w:rPr>
+        <w:fldChar w:fldCharType="end"/>
+      </w:r>
       <w:r>
         <w:t xml:space="preserve"> – Resumo das características dos Sistemas concorrenciais</w:t>
       </w:r>
@@ -6061,13 +6050,8 @@
               <w:jc w:val="center"/>
               <w:cnfStyle w:val="100000000000" w:firstRow="1" w:lastRow="0" w:firstColumn="0" w:lastColumn="0" w:oddVBand="0" w:evenVBand="0" w:oddHBand="0" w:evenHBand="0" w:firstRowFirstColumn="0" w:firstRowLastColumn="0" w:lastRowFirstColumn="0" w:lastRowLastColumn="0"/>
             </w:pPr>
-            <w:proofErr w:type="spellStart"/>
-            <w:r>
-              <w:t>Bring</w:t>
-            </w:r>
-            <w:proofErr w:type="spellEnd"/>
-            <w:r>
-              <w:t>!</w:t>
+            <w:r>
+              <w:t>Bring!</w:t>
             </w:r>
           </w:p>
         </w:tc>
@@ -6080,11 +6064,9 @@
               <w:jc w:val="center"/>
               <w:cnfStyle w:val="100000000000" w:firstRow="1" w:lastRow="0" w:firstColumn="0" w:lastColumn="0" w:oddVBand="0" w:evenVBand="0" w:oddHBand="0" w:evenHBand="0" w:firstRowFirstColumn="0" w:firstRowLastColumn="0" w:lastRowFirstColumn="0" w:lastRowLastColumn="0"/>
             </w:pPr>
-            <w:proofErr w:type="spellStart"/>
             <w:r>
               <w:t>Listonic</w:t>
             </w:r>
-            <w:proofErr w:type="spellEnd"/>
           </w:p>
         </w:tc>
         <w:tc>
@@ -6096,11 +6078,9 @@
               <w:jc w:val="center"/>
               <w:cnfStyle w:val="100000000000" w:firstRow="1" w:lastRow="0" w:firstColumn="0" w:lastColumn="0" w:oddVBand="0" w:evenVBand="0" w:oddHBand="0" w:evenHBand="0" w:firstRowFirstColumn="0" w:firstRowLastColumn="0" w:lastRowFirstColumn="0" w:lastRowLastColumn="0"/>
             </w:pPr>
-            <w:proofErr w:type="spellStart"/>
             <w:r>
               <w:t>HomeBudget</w:t>
             </w:r>
-            <w:proofErr w:type="spellEnd"/>
           </w:p>
         </w:tc>
       </w:tr>
@@ -6119,19 +6099,8 @@
                 <w:highlight w:val="yellow"/>
               </w:rPr>
             </w:pPr>
-            <w:proofErr w:type="spellStart"/>
-            <w:r>
-              <w:rPr>
-                <w:highlight w:val="yellow"/>
-              </w:rPr>
-              <w:t>Caract</w:t>
-            </w:r>
-            <w:proofErr w:type="spellEnd"/>
-            <w:r>
-              <w:rPr>
-                <w:highlight w:val="yellow"/>
-              </w:rPr>
-              <w:t>. 1</w:t>
+            <w:r>
+              <w:t>Criação de listas de compras</w:t>
             </w:r>
           </w:p>
         </w:tc>
@@ -6143,15 +6112,9 @@
             <w:pPr>
               <w:jc w:val="center"/>
               <w:cnfStyle w:val="000000100000" w:firstRow="0" w:lastRow="0" w:firstColumn="0" w:lastColumn="0" w:oddVBand="0" w:evenVBand="0" w:oddHBand="1" w:evenHBand="0" w:firstRowFirstColumn="0" w:firstRowLastColumn="0" w:lastRowFirstColumn="0" w:lastRowLastColumn="0"/>
-              <w:rPr>
-                <w:highlight w:val="yellow"/>
-              </w:rPr>
-            </w:pPr>
-            <w:r>
-              <w:rPr>
-                <w:highlight w:val="yellow"/>
-              </w:rPr>
-              <w:t>x</w:t>
+            </w:pPr>
+            <w:r>
+              <w:t>X</w:t>
             </w:r>
           </w:p>
         </w:tc>
@@ -6163,15 +6126,9 @@
             <w:pPr>
               <w:jc w:val="center"/>
               <w:cnfStyle w:val="000000100000" w:firstRow="0" w:lastRow="0" w:firstColumn="0" w:lastColumn="0" w:oddVBand="0" w:evenVBand="0" w:oddHBand="1" w:evenHBand="0" w:firstRowFirstColumn="0" w:firstRowLastColumn="0" w:lastRowFirstColumn="0" w:lastRowLastColumn="0"/>
-              <w:rPr>
-                <w:highlight w:val="yellow"/>
-              </w:rPr>
-            </w:pPr>
-            <w:r>
-              <w:rPr>
-                <w:highlight w:val="yellow"/>
-              </w:rPr>
-              <w:t>-</w:t>
+            </w:pPr>
+            <w:r>
+              <w:t>X</w:t>
             </w:r>
           </w:p>
         </w:tc>
@@ -6183,15 +6140,9 @@
             <w:pPr>
               <w:jc w:val="center"/>
               <w:cnfStyle w:val="000000100000" w:firstRow="0" w:lastRow="0" w:firstColumn="0" w:lastColumn="0" w:oddVBand="0" w:evenVBand="0" w:oddHBand="1" w:evenHBand="0" w:firstRowFirstColumn="0" w:firstRowLastColumn="0" w:lastRowFirstColumn="0" w:lastRowLastColumn="0"/>
-              <w:rPr>
-                <w:highlight w:val="yellow"/>
-              </w:rPr>
-            </w:pPr>
-            <w:r>
-              <w:rPr>
-                <w:highlight w:val="yellow"/>
-              </w:rPr>
-              <w:t>x</w:t>
+            </w:pPr>
+            <w:r>
+              <w:t>X</w:t>
             </w:r>
           </w:p>
         </w:tc>
@@ -6208,19 +6159,8 @@
                 <w:highlight w:val="yellow"/>
               </w:rPr>
             </w:pPr>
-            <w:proofErr w:type="spellStart"/>
-            <w:r>
-              <w:rPr>
-                <w:highlight w:val="yellow"/>
-              </w:rPr>
-              <w:t>Caract</w:t>
-            </w:r>
-            <w:proofErr w:type="spellEnd"/>
-            <w:r>
-              <w:rPr>
-                <w:highlight w:val="yellow"/>
-              </w:rPr>
-              <w:t>. 2</w:t>
+            <w:r>
+              <w:t>Gestão de orçamento</w:t>
             </w:r>
           </w:p>
         </w:tc>
@@ -6244,6 +6184,9 @@
               <w:jc w:val="center"/>
               <w:cnfStyle w:val="000000000000" w:firstRow="0" w:lastRow="0" w:firstColumn="0" w:lastColumn="0" w:oddVBand="0" w:evenVBand="0" w:oddHBand="0" w:evenHBand="0" w:firstRowFirstColumn="0" w:firstRowLastColumn="0" w:lastRowFirstColumn="0" w:lastRowLastColumn="0"/>
             </w:pPr>
+            <w:r>
+              <w:t>X</w:t>
+            </w:r>
           </w:p>
         </w:tc>
         <w:tc>
@@ -6255,6 +6198,9 @@
               <w:jc w:val="center"/>
               <w:cnfStyle w:val="000000000000" w:firstRow="0" w:lastRow="0" w:firstColumn="0" w:lastColumn="0" w:oddVBand="0" w:evenVBand="0" w:oddHBand="0" w:evenHBand="0" w:firstRowFirstColumn="0" w:firstRowLastColumn="0" w:lastRowFirstColumn="0" w:lastRowLastColumn="0"/>
             </w:pPr>
+            <w:r>
+              <w:t>X</w:t>
+            </w:r>
           </w:p>
         </w:tc>
       </w:tr>
@@ -6268,24 +6214,8 @@
             <w:tcW w:w="2348" w:type="dxa"/>
           </w:tcPr>
           <w:p>
-            <w:pPr>
-              <w:rPr>
-                <w:highlight w:val="yellow"/>
-              </w:rPr>
-            </w:pPr>
-            <w:proofErr w:type="spellStart"/>
-            <w:r>
-              <w:rPr>
-                <w:highlight w:val="yellow"/>
-              </w:rPr>
-              <w:t>Caract</w:t>
-            </w:r>
-            <w:proofErr w:type="spellEnd"/>
-            <w:r>
-              <w:rPr>
-                <w:highlight w:val="yellow"/>
-              </w:rPr>
-              <w:t>. 3</w:t>
+            <w:r>
+              <w:t>Partilha de listas em tempo real</w:t>
             </w:r>
           </w:p>
         </w:tc>
@@ -6298,6 +6228,9 @@
               <w:jc w:val="center"/>
               <w:cnfStyle w:val="000000100000" w:firstRow="0" w:lastRow="0" w:firstColumn="0" w:lastColumn="0" w:oddVBand="0" w:evenVBand="0" w:oddHBand="1" w:evenHBand="0" w:firstRowFirstColumn="0" w:firstRowLastColumn="0" w:lastRowFirstColumn="0" w:lastRowLastColumn="0"/>
             </w:pPr>
+            <w:r>
+              <w:t>X</w:t>
+            </w:r>
           </w:p>
         </w:tc>
         <w:tc>
@@ -6309,6 +6242,9 @@
               <w:jc w:val="center"/>
               <w:cnfStyle w:val="000000100000" w:firstRow="0" w:lastRow="0" w:firstColumn="0" w:lastColumn="0" w:oddVBand="0" w:evenVBand="0" w:oddHBand="1" w:evenHBand="0" w:firstRowFirstColumn="0" w:firstRowLastColumn="0" w:lastRowFirstColumn="0" w:lastRowLastColumn="0"/>
             </w:pPr>
+            <w:r>
+              <w:t>X</w:t>
+            </w:r>
           </w:p>
         </w:tc>
         <w:tc>
@@ -6320,6 +6256,9 @@
               <w:jc w:val="center"/>
               <w:cnfStyle w:val="000000100000" w:firstRow="0" w:lastRow="0" w:firstColumn="0" w:lastColumn="0" w:oddVBand="0" w:evenVBand="0" w:oddHBand="1" w:evenHBand="0" w:firstRowFirstColumn="0" w:firstRowLastColumn="0" w:lastRowFirstColumn="0" w:lastRowLastColumn="0"/>
             </w:pPr>
+            <w:r>
+              <w:t>X</w:t>
+            </w:r>
           </w:p>
         </w:tc>
       </w:tr>
@@ -6330,24 +6269,9 @@
             <w:tcW w:w="2348" w:type="dxa"/>
           </w:tcPr>
           <w:p>
-            <w:pPr>
-              <w:rPr>
-                <w:highlight w:val="yellow"/>
-              </w:rPr>
-            </w:pPr>
-            <w:proofErr w:type="spellStart"/>
-            <w:r>
-              <w:rPr>
-                <w:highlight w:val="yellow"/>
-              </w:rPr>
-              <w:t>Caract</w:t>
-            </w:r>
-            <w:proofErr w:type="spellEnd"/>
-            <w:r>
-              <w:rPr>
-                <w:highlight w:val="yellow"/>
-              </w:rPr>
-              <w:t>. 4</w:t>
+            <w:r>
+              <w:lastRenderedPageBreak/>
+              <w:t>Relatórios financeiros</w:t>
             </w:r>
           </w:p>
         </w:tc>
@@ -6359,6 +6283,9 @@
             <w:pPr>
               <w:jc w:val="center"/>
               <w:cnfStyle w:val="000000000000" w:firstRow="0" w:lastRow="0" w:firstColumn="0" w:lastColumn="0" w:oddVBand="0" w:evenVBand="0" w:oddHBand="0" w:evenHBand="0" w:firstRowFirstColumn="0" w:firstRowLastColumn="0" w:lastRowFirstColumn="0" w:lastRowLastColumn="0"/>
+              <w:rPr>
+                <w:highlight w:val="yellow"/>
+              </w:rPr>
             </w:pPr>
           </w:p>
         </w:tc>
@@ -6370,6 +6297,9 @@
             <w:pPr>
               <w:jc w:val="center"/>
               <w:cnfStyle w:val="000000000000" w:firstRow="0" w:lastRow="0" w:firstColumn="0" w:lastColumn="0" w:oddVBand="0" w:evenVBand="0" w:oddHBand="0" w:evenHBand="0" w:firstRowFirstColumn="0" w:firstRowLastColumn="0" w:lastRowFirstColumn="0" w:lastRowLastColumn="0"/>
+              <w:rPr>
+                <w:highlight w:val="yellow"/>
+              </w:rPr>
             </w:pPr>
           </w:p>
         </w:tc>
@@ -6382,6 +6312,9 @@
               <w:jc w:val="center"/>
               <w:cnfStyle w:val="000000000000" w:firstRow="0" w:lastRow="0" w:firstColumn="0" w:lastColumn="0" w:oddVBand="0" w:evenVBand="0" w:oddHBand="0" w:evenHBand="0" w:firstRowFirstColumn="0" w:firstRowLastColumn="0" w:lastRowFirstColumn="0" w:lastRowLastColumn="0"/>
             </w:pPr>
+            <w:r>
+              <w:t>X</w:t>
+            </w:r>
           </w:p>
         </w:tc>
       </w:tr>
@@ -6401,10 +6334,7 @@
               </w:rPr>
             </w:pPr>
             <w:r>
-              <w:rPr>
-                <w:highlight w:val="yellow"/>
-              </w:rPr>
-              <w:t>...</w:t>
+              <w:t>Organização por categorias</w:t>
             </w:r>
           </w:p>
         </w:tc>
@@ -6417,6 +6347,9 @@
               <w:jc w:val="center"/>
               <w:cnfStyle w:val="000000100000" w:firstRow="0" w:lastRow="0" w:firstColumn="0" w:lastColumn="0" w:oddVBand="0" w:evenVBand="0" w:oddHBand="1" w:evenHBand="0" w:firstRowFirstColumn="0" w:firstRowLastColumn="0" w:lastRowFirstColumn="0" w:lastRowLastColumn="0"/>
             </w:pPr>
+            <w:r>
+              <w:t>X</w:t>
+            </w:r>
           </w:p>
         </w:tc>
         <w:tc>
@@ -6428,6 +6361,9 @@
               <w:jc w:val="center"/>
               <w:cnfStyle w:val="000000100000" w:firstRow="0" w:lastRow="0" w:firstColumn="0" w:lastColumn="0" w:oddVBand="0" w:evenVBand="0" w:oddHBand="1" w:evenHBand="0" w:firstRowFirstColumn="0" w:firstRowLastColumn="0" w:lastRowFirstColumn="0" w:lastRowLastColumn="0"/>
             </w:pPr>
+            <w:r>
+              <w:t>X</w:t>
+            </w:r>
           </w:p>
         </w:tc>
         <w:tc>
@@ -6439,6 +6375,9 @@
               <w:jc w:val="center"/>
               <w:cnfStyle w:val="000000100000" w:firstRow="0" w:lastRow="0" w:firstColumn="0" w:lastColumn="0" w:oddVBand="0" w:evenVBand="0" w:oddHBand="1" w:evenHBand="0" w:firstRowFirstColumn="0" w:firstRowLastColumn="0" w:lastRowFirstColumn="0" w:lastRowLastColumn="0"/>
             </w:pPr>
+            <w:r>
+              <w:t>X</w:t>
+            </w:r>
           </w:p>
         </w:tc>
       </w:tr>
@@ -6448,7 +6387,11 @@
             <w:cnfStyle w:val="001000000000" w:firstRow="0" w:lastRow="0" w:firstColumn="1" w:lastColumn="0" w:oddVBand="0" w:evenVBand="0" w:oddHBand="0" w:evenHBand="0" w:firstRowFirstColumn="0" w:firstRowLastColumn="0" w:lastRowFirstColumn="0" w:lastRowLastColumn="0"/>
             <w:tcW w:w="2348" w:type="dxa"/>
           </w:tcPr>
-          <w:p/>
+          <w:p>
+            <w:r>
+              <w:t>Histórico de gastos</w:t>
+            </w:r>
+          </w:p>
         </w:tc>
         <w:tc>
           <w:tcPr>
@@ -6481,6 +6424,9 @@
               <w:jc w:val="center"/>
               <w:cnfStyle w:val="000000000000" w:firstRow="0" w:lastRow="0" w:firstColumn="0" w:lastColumn="0" w:oddVBand="0" w:evenVBand="0" w:oddHBand="0" w:evenHBand="0" w:firstRowFirstColumn="0" w:firstRowLastColumn="0" w:lastRowFirstColumn="0" w:lastRowLastColumn="0"/>
             </w:pPr>
+            <w:r>
+              <w:t>X</w:t>
+            </w:r>
           </w:p>
         </w:tc>
       </w:tr>
@@ -6493,7 +6439,11 @@
             <w:cnfStyle w:val="001000000000" w:firstRow="0" w:lastRow="0" w:firstColumn="1" w:lastColumn="0" w:oddVBand="0" w:evenVBand="0" w:oddHBand="0" w:evenHBand="0" w:firstRowFirstColumn="0" w:firstRowLastColumn="0" w:lastRowFirstColumn="0" w:lastRowLastColumn="0"/>
             <w:tcW w:w="2348" w:type="dxa"/>
           </w:tcPr>
-          <w:p/>
+          <w:p>
+            <w:r>
+              <w:t xml:space="preserve">Interface simples e intuitiva </w:t>
+            </w:r>
+          </w:p>
         </w:tc>
         <w:tc>
           <w:tcPr>
@@ -6504,6 +6454,9 @@
               <w:jc w:val="center"/>
               <w:cnfStyle w:val="000000100000" w:firstRow="0" w:lastRow="0" w:firstColumn="0" w:lastColumn="0" w:oddVBand="0" w:evenVBand="0" w:oddHBand="1" w:evenHBand="0" w:firstRowFirstColumn="0" w:firstRowLastColumn="0" w:lastRowFirstColumn="0" w:lastRowLastColumn="0"/>
             </w:pPr>
+            <w:r>
+              <w:t>X</w:t>
+            </w:r>
           </w:p>
         </w:tc>
         <w:tc>
@@ -6515,6 +6468,9 @@
               <w:jc w:val="center"/>
               <w:cnfStyle w:val="000000100000" w:firstRow="0" w:lastRow="0" w:firstColumn="0" w:lastColumn="0" w:oddVBand="0" w:evenVBand="0" w:oddHBand="1" w:evenHBand="0" w:firstRowFirstColumn="0" w:firstRowLastColumn="0" w:lastRowFirstColumn="0" w:lastRowLastColumn="0"/>
             </w:pPr>
+            <w:r>
+              <w:t>X</w:t>
+            </w:r>
           </w:p>
         </w:tc>
         <w:tc>
@@ -6525,6 +6481,165 @@
             <w:pPr>
               <w:jc w:val="center"/>
               <w:cnfStyle w:val="000000100000" w:firstRow="0" w:lastRow="0" w:firstColumn="0" w:lastColumn="0" w:oddVBand="0" w:evenVBand="0" w:oddHBand="1" w:evenHBand="0" w:firstRowFirstColumn="0" w:firstRowLastColumn="0" w:lastRowFirstColumn="0" w:lastRowLastColumn="0"/>
+            </w:pPr>
+            <w:r>
+              <w:t>X</w:t>
+            </w:r>
+          </w:p>
+        </w:tc>
+      </w:tr>
+      <w:tr>
+        <w:tc>
+          <w:tcPr>
+            <w:cnfStyle w:val="001000000000" w:firstRow="0" w:lastRow="0" w:firstColumn="1" w:lastColumn="0" w:oddVBand="0" w:evenVBand="0" w:oddHBand="0" w:evenHBand="0" w:firstRowFirstColumn="0" w:firstRowLastColumn="0" w:lastRowFirstColumn="0" w:lastRowLastColumn="0"/>
+            <w:tcW w:w="2348" w:type="dxa"/>
+          </w:tcPr>
+          <w:p>
+            <w:r>
+              <w:t>Controlo de despesas familiares</w:t>
+            </w:r>
+          </w:p>
+        </w:tc>
+        <w:tc>
+          <w:tcPr>
+            <w:tcW w:w="2348" w:type="dxa"/>
+          </w:tcPr>
+          <w:p>
+            <w:pPr>
+              <w:jc w:val="center"/>
+              <w:cnfStyle w:val="000000000000" w:firstRow="0" w:lastRow="0" w:firstColumn="0" w:lastColumn="0" w:oddVBand="0" w:evenVBand="0" w:oddHBand="0" w:evenHBand="0" w:firstRowFirstColumn="0" w:firstRowLastColumn="0" w:lastRowFirstColumn="0" w:lastRowLastColumn="0"/>
+            </w:pPr>
+          </w:p>
+        </w:tc>
+        <w:tc>
+          <w:tcPr>
+            <w:tcW w:w="2349" w:type="dxa"/>
+          </w:tcPr>
+          <w:p>
+            <w:pPr>
+              <w:jc w:val="center"/>
+              <w:cnfStyle w:val="000000000000" w:firstRow="0" w:lastRow="0" w:firstColumn="0" w:lastColumn="0" w:oddVBand="0" w:evenVBand="0" w:oddHBand="0" w:evenHBand="0" w:firstRowFirstColumn="0" w:firstRowLastColumn="0" w:lastRowFirstColumn="0" w:lastRowLastColumn="0"/>
+            </w:pPr>
+          </w:p>
+        </w:tc>
+        <w:tc>
+          <w:tcPr>
+            <w:tcW w:w="2349" w:type="dxa"/>
+          </w:tcPr>
+          <w:p>
+            <w:pPr>
+              <w:jc w:val="center"/>
+              <w:cnfStyle w:val="000000000000" w:firstRow="0" w:lastRow="0" w:firstColumn="0" w:lastColumn="0" w:oddVBand="0" w:evenVBand="0" w:oddHBand="0" w:evenHBand="0" w:firstRowFirstColumn="0" w:firstRowLastColumn="0" w:lastRowFirstColumn="0" w:lastRowLastColumn="0"/>
+            </w:pPr>
+            <w:r>
+              <w:t>X</w:t>
+            </w:r>
+          </w:p>
+        </w:tc>
+      </w:tr>
+      <w:tr>
+        <w:trPr>
+          <w:cnfStyle w:val="000000100000" w:firstRow="0" w:lastRow="0" w:firstColumn="0" w:lastColumn="0" w:oddVBand="0" w:evenVBand="0" w:oddHBand="1" w:evenHBand="0" w:firstRowFirstColumn="0" w:firstRowLastColumn="0" w:lastRowFirstColumn="0" w:lastRowLastColumn="0"/>
+        </w:trPr>
+        <w:tc>
+          <w:tcPr>
+            <w:cnfStyle w:val="001000000000" w:firstRow="0" w:lastRow="0" w:firstColumn="1" w:lastColumn="0" w:oddVBand="0" w:evenVBand="0" w:oddHBand="0" w:evenHBand="0" w:firstRowFirstColumn="0" w:firstRowLastColumn="0" w:lastRowFirstColumn="0" w:lastRowLastColumn="0"/>
+            <w:tcW w:w="2348" w:type="dxa"/>
+          </w:tcPr>
+          <w:p>
+            <w:r>
+              <w:t>Compatível com Andoid e iOS</w:t>
+            </w:r>
+          </w:p>
+        </w:tc>
+        <w:tc>
+          <w:tcPr>
+            <w:tcW w:w="2348" w:type="dxa"/>
+          </w:tcPr>
+          <w:p>
+            <w:pPr>
+              <w:jc w:val="center"/>
+              <w:cnfStyle w:val="000000100000" w:firstRow="0" w:lastRow="0" w:firstColumn="0" w:lastColumn="0" w:oddVBand="0" w:evenVBand="0" w:oddHBand="1" w:evenHBand="0" w:firstRowFirstColumn="0" w:firstRowLastColumn="0" w:lastRowFirstColumn="0" w:lastRowLastColumn="0"/>
+            </w:pPr>
+            <w:r>
+              <w:t>X</w:t>
+            </w:r>
+          </w:p>
+        </w:tc>
+        <w:tc>
+          <w:tcPr>
+            <w:tcW w:w="2349" w:type="dxa"/>
+          </w:tcPr>
+          <w:p>
+            <w:pPr>
+              <w:jc w:val="center"/>
+              <w:cnfStyle w:val="000000100000" w:firstRow="0" w:lastRow="0" w:firstColumn="0" w:lastColumn="0" w:oddVBand="0" w:evenVBand="0" w:oddHBand="1" w:evenHBand="0" w:firstRowFirstColumn="0" w:firstRowLastColumn="0" w:lastRowFirstColumn="0" w:lastRowLastColumn="0"/>
+            </w:pPr>
+            <w:r>
+              <w:t>X</w:t>
+            </w:r>
+          </w:p>
+        </w:tc>
+        <w:tc>
+          <w:tcPr>
+            <w:tcW w:w="2349" w:type="dxa"/>
+          </w:tcPr>
+          <w:p>
+            <w:pPr>
+              <w:jc w:val="center"/>
+              <w:cnfStyle w:val="000000100000" w:firstRow="0" w:lastRow="0" w:firstColumn="0" w:lastColumn="0" w:oddVBand="0" w:evenVBand="0" w:oddHBand="1" w:evenHBand="0" w:firstRowFirstColumn="0" w:firstRowLastColumn="0" w:lastRowFirstColumn="0" w:lastRowLastColumn="0"/>
+            </w:pPr>
+            <w:r>
+              <w:t>X</w:t>
+            </w:r>
+          </w:p>
+        </w:tc>
+      </w:tr>
+      <w:tr>
+        <w:tc>
+          <w:tcPr>
+            <w:cnfStyle w:val="001000000000" w:firstRow="0" w:lastRow="0" w:firstColumn="1" w:lastColumn="0" w:oddVBand="0" w:evenVBand="0" w:oddHBand="0" w:evenHBand="0" w:firstRowFirstColumn="0" w:firstRowLastColumn="0" w:lastRowFirstColumn="0" w:lastRowLastColumn="0"/>
+            <w:tcW w:w="2348" w:type="dxa"/>
+          </w:tcPr>
+          <w:p>
+            <w:r>
+              <w:t xml:space="preserve">Sugestões inteligentes </w:t>
+            </w:r>
+          </w:p>
+        </w:tc>
+        <w:tc>
+          <w:tcPr>
+            <w:tcW w:w="2348" w:type="dxa"/>
+          </w:tcPr>
+          <w:p>
+            <w:pPr>
+              <w:jc w:val="center"/>
+              <w:cnfStyle w:val="000000000000" w:firstRow="0" w:lastRow="0" w:firstColumn="0" w:lastColumn="0" w:oddVBand="0" w:evenVBand="0" w:oddHBand="0" w:evenHBand="0" w:firstRowFirstColumn="0" w:firstRowLastColumn="0" w:lastRowFirstColumn="0" w:lastRowLastColumn="0"/>
+            </w:pPr>
+          </w:p>
+        </w:tc>
+        <w:tc>
+          <w:tcPr>
+            <w:tcW w:w="2349" w:type="dxa"/>
+          </w:tcPr>
+          <w:p>
+            <w:pPr>
+              <w:jc w:val="center"/>
+              <w:cnfStyle w:val="000000000000" w:firstRow="0" w:lastRow="0" w:firstColumn="0" w:lastColumn="0" w:oddVBand="0" w:evenVBand="0" w:oddHBand="0" w:evenHBand="0" w:firstRowFirstColumn="0" w:firstRowLastColumn="0" w:lastRowFirstColumn="0" w:lastRowLastColumn="0"/>
+            </w:pPr>
+            <w:r>
+              <w:t>X</w:t>
+            </w:r>
+          </w:p>
+        </w:tc>
+        <w:tc>
+          <w:tcPr>
+            <w:tcW w:w="2349" w:type="dxa"/>
+          </w:tcPr>
+          <w:p>
+            <w:pPr>
+              <w:jc w:val="center"/>
+              <w:cnfStyle w:val="000000000000" w:firstRow="0" w:lastRow="0" w:firstColumn="0" w:lastColumn="0" w:oddVBand="0" w:evenVBand="0" w:oddHBand="0" w:evenHBand="0" w:firstRowFirstColumn="0" w:firstRowLastColumn="0" w:lastRowFirstColumn="0" w:lastRowLastColumn="0"/>
             </w:pPr>
           </w:p>
         </w:tc>
@@ -6675,55 +6790,17 @@
         <w:pStyle w:val="Ttulo2"/>
       </w:pPr>
       <w:bookmarkStart w:id="12" w:name="_Toc227748424"/>
-      <w:proofErr w:type="spellStart"/>
-      <w:r>
-        <w:t>Wireframes</w:t>
-      </w:r>
-      <w:proofErr w:type="spellEnd"/>
-      <w:r>
-        <w:t>/</w:t>
-      </w:r>
-      <w:proofErr w:type="spellStart"/>
-      <w:r>
-        <w:t>Mockups</w:t>
+      <w:r>
+        <w:t>Wireframes/Mockups</w:t>
       </w:r>
       <w:bookmarkEnd w:id="12"/>
-      <w:proofErr w:type="spellEnd"/>
     </w:p>
     <w:p>
       <w:r>
         <w:rPr>
           <w:highlight w:val="yellow"/>
         </w:rPr>
-        <w:t xml:space="preserve">&lt;Desenho dos </w:t>
-      </w:r>
-      <w:proofErr w:type="spellStart"/>
-      <w:r>
-        <w:rPr>
-          <w:highlight w:val="yellow"/>
-        </w:rPr>
-        <w:t>wireframes</w:t>
-      </w:r>
-      <w:proofErr w:type="spellEnd"/>
-      <w:r>
-        <w:rPr>
-          <w:highlight w:val="yellow"/>
-        </w:rPr>
-        <w:t xml:space="preserve"> já a aproximarem-se de </w:t>
-      </w:r>
-      <w:proofErr w:type="spellStart"/>
-      <w:r>
-        <w:rPr>
-          <w:highlight w:val="yellow"/>
-        </w:rPr>
-        <w:t>mockups</w:t>
-      </w:r>
-      <w:proofErr w:type="spellEnd"/>
-      <w:r>
-        <w:rPr>
-          <w:highlight w:val="yellow"/>
-        </w:rPr>
-        <w:t xml:space="preserve"> (mais detalhados)</w:t>
+        <w:t>&lt;Desenho dos wireframes já a aproximarem-se de mockups (mais detalhados)</w:t>
       </w:r>
       <w:r>
         <w:rPr>
@@ -6743,6 +6820,9 @@
         <w:ind w:left="-426" w:firstLine="142"/>
       </w:pPr>
       <w:r>
+        <w:rPr>
+          <w:noProof/>
+        </w:rPr>
         <w:drawing>
           <wp:inline distT="0" distB="0" distL="0" distR="0" wp14:anchorId="0F09FD9E" wp14:editId="182904F5">
             <wp:extent cx="2963119" cy="2611146"/>
@@ -6834,14 +6914,27 @@
       <w:r>
         <w:t xml:space="preserve">Figura </w:t>
       </w:r>
-      <w:fldSimple w:instr=" SEQ Figura \* ARABIC ">
-        <w:r>
-          <w:rPr>
-            <w:noProof/>
-          </w:rPr>
-          <w:t>1</w:t>
-        </w:r>
-      </w:fldSimple>
+      <w:r>
+        <w:fldChar w:fldCharType="begin"/>
+      </w:r>
+      <w:r>
+        <w:instrText xml:space="preserve"> SEQ Figura \* ARABIC </w:instrText>
+      </w:r>
+      <w:r>
+        <w:fldChar w:fldCharType="separate"/>
+      </w:r>
+      <w:r>
+        <w:rPr>
+          <w:noProof/>
+        </w:rPr>
+        <w:t>1</w:t>
+      </w:r>
+      <w:r>
+        <w:rPr>
+          <w:noProof/>
+        </w:rPr>
+        <w:fldChar w:fldCharType="end"/>
+      </w:r>
       <w:r>
         <w:t xml:space="preserve">- </w:t>
       </w:r>
@@ -6849,21 +6942,8 @@
         <w:t>Página Login</w:t>
       </w:r>
       <w:r>
-        <w:t xml:space="preserve"> </w:t>
-      </w:r>
-      <w:proofErr w:type="spellStart"/>
-      <w:r>
-        <w:t>Mockup</w:t>
-      </w:r>
-      <w:proofErr w:type="spellEnd"/>
-      <w:r>
-        <w:t>/</w:t>
-      </w:r>
-      <w:proofErr w:type="spellStart"/>
-      <w:r>
-        <w:t>WireFame</w:t>
-      </w:r>
-      <w:proofErr w:type="spellEnd"/>
+        <w:t xml:space="preserve"> Mockup/WireFame</w:t>
+      </w:r>
     </w:p>
     <w:p>
       <w:pPr>
@@ -6978,38 +7058,30 @@
       <w:r>
         <w:t xml:space="preserve">Figura </w:t>
       </w:r>
-      <w:fldSimple w:instr=" SEQ Figura \* ARABIC ">
-        <w:r>
-          <w:rPr>
-            <w:noProof/>
-          </w:rPr>
-          <w:t>2</w:t>
-        </w:r>
-      </w:fldSimple>
-      <w:r>
-        <w:t xml:space="preserve"> - Página </w:t>
-      </w:r>
-      <w:proofErr w:type="gramStart"/>
-      <w:r>
-        <w:t>Registrar</w:t>
-      </w:r>
-      <w:proofErr w:type="gramEnd"/>
-      <w:r>
-        <w:t xml:space="preserve"> </w:t>
-      </w:r>
-      <w:proofErr w:type="spellStart"/>
-      <w:r>
-        <w:t>Mockup</w:t>
-      </w:r>
-      <w:proofErr w:type="spellEnd"/>
-      <w:r>
-        <w:t>/</w:t>
-      </w:r>
-      <w:proofErr w:type="spellStart"/>
-      <w:r>
-        <w:t>WireFrame</w:t>
-      </w:r>
-      <w:proofErr w:type="spellEnd"/>
+      <w:r>
+        <w:fldChar w:fldCharType="begin"/>
+      </w:r>
+      <w:r>
+        <w:instrText xml:space="preserve"> SEQ Figura \* ARABIC </w:instrText>
+      </w:r>
+      <w:r>
+        <w:fldChar w:fldCharType="separate"/>
+      </w:r>
+      <w:r>
+        <w:rPr>
+          <w:noProof/>
+        </w:rPr>
+        <w:t>2</w:t>
+      </w:r>
+      <w:r>
+        <w:rPr>
+          <w:noProof/>
+        </w:rPr>
+        <w:fldChar w:fldCharType="end"/>
+      </w:r>
+      <w:r>
+        <w:t xml:space="preserve"> - Página Registrar Mockup/WireFrame</w:t>
+      </w:r>
     </w:p>
     <w:p>
       <w:pPr>
@@ -7017,6 +7089,9 @@
         <w:jc w:val="center"/>
       </w:pPr>
       <w:r>
+        <w:rPr>
+          <w:noProof/>
+        </w:rPr>
         <w:drawing>
           <wp:inline distT="0" distB="0" distL="0" distR="0" wp14:anchorId="75B18AB8" wp14:editId="6D5F59B0">
             <wp:extent cx="2986269" cy="1964097"/>
@@ -7109,14 +7184,27 @@
       <w:r>
         <w:t xml:space="preserve">Figura </w:t>
       </w:r>
-      <w:fldSimple w:instr=" SEQ Figura \* ARABIC ">
-        <w:r>
-          <w:rPr>
-            <w:noProof/>
-          </w:rPr>
-          <w:t>3</w:t>
-        </w:r>
-      </w:fldSimple>
+      <w:r>
+        <w:fldChar w:fldCharType="begin"/>
+      </w:r>
+      <w:r>
+        <w:instrText xml:space="preserve"> SEQ Figura \* ARABIC </w:instrText>
+      </w:r>
+      <w:r>
+        <w:fldChar w:fldCharType="separate"/>
+      </w:r>
+      <w:r>
+        <w:rPr>
+          <w:noProof/>
+        </w:rPr>
+        <w:t>3</w:t>
+      </w:r>
+      <w:r>
+        <w:rPr>
+          <w:noProof/>
+        </w:rPr>
+        <w:fldChar w:fldCharType="end"/>
+      </w:r>
       <w:r>
         <w:t xml:space="preserve"> – </w:t>
       </w:r>
@@ -7230,14 +7318,27 @@
       <w:r>
         <w:t xml:space="preserve">Figura </w:t>
       </w:r>
-      <w:fldSimple w:instr=" SEQ Figura \* ARABIC ">
-        <w:r>
-          <w:rPr>
-            <w:noProof/>
-          </w:rPr>
-          <w:t>4</w:t>
-        </w:r>
-      </w:fldSimple>
+      <w:r>
+        <w:fldChar w:fldCharType="begin"/>
+      </w:r>
+      <w:r>
+        <w:instrText xml:space="preserve"> SEQ Figura \* ARABIC </w:instrText>
+      </w:r>
+      <w:r>
+        <w:fldChar w:fldCharType="separate"/>
+      </w:r>
+      <w:r>
+        <w:rPr>
+          <w:noProof/>
+        </w:rPr>
+        <w:t>4</w:t>
+      </w:r>
+      <w:r>
+        <w:rPr>
+          <w:noProof/>
+        </w:rPr>
+        <w:fldChar w:fldCharType="end"/>
+      </w:r>
       <w:r>
         <w:t xml:space="preserve"> – Diagrama de classes </w:t>
       </w:r>
@@ -7256,13 +7357,11 @@
         <w:pStyle w:val="Ttulo1"/>
       </w:pPr>
       <w:bookmarkStart w:id="18" w:name="_Toc227748426"/>
-      <w:proofErr w:type="spellStart"/>
       <w:r>
         <w:lastRenderedPageBreak/>
         <w:t>Scrum</w:t>
       </w:r>
       <w:bookmarkEnd w:id="18"/>
-      <w:proofErr w:type="spellEnd"/>
     </w:p>
     <w:p>
       <w:r>
@@ -7279,15 +7378,7 @@
       </w:pPr>
       <w:bookmarkStart w:id="19" w:name="_Toc227748427"/>
       <w:r>
-        <w:t xml:space="preserve">Aplicação do </w:t>
-      </w:r>
-      <w:proofErr w:type="spellStart"/>
-      <w:r>
-        <w:t>Scrum</w:t>
-      </w:r>
-      <w:proofErr w:type="spellEnd"/>
-      <w:r>
-        <w:t xml:space="preserve"> ao Projeto</w:t>
+        <w:t>Aplicação do Scrum ao Projeto</w:t>
       </w:r>
       <w:bookmarkEnd w:id="19"/>
     </w:p>
@@ -7340,41 +7431,13 @@
         <w:rPr>
           <w:highlight w:val="yellow"/>
         </w:rPr>
-        <w:t xml:space="preserve">Forma como foi aplicado o </w:t>
-      </w:r>
-      <w:proofErr w:type="spellStart"/>
+        <w:t>Forma como foi aplicado o Scrum ao projeto</w:t>
+      </w:r>
       <w:r>
         <w:rPr>
           <w:highlight w:val="yellow"/>
         </w:rPr>
-        <w:t>Scrum</w:t>
-      </w:r>
-      <w:proofErr w:type="spellEnd"/>
-      <w:r>
-        <w:rPr>
-          <w:highlight w:val="yellow"/>
-        </w:rPr>
-        <w:t xml:space="preserve"> ao projeto</w:t>
-      </w:r>
-      <w:r>
-        <w:rPr>
-          <w:highlight w:val="yellow"/>
-        </w:rPr>
-        <w:t xml:space="preserve"> (</w:t>
-      </w:r>
-      <w:proofErr w:type="spellStart"/>
-      <w:r>
-        <w:rPr>
-          <w:highlight w:val="yellow"/>
-        </w:rPr>
-        <w:t>acaptações</w:t>
-      </w:r>
-      <w:proofErr w:type="spellEnd"/>
-      <w:r>
-        <w:rPr>
-          <w:highlight w:val="yellow"/>
-        </w:rPr>
-        <w:t xml:space="preserve"> que teve)</w:t>
+        <w:t xml:space="preserve"> (acaptações que teve)</w:t>
       </w:r>
     </w:p>
     <w:p>
@@ -7404,69 +7467,13 @@
         <w:rPr>
           <w:highlight w:val="yellow"/>
         </w:rPr>
-        <w:t xml:space="preserve">Quais os eventos do </w:t>
-      </w:r>
-      <w:proofErr w:type="spellStart"/>
+        <w:t>Quais os eventos do Scrum seguidos (</w:t>
+      </w:r>
       <w:r>
         <w:rPr>
           <w:highlight w:val="yellow"/>
         </w:rPr>
-        <w:t>Scrum</w:t>
-      </w:r>
-      <w:proofErr w:type="spellEnd"/>
-      <w:r>
-        <w:rPr>
-          <w:highlight w:val="yellow"/>
-        </w:rPr>
-        <w:t xml:space="preserve"> seguidos (</w:t>
-      </w:r>
-      <w:r>
-        <w:rPr>
-          <w:highlight w:val="yellow"/>
-        </w:rPr>
-        <w:t xml:space="preserve">sprint </w:t>
-      </w:r>
-      <w:proofErr w:type="spellStart"/>
-      <w:r>
-        <w:rPr>
-          <w:highlight w:val="yellow"/>
-        </w:rPr>
-        <w:t>planning</w:t>
-      </w:r>
-      <w:proofErr w:type="spellEnd"/>
-      <w:r>
-        <w:rPr>
-          <w:highlight w:val="yellow"/>
-        </w:rPr>
-        <w:t xml:space="preserve">, </w:t>
-      </w:r>
-      <w:proofErr w:type="spellStart"/>
-      <w:r>
-        <w:rPr>
-          <w:highlight w:val="yellow"/>
-        </w:rPr>
-        <w:t>Daily</w:t>
-      </w:r>
-      <w:proofErr w:type="spellEnd"/>
-      <w:r>
-        <w:rPr>
-          <w:highlight w:val="yellow"/>
-        </w:rPr>
-        <w:t xml:space="preserve"> </w:t>
-      </w:r>
-      <w:proofErr w:type="spellStart"/>
-      <w:r>
-        <w:rPr>
-          <w:highlight w:val="yellow"/>
-        </w:rPr>
-        <w:t>Scrum</w:t>
-      </w:r>
-      <w:proofErr w:type="spellEnd"/>
-      <w:r>
-        <w:rPr>
-          <w:highlight w:val="yellow"/>
-        </w:rPr>
-        <w:t xml:space="preserve">, </w:t>
+        <w:t xml:space="preserve">sprint planning, Daily Scrum, </w:t>
       </w:r>
       <w:r>
         <w:rPr>
@@ -7493,63 +7500,7 @@
         <w:rPr>
           <w:highlight w:val="yellow"/>
         </w:rPr>
-        <w:t xml:space="preserve">Sprint </w:t>
-      </w:r>
-      <w:proofErr w:type="spellStart"/>
-      <w:r>
-        <w:rPr>
-          <w:highlight w:val="yellow"/>
-        </w:rPr>
-        <w:t>Planning</w:t>
-      </w:r>
-      <w:proofErr w:type="spellEnd"/>
-      <w:r>
-        <w:rPr>
-          <w:highlight w:val="yellow"/>
-        </w:rPr>
-        <w:t>: número de sprints, duração de cada uma, definição de pronto (</w:t>
-      </w:r>
-      <w:proofErr w:type="spellStart"/>
-      <w:r>
-        <w:rPr>
-          <w:highlight w:val="yellow"/>
-        </w:rPr>
-        <w:t>Definition</w:t>
-      </w:r>
-      <w:proofErr w:type="spellEnd"/>
-      <w:r>
-        <w:rPr>
-          <w:highlight w:val="yellow"/>
-        </w:rPr>
-        <w:t xml:space="preserve"> </w:t>
-      </w:r>
-      <w:proofErr w:type="spellStart"/>
-      <w:r>
-        <w:rPr>
-          <w:highlight w:val="yellow"/>
-        </w:rPr>
-        <w:t>of</w:t>
-      </w:r>
-      <w:proofErr w:type="spellEnd"/>
-      <w:r>
-        <w:rPr>
-          <w:highlight w:val="yellow"/>
-        </w:rPr>
-        <w:t xml:space="preserve"> </w:t>
-      </w:r>
-      <w:proofErr w:type="spellStart"/>
-      <w:r>
-        <w:rPr>
-          <w:highlight w:val="yellow"/>
-        </w:rPr>
-        <w:t>Done</w:t>
-      </w:r>
-      <w:proofErr w:type="spellEnd"/>
-      <w:r>
-        <w:rPr>
-          <w:highlight w:val="yellow"/>
-        </w:rPr>
-        <w:t>)</w:t>
+        <w:t>Sprint Planning: número de sprints, duração de cada uma, definição de pronto (Definition of Done)</w:t>
       </w:r>
     </w:p>
     <w:p>
@@ -7582,21 +7533,8 @@
         <w:pStyle w:val="Ttulo2"/>
       </w:pPr>
       <w:bookmarkStart w:id="20" w:name="_Toc227748428"/>
-      <w:proofErr w:type="spellStart"/>
-      <w:r>
-        <w:t>Stakeholders</w:t>
-      </w:r>
-      <w:proofErr w:type="spellEnd"/>
-      <w:r>
-        <w:t xml:space="preserve"> e </w:t>
-      </w:r>
-      <w:proofErr w:type="spellStart"/>
-      <w:r>
-        <w:t>Scrum</w:t>
-      </w:r>
-      <w:proofErr w:type="spellEnd"/>
-      <w:r>
-        <w:t xml:space="preserve"> Team</w:t>
+      <w:r>
+        <w:t>Stakeholders e Scrum Team</w:t>
       </w:r>
       <w:bookmarkEnd w:id="20"/>
     </w:p>
@@ -7605,35 +7543,7 @@
         <w:rPr>
           <w:highlight w:val="yellow"/>
         </w:rPr>
-        <w:t xml:space="preserve">&lt;Identificação dos </w:t>
-      </w:r>
-      <w:proofErr w:type="spellStart"/>
-      <w:r>
-        <w:rPr>
-          <w:highlight w:val="yellow"/>
-        </w:rPr>
-        <w:t>stakeholders</w:t>
-      </w:r>
-      <w:proofErr w:type="spellEnd"/>
-      <w:r>
-        <w:rPr>
-          <w:highlight w:val="yellow"/>
-        </w:rPr>
-        <w:t xml:space="preserve"> e da </w:t>
-      </w:r>
-      <w:proofErr w:type="spellStart"/>
-      <w:r>
-        <w:rPr>
-          <w:highlight w:val="yellow"/>
-        </w:rPr>
-        <w:t>Scrum</w:t>
-      </w:r>
-      <w:proofErr w:type="spellEnd"/>
-      <w:r>
-        <w:rPr>
-          <w:highlight w:val="yellow"/>
-        </w:rPr>
-        <w:t xml:space="preserve"> Team (Roles) no projeto, bem como quais as suas funções&gt;</w:t>
+        <w:t>&lt;Identificação dos stakeholders e da Scrum Team (Roles) no projeto, bem como quais as suas funções&gt;</w:t>
       </w:r>
     </w:p>
     <w:p/>
@@ -7647,32 +7557,32 @@
       <w:r>
         <w:t xml:space="preserve">Tabela </w:t>
       </w:r>
-      <w:fldSimple w:instr=" SEQ Tabela \* ARABIC ">
-        <w:r>
-          <w:rPr>
-            <w:noProof/>
-          </w:rPr>
-          <w:t>5</w:t>
-        </w:r>
-      </w:fldSimple>
+      <w:r>
+        <w:fldChar w:fldCharType="begin"/>
+      </w:r>
+      <w:r>
+        <w:instrText xml:space="preserve"> SEQ Tabela \* ARABIC </w:instrText>
+      </w:r>
+      <w:r>
+        <w:fldChar w:fldCharType="separate"/>
+      </w:r>
+      <w:r>
+        <w:rPr>
+          <w:noProof/>
+        </w:rPr>
+        <w:t>5</w:t>
+      </w:r>
+      <w:r>
+        <w:rPr>
+          <w:noProof/>
+        </w:rPr>
+        <w:fldChar w:fldCharType="end"/>
+      </w:r>
       <w:r>
         <w:t xml:space="preserve"> – Identificação e funções dos </w:t>
       </w:r>
-      <w:proofErr w:type="spellStart"/>
-      <w:r>
-        <w:t>Stakeholders</w:t>
-      </w:r>
-      <w:proofErr w:type="spellEnd"/>
-      <w:r>
-        <w:t xml:space="preserve"> e </w:t>
-      </w:r>
-      <w:proofErr w:type="spellStart"/>
-      <w:r>
-        <w:t>Scrum</w:t>
-      </w:r>
-      <w:proofErr w:type="spellEnd"/>
-      <w:r>
-        <w:t xml:space="preserve"> Team</w:t>
+      <w:r>
+        <w:t>Stakeholders e Scrum Team</w:t>
       </w:r>
       <w:bookmarkEnd w:id="21"/>
     </w:p>
@@ -7799,19 +7709,9 @@
             <w:tcW w:w="2132" w:type="dxa"/>
           </w:tcPr>
           <w:p>
-            <w:proofErr w:type="spellStart"/>
-            <w:r>
-              <w:t>Product</w:t>
-            </w:r>
-            <w:proofErr w:type="spellEnd"/>
-            <w:r>
-              <w:t xml:space="preserve"> </w:t>
-            </w:r>
-            <w:proofErr w:type="spellStart"/>
-            <w:r>
-              <w:t>Owner</w:t>
-            </w:r>
-            <w:proofErr w:type="spellEnd"/>
+            <w:r>
+              <w:t>Product Owner</w:t>
+            </w:r>
           </w:p>
         </w:tc>
         <w:tc>
@@ -7874,19 +7774,9 @@
             <w:tcW w:w="2132" w:type="dxa"/>
           </w:tcPr>
           <w:p>
-            <w:proofErr w:type="spellStart"/>
-            <w:r>
-              <w:t>Scrum</w:t>
-            </w:r>
-            <w:proofErr w:type="spellEnd"/>
-            <w:r>
-              <w:t xml:space="preserve"> </w:t>
-            </w:r>
-            <w:proofErr w:type="spellStart"/>
-            <w:r>
-              <w:t>Master</w:t>
-            </w:r>
-            <w:proofErr w:type="spellEnd"/>
+            <w:r>
+              <w:t>Scrum Master</w:t>
+            </w:r>
           </w:p>
         </w:tc>
         <w:tc>
@@ -7936,19 +7826,11 @@
                 <w:lang w:val="en-US"/>
               </w:rPr>
             </w:pPr>
-            <w:proofErr w:type="spellStart"/>
             <w:r>
               <w:rPr>
                 <w:lang w:val="en-US"/>
               </w:rPr>
-              <w:t>Apoiar</w:t>
-            </w:r>
-            <w:proofErr w:type="spellEnd"/>
-            <w:r>
-              <w:rPr>
-                <w:lang w:val="en-US"/>
-              </w:rPr>
-              <w:t xml:space="preserve"> sprint planning e W</w:t>
+              <w:t>Apoiar sprint planning e W</w:t>
             </w:r>
             <w:r>
               <w:rPr>
@@ -7975,35 +7857,7 @@
               <w:rPr>
                 <w:lang w:val="en-US"/>
               </w:rPr>
-              <w:t xml:space="preserve">Remover </w:t>
-            </w:r>
-            <w:proofErr w:type="spellStart"/>
-            <w:r>
-              <w:rPr>
-                <w:lang w:val="en-US"/>
-              </w:rPr>
-              <w:t>impedimentos</w:t>
-            </w:r>
-            <w:proofErr w:type="spellEnd"/>
-            <w:r>
-              <w:rPr>
-                <w:lang w:val="en-US"/>
-              </w:rPr>
-              <w:t xml:space="preserve"> da </w:t>
-            </w:r>
-            <w:proofErr w:type="spellStart"/>
-            <w:r>
-              <w:rPr>
-                <w:lang w:val="en-US"/>
-              </w:rPr>
-              <w:t>equipa</w:t>
-            </w:r>
-            <w:proofErr w:type="spellEnd"/>
-            <w:r>
-              <w:rPr>
-                <w:lang w:val="en-US"/>
-              </w:rPr>
-              <w:t>.</w:t>
+              <w:t>Remover impedimentos da equipa.</w:t>
             </w:r>
           </w:p>
         </w:tc>
@@ -8015,13 +7869,8 @@
             <w:tcW w:w="2132" w:type="dxa"/>
           </w:tcPr>
           <w:p>
-            <w:proofErr w:type="spellStart"/>
-            <w:r>
-              <w:t>Development</w:t>
-            </w:r>
-            <w:proofErr w:type="spellEnd"/>
-            <w:r>
-              <w:t xml:space="preserve"> Team</w:t>
+            <w:r>
+              <w:t>Development Team</w:t>
             </w:r>
           </w:p>
         </w:tc>
@@ -8035,13 +7884,8 @@
               <w:cnfStyle w:val="000000000000" w:firstRow="0" w:lastRow="0" w:firstColumn="0" w:lastColumn="0" w:oddVBand="0" w:evenVBand="0" w:oddHBand="0" w:evenHBand="0" w:firstRowFirstColumn="0" w:firstRowLastColumn="0" w:lastRowFirstColumn="0" w:lastRowLastColumn="0"/>
             </w:pPr>
             <w:r>
-              <w:t xml:space="preserve">Kelly Ferreira, Bianca Maluf, João </w:t>
-            </w:r>
-            <w:proofErr w:type="spellStart"/>
-            <w:r>
-              <w:t>Moreiro</w:t>
-            </w:r>
-            <w:proofErr w:type="spellEnd"/>
+              <w:t>Kelly Ferreira, Bianca Maluf, João Moreiro</w:t>
+            </w:r>
           </w:p>
         </w:tc>
         <w:tc>
@@ -8134,14 +7978,9 @@
       </w:pPr>
       <w:bookmarkStart w:id="22" w:name="_Toc227748429"/>
       <w:r>
-        <w:t xml:space="preserve">User </w:t>
-      </w:r>
-      <w:proofErr w:type="spellStart"/>
-      <w:r>
-        <w:t>Stories</w:t>
+        <w:t>User Stories</w:t>
       </w:r>
       <w:bookmarkEnd w:id="22"/>
-      <w:proofErr w:type="spellEnd"/>
     </w:p>
     <w:p>
       <w:r>
@@ -8154,26 +7993,17 @@
         <w:rPr>
           <w:highlight w:val="yellow"/>
         </w:rPr>
-        <w:t xml:space="preserve">especificados os requisitos funcionais do ponto de vista do utilizador sob forma de User </w:t>
-      </w:r>
-      <w:proofErr w:type="spellStart"/>
+        <w:t>especificados os requisitos funcionais do ponto de vista do utilizador sob forma de User Stories</w:t>
+      </w:r>
+      <w:r>
+        <w:t xml:space="preserve"> </w:t>
+      </w:r>
       <w:r>
         <w:rPr>
           <w:highlight w:val="yellow"/>
         </w:rPr>
-        <w:t>Stories</w:t>
-      </w:r>
-      <w:proofErr w:type="spellEnd"/>
-      <w:r>
-        <w:t xml:space="preserve"> </w:t>
-      </w:r>
-      <w:r>
-        <w:rPr>
-          <w:highlight w:val="yellow"/>
-        </w:rPr>
         <w:t xml:space="preserve">As </w:t>
       </w:r>
-      <w:proofErr w:type="spellStart"/>
       <w:r>
         <w:rPr>
           <w:i/>
@@ -8182,80 +8012,23 @@
         </w:rPr>
         <w:t>issues</w:t>
       </w:r>
-      <w:proofErr w:type="spellEnd"/>
       <w:r>
         <w:rPr>
           <w:highlight w:val="yellow"/>
         </w:rPr>
-        <w:t xml:space="preserve"> devem ser estimadas em </w:t>
-      </w:r>
-      <w:proofErr w:type="spellStart"/>
+        <w:t xml:space="preserve"> devem ser estimadas em Story Points utilizando a sequência de Fibonacci: 1, 2, 3, 5, 8, 13, 20</w:t>
+      </w:r>
       <w:r>
         <w:rPr>
           <w:highlight w:val="yellow"/>
         </w:rPr>
-        <w:t>Story</w:t>
-      </w:r>
-      <w:proofErr w:type="spellEnd"/>
+        <w:t xml:space="preserve"> </w:t>
+      </w:r>
       <w:r>
         <w:rPr>
           <w:highlight w:val="yellow"/>
         </w:rPr>
-        <w:t xml:space="preserve"> </w:t>
-      </w:r>
-      <w:proofErr w:type="spellStart"/>
-      <w:r>
-        <w:rPr>
-          <w:highlight w:val="yellow"/>
-        </w:rPr>
-        <w:t>Points</w:t>
-      </w:r>
-      <w:proofErr w:type="spellEnd"/>
-      <w:r>
-        <w:rPr>
-          <w:highlight w:val="yellow"/>
-        </w:rPr>
-        <w:t xml:space="preserve"> utilizando a sequência de </w:t>
-      </w:r>
-      <w:proofErr w:type="spellStart"/>
-      <w:r>
-        <w:rPr>
-          <w:highlight w:val="yellow"/>
-        </w:rPr>
-        <w:t>Fibonacci</w:t>
-      </w:r>
-      <w:proofErr w:type="spellEnd"/>
-      <w:r>
-        <w:rPr>
-          <w:highlight w:val="yellow"/>
-        </w:rPr>
-        <w:t>: 1, 2, 3, 5, 8, 13, 20</w:t>
-      </w:r>
-      <w:r>
-        <w:rPr>
-          <w:highlight w:val="yellow"/>
-        </w:rPr>
-        <w:t xml:space="preserve"> </w:t>
-      </w:r>
-      <w:r>
-        <w:rPr>
-          <w:highlight w:val="yellow"/>
-        </w:rPr>
-        <w:t>(</w:t>
-      </w:r>
-      <w:proofErr w:type="spellStart"/>
-      <w:r>
-        <w:rPr>
-          <w:highlight w:val="yellow"/>
-        </w:rPr>
-        <w:t>máx</w:t>
-      </w:r>
-      <w:proofErr w:type="spellEnd"/>
-      <w:r>
-        <w:rPr>
-          <w:highlight w:val="yellow"/>
-        </w:rPr>
-        <w:t>).&gt;</w:t>
+        <w:t>(máx).&gt;</w:t>
       </w:r>
     </w:p>
     <w:p>
@@ -8352,21 +8125,7 @@
         <w:rPr>
           <w:highlight w:val="yellow"/>
         </w:rPr>
-        <w:t xml:space="preserve">Focar nestes 3 e evitar o Como (excluir aspetos de desenho, interface design </w:t>
-      </w:r>
-      <w:proofErr w:type="spellStart"/>
-      <w:r>
-        <w:rPr>
-          <w:highlight w:val="yellow"/>
-        </w:rPr>
-        <w:t>statements</w:t>
-      </w:r>
-      <w:proofErr w:type="spellEnd"/>
-      <w:r>
-        <w:rPr>
-          <w:highlight w:val="yellow"/>
-        </w:rPr>
-        <w:t>).</w:t>
+        <w:t>Focar nestes 3 e evitar o Como (excluir aspetos de desenho, interface design statements).</w:t>
       </w:r>
     </w:p>
     <w:p>
@@ -8412,35 +8171,7 @@
         <w:rPr>
           <w:highlight w:val="yellow"/>
         </w:rPr>
-        <w:t xml:space="preserve">].” – como é que o desejo imediato deles para fazer algo se integra na </w:t>
-      </w:r>
-      <w:proofErr w:type="spellStart"/>
-      <w:r>
-        <w:rPr>
-          <w:highlight w:val="yellow"/>
-        </w:rPr>
-        <w:t>big</w:t>
-      </w:r>
-      <w:proofErr w:type="spellEnd"/>
-      <w:r>
-        <w:rPr>
-          <w:highlight w:val="yellow"/>
-        </w:rPr>
-        <w:t xml:space="preserve"> </w:t>
-      </w:r>
-      <w:proofErr w:type="spellStart"/>
-      <w:r>
-        <w:rPr>
-          <w:highlight w:val="yellow"/>
-        </w:rPr>
-        <w:t>picture</w:t>
-      </w:r>
-      <w:proofErr w:type="spellEnd"/>
-      <w:r>
-        <w:rPr>
-          <w:highlight w:val="yellow"/>
-        </w:rPr>
-        <w:t>? Qual o objetivo geral que estão a tentar atingir? Qual o principal problema que precisa de ser resolvido?</w:t>
+        <w:t>].” – como é que o desejo imediato deles para fazer algo se integra na big picture? Qual o objetivo geral que estão a tentar atingir? Qual o principal problema que precisa de ser resolvido?</w:t>
       </w:r>
     </w:p>
     <w:p/>
@@ -8763,21 +8494,12 @@
                 <w:bCs w:val="0"/>
               </w:rPr>
             </w:pPr>
-            <w:proofErr w:type="spellStart"/>
-            <w:r>
-              <w:rPr>
-                <w:b w:val="0"/>
-                <w:bCs w:val="0"/>
-              </w:rPr>
-              <w:t>Username</w:t>
-            </w:r>
-            <w:proofErr w:type="spellEnd"/>
-            <w:r>
-              <w:rPr>
-                <w:b w:val="0"/>
-                <w:bCs w:val="0"/>
-              </w:rPr>
-              <w:t xml:space="preserve"> obrigatório;</w:t>
+            <w:r>
+              <w:rPr>
+                <w:b w:val="0"/>
+                <w:bCs w:val="0"/>
+              </w:rPr>
+              <w:t>Username obrigatório;</w:t>
             </w:r>
           </w:p>
           <w:p>
@@ -9493,35 +9215,7 @@
         <w:rPr>
           <w:highlight w:val="yellow"/>
         </w:rPr>
-        <w:t>&lt;</w:t>
-      </w:r>
-      <w:proofErr w:type="spellStart"/>
-      <w:r>
-        <w:rPr>
-          <w:highlight w:val="yellow"/>
-        </w:rPr>
-        <w:t>Product</w:t>
-      </w:r>
-      <w:proofErr w:type="spellEnd"/>
-      <w:r>
-        <w:rPr>
-          <w:highlight w:val="yellow"/>
-        </w:rPr>
-        <w:t xml:space="preserve"> </w:t>
-      </w:r>
-      <w:proofErr w:type="spellStart"/>
-      <w:r>
-        <w:rPr>
-          <w:highlight w:val="yellow"/>
-        </w:rPr>
-        <w:t>backlog</w:t>
-      </w:r>
-      <w:proofErr w:type="spellEnd"/>
-      <w:r>
-        <w:rPr>
-          <w:highlight w:val="yellow"/>
-        </w:rPr>
-        <w:t xml:space="preserve"> do projeto</w:t>
+        <w:t>&lt;Product backlog do projeto</w:t>
       </w:r>
       <w:r>
         <w:rPr>
@@ -9563,21 +9257,7 @@
         <w:rPr>
           <w:highlight w:val="yellow"/>
         </w:rPr>
-        <w:t xml:space="preserve">Sprint </w:t>
-      </w:r>
-      <w:proofErr w:type="spellStart"/>
-      <w:r>
-        <w:rPr>
-          <w:highlight w:val="yellow"/>
-        </w:rPr>
-        <w:t>Backlog</w:t>
-      </w:r>
-      <w:proofErr w:type="spellEnd"/>
-      <w:r>
-        <w:rPr>
-          <w:highlight w:val="yellow"/>
-        </w:rPr>
-        <w:t xml:space="preserve"> 1</w:t>
+        <w:t>Sprint Backlog 1</w:t>
       </w:r>
     </w:p>
     <w:p>
@@ -9595,21 +9275,7 @@
         <w:rPr>
           <w:highlight w:val="yellow"/>
         </w:rPr>
-        <w:t xml:space="preserve">Sprint </w:t>
-      </w:r>
-      <w:proofErr w:type="spellStart"/>
-      <w:r>
-        <w:rPr>
-          <w:highlight w:val="yellow"/>
-        </w:rPr>
-        <w:t>Backlog</w:t>
-      </w:r>
-      <w:proofErr w:type="spellEnd"/>
-      <w:r>
-        <w:rPr>
-          <w:highlight w:val="yellow"/>
-        </w:rPr>
-        <w:t xml:space="preserve"> 2</w:t>
+        <w:t>Sprint Backlog 2</w:t>
       </w:r>
     </w:p>
     <w:p>
@@ -9627,21 +9293,7 @@
         <w:rPr>
           <w:highlight w:val="yellow"/>
         </w:rPr>
-        <w:t xml:space="preserve">Sprint </w:t>
-      </w:r>
-      <w:proofErr w:type="spellStart"/>
-      <w:r>
-        <w:rPr>
-          <w:highlight w:val="yellow"/>
-        </w:rPr>
-        <w:t>Backlog</w:t>
-      </w:r>
-      <w:proofErr w:type="spellEnd"/>
-      <w:r>
-        <w:rPr>
-          <w:highlight w:val="yellow"/>
-        </w:rPr>
-        <w:t xml:space="preserve"> 3</w:t>
+        <w:t>Sprint Backlog 3</w:t>
       </w:r>
     </w:p>
     <w:p>
@@ -9659,21 +9311,7 @@
         <w:rPr>
           <w:highlight w:val="yellow"/>
         </w:rPr>
-        <w:t xml:space="preserve">Sprint </w:t>
-      </w:r>
-      <w:proofErr w:type="spellStart"/>
-      <w:r>
-        <w:rPr>
-          <w:highlight w:val="yellow"/>
-        </w:rPr>
-        <w:t>Backlog</w:t>
-      </w:r>
-      <w:proofErr w:type="spellEnd"/>
-      <w:r>
-        <w:rPr>
-          <w:highlight w:val="yellow"/>
-        </w:rPr>
-        <w:t xml:space="preserve"> 4</w:t>
+        <w:t>Sprint Backlog 4</w:t>
       </w:r>
     </w:p>
     <w:p>
@@ -9681,161 +9319,7 @@
         <w:rPr>
           <w:highlight w:val="yellow"/>
         </w:rPr>
-        <w:t xml:space="preserve">Cada item do </w:t>
-      </w:r>
-      <w:proofErr w:type="spellStart"/>
-      <w:r>
-        <w:rPr>
-          <w:highlight w:val="yellow"/>
-        </w:rPr>
-        <w:t>Product</w:t>
-      </w:r>
-      <w:proofErr w:type="spellEnd"/>
-      <w:r>
-        <w:rPr>
-          <w:highlight w:val="yellow"/>
-        </w:rPr>
-        <w:t xml:space="preserve"> </w:t>
-      </w:r>
-      <w:proofErr w:type="spellStart"/>
-      <w:r>
-        <w:rPr>
-          <w:highlight w:val="yellow"/>
-        </w:rPr>
-        <w:t>Backlog</w:t>
-      </w:r>
-      <w:proofErr w:type="spellEnd"/>
-      <w:r>
-        <w:rPr>
-          <w:highlight w:val="yellow"/>
-        </w:rPr>
-        <w:t xml:space="preserve"> deve corresponder a uma </w:t>
-      </w:r>
-      <w:proofErr w:type="spellStart"/>
-      <w:r>
-        <w:rPr>
-          <w:highlight w:val="yellow"/>
-        </w:rPr>
-        <w:t>Issue</w:t>
-      </w:r>
-      <w:proofErr w:type="spellEnd"/>
-      <w:r>
-        <w:rPr>
-          <w:highlight w:val="yellow"/>
-        </w:rPr>
-        <w:t xml:space="preserve"> (</w:t>
-      </w:r>
-      <w:proofErr w:type="spellStart"/>
-      <w:r>
-        <w:rPr>
-          <w:highlight w:val="yellow"/>
-        </w:rPr>
-        <w:t>Jira</w:t>
-      </w:r>
-      <w:proofErr w:type="spellEnd"/>
-      <w:r>
-        <w:rPr>
-          <w:highlight w:val="yellow"/>
-        </w:rPr>
-        <w:t xml:space="preserve">) do tipo </w:t>
-      </w:r>
-      <w:proofErr w:type="spellStart"/>
-      <w:r>
-        <w:rPr>
-          <w:highlight w:val="yellow"/>
-        </w:rPr>
-        <w:t>Task</w:t>
-      </w:r>
-      <w:proofErr w:type="spellEnd"/>
-      <w:r>
-        <w:rPr>
-          <w:highlight w:val="yellow"/>
-        </w:rPr>
-        <w:t xml:space="preserve">, </w:t>
-      </w:r>
-      <w:proofErr w:type="spellStart"/>
-      <w:r>
-        <w:rPr>
-          <w:highlight w:val="yellow"/>
-        </w:rPr>
-        <w:t>Story</w:t>
-      </w:r>
-      <w:proofErr w:type="spellEnd"/>
-      <w:r>
-        <w:rPr>
-          <w:highlight w:val="yellow"/>
-        </w:rPr>
-        <w:t xml:space="preserve"> ou Bug. User </w:t>
-      </w:r>
-      <w:proofErr w:type="spellStart"/>
-      <w:r>
-        <w:rPr>
-          <w:highlight w:val="yellow"/>
-        </w:rPr>
-        <w:t>Story</w:t>
-      </w:r>
-      <w:proofErr w:type="spellEnd"/>
-      <w:r>
-        <w:rPr>
-          <w:highlight w:val="yellow"/>
-        </w:rPr>
-        <w:t xml:space="preserve"> identificada pelo cliente. As </w:t>
-      </w:r>
-      <w:proofErr w:type="spellStart"/>
-      <w:r>
-        <w:rPr>
-          <w:highlight w:val="yellow"/>
-        </w:rPr>
-        <w:t>issues</w:t>
-      </w:r>
-      <w:proofErr w:type="spellEnd"/>
-      <w:r>
-        <w:rPr>
-          <w:highlight w:val="yellow"/>
-        </w:rPr>
-        <w:t xml:space="preserve"> devem ser estimadas em </w:t>
-      </w:r>
-      <w:proofErr w:type="spellStart"/>
-      <w:r>
-        <w:rPr>
-          <w:highlight w:val="yellow"/>
-        </w:rPr>
-        <w:t>Story</w:t>
-      </w:r>
-      <w:proofErr w:type="spellEnd"/>
-      <w:r>
-        <w:rPr>
-          <w:highlight w:val="yellow"/>
-        </w:rPr>
-        <w:t xml:space="preserve"> </w:t>
-      </w:r>
-      <w:proofErr w:type="spellStart"/>
-      <w:r>
-        <w:rPr>
-          <w:highlight w:val="yellow"/>
-        </w:rPr>
-        <w:t>Points</w:t>
-      </w:r>
-      <w:proofErr w:type="spellEnd"/>
-      <w:r>
-        <w:rPr>
-          <w:highlight w:val="yellow"/>
-        </w:rPr>
-        <w:t xml:space="preserve"> utilizando a sequência de </w:t>
-      </w:r>
-      <w:proofErr w:type="spellStart"/>
-      <w:r>
-        <w:rPr>
-          <w:highlight w:val="yellow"/>
-        </w:rPr>
-        <w:t>Fibonacci</w:t>
-      </w:r>
-      <w:proofErr w:type="spellEnd"/>
-      <w:r>
-        <w:rPr>
-          <w:highlight w:val="yellow"/>
-        </w:rPr>
-        <w:t>: 1, 2, 3, 5, 8, 13, 2</w:t>
+        <w:t>Cada item do Product Backlog deve corresponder a uma Issue (Jira) do tipo Task, Story ou Bug. User Story identificada pelo cliente. As issues devem ser estimadas em Story Points utilizando a sequência de Fibonacci: 1, 2, 3, 5, 8, 13, 2</w:t>
       </w:r>
       <w:r>
         <w:rPr>
@@ -9890,13 +9374,8 @@
     </w:p>
     <w:p>
       <w:r>
-        <w:t xml:space="preserve">De seguida encontram-se descritos os principais eventos </w:t>
-      </w:r>
-      <w:proofErr w:type="spellStart"/>
-      <w:r>
-        <w:t>Scrum</w:t>
-      </w:r>
-      <w:proofErr w:type="spellEnd"/>
+        <w:t>De seguida encontram-se descritos os principais eventos Scrum</w:t>
+      </w:r>
       <w:r>
         <w:t xml:space="preserve"> da Sprint </w:t>
       </w:r>
@@ -9912,13 +9391,8 @@
         <w:pStyle w:val="Ttulo4"/>
       </w:pPr>
       <w:r>
-        <w:t xml:space="preserve">Sprint </w:t>
-      </w:r>
-      <w:proofErr w:type="spellStart"/>
-      <w:r>
-        <w:t>Planning</w:t>
-      </w:r>
-      <w:proofErr w:type="spellEnd"/>
+        <w:t>Sprint Planning</w:t>
+      </w:r>
     </w:p>
     <w:p/>
     <w:tbl>
@@ -10029,17 +9503,8 @@
                 <w:i/>
                 <w:iCs/>
               </w:rPr>
-              <w:t xml:space="preserve">Sprint </w:t>
-            </w:r>
-            <w:proofErr w:type="spellStart"/>
-            <w:r>
-              <w:rPr>
-                <w:i/>
-                <w:iCs/>
-              </w:rPr>
-              <w:t>Backlog</w:t>
-            </w:r>
-            <w:proofErr w:type="spellEnd"/>
+              <w:t>Sprint Backlog</w:t>
+            </w:r>
             <w:r>
               <w:t xml:space="preserve">: </w:t>
             </w:r>
@@ -10049,25 +9514,7 @@
                 <w:bCs w:val="0"/>
                 <w:highlight w:val="yellow"/>
               </w:rPr>
-              <w:t xml:space="preserve">&lt;retirar do </w:t>
-            </w:r>
-            <w:proofErr w:type="spellStart"/>
-            <w:r>
-              <w:rPr>
-                <w:b w:val="0"/>
-                <w:bCs w:val="0"/>
-                <w:highlight w:val="yellow"/>
-              </w:rPr>
-              <w:t>jira</w:t>
-            </w:r>
-            <w:proofErr w:type="spellEnd"/>
-            <w:r>
-              <w:rPr>
-                <w:b w:val="0"/>
-                <w:bCs w:val="0"/>
-                <w:highlight w:val="yellow"/>
-              </w:rPr>
-              <w:t xml:space="preserve"> tal como na imagem:&gt;</w:t>
+              <w:t>&lt;retirar do jira tal como na imagem:&gt;</w:t>
             </w:r>
           </w:p>
           <w:p>
@@ -10121,13 +9568,8 @@
       <w:pPr>
         <w:pStyle w:val="Ttulo4"/>
       </w:pPr>
-      <w:proofErr w:type="spellStart"/>
-      <w:r>
-        <w:t>Daily</w:t>
-      </w:r>
-      <w:proofErr w:type="spellEnd"/>
-      <w:r>
-        <w:t xml:space="preserve"> Meetings</w:t>
+      <w:r>
+        <w:t>Daily Meetings</w:t>
       </w:r>
       <w:r>
         <w:t xml:space="preserve"> (1 por semana)</w:t>
@@ -10297,88 +9739,22 @@
                 <w:b w:val="0"/>
                 <w:bCs w:val="0"/>
               </w:rPr>
-              <w:t xml:space="preserve">Criar projeto </w:t>
-            </w:r>
-            <w:proofErr w:type="spellStart"/>
-            <w:r>
-              <w:rPr>
-                <w:b w:val="0"/>
-                <w:bCs w:val="0"/>
-              </w:rPr>
-              <w:t>Github</w:t>
-            </w:r>
-            <w:proofErr w:type="spellEnd"/>
-            <w:r>
-              <w:rPr>
-                <w:b w:val="0"/>
-                <w:bCs w:val="0"/>
-              </w:rPr>
-              <w:t xml:space="preserve">, Analisar Concorrencial </w:t>
-            </w:r>
-            <w:proofErr w:type="spellStart"/>
-            <w:r>
-              <w:rPr>
-                <w:b w:val="0"/>
-                <w:bCs w:val="0"/>
-              </w:rPr>
-              <w:t>Listonic</w:t>
-            </w:r>
-            <w:proofErr w:type="spellEnd"/>
-            <w:r>
-              <w:rPr>
-                <w:b w:val="0"/>
-                <w:bCs w:val="0"/>
-              </w:rPr>
-              <w:t xml:space="preserve">, </w:t>
-            </w:r>
-            <w:r>
-              <w:rPr>
-                <w:b w:val="0"/>
-                <w:bCs w:val="0"/>
-              </w:rPr>
-              <w:t xml:space="preserve">User </w:t>
-            </w:r>
-            <w:proofErr w:type="spellStart"/>
-            <w:r>
-              <w:rPr>
-                <w:b w:val="0"/>
-                <w:bCs w:val="0"/>
-              </w:rPr>
-              <w:t>Stories</w:t>
-            </w:r>
-            <w:proofErr w:type="spellEnd"/>
-            <w:r>
-              <w:rPr>
-                <w:b w:val="0"/>
-                <w:bCs w:val="0"/>
-              </w:rPr>
-              <w:t xml:space="preserve">, </w:t>
-            </w:r>
-            <w:proofErr w:type="spellStart"/>
-            <w:r>
-              <w:rPr>
-                <w:b w:val="0"/>
-                <w:bCs w:val="0"/>
-              </w:rPr>
-              <w:t>mockups</w:t>
-            </w:r>
-            <w:proofErr w:type="spellEnd"/>
-            <w:r>
-              <w:rPr>
-                <w:b w:val="0"/>
-                <w:bCs w:val="0"/>
-              </w:rPr>
-              <w:t xml:space="preserve">, </w:t>
-            </w:r>
-            <w:proofErr w:type="spellStart"/>
-            <w:r>
-              <w:rPr>
-                <w:b w:val="0"/>
-                <w:bCs w:val="0"/>
-              </w:rPr>
-              <w:t>wireframe</w:t>
-            </w:r>
-            <w:proofErr w:type="spellEnd"/>
+              <w:t xml:space="preserve">Criar projeto Github, Analisar Concorrencial Listonic, </w:t>
+            </w:r>
+            <w:r>
+              <w:rPr>
+                <w:b w:val="0"/>
+                <w:bCs w:val="0"/>
+              </w:rPr>
+              <w:t>User Stories</w:t>
+            </w:r>
+            <w:r>
+              <w:rPr>
+                <w:b w:val="0"/>
+                <w:bCs w:val="0"/>
+              </w:rPr>
+              <w:t>, mockups, wireframe</w:t>
+            </w:r>
             <w:r>
               <w:rPr>
                 <w:b w:val="0"/>
@@ -10771,71 +10147,7 @@
                 <w:b w:val="0"/>
                 <w:bCs w:val="0"/>
               </w:rPr>
-              <w:t xml:space="preserve">Criar projeto </w:t>
-            </w:r>
-            <w:proofErr w:type="spellStart"/>
-            <w:r>
-              <w:rPr>
-                <w:b w:val="0"/>
-                <w:bCs w:val="0"/>
-              </w:rPr>
-              <w:t>Github</w:t>
-            </w:r>
-            <w:proofErr w:type="spellEnd"/>
-            <w:r>
-              <w:rPr>
-                <w:b w:val="0"/>
-                <w:bCs w:val="0"/>
-              </w:rPr>
-              <w:t xml:space="preserve">, Analisar Concorrencial Listonic, </w:t>
-            </w:r>
-            <w:proofErr w:type="spellStart"/>
-            <w:r>
-              <w:rPr>
-                <w:b w:val="0"/>
-                <w:bCs w:val="0"/>
-              </w:rPr>
-              <w:t>User Stories</w:t>
-            </w:r>
-            <w:proofErr w:type="spellEnd"/>
-            <w:r>
-              <w:rPr>
-                <w:b w:val="0"/>
-                <w:bCs w:val="0"/>
-              </w:rPr>
-              <w:t xml:space="preserve">, </w:t>
-            </w:r>
-            <w:proofErr w:type="spellStart"/>
-            <w:r>
-              <w:rPr>
-                <w:b w:val="0"/>
-                <w:bCs w:val="0"/>
-              </w:rPr>
-              <w:t>mockups</w:t>
-            </w:r>
-            <w:proofErr w:type="spellEnd"/>
-            <w:r>
-              <w:rPr>
-                <w:b w:val="0"/>
-                <w:bCs w:val="0"/>
-              </w:rPr>
-              <w:t xml:space="preserve">, </w:t>
-            </w:r>
-            <w:proofErr w:type="spellStart"/>
-            <w:r>
-              <w:rPr>
-                <w:b w:val="0"/>
-                <w:bCs w:val="0"/>
-              </w:rPr>
-              <w:t>wireframe</w:t>
-            </w:r>
-            <w:proofErr w:type="spellEnd"/>
-            <w:r>
-              <w:rPr>
-                <w:b w:val="0"/>
-                <w:bCs w:val="0"/>
-              </w:rPr>
-              <w:t>. Aplicação SCRUM.</w:t>
+              <w:t>Criar projeto Github, Analisar Concorrencial Listonic, User Stories, mockups, wireframe. Aplicação SCRUM.</w:t>
             </w:r>
           </w:p>
           <w:p>
@@ -10860,7 +10172,6 @@
               </w:rPr>
               <w:t>O que vai fazer esta semana</w:t>
             </w:r>
-            <w:proofErr w:type="gramStart"/>
             <w:r>
               <w:rPr>
                 <w:b w:val="0"/>
@@ -10875,52 +10186,12 @@
               </w:rPr>
               <w:t>:</w:t>
             </w:r>
-            <w:proofErr w:type="gramEnd"/>
-            <w:r>
-              <w:rPr>
-                <w:b w:val="0"/>
-                <w:bCs w:val="0"/>
-              </w:rPr>
-              <w:t xml:space="preserve"> </w:t>
-            </w:r>
-            <w:proofErr w:type="spellStart"/>
-            <w:r>
-              <w:rPr>
-                <w:b w:val="0"/>
-                <w:bCs w:val="0"/>
-              </w:rPr>
-              <w:t>Mockups</w:t>
-            </w:r>
-            <w:proofErr w:type="spellEnd"/>
-            <w:r>
-              <w:rPr>
-                <w:b w:val="0"/>
-                <w:bCs w:val="0"/>
-              </w:rPr>
-              <w:t>,</w:t>
-            </w:r>
-            <w:r>
-              <w:rPr>
-                <w:b w:val="0"/>
-                <w:bCs w:val="0"/>
-              </w:rPr>
-              <w:t xml:space="preserve"> desenvolvimento de User </w:t>
-            </w:r>
-            <w:proofErr w:type="spellStart"/>
-            <w:r>
-              <w:rPr>
-                <w:b w:val="0"/>
-                <w:bCs w:val="0"/>
-              </w:rPr>
-              <w:t>Story</w:t>
-            </w:r>
-            <w:proofErr w:type="spellEnd"/>
-            <w:r>
-              <w:rPr>
-                <w:b w:val="0"/>
-                <w:bCs w:val="0"/>
-              </w:rPr>
-              <w:t xml:space="preserve"> 1.</w:t>
+            <w:r>
+              <w:rPr>
+                <w:b w:val="0"/>
+                <w:bCs w:val="0"/>
+              </w:rPr>
+              <w:t xml:space="preserve"> Mockups, desenvolvimento de User Story 1.</w:t>
             </w:r>
           </w:p>
           <w:p>
@@ -10957,30 +10228,7 @@
                 <w:b w:val="0"/>
                 <w:bCs w:val="0"/>
               </w:rPr>
-              <w:t xml:space="preserve"> D</w:t>
-            </w:r>
-            <w:r>
-              <w:rPr>
-                <w:b w:val="0"/>
-                <w:bCs w:val="0"/>
-              </w:rPr>
-              <w:t xml:space="preserve">esenvolvimento de User </w:t>
-            </w:r>
-            <w:proofErr w:type="spellStart"/>
-            <w:r>
-              <w:rPr>
-                <w:b w:val="0"/>
-                <w:bCs w:val="0"/>
-              </w:rPr>
-              <w:t>Story</w:t>
-            </w:r>
-            <w:proofErr w:type="spellEnd"/>
-            <w:r>
-              <w:rPr>
-                <w:b w:val="0"/>
-                <w:bCs w:val="0"/>
-              </w:rPr>
-              <w:t xml:space="preserve"> 1.</w:t>
+              <w:t xml:space="preserve"> Desenvolvimento de User Story 1.</w:t>
             </w:r>
           </w:p>
           <w:p>
@@ -11203,13 +10451,8 @@
         <w:pStyle w:val="Ttulo4"/>
       </w:pPr>
       <w:r>
-        <w:t xml:space="preserve">Sprint </w:t>
-      </w:r>
-      <w:proofErr w:type="spellStart"/>
-      <w:r>
-        <w:t>Retrospective</w:t>
-      </w:r>
-      <w:proofErr w:type="spellEnd"/>
+        <w:t>Sprint Retrospective</w:t>
+      </w:r>
     </w:p>
     <w:p/>
     <w:tbl>
@@ -11341,7 +10584,6 @@
               </w:rPr>
               <w:t xml:space="preserve">, tirar conclusões acerca de 1 dos gráficos de </w:t>
             </w:r>
-            <w:proofErr w:type="spellStart"/>
             <w:r>
               <w:rPr>
                 <w:b w:val="0"/>
@@ -11350,9 +10592,16 @@
                 <w:iCs/>
                 <w:highlight w:val="yellow"/>
               </w:rPr>
-              <w:t>burn</w:t>
-            </w:r>
-            <w:proofErr w:type="spellEnd"/>
+              <w:t>burn down</w:t>
+            </w:r>
+            <w:r>
+              <w:rPr>
+                <w:b w:val="0"/>
+                <w:bCs w:val="0"/>
+                <w:highlight w:val="yellow"/>
+              </w:rPr>
+              <w:t xml:space="preserve"> ou </w:t>
+            </w:r>
             <w:r>
               <w:rPr>
                 <w:b w:val="0"/>
@@ -11361,62 +10610,8 @@
                 <w:iCs/>
                 <w:highlight w:val="yellow"/>
               </w:rPr>
-              <w:t xml:space="preserve"> </w:t>
-            </w:r>
-            <w:proofErr w:type="spellStart"/>
-            <w:r>
-              <w:rPr>
-                <w:b w:val="0"/>
-                <w:bCs w:val="0"/>
-                <w:i/>
-                <w:iCs/>
-                <w:highlight w:val="yellow"/>
-              </w:rPr>
-              <w:t>down</w:t>
-            </w:r>
-            <w:proofErr w:type="spellEnd"/>
-            <w:r>
-              <w:rPr>
-                <w:b w:val="0"/>
-                <w:bCs w:val="0"/>
-                <w:highlight w:val="yellow"/>
-              </w:rPr>
-              <w:t xml:space="preserve"> ou </w:t>
-            </w:r>
-            <w:proofErr w:type="spellStart"/>
-            <w:r>
-              <w:rPr>
-                <w:b w:val="0"/>
-                <w:bCs w:val="0"/>
-                <w:i/>
-                <w:iCs/>
-                <w:highlight w:val="yellow"/>
-              </w:rPr>
-              <w:t>burn</w:t>
-            </w:r>
-            <w:proofErr w:type="spellEnd"/>
-            <w:r>
-              <w:rPr>
-                <w:b w:val="0"/>
-                <w:bCs w:val="0"/>
-                <w:i/>
-                <w:iCs/>
-                <w:highlight w:val="yellow"/>
-              </w:rPr>
-              <w:t xml:space="preserve"> </w:t>
-            </w:r>
-            <w:proofErr w:type="spellStart"/>
-            <w:r>
-              <w:rPr>
-                <w:b w:val="0"/>
-                <w:bCs w:val="0"/>
-                <w:i/>
-                <w:iCs/>
-                <w:highlight w:val="yellow"/>
-              </w:rPr>
-              <w:t>up</w:t>
-            </w:r>
-            <w:proofErr w:type="spellEnd"/>
+              <w:t>burn up</w:t>
+            </w:r>
             <w:r>
               <w:rPr>
                 <w:b w:val="0"/>
@@ -11501,25 +10696,7 @@
                 <w:bCs w:val="0"/>
                 <w:highlight w:val="yellow"/>
               </w:rPr>
-              <w:t xml:space="preserve">retirar do </w:t>
-            </w:r>
-            <w:proofErr w:type="spellStart"/>
-            <w:r>
-              <w:rPr>
-                <w:b w:val="0"/>
-                <w:bCs w:val="0"/>
-                <w:highlight w:val="yellow"/>
-              </w:rPr>
-              <w:t>jira</w:t>
-            </w:r>
-            <w:proofErr w:type="spellEnd"/>
-            <w:r>
-              <w:rPr>
-                <w:b w:val="0"/>
-                <w:bCs w:val="0"/>
-                <w:highlight w:val="yellow"/>
-              </w:rPr>
-              <w:t xml:space="preserve"> </w:t>
+              <w:t xml:space="preserve">retirar do jira </w:t>
             </w:r>
             <w:r>
               <w:rPr>
@@ -11626,13 +10803,8 @@
     </w:p>
     <w:p>
       <w:r>
-        <w:t xml:space="preserve">De seguida encontram-se descritos os principais eventos </w:t>
-      </w:r>
-      <w:proofErr w:type="spellStart"/>
-      <w:r>
-        <w:t>Scrum</w:t>
-      </w:r>
-      <w:proofErr w:type="spellEnd"/>
+        <w:t>De seguida encontram-se descritos os principais eventos Scrum</w:t>
+      </w:r>
       <w:r>
         <w:t xml:space="preserve"> da Sprint 4</w:t>
       </w:r>
@@ -11645,13 +10817,8 @@
         <w:pStyle w:val="Ttulo4"/>
       </w:pPr>
       <w:r>
-        <w:t xml:space="preserve">Sprint </w:t>
-      </w:r>
-      <w:proofErr w:type="spellStart"/>
-      <w:r>
-        <w:t>Planning</w:t>
-      </w:r>
-      <w:proofErr w:type="spellEnd"/>
+        <w:t>Sprint Planning</w:t>
+      </w:r>
     </w:p>
     <w:p/>
     <w:tbl>
@@ -11768,17 +10935,8 @@
                 <w:i/>
                 <w:iCs/>
               </w:rPr>
-              <w:t xml:space="preserve">Sprint </w:t>
-            </w:r>
-            <w:proofErr w:type="spellStart"/>
-            <w:r>
-              <w:rPr>
-                <w:i/>
-                <w:iCs/>
-              </w:rPr>
-              <w:t>Backlog</w:t>
-            </w:r>
-            <w:proofErr w:type="spellEnd"/>
+              <w:t>Sprint Backlog</w:t>
+            </w:r>
             <w:r>
               <w:t xml:space="preserve">: </w:t>
             </w:r>
@@ -11788,25 +10946,7 @@
                 <w:bCs w:val="0"/>
                 <w:highlight w:val="yellow"/>
               </w:rPr>
-              <w:t xml:space="preserve">&lt;retirar do </w:t>
-            </w:r>
-            <w:proofErr w:type="spellStart"/>
-            <w:r>
-              <w:rPr>
-                <w:b w:val="0"/>
-                <w:bCs w:val="0"/>
-                <w:highlight w:val="yellow"/>
-              </w:rPr>
-              <w:t>jira</w:t>
-            </w:r>
-            <w:proofErr w:type="spellEnd"/>
-            <w:r>
-              <w:rPr>
-                <w:b w:val="0"/>
-                <w:bCs w:val="0"/>
-                <w:highlight w:val="yellow"/>
-              </w:rPr>
-              <w:t xml:space="preserve"> a imagem</w:t>
+              <w:t>&lt;retirar do jira a imagem</w:t>
             </w:r>
             <w:r>
               <w:rPr>
@@ -11834,13 +10974,8 @@
       <w:pPr>
         <w:pStyle w:val="Ttulo4"/>
       </w:pPr>
-      <w:proofErr w:type="spellStart"/>
-      <w:r>
-        <w:t>Daily</w:t>
-      </w:r>
-      <w:proofErr w:type="spellEnd"/>
-      <w:r>
-        <w:t xml:space="preserve"> Meetings</w:t>
+      <w:r>
+        <w:t>Daily Meetings</w:t>
       </w:r>
       <w:r>
         <w:t xml:space="preserve"> (1 por semana)</w:t>
@@ -12694,13 +11829,8 @@
         <w:pStyle w:val="Ttulo4"/>
       </w:pPr>
       <w:r>
-        <w:t xml:space="preserve">Sprint </w:t>
-      </w:r>
-      <w:proofErr w:type="spellStart"/>
-      <w:r>
-        <w:t>Retrospective</w:t>
-      </w:r>
-      <w:proofErr w:type="spellEnd"/>
+        <w:t>Sprint Retrospective</w:t>
+      </w:r>
     </w:p>
     <w:p/>
     <w:tbl>
@@ -12833,7 +11963,6 @@
               </w:rPr>
               <w:t xml:space="preserve">, tirar conclusões acerca de 1 dos gráficos de </w:t>
             </w:r>
-            <w:proofErr w:type="spellStart"/>
             <w:r>
               <w:rPr>
                 <w:b w:val="0"/>
@@ -12842,9 +11971,16 @@
                 <w:iCs/>
                 <w:highlight w:val="yellow"/>
               </w:rPr>
-              <w:t>burn</w:t>
-            </w:r>
-            <w:proofErr w:type="spellEnd"/>
+              <w:t>burn down</w:t>
+            </w:r>
+            <w:r>
+              <w:rPr>
+                <w:b w:val="0"/>
+                <w:bCs w:val="0"/>
+                <w:highlight w:val="yellow"/>
+              </w:rPr>
+              <w:t xml:space="preserve"> ou </w:t>
+            </w:r>
             <w:r>
               <w:rPr>
                 <w:b w:val="0"/>
@@ -12853,62 +11989,8 @@
                 <w:iCs/>
                 <w:highlight w:val="yellow"/>
               </w:rPr>
-              <w:t xml:space="preserve"> </w:t>
-            </w:r>
-            <w:proofErr w:type="spellStart"/>
-            <w:r>
-              <w:rPr>
-                <w:b w:val="0"/>
-                <w:bCs w:val="0"/>
-                <w:i/>
-                <w:iCs/>
-                <w:highlight w:val="yellow"/>
-              </w:rPr>
-              <w:t>down</w:t>
-            </w:r>
-            <w:proofErr w:type="spellEnd"/>
-            <w:r>
-              <w:rPr>
-                <w:b w:val="0"/>
-                <w:bCs w:val="0"/>
-                <w:highlight w:val="yellow"/>
-              </w:rPr>
-              <w:t xml:space="preserve"> ou </w:t>
-            </w:r>
-            <w:proofErr w:type="spellStart"/>
-            <w:r>
-              <w:rPr>
-                <w:b w:val="0"/>
-                <w:bCs w:val="0"/>
-                <w:i/>
-                <w:iCs/>
-                <w:highlight w:val="yellow"/>
-              </w:rPr>
-              <w:t>burn</w:t>
-            </w:r>
-            <w:proofErr w:type="spellEnd"/>
-            <w:r>
-              <w:rPr>
-                <w:b w:val="0"/>
-                <w:bCs w:val="0"/>
-                <w:i/>
-                <w:iCs/>
-                <w:highlight w:val="yellow"/>
-              </w:rPr>
-              <w:t xml:space="preserve"> </w:t>
-            </w:r>
-            <w:proofErr w:type="spellStart"/>
-            <w:r>
-              <w:rPr>
-                <w:b w:val="0"/>
-                <w:bCs w:val="0"/>
-                <w:i/>
-                <w:iCs/>
-                <w:highlight w:val="yellow"/>
-              </w:rPr>
-              <w:t>up</w:t>
-            </w:r>
-            <w:proofErr w:type="spellEnd"/>
+              <w:t>burn up</w:t>
+            </w:r>
             <w:r>
               <w:rPr>
                 <w:b w:val="0"/>
@@ -12993,25 +12075,7 @@
                 <w:bCs w:val="0"/>
                 <w:highlight w:val="yellow"/>
               </w:rPr>
-              <w:t xml:space="preserve">retirar do </w:t>
-            </w:r>
-            <w:proofErr w:type="spellStart"/>
-            <w:r>
-              <w:rPr>
-                <w:b w:val="0"/>
-                <w:bCs w:val="0"/>
-                <w:highlight w:val="yellow"/>
-              </w:rPr>
-              <w:t>jira</w:t>
-            </w:r>
-            <w:proofErr w:type="spellEnd"/>
-            <w:r>
-              <w:rPr>
-                <w:b w:val="0"/>
-                <w:bCs w:val="0"/>
-                <w:highlight w:val="yellow"/>
-              </w:rPr>
-              <w:t xml:space="preserve"> </w:t>
+              <w:t xml:space="preserve">retirar do jira </w:t>
             </w:r>
             <w:r>
               <w:rPr>
@@ -13091,13 +12155,8 @@
     </w:p>
     <w:p>
       <w:r>
-        <w:t xml:space="preserve">De seguida encontram-se descritos os principais eventos </w:t>
-      </w:r>
-      <w:proofErr w:type="spellStart"/>
-      <w:r>
-        <w:t>Scrum</w:t>
-      </w:r>
-      <w:proofErr w:type="spellEnd"/>
+        <w:t>De seguida encontram-se descritos os principais eventos Scrum</w:t>
+      </w:r>
       <w:r>
         <w:t xml:space="preserve"> da Sprint 3</w:t>
       </w:r>
@@ -13110,13 +12169,8 @@
         <w:pStyle w:val="Ttulo4"/>
       </w:pPr>
       <w:r>
-        <w:t xml:space="preserve">Sprint </w:t>
-      </w:r>
-      <w:proofErr w:type="spellStart"/>
-      <w:r>
-        <w:t>Planning</w:t>
-      </w:r>
-      <w:proofErr w:type="spellEnd"/>
+        <w:t>Sprint Planning</w:t>
+      </w:r>
     </w:p>
     <w:p/>
     <w:tbl>
@@ -13227,17 +12281,8 @@
                 <w:i/>
                 <w:iCs/>
               </w:rPr>
-              <w:t xml:space="preserve">Sprint </w:t>
-            </w:r>
-            <w:proofErr w:type="spellStart"/>
-            <w:r>
-              <w:rPr>
-                <w:i/>
-                <w:iCs/>
-              </w:rPr>
-              <w:t>Backlog</w:t>
-            </w:r>
-            <w:proofErr w:type="spellEnd"/>
+              <w:t>Sprint Backlog</w:t>
+            </w:r>
             <w:r>
               <w:t xml:space="preserve">: </w:t>
             </w:r>
@@ -13247,25 +12292,7 @@
                 <w:bCs w:val="0"/>
                 <w:highlight w:val="yellow"/>
               </w:rPr>
-              <w:t xml:space="preserve">&lt;retirar do </w:t>
-            </w:r>
-            <w:proofErr w:type="spellStart"/>
-            <w:r>
-              <w:rPr>
-                <w:b w:val="0"/>
-                <w:bCs w:val="0"/>
-                <w:highlight w:val="yellow"/>
-              </w:rPr>
-              <w:t>jira</w:t>
-            </w:r>
-            <w:proofErr w:type="spellEnd"/>
-            <w:r>
-              <w:rPr>
-                <w:b w:val="0"/>
-                <w:bCs w:val="0"/>
-                <w:highlight w:val="yellow"/>
-              </w:rPr>
-              <w:t xml:space="preserve"> a imagem</w:t>
+              <w:t>&lt;retirar do jira a imagem</w:t>
             </w:r>
             <w:r>
               <w:rPr>
@@ -13293,13 +12320,8 @@
       <w:pPr>
         <w:pStyle w:val="Ttulo4"/>
       </w:pPr>
-      <w:proofErr w:type="spellStart"/>
-      <w:r>
-        <w:t>Daily</w:t>
-      </w:r>
-      <w:proofErr w:type="spellEnd"/>
-      <w:r>
-        <w:t xml:space="preserve"> Meetings</w:t>
+      <w:r>
+        <w:t>Daily Meetings</w:t>
       </w:r>
       <w:r>
         <w:t xml:space="preserve"> (1 por semana)</w:t>
@@ -14154,13 +13176,8 @@
         <w:pStyle w:val="Ttulo4"/>
       </w:pPr>
       <w:r>
-        <w:t xml:space="preserve">Sprint </w:t>
-      </w:r>
-      <w:proofErr w:type="spellStart"/>
-      <w:r>
-        <w:t>Retrospective</w:t>
-      </w:r>
-      <w:proofErr w:type="spellEnd"/>
+        <w:t>Sprint Retrospective</w:t>
+      </w:r>
     </w:p>
     <w:p/>
     <w:tbl>
@@ -14292,7 +13309,6 @@
               </w:rPr>
               <w:t xml:space="preserve">, tirar conclusões acerca de 1 dos gráficos de </w:t>
             </w:r>
-            <w:proofErr w:type="spellStart"/>
             <w:r>
               <w:rPr>
                 <w:b w:val="0"/>
@@ -14301,9 +13317,16 @@
                 <w:iCs/>
                 <w:highlight w:val="yellow"/>
               </w:rPr>
-              <w:t>burn</w:t>
-            </w:r>
-            <w:proofErr w:type="spellEnd"/>
+              <w:t>burn down</w:t>
+            </w:r>
+            <w:r>
+              <w:rPr>
+                <w:b w:val="0"/>
+                <w:bCs w:val="0"/>
+                <w:highlight w:val="yellow"/>
+              </w:rPr>
+              <w:t xml:space="preserve"> ou </w:t>
+            </w:r>
             <w:r>
               <w:rPr>
                 <w:b w:val="0"/>
@@ -14312,62 +13335,8 @@
                 <w:iCs/>
                 <w:highlight w:val="yellow"/>
               </w:rPr>
-              <w:t xml:space="preserve"> </w:t>
-            </w:r>
-            <w:proofErr w:type="spellStart"/>
-            <w:r>
-              <w:rPr>
-                <w:b w:val="0"/>
-                <w:bCs w:val="0"/>
-                <w:i/>
-                <w:iCs/>
-                <w:highlight w:val="yellow"/>
-              </w:rPr>
-              <w:t>down</w:t>
-            </w:r>
-            <w:proofErr w:type="spellEnd"/>
-            <w:r>
-              <w:rPr>
-                <w:b w:val="0"/>
-                <w:bCs w:val="0"/>
-                <w:highlight w:val="yellow"/>
-              </w:rPr>
-              <w:t xml:space="preserve"> ou </w:t>
-            </w:r>
-            <w:proofErr w:type="spellStart"/>
-            <w:r>
-              <w:rPr>
-                <w:b w:val="0"/>
-                <w:bCs w:val="0"/>
-                <w:i/>
-                <w:iCs/>
-                <w:highlight w:val="yellow"/>
-              </w:rPr>
-              <w:t>burn</w:t>
-            </w:r>
-            <w:proofErr w:type="spellEnd"/>
-            <w:r>
-              <w:rPr>
-                <w:b w:val="0"/>
-                <w:bCs w:val="0"/>
-                <w:i/>
-                <w:iCs/>
-                <w:highlight w:val="yellow"/>
-              </w:rPr>
-              <w:t xml:space="preserve"> </w:t>
-            </w:r>
-            <w:proofErr w:type="spellStart"/>
-            <w:r>
-              <w:rPr>
-                <w:b w:val="0"/>
-                <w:bCs w:val="0"/>
-                <w:i/>
-                <w:iCs/>
-                <w:highlight w:val="yellow"/>
-              </w:rPr>
-              <w:t>up</w:t>
-            </w:r>
-            <w:proofErr w:type="spellEnd"/>
+              <w:t>burn up</w:t>
+            </w:r>
             <w:r>
               <w:rPr>
                 <w:b w:val="0"/>
@@ -14452,25 +13421,7 @@
                 <w:bCs w:val="0"/>
                 <w:highlight w:val="yellow"/>
               </w:rPr>
-              <w:t xml:space="preserve">retirar do </w:t>
-            </w:r>
-            <w:proofErr w:type="spellStart"/>
-            <w:r>
-              <w:rPr>
-                <w:b w:val="0"/>
-                <w:bCs w:val="0"/>
-                <w:highlight w:val="yellow"/>
-              </w:rPr>
-              <w:t>jira</w:t>
-            </w:r>
-            <w:proofErr w:type="spellEnd"/>
-            <w:r>
-              <w:rPr>
-                <w:b w:val="0"/>
-                <w:bCs w:val="0"/>
-                <w:highlight w:val="yellow"/>
-              </w:rPr>
-              <w:t xml:space="preserve"> </w:t>
+              <w:t xml:space="preserve">retirar do jira </w:t>
             </w:r>
             <w:r>
               <w:rPr>
@@ -14517,31 +13468,13 @@
         <w:pStyle w:val="Ttulo2"/>
       </w:pPr>
       <w:bookmarkStart w:id="27" w:name="_Toc227748434"/>
-      <w:proofErr w:type="spellStart"/>
       <w:r>
         <w:rPr>
           <w:i/>
           <w:iCs/>
         </w:rPr>
-        <w:t>Retrospective</w:t>
-      </w:r>
-      <w:proofErr w:type="spellEnd"/>
-      <w:r>
-        <w:rPr>
-          <w:i/>
-          <w:iCs/>
-        </w:rPr>
-        <w:t xml:space="preserve"> </w:t>
-      </w:r>
-      <w:proofErr w:type="spellStart"/>
-      <w:r>
-        <w:rPr>
-          <w:i/>
-          <w:iCs/>
-        </w:rPr>
-        <w:t>Summary</w:t>
-      </w:r>
-      <w:proofErr w:type="spellEnd"/>
+        <w:t>Retrospective Summary</w:t>
+      </w:r>
       <w:r>
         <w:t xml:space="preserve"> do Projeto</w:t>
       </w:r>
@@ -14636,47 +13569,13 @@
             <w:gridSpan w:val="2"/>
           </w:tcPr>
           <w:p>
-            <w:proofErr w:type="spellStart"/>
             <w:r>
               <w:rPr>
                 <w:i/>
                 <w:iCs/>
               </w:rPr>
-              <w:t>Things</w:t>
-            </w:r>
-            <w:proofErr w:type="spellEnd"/>
-            <w:r>
-              <w:rPr>
-                <w:i/>
-                <w:iCs/>
-              </w:rPr>
-              <w:t xml:space="preserve"> that </w:t>
-            </w:r>
-            <w:proofErr w:type="spellStart"/>
-            <w:r>
-              <w:rPr>
-                <w:i/>
-                <w:iCs/>
-              </w:rPr>
-              <w:t>went</w:t>
-            </w:r>
-            <w:proofErr w:type="spellEnd"/>
-            <w:r>
-              <w:rPr>
-                <w:i/>
-                <w:iCs/>
-              </w:rPr>
-              <w:t xml:space="preserve"> </w:t>
-            </w:r>
-            <w:proofErr w:type="spellStart"/>
-            <w:r>
-              <w:rPr>
-                <w:i/>
-                <w:iCs/>
-              </w:rPr>
-              <w:t>well</w:t>
-            </w:r>
-            <w:proofErr w:type="spellEnd"/>
+              <w:t>Things that went well</w:t>
+            </w:r>
           </w:p>
         </w:tc>
       </w:tr>
@@ -14953,21 +13852,12 @@
             <w:gridSpan w:val="2"/>
           </w:tcPr>
           <w:p>
-            <w:proofErr w:type="spellStart"/>
             <w:r>
               <w:rPr>
                 <w:i/>
                 <w:iCs/>
               </w:rPr>
-              <w:t>Lessons</w:t>
-            </w:r>
-            <w:proofErr w:type="spellEnd"/>
-            <w:r>
-              <w:rPr>
-                <w:i/>
-                <w:iCs/>
-              </w:rPr>
-              <w:t xml:space="preserve"> learned</w:t>
+              <w:t>Lessons learned</w:t>
             </w:r>
           </w:p>
         </w:tc>
@@ -15404,34 +14294,14 @@
         </w:rPr>
         <w:t xml:space="preserve">Acrescentar conclusões gerais e que não se enquadrem no </w:t>
       </w:r>
-      <w:proofErr w:type="spellStart"/>
       <w:r>
         <w:rPr>
           <w:i/>
           <w:iCs/>
           <w:highlight w:val="yellow"/>
         </w:rPr>
-        <w:t>retrospective</w:t>
-      </w:r>
-      <w:proofErr w:type="spellEnd"/>
-      <w:r>
-        <w:rPr>
-          <w:i/>
-          <w:iCs/>
-          <w:highlight w:val="yellow"/>
-        </w:rPr>
-        <w:t xml:space="preserve"> </w:t>
-      </w:r>
-      <w:proofErr w:type="spellStart"/>
-      <w:r>
-        <w:rPr>
-          <w:i/>
-          <w:iCs/>
-          <w:highlight w:val="yellow"/>
-        </w:rPr>
-        <w:t>summary</w:t>
-      </w:r>
-      <w:proofErr w:type="spellEnd"/>
+        <w:t>retrospective summary</w:t>
+      </w:r>
       <w:r>
         <w:rPr>
           <w:highlight w:val="yellow"/>
@@ -15584,7 +14454,7 @@
 </file>
 
 <file path=word/endnotes.xml><?xml version="1.0" encoding="utf-8"?>
-<w:endnotes xmlns:wpc="http://schemas.microsoft.com/office/word/2010/wordprocessingCanvas" xmlns:cx="http://schemas.microsoft.com/office/drawing/2014/chartex" xmlns:cx1="http://schemas.microsoft.com/office/drawing/2015/9/8/chartex" xmlns:cx2="http://schemas.microsoft.com/office/drawing/2015/10/21/chartex" xmlns:cx3="http://schemas.microsoft.com/office/drawing/2016/5/9/chartex" xmlns:cx4="http://schemas.microsoft.com/office/drawing/2016/5/10/chartex" xmlns:cx5="http://schemas.microsoft.com/office/drawing/2016/5/11/chartex" xmlns:cx6="http://schemas.microsoft.com/office/drawing/2016/5/12/chartex" xmlns:cx7="http://schemas.microsoft.com/office/drawing/2016/5/13/chartex" xmlns:cx8="http://schemas.microsoft.com/office/drawing/2016/5/14/chartex" xmlns:mc="http://schemas.openxmlformats.org/markup-compatibility/2006" xmlns:aink="http://schemas.microsoft.com/office/drawing/2016/ink" xmlns:am3d="http://schemas.microsoft.com/office/drawing/2017/model3d" xmlns:o="urn:schemas-microsoft-com:office:office" xmlns:oel="http://schemas.microsoft.com/office/2019/extlst" xmlns:r="http://schemas.openxmlformats.org/officeDocument/2006/relationships" xmlns:m="http://schemas.openxmlformats.org/officeDocument/2006/math" xmlns:v="urn:schemas-microsoft-com:vml" xmlns:wp14="http://schemas.microsoft.com/office/word/2010/wordprocessingDrawing" xmlns:wp="http://schemas.openxmlformats.org/drawingml/2006/wordprocessingDrawing" xmlns:w10="urn:schemas-microsoft-com:office:word" xmlns:w="http://schemas.openxmlformats.org/wordprocessingml/2006/main" xmlns:w14="http://schemas.microsoft.com/office/word/2010/wordml" xmlns:w15="http://schemas.microsoft.com/office/word/2012/wordml" xmlns:w16cex="http://schemas.microsoft.com/office/word/2018/wordml/cex" xmlns:w16cid="http://schemas.microsoft.com/office/word/2016/wordml/cid" xmlns:w16="http://schemas.microsoft.com/office/word/2018/wordml" xmlns:w16du="http://schemas.microsoft.com/office/word/2023/wordml/word16du" xmlns:w16sdtdh="http://schemas.microsoft.com/office/word/2020/wordml/sdtdatahash" xmlns:w16sdtfl="http://schemas.microsoft.com/office/word/2024/wordml/sdtformatlock" xmlns:w16se="http://schemas.microsoft.com/office/word/2015/wordml/symex" xmlns:wpg="http://schemas.microsoft.com/office/word/2010/wordprocessingGroup" xmlns:wpi="http://schemas.microsoft.com/office/word/2010/wordprocessingInk" xmlns:wne="http://schemas.microsoft.com/office/word/2006/wordml" xmlns:wps="http://schemas.microsoft.com/office/word/2010/wordprocessingShape" mc:Ignorable="w14 w15 w16se w16cid w16 w16cex w16sdtdh w16sdtfl w16du wp14">
+<w:endnotes xmlns:wpc="http://schemas.microsoft.com/office/word/2010/wordprocessingCanvas" xmlns:cx="http://schemas.microsoft.com/office/drawing/2014/chartex" xmlns:cx1="http://schemas.microsoft.com/office/drawing/2015/9/8/chartex" xmlns:cx2="http://schemas.microsoft.com/office/drawing/2015/10/21/chartex" xmlns:cx3="http://schemas.microsoft.com/office/drawing/2016/5/9/chartex" xmlns:cx4="http://schemas.microsoft.com/office/drawing/2016/5/10/chartex" xmlns:cx5="http://schemas.microsoft.com/office/drawing/2016/5/11/chartex" xmlns:cx6="http://schemas.microsoft.com/office/drawing/2016/5/12/chartex" xmlns:cx7="http://schemas.microsoft.com/office/drawing/2016/5/13/chartex" xmlns:cx8="http://schemas.microsoft.com/office/drawing/2016/5/14/chartex" xmlns:mc="http://schemas.openxmlformats.org/markup-compatibility/2006" xmlns:aink="http://schemas.microsoft.com/office/drawing/2016/ink" xmlns:am3d="http://schemas.microsoft.com/office/drawing/2017/model3d" xmlns:o="urn:schemas-microsoft-com:office:office" xmlns:oel="http://schemas.microsoft.com/office/2019/extlst" xmlns:r="http://schemas.openxmlformats.org/officeDocument/2006/relationships" xmlns:m="http://schemas.openxmlformats.org/officeDocument/2006/math" xmlns:v="urn:schemas-microsoft-com:vml" xmlns:wp14="http://schemas.microsoft.com/office/word/2010/wordprocessingDrawing" xmlns:wp="http://schemas.openxmlformats.org/drawingml/2006/wordprocessingDrawing" xmlns:w10="urn:schemas-microsoft-com:office:word" xmlns:w="http://schemas.openxmlformats.org/wordprocessingml/2006/main" xmlns:w14="http://schemas.microsoft.com/office/word/2010/wordml" xmlns:w15="http://schemas.microsoft.com/office/word/2012/wordml" xmlns:w16cex="http://schemas.microsoft.com/office/word/2018/wordml/cex" xmlns:w16cid="http://schemas.microsoft.com/office/word/2016/wordml/cid" xmlns:w16="http://schemas.microsoft.com/office/word/2018/wordml" xmlns:w16sdtdh="http://schemas.microsoft.com/office/word/2020/wordml/sdtdatahash" xmlns:w16se="http://schemas.microsoft.com/office/word/2015/wordml/symex" xmlns:wpg="http://schemas.microsoft.com/office/word/2010/wordprocessingGroup" xmlns:wpi="http://schemas.microsoft.com/office/word/2010/wordprocessingInk" xmlns:wne="http://schemas.microsoft.com/office/word/2006/wordml" xmlns:wps="http://schemas.microsoft.com/office/word/2010/wordprocessingShape" mc:Ignorable="w14 w15 w16se w16cid w16 w16cex w16sdtdh wp14">
   <w:endnote w:type="separator" w:id="-1">
     <w:p>
       <w:r>
@@ -15603,7 +14473,7 @@
 </file>
 
 <file path=word/footer1.xml><?xml version="1.0" encoding="utf-8"?>
-<w:ftr xmlns:wpc="http://schemas.microsoft.com/office/word/2010/wordprocessingCanvas" xmlns:cx="http://schemas.microsoft.com/office/drawing/2014/chartex" xmlns:cx1="http://schemas.microsoft.com/office/drawing/2015/9/8/chartex" xmlns:cx2="http://schemas.microsoft.com/office/drawing/2015/10/21/chartex" xmlns:cx3="http://schemas.microsoft.com/office/drawing/2016/5/9/chartex" xmlns:cx4="http://schemas.microsoft.com/office/drawing/2016/5/10/chartex" xmlns:cx5="http://schemas.microsoft.com/office/drawing/2016/5/11/chartex" xmlns:cx6="http://schemas.microsoft.com/office/drawing/2016/5/12/chartex" xmlns:cx7="http://schemas.microsoft.com/office/drawing/2016/5/13/chartex" xmlns:cx8="http://schemas.microsoft.com/office/drawing/2016/5/14/chartex" xmlns:mc="http://schemas.openxmlformats.org/markup-compatibility/2006" xmlns:aink="http://schemas.microsoft.com/office/drawing/2016/ink" xmlns:am3d="http://schemas.microsoft.com/office/drawing/2017/model3d" xmlns:o="urn:schemas-microsoft-com:office:office" xmlns:oel="http://schemas.microsoft.com/office/2019/extlst" xmlns:r="http://schemas.openxmlformats.org/officeDocument/2006/relationships" xmlns:m="http://schemas.openxmlformats.org/officeDocument/2006/math" xmlns:v="urn:schemas-microsoft-com:vml" xmlns:wp14="http://schemas.microsoft.com/office/word/2010/wordprocessingDrawing" xmlns:wp="http://schemas.openxmlformats.org/drawingml/2006/wordprocessingDrawing" xmlns:w10="urn:schemas-microsoft-com:office:word" xmlns:w="http://schemas.openxmlformats.org/wordprocessingml/2006/main" xmlns:w14="http://schemas.microsoft.com/office/word/2010/wordml" xmlns:w15="http://schemas.microsoft.com/office/word/2012/wordml" xmlns:w16cex="http://schemas.microsoft.com/office/word/2018/wordml/cex" xmlns:w16cid="http://schemas.microsoft.com/office/word/2016/wordml/cid" xmlns:w16="http://schemas.microsoft.com/office/word/2018/wordml" xmlns:w16du="http://schemas.microsoft.com/office/word/2023/wordml/word16du" xmlns:w16sdtdh="http://schemas.microsoft.com/office/word/2020/wordml/sdtdatahash" xmlns:w16sdtfl="http://schemas.microsoft.com/office/word/2024/wordml/sdtformatlock" xmlns:w16se="http://schemas.microsoft.com/office/word/2015/wordml/symex" xmlns:wpg="http://schemas.microsoft.com/office/word/2010/wordprocessingGroup" xmlns:wpi="http://schemas.microsoft.com/office/word/2010/wordprocessingInk" xmlns:wne="http://schemas.microsoft.com/office/word/2006/wordml" xmlns:wps="http://schemas.microsoft.com/office/word/2010/wordprocessingShape" mc:Ignorable="w14 w15 w16se w16cid w16 w16cex w16sdtdh w16sdtfl w16du wp14">
+<w:ftr xmlns:wpc="http://schemas.microsoft.com/office/word/2010/wordprocessingCanvas" xmlns:cx="http://schemas.microsoft.com/office/drawing/2014/chartex" xmlns:cx1="http://schemas.microsoft.com/office/drawing/2015/9/8/chartex" xmlns:cx2="http://schemas.microsoft.com/office/drawing/2015/10/21/chartex" xmlns:cx3="http://schemas.microsoft.com/office/drawing/2016/5/9/chartex" xmlns:cx4="http://schemas.microsoft.com/office/drawing/2016/5/10/chartex" xmlns:cx5="http://schemas.microsoft.com/office/drawing/2016/5/11/chartex" xmlns:cx6="http://schemas.microsoft.com/office/drawing/2016/5/12/chartex" xmlns:cx7="http://schemas.microsoft.com/office/drawing/2016/5/13/chartex" xmlns:cx8="http://schemas.microsoft.com/office/drawing/2016/5/14/chartex" xmlns:mc="http://schemas.openxmlformats.org/markup-compatibility/2006" xmlns:aink="http://schemas.microsoft.com/office/drawing/2016/ink" xmlns:am3d="http://schemas.microsoft.com/office/drawing/2017/model3d" xmlns:o="urn:schemas-microsoft-com:office:office" xmlns:oel="http://schemas.microsoft.com/office/2019/extlst" xmlns:r="http://schemas.openxmlformats.org/officeDocument/2006/relationships" xmlns:m="http://schemas.openxmlformats.org/officeDocument/2006/math" xmlns:v="urn:schemas-microsoft-com:vml" xmlns:wp14="http://schemas.microsoft.com/office/word/2010/wordprocessingDrawing" xmlns:wp="http://schemas.openxmlformats.org/drawingml/2006/wordprocessingDrawing" xmlns:w10="urn:schemas-microsoft-com:office:word" xmlns:w="http://schemas.openxmlformats.org/wordprocessingml/2006/main" xmlns:w14="http://schemas.microsoft.com/office/word/2010/wordml" xmlns:w15="http://schemas.microsoft.com/office/word/2012/wordml" xmlns:w16cex="http://schemas.microsoft.com/office/word/2018/wordml/cex" xmlns:w16cid="http://schemas.microsoft.com/office/word/2016/wordml/cid" xmlns:w16="http://schemas.microsoft.com/office/word/2018/wordml" xmlns:w16sdtdh="http://schemas.microsoft.com/office/word/2020/wordml/sdtdatahash" xmlns:w16se="http://schemas.microsoft.com/office/word/2015/wordml/symex" xmlns:wpg="http://schemas.microsoft.com/office/word/2010/wordprocessingGroup" xmlns:wpi="http://schemas.microsoft.com/office/word/2010/wordprocessingInk" xmlns:wne="http://schemas.microsoft.com/office/word/2006/wordml" xmlns:wps="http://schemas.microsoft.com/office/word/2010/wordprocessingShape" mc:Ignorable="w14 w15 w16se w16cid w16 w16cex w16sdtdh wp14">
   <w:p>
     <w:pPr>
       <w:pStyle w:val="Rodap"/>
@@ -15667,7 +14537,7 @@
 </file>
 
 <file path=word/footer2.xml><?xml version="1.0" encoding="utf-8"?>
-<w:ftr xmlns:wpc="http://schemas.microsoft.com/office/word/2010/wordprocessingCanvas" xmlns:cx="http://schemas.microsoft.com/office/drawing/2014/chartex" xmlns:cx1="http://schemas.microsoft.com/office/drawing/2015/9/8/chartex" xmlns:cx2="http://schemas.microsoft.com/office/drawing/2015/10/21/chartex" xmlns:cx3="http://schemas.microsoft.com/office/drawing/2016/5/9/chartex" xmlns:cx4="http://schemas.microsoft.com/office/drawing/2016/5/10/chartex" xmlns:cx5="http://schemas.microsoft.com/office/drawing/2016/5/11/chartex" xmlns:cx6="http://schemas.microsoft.com/office/drawing/2016/5/12/chartex" xmlns:cx7="http://schemas.microsoft.com/office/drawing/2016/5/13/chartex" xmlns:cx8="http://schemas.microsoft.com/office/drawing/2016/5/14/chartex" xmlns:mc="http://schemas.openxmlformats.org/markup-compatibility/2006" xmlns:aink="http://schemas.microsoft.com/office/drawing/2016/ink" xmlns:am3d="http://schemas.microsoft.com/office/drawing/2017/model3d" xmlns:o="urn:schemas-microsoft-com:office:office" xmlns:oel="http://schemas.microsoft.com/office/2019/extlst" xmlns:r="http://schemas.openxmlformats.org/officeDocument/2006/relationships" xmlns:m="http://schemas.openxmlformats.org/officeDocument/2006/math" xmlns:v="urn:schemas-microsoft-com:vml" xmlns:wp14="http://schemas.microsoft.com/office/word/2010/wordprocessingDrawing" xmlns:wp="http://schemas.openxmlformats.org/drawingml/2006/wordprocessingDrawing" xmlns:w10="urn:schemas-microsoft-com:office:word" xmlns:w="http://schemas.openxmlformats.org/wordprocessingml/2006/main" xmlns:w14="http://schemas.microsoft.com/office/word/2010/wordml" xmlns:w15="http://schemas.microsoft.com/office/word/2012/wordml" xmlns:w16cex="http://schemas.microsoft.com/office/word/2018/wordml/cex" xmlns:w16cid="http://schemas.microsoft.com/office/word/2016/wordml/cid" xmlns:w16="http://schemas.microsoft.com/office/word/2018/wordml" xmlns:w16du="http://schemas.microsoft.com/office/word/2023/wordml/word16du" xmlns:w16sdtdh="http://schemas.microsoft.com/office/word/2020/wordml/sdtdatahash" xmlns:w16sdtfl="http://schemas.microsoft.com/office/word/2024/wordml/sdtformatlock" xmlns:w16se="http://schemas.microsoft.com/office/word/2015/wordml/symex" xmlns:wpg="http://schemas.microsoft.com/office/word/2010/wordprocessingGroup" xmlns:wpi="http://schemas.microsoft.com/office/word/2010/wordprocessingInk" xmlns:wne="http://schemas.microsoft.com/office/word/2006/wordml" xmlns:wps="http://schemas.microsoft.com/office/word/2010/wordprocessingShape" mc:Ignorable="w14 w15 w16se w16cid w16 w16cex w16sdtdh w16sdtfl w16du wp14">
+<w:ftr xmlns:wpc="http://schemas.microsoft.com/office/word/2010/wordprocessingCanvas" xmlns:cx="http://schemas.microsoft.com/office/drawing/2014/chartex" xmlns:cx1="http://schemas.microsoft.com/office/drawing/2015/9/8/chartex" xmlns:cx2="http://schemas.microsoft.com/office/drawing/2015/10/21/chartex" xmlns:cx3="http://schemas.microsoft.com/office/drawing/2016/5/9/chartex" xmlns:cx4="http://schemas.microsoft.com/office/drawing/2016/5/10/chartex" xmlns:cx5="http://schemas.microsoft.com/office/drawing/2016/5/11/chartex" xmlns:cx6="http://schemas.microsoft.com/office/drawing/2016/5/12/chartex" xmlns:cx7="http://schemas.microsoft.com/office/drawing/2016/5/13/chartex" xmlns:cx8="http://schemas.microsoft.com/office/drawing/2016/5/14/chartex" xmlns:mc="http://schemas.openxmlformats.org/markup-compatibility/2006" xmlns:aink="http://schemas.microsoft.com/office/drawing/2016/ink" xmlns:am3d="http://schemas.microsoft.com/office/drawing/2017/model3d" xmlns:o="urn:schemas-microsoft-com:office:office" xmlns:oel="http://schemas.microsoft.com/office/2019/extlst" xmlns:r="http://schemas.openxmlformats.org/officeDocument/2006/relationships" xmlns:m="http://schemas.openxmlformats.org/officeDocument/2006/math" xmlns:v="urn:schemas-microsoft-com:vml" xmlns:wp14="http://schemas.microsoft.com/office/word/2010/wordprocessingDrawing" xmlns:wp="http://schemas.openxmlformats.org/drawingml/2006/wordprocessingDrawing" xmlns:w10="urn:schemas-microsoft-com:office:word" xmlns:w="http://schemas.openxmlformats.org/wordprocessingml/2006/main" xmlns:w14="http://schemas.microsoft.com/office/word/2010/wordml" xmlns:w15="http://schemas.microsoft.com/office/word/2012/wordml" xmlns:w16cex="http://schemas.microsoft.com/office/word/2018/wordml/cex" xmlns:w16cid="http://schemas.microsoft.com/office/word/2016/wordml/cid" xmlns:w16="http://schemas.microsoft.com/office/word/2018/wordml" xmlns:w16sdtdh="http://schemas.microsoft.com/office/word/2020/wordml/sdtdatahash" xmlns:w16se="http://schemas.microsoft.com/office/word/2015/wordml/symex" xmlns:wpg="http://schemas.microsoft.com/office/word/2010/wordprocessingGroup" xmlns:wpi="http://schemas.microsoft.com/office/word/2010/wordprocessingInk" xmlns:wne="http://schemas.microsoft.com/office/word/2006/wordml" xmlns:wps="http://schemas.microsoft.com/office/word/2010/wordprocessingShape" mc:Ignorable="w14 w15 w16se w16cid w16 w16cex w16sdtdh wp14">
   <w:sdt>
     <w:sdtPr>
       <w:id w:val="2071930181"/>
@@ -15853,7 +14723,7 @@
 </file>
 
 <file path=word/footnotes.xml><?xml version="1.0" encoding="utf-8"?>
-<w:footnotes xmlns:wpc="http://schemas.microsoft.com/office/word/2010/wordprocessingCanvas" xmlns:cx="http://schemas.microsoft.com/office/drawing/2014/chartex" xmlns:cx1="http://schemas.microsoft.com/office/drawing/2015/9/8/chartex" xmlns:cx2="http://schemas.microsoft.com/office/drawing/2015/10/21/chartex" xmlns:cx3="http://schemas.microsoft.com/office/drawing/2016/5/9/chartex" xmlns:cx4="http://schemas.microsoft.com/office/drawing/2016/5/10/chartex" xmlns:cx5="http://schemas.microsoft.com/office/drawing/2016/5/11/chartex" xmlns:cx6="http://schemas.microsoft.com/office/drawing/2016/5/12/chartex" xmlns:cx7="http://schemas.microsoft.com/office/drawing/2016/5/13/chartex" xmlns:cx8="http://schemas.microsoft.com/office/drawing/2016/5/14/chartex" xmlns:mc="http://schemas.openxmlformats.org/markup-compatibility/2006" xmlns:aink="http://schemas.microsoft.com/office/drawing/2016/ink" xmlns:am3d="http://schemas.microsoft.com/office/drawing/2017/model3d" xmlns:o="urn:schemas-microsoft-com:office:office" xmlns:oel="http://schemas.microsoft.com/office/2019/extlst" xmlns:r="http://schemas.openxmlformats.org/officeDocument/2006/relationships" xmlns:m="http://schemas.openxmlformats.org/officeDocument/2006/math" xmlns:v="urn:schemas-microsoft-com:vml" xmlns:wp14="http://schemas.microsoft.com/office/word/2010/wordprocessingDrawing" xmlns:wp="http://schemas.openxmlformats.org/drawingml/2006/wordprocessingDrawing" xmlns:w10="urn:schemas-microsoft-com:office:word" xmlns:w="http://schemas.openxmlformats.org/wordprocessingml/2006/main" xmlns:w14="http://schemas.microsoft.com/office/word/2010/wordml" xmlns:w15="http://schemas.microsoft.com/office/word/2012/wordml" xmlns:w16cex="http://schemas.microsoft.com/office/word/2018/wordml/cex" xmlns:w16cid="http://schemas.microsoft.com/office/word/2016/wordml/cid" xmlns:w16="http://schemas.microsoft.com/office/word/2018/wordml" xmlns:w16du="http://schemas.microsoft.com/office/word/2023/wordml/word16du" xmlns:w16sdtdh="http://schemas.microsoft.com/office/word/2020/wordml/sdtdatahash" xmlns:w16sdtfl="http://schemas.microsoft.com/office/word/2024/wordml/sdtformatlock" xmlns:w16se="http://schemas.microsoft.com/office/word/2015/wordml/symex" xmlns:wpg="http://schemas.microsoft.com/office/word/2010/wordprocessingGroup" xmlns:wpi="http://schemas.microsoft.com/office/word/2010/wordprocessingInk" xmlns:wne="http://schemas.microsoft.com/office/word/2006/wordml" xmlns:wps="http://schemas.microsoft.com/office/word/2010/wordprocessingShape" mc:Ignorable="w14 w15 w16se w16cid w16 w16cex w16sdtdh w16sdtfl w16du wp14">
+<w:footnotes xmlns:wpc="http://schemas.microsoft.com/office/word/2010/wordprocessingCanvas" xmlns:cx="http://schemas.microsoft.com/office/drawing/2014/chartex" xmlns:cx1="http://schemas.microsoft.com/office/drawing/2015/9/8/chartex" xmlns:cx2="http://schemas.microsoft.com/office/drawing/2015/10/21/chartex" xmlns:cx3="http://schemas.microsoft.com/office/drawing/2016/5/9/chartex" xmlns:cx4="http://schemas.microsoft.com/office/drawing/2016/5/10/chartex" xmlns:cx5="http://schemas.microsoft.com/office/drawing/2016/5/11/chartex" xmlns:cx6="http://schemas.microsoft.com/office/drawing/2016/5/12/chartex" xmlns:cx7="http://schemas.microsoft.com/office/drawing/2016/5/13/chartex" xmlns:cx8="http://schemas.microsoft.com/office/drawing/2016/5/14/chartex" xmlns:mc="http://schemas.openxmlformats.org/markup-compatibility/2006" xmlns:aink="http://schemas.microsoft.com/office/drawing/2016/ink" xmlns:am3d="http://schemas.microsoft.com/office/drawing/2017/model3d" xmlns:o="urn:schemas-microsoft-com:office:office" xmlns:oel="http://schemas.microsoft.com/office/2019/extlst" xmlns:r="http://schemas.openxmlformats.org/officeDocument/2006/relationships" xmlns:m="http://schemas.openxmlformats.org/officeDocument/2006/math" xmlns:v="urn:schemas-microsoft-com:vml" xmlns:wp14="http://schemas.microsoft.com/office/word/2010/wordprocessingDrawing" xmlns:wp="http://schemas.openxmlformats.org/drawingml/2006/wordprocessingDrawing" xmlns:w10="urn:schemas-microsoft-com:office:word" xmlns:w="http://schemas.openxmlformats.org/wordprocessingml/2006/main" xmlns:w14="http://schemas.microsoft.com/office/word/2010/wordml" xmlns:w15="http://schemas.microsoft.com/office/word/2012/wordml" xmlns:w16cex="http://schemas.microsoft.com/office/word/2018/wordml/cex" xmlns:w16cid="http://schemas.microsoft.com/office/word/2016/wordml/cid" xmlns:w16="http://schemas.microsoft.com/office/word/2018/wordml" xmlns:w16sdtdh="http://schemas.microsoft.com/office/word/2020/wordml/sdtdatahash" xmlns:w16se="http://schemas.microsoft.com/office/word/2015/wordml/symex" xmlns:wpg="http://schemas.microsoft.com/office/word/2010/wordprocessingGroup" xmlns:wpi="http://schemas.microsoft.com/office/word/2010/wordprocessingInk" xmlns:wne="http://schemas.microsoft.com/office/word/2006/wordml" xmlns:wps="http://schemas.microsoft.com/office/word/2010/wordprocessingShape" mc:Ignorable="w14 w15 w16se w16cid w16 w16cex w16sdtdh wp14">
   <w:footnote w:type="separator" w:id="-1">
     <w:p>
       <w:r>
@@ -15872,7 +14742,7 @@
 </file>
 
 <file path=word/header1.xml><?xml version="1.0" encoding="utf-8"?>
-<w:hdr xmlns:wpc="http://schemas.microsoft.com/office/word/2010/wordprocessingCanvas" xmlns:cx="http://schemas.microsoft.com/office/drawing/2014/chartex" xmlns:cx1="http://schemas.microsoft.com/office/drawing/2015/9/8/chartex" xmlns:cx2="http://schemas.microsoft.com/office/drawing/2015/10/21/chartex" xmlns:cx3="http://schemas.microsoft.com/office/drawing/2016/5/9/chartex" xmlns:cx4="http://schemas.microsoft.com/office/drawing/2016/5/10/chartex" xmlns:cx5="http://schemas.microsoft.com/office/drawing/2016/5/11/chartex" xmlns:cx6="http://schemas.microsoft.com/office/drawing/2016/5/12/chartex" xmlns:cx7="http://schemas.microsoft.com/office/drawing/2016/5/13/chartex" xmlns:cx8="http://schemas.microsoft.com/office/drawing/2016/5/14/chartex" xmlns:mc="http://schemas.openxmlformats.org/markup-compatibility/2006" xmlns:aink="http://schemas.microsoft.com/office/drawing/2016/ink" xmlns:am3d="http://schemas.microsoft.com/office/drawing/2017/model3d" xmlns:o="urn:schemas-microsoft-com:office:office" xmlns:oel="http://schemas.microsoft.com/office/2019/extlst" xmlns:r="http://schemas.openxmlformats.org/officeDocument/2006/relationships" xmlns:m="http://schemas.openxmlformats.org/officeDocument/2006/math" xmlns:v="urn:schemas-microsoft-com:vml" xmlns:wp14="http://schemas.microsoft.com/office/word/2010/wordprocessingDrawing" xmlns:wp="http://schemas.openxmlformats.org/drawingml/2006/wordprocessingDrawing" xmlns:w10="urn:schemas-microsoft-com:office:word" xmlns:w="http://schemas.openxmlformats.org/wordprocessingml/2006/main" xmlns:w14="http://schemas.microsoft.com/office/word/2010/wordml" xmlns:w15="http://schemas.microsoft.com/office/word/2012/wordml" xmlns:w16cex="http://schemas.microsoft.com/office/word/2018/wordml/cex" xmlns:w16cid="http://schemas.microsoft.com/office/word/2016/wordml/cid" xmlns:w16="http://schemas.microsoft.com/office/word/2018/wordml" xmlns:w16du="http://schemas.microsoft.com/office/word/2023/wordml/word16du" xmlns:w16sdtdh="http://schemas.microsoft.com/office/word/2020/wordml/sdtdatahash" xmlns:w16sdtfl="http://schemas.microsoft.com/office/word/2024/wordml/sdtformatlock" xmlns:w16se="http://schemas.microsoft.com/office/word/2015/wordml/symex" xmlns:wpg="http://schemas.microsoft.com/office/word/2010/wordprocessingGroup" xmlns:wpi="http://schemas.microsoft.com/office/word/2010/wordprocessingInk" xmlns:wne="http://schemas.microsoft.com/office/word/2006/wordml" xmlns:wps="http://schemas.microsoft.com/office/word/2010/wordprocessingShape" mc:Ignorable="w14 w15 w16se w16cid w16 w16cex w16sdtdh w16sdtfl w16du wp14">
+<w:hdr xmlns:wpc="http://schemas.microsoft.com/office/word/2010/wordprocessingCanvas" xmlns:cx="http://schemas.microsoft.com/office/drawing/2014/chartex" xmlns:cx1="http://schemas.microsoft.com/office/drawing/2015/9/8/chartex" xmlns:cx2="http://schemas.microsoft.com/office/drawing/2015/10/21/chartex" xmlns:cx3="http://schemas.microsoft.com/office/drawing/2016/5/9/chartex" xmlns:cx4="http://schemas.microsoft.com/office/drawing/2016/5/10/chartex" xmlns:cx5="http://schemas.microsoft.com/office/drawing/2016/5/11/chartex" xmlns:cx6="http://schemas.microsoft.com/office/drawing/2016/5/12/chartex" xmlns:cx7="http://schemas.microsoft.com/office/drawing/2016/5/13/chartex" xmlns:cx8="http://schemas.microsoft.com/office/drawing/2016/5/14/chartex" xmlns:mc="http://schemas.openxmlformats.org/markup-compatibility/2006" xmlns:aink="http://schemas.microsoft.com/office/drawing/2016/ink" xmlns:am3d="http://schemas.microsoft.com/office/drawing/2017/model3d" xmlns:o="urn:schemas-microsoft-com:office:office" xmlns:oel="http://schemas.microsoft.com/office/2019/extlst" xmlns:r="http://schemas.openxmlformats.org/officeDocument/2006/relationships" xmlns:m="http://schemas.openxmlformats.org/officeDocument/2006/math" xmlns:v="urn:schemas-microsoft-com:vml" xmlns:wp14="http://schemas.microsoft.com/office/word/2010/wordprocessingDrawing" xmlns:wp="http://schemas.openxmlformats.org/drawingml/2006/wordprocessingDrawing" xmlns:w10="urn:schemas-microsoft-com:office:word" xmlns:w="http://schemas.openxmlformats.org/wordprocessingml/2006/main" xmlns:w14="http://schemas.microsoft.com/office/word/2010/wordml" xmlns:w15="http://schemas.microsoft.com/office/word/2012/wordml" xmlns:w16cex="http://schemas.microsoft.com/office/word/2018/wordml/cex" xmlns:w16cid="http://schemas.microsoft.com/office/word/2016/wordml/cid" xmlns:w16="http://schemas.microsoft.com/office/word/2018/wordml" xmlns:w16sdtdh="http://schemas.microsoft.com/office/word/2020/wordml/sdtdatahash" xmlns:w16se="http://schemas.microsoft.com/office/word/2015/wordml/symex" xmlns:wpg="http://schemas.microsoft.com/office/word/2010/wordprocessingGroup" xmlns:wpi="http://schemas.microsoft.com/office/word/2010/wordprocessingInk" xmlns:wne="http://schemas.microsoft.com/office/word/2006/wordml" xmlns:wps="http://schemas.microsoft.com/office/word/2010/wordprocessingShape" mc:Ignorable="w14 w15 w16se w16cid w16 w16cex w16sdtdh wp14">
   <w:p>
     <w:pPr>
       <w:pStyle w:val="Cabealho"/>
@@ -15882,7 +14752,7 @@
 </file>
 
 <file path=word/numbering.xml><?xml version="1.0" encoding="utf-8"?>
-<w:numbering xmlns:wpc="http://schemas.microsoft.com/office/word/2010/wordprocessingCanvas" xmlns:cx="http://schemas.microsoft.com/office/drawing/2014/chartex" xmlns:cx1="http://schemas.microsoft.com/office/drawing/2015/9/8/chartex" xmlns:cx2="http://schemas.microsoft.com/office/drawing/2015/10/21/chartex" xmlns:cx3="http://schemas.microsoft.com/office/drawing/2016/5/9/chartex" xmlns:cx4="http://schemas.microsoft.com/office/drawing/2016/5/10/chartex" xmlns:cx5="http://schemas.microsoft.com/office/drawing/2016/5/11/chartex" xmlns:cx6="http://schemas.microsoft.com/office/drawing/2016/5/12/chartex" xmlns:cx7="http://schemas.microsoft.com/office/drawing/2016/5/13/chartex" xmlns:cx8="http://schemas.microsoft.com/office/drawing/2016/5/14/chartex" xmlns:mc="http://schemas.openxmlformats.org/markup-compatibility/2006" xmlns:aink="http://schemas.microsoft.com/office/drawing/2016/ink" xmlns:am3d="http://schemas.microsoft.com/office/drawing/2017/model3d" xmlns:o="urn:schemas-microsoft-com:office:office" xmlns:oel="http://schemas.microsoft.com/office/2019/extlst" xmlns:r="http://schemas.openxmlformats.org/officeDocument/2006/relationships" xmlns:m="http://schemas.openxmlformats.org/officeDocument/2006/math" xmlns:v="urn:schemas-microsoft-com:vml" xmlns:wp14="http://schemas.microsoft.com/office/word/2010/wordprocessingDrawing" xmlns:wp="http://schemas.openxmlformats.org/drawingml/2006/wordprocessingDrawing" xmlns:w10="urn:schemas-microsoft-com:office:word" xmlns:w="http://schemas.openxmlformats.org/wordprocessingml/2006/main" xmlns:w14="http://schemas.microsoft.com/office/word/2010/wordml" xmlns:w15="http://schemas.microsoft.com/office/word/2012/wordml" xmlns:w16cex="http://schemas.microsoft.com/office/word/2018/wordml/cex" xmlns:w16cid="http://schemas.microsoft.com/office/word/2016/wordml/cid" xmlns:w16="http://schemas.microsoft.com/office/word/2018/wordml" xmlns:w16du="http://schemas.microsoft.com/office/word/2023/wordml/word16du" xmlns:w16sdtdh="http://schemas.microsoft.com/office/word/2020/wordml/sdtdatahash" xmlns:w16sdtfl="http://schemas.microsoft.com/office/word/2024/wordml/sdtformatlock" xmlns:w16se="http://schemas.microsoft.com/office/word/2015/wordml/symex" xmlns:wpg="http://schemas.microsoft.com/office/word/2010/wordprocessingGroup" xmlns:wpi="http://schemas.microsoft.com/office/word/2010/wordprocessingInk" xmlns:wne="http://schemas.microsoft.com/office/word/2006/wordml" xmlns:wps="http://schemas.microsoft.com/office/word/2010/wordprocessingShape" mc:Ignorable="w14 w15 w16se w16cid w16 w16cex w16sdtdh w16sdtfl w16du wp14">
+<w:numbering xmlns:wpc="http://schemas.microsoft.com/office/word/2010/wordprocessingCanvas" xmlns:cx="http://schemas.microsoft.com/office/drawing/2014/chartex" xmlns:cx1="http://schemas.microsoft.com/office/drawing/2015/9/8/chartex" xmlns:cx2="http://schemas.microsoft.com/office/drawing/2015/10/21/chartex" xmlns:cx3="http://schemas.microsoft.com/office/drawing/2016/5/9/chartex" xmlns:cx4="http://schemas.microsoft.com/office/drawing/2016/5/10/chartex" xmlns:cx5="http://schemas.microsoft.com/office/drawing/2016/5/11/chartex" xmlns:cx6="http://schemas.microsoft.com/office/drawing/2016/5/12/chartex" xmlns:cx7="http://schemas.microsoft.com/office/drawing/2016/5/13/chartex" xmlns:cx8="http://schemas.microsoft.com/office/drawing/2016/5/14/chartex" xmlns:mc="http://schemas.openxmlformats.org/markup-compatibility/2006" xmlns:aink="http://schemas.microsoft.com/office/drawing/2016/ink" xmlns:am3d="http://schemas.microsoft.com/office/drawing/2017/model3d" xmlns:o="urn:schemas-microsoft-com:office:office" xmlns:oel="http://schemas.microsoft.com/office/2019/extlst" xmlns:r="http://schemas.openxmlformats.org/officeDocument/2006/relationships" xmlns:m="http://schemas.openxmlformats.org/officeDocument/2006/math" xmlns:v="urn:schemas-microsoft-com:vml" xmlns:wp14="http://schemas.microsoft.com/office/word/2010/wordprocessingDrawing" xmlns:wp="http://schemas.openxmlformats.org/drawingml/2006/wordprocessingDrawing" xmlns:w10="urn:schemas-microsoft-com:office:word" xmlns:w="http://schemas.openxmlformats.org/wordprocessingml/2006/main" xmlns:w14="http://schemas.microsoft.com/office/word/2010/wordml" xmlns:w15="http://schemas.microsoft.com/office/word/2012/wordml" xmlns:w16cex="http://schemas.microsoft.com/office/word/2018/wordml/cex" xmlns:w16cid="http://schemas.microsoft.com/office/word/2016/wordml/cid" xmlns:w16="http://schemas.microsoft.com/office/word/2018/wordml" xmlns:w16sdtdh="http://schemas.microsoft.com/office/word/2020/wordml/sdtdatahash" xmlns:w16se="http://schemas.microsoft.com/office/word/2015/wordml/symex" xmlns:wpg="http://schemas.microsoft.com/office/word/2010/wordprocessingGroup" xmlns:wpi="http://schemas.microsoft.com/office/word/2010/wordprocessingInk" xmlns:wne="http://schemas.microsoft.com/office/word/2006/wordml" xmlns:wps="http://schemas.microsoft.com/office/word/2010/wordprocessingShape" mc:Ignorable="w14 w15 w16se w16cid w16 w16cex w16sdtdh wp14">
   <w:abstractNum w:abstractNumId="0" w15:restartNumberingAfterBreak="0">
     <w:nsid w:val="033B1D64"/>
     <w:multiLevelType w:val="hybridMultilevel"/>
@@ -19199,7 +18069,7 @@
 </file>
 
 <file path=word/styles.xml><?xml version="1.0" encoding="utf-8"?>
-<w:styles xmlns:mc="http://schemas.openxmlformats.org/markup-compatibility/2006" xmlns:r="http://schemas.openxmlformats.org/officeDocument/2006/relationships" xmlns:w="http://schemas.openxmlformats.org/wordprocessingml/2006/main" xmlns:w14="http://schemas.microsoft.com/office/word/2010/wordml" xmlns:w15="http://schemas.microsoft.com/office/word/2012/wordml" xmlns:w16cex="http://schemas.microsoft.com/office/word/2018/wordml/cex" xmlns:w16cid="http://schemas.microsoft.com/office/word/2016/wordml/cid" xmlns:w16="http://schemas.microsoft.com/office/word/2018/wordml" xmlns:w16du="http://schemas.microsoft.com/office/word/2023/wordml/word16du" xmlns:w16sdtdh="http://schemas.microsoft.com/office/word/2020/wordml/sdtdatahash" xmlns:w16sdtfl="http://schemas.microsoft.com/office/word/2024/wordml/sdtformatlock" xmlns:w16se="http://schemas.microsoft.com/office/word/2015/wordml/symex" mc:Ignorable="w14 w15 w16se w16cid w16 w16cex w16sdtdh w16sdtfl w16du">
+<w:styles xmlns:mc="http://schemas.openxmlformats.org/markup-compatibility/2006" xmlns:r="http://schemas.openxmlformats.org/officeDocument/2006/relationships" xmlns:w="http://schemas.openxmlformats.org/wordprocessingml/2006/main" xmlns:w14="http://schemas.microsoft.com/office/word/2010/wordml" xmlns:w15="http://schemas.microsoft.com/office/word/2012/wordml" xmlns:w16cex="http://schemas.microsoft.com/office/word/2018/wordml/cex" xmlns:w16cid="http://schemas.microsoft.com/office/word/2016/wordml/cid" xmlns:w16="http://schemas.microsoft.com/office/word/2018/wordml" xmlns:w16sdtdh="http://schemas.microsoft.com/office/word/2020/wordml/sdtdatahash" xmlns:w16se="http://schemas.microsoft.com/office/word/2015/wordml/symex" mc:Ignorable="w14 w15 w16se w16cid w16 w16cex w16sdtdh">
   <w:docDefaults>
     <w:rPrDefault>
       <w:rPr>
@@ -21349,21 +20219,6 @@
 </file>
 
 <file path=customXml/item2.xml><?xml version="1.0" encoding="utf-8"?>
-<p:properties xmlns:p="http://schemas.microsoft.com/office/2006/metadata/properties" xmlns:xsi="http://www.w3.org/2001/XMLSchema-instance" xmlns:pc="http://schemas.microsoft.com/office/infopath/2007/PartnerControls">
-  <documentManagement>
-    <TaxCatchAll xmlns="fa1ba186-cf14-4658-82ff-4e1486731960" xsi:nil="true"/>
-    <lcf76f155ced4ddcb4097134ff3c332f xmlns="52a6887f-9537-4a34-8793-b765f13d0873">
-      <Terms xmlns="http://schemas.microsoft.com/office/infopath/2007/PartnerControls"/>
-    </lcf76f155ced4ddcb4097134ff3c332f>
-  </documentManagement>
-</p:properties>
-</file>
-
-<file path=customXml/item3.xml><?xml version="1.0" encoding="utf-8"?>
-<b:Sources xmlns:b="http://schemas.openxmlformats.org/officeDocument/2006/bibliography" xmlns="http://schemas.openxmlformats.org/officeDocument/2006/bibliography" SelectedStyle="\APASixthEditionOfficeOnline.xsl" StyleName="APA" Version="6"/>
-</file>
-
-<file path=customXml/item4.xml><?xml version="1.0" encoding="utf-8"?>
 <ct:contentTypeSchema xmlns:ct="http://schemas.microsoft.com/office/2006/metadata/contentType" xmlns:ma="http://schemas.microsoft.com/office/2006/metadata/properties/metaAttributes" ct:_="" ma:_="" ma:contentTypeName="Documento" ma:contentTypeID="0x0101003F8ECAAF88AFCB4AB1D806FDE394FD03" ma:contentTypeVersion="12" ma:contentTypeDescription="Criar um novo documento." ma:contentTypeScope="" ma:versionID="541e5482cd22746a72c07b4578302587">
   <xsd:schema xmlns:xsd="http://www.w3.org/2001/XMLSchema" xmlns:xs="http://www.w3.org/2001/XMLSchema" xmlns:p="http://schemas.microsoft.com/office/2006/metadata/properties" xmlns:ns2="52a6887f-9537-4a34-8793-b765f13d0873" xmlns:ns3="fa1ba186-cf14-4658-82ff-4e1486731960" targetNamespace="http://schemas.microsoft.com/office/2006/metadata/properties" ma:root="true" ma:fieldsID="4badabe4fa58f02b4fe1f9c3f11ac53e" ns2:_="" ns3:_="">
     <xsd:import namespace="52a6887f-9537-4a34-8793-b765f13d0873"/>
@@ -21564,6 +20419,21 @@
 </ct:contentTypeSchema>
 </file>
 
+<file path=customXml/item3.xml><?xml version="1.0" encoding="utf-8"?>
+<b:Sources xmlns:b="http://schemas.openxmlformats.org/officeDocument/2006/bibliography" xmlns="http://schemas.openxmlformats.org/officeDocument/2006/bibliography" SelectedStyle="\APASixthEditionOfficeOnline.xsl" StyleName="APA" Version="6"/>
+</file>
+
+<file path=customXml/item4.xml><?xml version="1.0" encoding="utf-8"?>
+<p:properties xmlns:p="http://schemas.microsoft.com/office/2006/metadata/properties" xmlns:xsi="http://www.w3.org/2001/XMLSchema-instance" xmlns:pc="http://schemas.microsoft.com/office/infopath/2007/PartnerControls">
+  <documentManagement>
+    <TaxCatchAll xmlns="fa1ba186-cf14-4658-82ff-4e1486731960" xsi:nil="true"/>
+    <lcf76f155ced4ddcb4097134ff3c332f xmlns="52a6887f-9537-4a34-8793-b765f13d0873">
+      <Terms xmlns="http://schemas.microsoft.com/office/infopath/2007/PartnerControls"/>
+    </lcf76f155ced4ddcb4097134ff3c332f>
+  </documentManagement>
+</p:properties>
+</file>
+
 <file path=customXml/itemProps1.xml><?xml version="1.0" encoding="utf-8"?>
 <ds:datastoreItem xmlns:ds="http://schemas.openxmlformats.org/officeDocument/2006/customXml" ds:itemID="{990C7B0B-29F8-4472-849D-8AEB923CF9C9}">
   <ds:schemaRefs>
@@ -21573,25 +20443,6 @@
 </file>
 
 <file path=customXml/itemProps2.xml><?xml version="1.0" encoding="utf-8"?>
-<ds:datastoreItem xmlns:ds="http://schemas.openxmlformats.org/officeDocument/2006/customXml" ds:itemID="{B0D02839-B28B-4402-A79D-B0CCDC274F38}">
-  <ds:schemaRefs>
-    <ds:schemaRef ds:uri="http://schemas.microsoft.com/office/2006/metadata/properties"/>
-    <ds:schemaRef ds:uri="http://schemas.microsoft.com/office/infopath/2007/PartnerControls"/>
-    <ds:schemaRef ds:uri="fa1ba186-cf14-4658-82ff-4e1486731960"/>
-    <ds:schemaRef ds:uri="52a6887f-9537-4a34-8793-b765f13d0873"/>
-  </ds:schemaRefs>
-</ds:datastoreItem>
-</file>
-
-<file path=customXml/itemProps3.xml><?xml version="1.0" encoding="utf-8"?>
-<ds:datastoreItem xmlns:ds="http://schemas.openxmlformats.org/officeDocument/2006/customXml" ds:itemID="{34E35503-31BE-4C22-8EB5-1B8C3DFFC716}">
-  <ds:schemaRefs>
-    <ds:schemaRef ds:uri="http://schemas.openxmlformats.org/officeDocument/2006/bibliography"/>
-  </ds:schemaRefs>
-</ds:datastoreItem>
-</file>
-
-<file path=customXml/itemProps4.xml><?xml version="1.0" encoding="utf-8"?>
 <ds:datastoreItem xmlns:ds="http://schemas.openxmlformats.org/officeDocument/2006/customXml" ds:itemID="{B04309D4-A979-44A4-8B48-1DFD9E70F312}">
   <ds:schemaRefs>
     <ds:schemaRef ds:uri="http://schemas.microsoft.com/office/2006/metadata/contentType"/>
@@ -21608,4 +20459,23 @@
     <ds:schemaRef ds:uri="http://schemas.microsoft.com/internal/obd"/>
   </ds:schemaRefs>
 </ds:datastoreItem>
+</file>
+
+<file path=customXml/itemProps3.xml><?xml version="1.0" encoding="utf-8"?>
+<ds:datastoreItem xmlns:ds="http://schemas.openxmlformats.org/officeDocument/2006/customXml" ds:itemID="{34E35503-31BE-4C22-8EB5-1B8C3DFFC716}">
+  <ds:schemaRefs>
+    <ds:schemaRef ds:uri="http://schemas.openxmlformats.org/officeDocument/2006/bibliography"/>
+  </ds:schemaRefs>
+</ds:datastoreItem>
+</file>
+
+<file path=customXml/itemProps4.xml><?xml version="1.0" encoding="utf-8"?>
+<ds:datastoreItem xmlns:ds="http://schemas.openxmlformats.org/officeDocument/2006/customXml" ds:itemID="{B0D02839-B28B-4402-A79D-B0CCDC274F38}">
+  <ds:schemaRefs>
+    <ds:schemaRef ds:uri="http://schemas.microsoft.com/office/2006/metadata/properties"/>
+    <ds:schemaRef ds:uri="http://schemas.microsoft.com/office/infopath/2007/PartnerControls"/>
+    <ds:schemaRef ds:uri="fa1ba186-cf14-4658-82ff-4e1486731960"/>
+    <ds:schemaRef ds:uri="52a6887f-9537-4a34-8793-b765f13d0873"/>
+  </ds:schemaRefs>
+</ds:datastoreItem>
 </file>
</xml_diff>

<commit_message>
Commit resumo do capitulo 2
</commit_message>
<xml_diff>
--- a/MDS-2026-Relatorio.docx
+++ b/MDS-2026-Relatorio.docx
@@ -1013,7 +1013,7 @@
             </w:rPr>
             <w:fldChar w:fldCharType="separate"/>
           </w:r>
-          <w:hyperlink w:anchor="_Toc232850964" w:history="1">
+          <w:hyperlink w:anchor="_Toc232856230" w:history="1">
             <w:r>
               <w:rPr>
                 <w:rStyle w:val="Hiperligao"/>
@@ -1040,7 +1040,7 @@
                 <w:noProof/>
                 <w:webHidden/>
               </w:rPr>
-              <w:instrText xml:space="preserve"> PAGEREF _Toc232850964 \h </w:instrText>
+              <w:instrText xml:space="preserve"> PAGEREF _Toc232856230 \h </w:instrText>
             </w:r>
             <w:r>
               <w:rPr>
@@ -1091,7 +1091,7 @@
               <w14:ligatures w14:val="standardContextual"/>
             </w:rPr>
           </w:pPr>
-          <w:hyperlink w:anchor="_Toc232850965" w:history="1">
+          <w:hyperlink w:anchor="_Toc232856231" w:history="1">
             <w:r>
               <w:rPr>
                 <w:rStyle w:val="Hiperligao"/>
@@ -1118,7 +1118,7 @@
                 <w:noProof/>
                 <w:webHidden/>
               </w:rPr>
-              <w:instrText xml:space="preserve"> PAGEREF _Toc232850965 \h </w:instrText>
+              <w:instrText xml:space="preserve"> PAGEREF _Toc232856231 \h </w:instrText>
             </w:r>
             <w:r>
               <w:rPr>
@@ -1170,7 +1170,7 @@
               <w14:ligatures w14:val="standardContextual"/>
             </w:rPr>
           </w:pPr>
-          <w:hyperlink w:anchor="_Toc232850966" w:history="1">
+          <w:hyperlink w:anchor="_Toc232856232" w:history="1">
             <w:r>
               <w:rPr>
                 <w:rStyle w:val="Hiperligao"/>
@@ -1220,7 +1220,7 @@
                 <w:noProof/>
                 <w:webHidden/>
               </w:rPr>
-              <w:instrText xml:space="preserve"> PAGEREF _Toc232850966 \h </w:instrText>
+              <w:instrText xml:space="preserve"> PAGEREF _Toc232856232 \h </w:instrText>
             </w:r>
             <w:r>
               <w:rPr>
@@ -1271,7 +1271,7 @@
               <w14:ligatures w14:val="standardContextual"/>
             </w:rPr>
           </w:pPr>
-          <w:hyperlink w:anchor="_Toc232850967" w:history="1">
+          <w:hyperlink w:anchor="_Toc232856233" w:history="1">
             <w:r>
               <w:rPr>
                 <w:rStyle w:val="Hiperligao"/>
@@ -1320,7 +1320,7 @@
                 <w:noProof/>
                 <w:webHidden/>
               </w:rPr>
-              <w:instrText xml:space="preserve"> PAGEREF _Toc232850967 \h </w:instrText>
+              <w:instrText xml:space="preserve"> PAGEREF _Toc232856233 \h </w:instrText>
             </w:r>
             <w:r>
               <w:rPr>
@@ -1372,7 +1372,7 @@
               <w14:ligatures w14:val="standardContextual"/>
             </w:rPr>
           </w:pPr>
-          <w:hyperlink w:anchor="_Toc232850968" w:history="1">
+          <w:hyperlink w:anchor="_Toc232856234" w:history="1">
             <w:r>
               <w:rPr>
                 <w:rStyle w:val="Hiperligao"/>
@@ -1422,7 +1422,7 @@
                 <w:noProof/>
                 <w:webHidden/>
               </w:rPr>
-              <w:instrText xml:space="preserve"> PAGEREF _Toc232850968 \h </w:instrText>
+              <w:instrText xml:space="preserve"> PAGEREF _Toc232856234 \h </w:instrText>
             </w:r>
             <w:r>
               <w:rPr>
@@ -1473,7 +1473,7 @@
               <w14:ligatures w14:val="standardContextual"/>
             </w:rPr>
           </w:pPr>
-          <w:hyperlink w:anchor="_Toc232850969" w:history="1">
+          <w:hyperlink w:anchor="_Toc232856235" w:history="1">
             <w:r>
               <w:rPr>
                 <w:rStyle w:val="Hiperligao"/>
@@ -1522,7 +1522,7 @@
                 <w:noProof/>
                 <w:webHidden/>
               </w:rPr>
-              <w:instrText xml:space="preserve"> PAGEREF _Toc232850969 \h </w:instrText>
+              <w:instrText xml:space="preserve"> PAGEREF _Toc232856235 \h </w:instrText>
             </w:r>
             <w:r>
               <w:rPr>
@@ -1571,7 +1571,7 @@
               <w14:ligatures w14:val="standardContextual"/>
             </w:rPr>
           </w:pPr>
-          <w:hyperlink w:anchor="_Toc232850970" w:history="1">
+          <w:hyperlink w:anchor="_Toc232856236" w:history="1">
             <w:r>
               <w:rPr>
                 <w:rStyle w:val="Hiperligao"/>
@@ -1618,7 +1618,7 @@
                 <w:noProof/>
                 <w:webHidden/>
               </w:rPr>
-              <w:instrText xml:space="preserve"> PAGEREF _Toc232850970 \h </w:instrText>
+              <w:instrText xml:space="preserve"> PAGEREF _Toc232856236 \h </w:instrText>
             </w:r>
             <w:r>
               <w:rPr>
@@ -1667,7 +1667,7 @@
               <w14:ligatures w14:val="standardContextual"/>
             </w:rPr>
           </w:pPr>
-          <w:hyperlink w:anchor="_Toc232850971" w:history="1">
+          <w:hyperlink w:anchor="_Toc232856237" w:history="1">
             <w:r>
               <w:rPr>
                 <w:rStyle w:val="Hiperligao"/>
@@ -1714,7 +1714,7 @@
                 <w:noProof/>
                 <w:webHidden/>
               </w:rPr>
-              <w:instrText xml:space="preserve"> PAGEREF _Toc232850971 \h </w:instrText>
+              <w:instrText xml:space="preserve"> PAGEREF _Toc232856237 \h </w:instrText>
             </w:r>
             <w:r>
               <w:rPr>
@@ -1734,7 +1734,7 @@
                 <w:noProof/>
                 <w:webHidden/>
               </w:rPr>
-              <w:t>9</w:t>
+              <w:t>8</w:t>
             </w:r>
             <w:r>
               <w:rPr>
@@ -1763,7 +1763,7 @@
               <w14:ligatures w14:val="standardContextual"/>
             </w:rPr>
           </w:pPr>
-          <w:hyperlink w:anchor="_Toc232850972" w:history="1">
+          <w:hyperlink w:anchor="_Toc232856238" w:history="1">
             <w:r>
               <w:rPr>
                 <w:rStyle w:val="Hiperligao"/>
@@ -1810,7 +1810,7 @@
                 <w:noProof/>
                 <w:webHidden/>
               </w:rPr>
-              <w:instrText xml:space="preserve"> PAGEREF _Toc232850972 \h </w:instrText>
+              <w:instrText xml:space="preserve"> PAGEREF _Toc232856238 \h </w:instrText>
             </w:r>
             <w:r>
               <w:rPr>
@@ -1830,7 +1830,7 @@
                 <w:noProof/>
                 <w:webHidden/>
               </w:rPr>
-              <w:t>10</w:t>
+              <w:t>9</w:t>
             </w:r>
             <w:r>
               <w:rPr>
@@ -1859,7 +1859,7 @@
               <w14:ligatures w14:val="standardContextual"/>
             </w:rPr>
           </w:pPr>
-          <w:hyperlink w:anchor="_Toc232850973" w:history="1">
+          <w:hyperlink w:anchor="_Toc232856239" w:history="1">
             <w:r>
               <w:rPr>
                 <w:rStyle w:val="Hiperligao"/>
@@ -1906,7 +1906,7 @@
                 <w:noProof/>
                 <w:webHidden/>
               </w:rPr>
-              <w:instrText xml:space="preserve"> PAGEREF _Toc232850973 \h </w:instrText>
+              <w:instrText xml:space="preserve"> PAGEREF _Toc232856239 \h </w:instrText>
             </w:r>
             <w:r>
               <w:rPr>
@@ -1926,7 +1926,7 @@
                 <w:noProof/>
                 <w:webHidden/>
               </w:rPr>
-              <w:t>10</w:t>
+              <w:t>9</w:t>
             </w:r>
             <w:r>
               <w:rPr>
@@ -1955,7 +1955,7 @@
               <w14:ligatures w14:val="standardContextual"/>
             </w:rPr>
           </w:pPr>
-          <w:hyperlink w:anchor="_Toc232850974" w:history="1">
+          <w:hyperlink w:anchor="_Toc232856240" w:history="1">
             <w:r>
               <w:rPr>
                 <w:rStyle w:val="Hiperligao"/>
@@ -2002,7 +2002,7 @@
                 <w:noProof/>
                 <w:webHidden/>
               </w:rPr>
-              <w:instrText xml:space="preserve"> PAGEREF _Toc232850974 \h </w:instrText>
+              <w:instrText xml:space="preserve"> PAGEREF _Toc232856240 \h </w:instrText>
             </w:r>
             <w:r>
               <w:rPr>
@@ -2022,7 +2022,7 @@
                 <w:noProof/>
                 <w:webHidden/>
               </w:rPr>
-              <w:t>11</w:t>
+              <w:t>10</w:t>
             </w:r>
             <w:r>
               <w:rPr>
@@ -2053,7 +2053,7 @@
               <w14:ligatures w14:val="standardContextual"/>
             </w:rPr>
           </w:pPr>
-          <w:hyperlink w:anchor="_Toc232850975" w:history="1">
+          <w:hyperlink w:anchor="_Toc232856241" w:history="1">
             <w:r>
               <w:rPr>
                 <w:rStyle w:val="Hiperligao"/>
@@ -2102,7 +2102,7 @@
                 <w:noProof/>
                 <w:webHidden/>
               </w:rPr>
-              <w:instrText xml:space="preserve"> PAGEREF _Toc232850975 \h </w:instrText>
+              <w:instrText xml:space="preserve"> PAGEREF _Toc232856241 \h </w:instrText>
             </w:r>
             <w:r>
               <w:rPr>
@@ -2153,7 +2153,7 @@
               <w14:ligatures w14:val="standardContextual"/>
             </w:rPr>
           </w:pPr>
-          <w:hyperlink w:anchor="_Toc232850976" w:history="1">
+          <w:hyperlink w:anchor="_Toc232856242" w:history="1">
             <w:r>
               <w:rPr>
                 <w:rStyle w:val="Hiperligao"/>
@@ -2202,7 +2202,7 @@
                 <w:noProof/>
                 <w:webHidden/>
               </w:rPr>
-              <w:instrText xml:space="preserve"> PAGEREF _Toc232850976 \h </w:instrText>
+              <w:instrText xml:space="preserve"> PAGEREF _Toc232856242 \h </w:instrText>
             </w:r>
             <w:r>
               <w:rPr>
@@ -2222,7 +2222,7 @@
                 <w:noProof/>
                 <w:webHidden/>
               </w:rPr>
-              <w:t>15</w:t>
+              <w:t>14</w:t>
             </w:r>
             <w:r>
               <w:rPr>
@@ -2254,7 +2254,7 @@
               <w14:ligatures w14:val="standardContextual"/>
             </w:rPr>
           </w:pPr>
-          <w:hyperlink w:anchor="_Toc232850977" w:history="1">
+          <w:hyperlink w:anchor="_Toc232856243" w:history="1">
             <w:r>
               <w:rPr>
                 <w:rStyle w:val="Hiperligao"/>
@@ -2304,7 +2304,7 @@
                 <w:noProof/>
                 <w:webHidden/>
               </w:rPr>
-              <w:instrText xml:space="preserve"> PAGEREF _Toc232850977 \h </w:instrText>
+              <w:instrText xml:space="preserve"> PAGEREF _Toc232856243 \h </w:instrText>
             </w:r>
             <w:r>
               <w:rPr>
@@ -2324,7 +2324,7 @@
                 <w:noProof/>
                 <w:webHidden/>
               </w:rPr>
-              <w:t>16</w:t>
+              <w:t>15</w:t>
             </w:r>
             <w:r>
               <w:rPr>
@@ -2355,7 +2355,7 @@
               <w14:ligatures w14:val="standardContextual"/>
             </w:rPr>
           </w:pPr>
-          <w:hyperlink w:anchor="_Toc232850978" w:history="1">
+          <w:hyperlink w:anchor="_Toc232856244" w:history="1">
             <w:r>
               <w:rPr>
                 <w:rStyle w:val="Hiperligao"/>
@@ -2404,7 +2404,7 @@
                 <w:noProof/>
                 <w:webHidden/>
               </w:rPr>
-              <w:instrText xml:space="preserve"> PAGEREF _Toc232850978 \h </w:instrText>
+              <w:instrText xml:space="preserve"> PAGEREF _Toc232856244 \h </w:instrText>
             </w:r>
             <w:r>
               <w:rPr>
@@ -2424,7 +2424,7 @@
                 <w:noProof/>
                 <w:webHidden/>
               </w:rPr>
-              <w:t>16</w:t>
+              <w:t>15</w:t>
             </w:r>
             <w:r>
               <w:rPr>
@@ -2455,7 +2455,7 @@
               <w14:ligatures w14:val="standardContextual"/>
             </w:rPr>
           </w:pPr>
-          <w:hyperlink w:anchor="_Toc232850979" w:history="1">
+          <w:hyperlink w:anchor="_Toc232856245" w:history="1">
             <w:r>
               <w:rPr>
                 <w:rStyle w:val="Hiperligao"/>
@@ -2504,7 +2504,7 @@
                 <w:noProof/>
                 <w:webHidden/>
               </w:rPr>
-              <w:instrText xml:space="preserve"> PAGEREF _Toc232850979 \h </w:instrText>
+              <w:instrText xml:space="preserve"> PAGEREF _Toc232856245 \h </w:instrText>
             </w:r>
             <w:r>
               <w:rPr>
@@ -2524,7 +2524,7 @@
                 <w:noProof/>
                 <w:webHidden/>
               </w:rPr>
-              <w:t>16</w:t>
+              <w:t>15</w:t>
             </w:r>
             <w:r>
               <w:rPr>
@@ -2555,7 +2555,7 @@
               <w14:ligatures w14:val="standardContextual"/>
             </w:rPr>
           </w:pPr>
-          <w:hyperlink w:anchor="_Toc232850980" w:history="1">
+          <w:hyperlink w:anchor="_Toc232856246" w:history="1">
             <w:r>
               <w:rPr>
                 <w:rStyle w:val="Hiperligao"/>
@@ -2604,7 +2604,7 @@
                 <w:noProof/>
                 <w:webHidden/>
               </w:rPr>
-              <w:instrText xml:space="preserve"> PAGEREF _Toc232850980 \h </w:instrText>
+              <w:instrText xml:space="preserve"> PAGEREF _Toc232856246 \h </w:instrText>
             </w:r>
             <w:r>
               <w:rPr>
@@ -2655,7 +2655,7 @@
               <w14:ligatures w14:val="standardContextual"/>
             </w:rPr>
           </w:pPr>
-          <w:hyperlink w:anchor="_Toc232850981" w:history="1">
+          <w:hyperlink w:anchor="_Toc232856247" w:history="1">
             <w:r>
               <w:rPr>
                 <w:rStyle w:val="Hiperligao"/>
@@ -2704,7 +2704,7 @@
                 <w:noProof/>
                 <w:webHidden/>
               </w:rPr>
-              <w:instrText xml:space="preserve"> PAGEREF _Toc232850981 \h </w:instrText>
+              <w:instrText xml:space="preserve"> PAGEREF _Toc232856247 \h </w:instrText>
             </w:r>
             <w:r>
               <w:rPr>
@@ -2724,7 +2724,7 @@
                 <w:noProof/>
                 <w:webHidden/>
               </w:rPr>
-              <w:t>20</w:t>
+              <w:t>19</w:t>
             </w:r>
             <w:r>
               <w:rPr>
@@ -2753,7 +2753,7 @@
               <w14:ligatures w14:val="standardContextual"/>
             </w:rPr>
           </w:pPr>
-          <w:hyperlink w:anchor="_Toc232850982" w:history="1">
+          <w:hyperlink w:anchor="_Toc232856248" w:history="1">
             <w:r>
               <w:rPr>
                 <w:rStyle w:val="Hiperligao"/>
@@ -2779,22 +2779,7 @@
                 <w:rStyle w:val="Hiperligao"/>
                 <w:noProof/>
               </w:rPr>
-              <w:t>Sprint 1 (</w:t>
-            </w:r>
-            <w:r>
-              <w:rPr>
-                <w:rStyle w:val="Hiperligao"/>
-                <w:noProof/>
-                <w:highlight w:val="yellow"/>
-              </w:rPr>
-              <w:t>Dia de Mês de Ano a Dia de Mês de Ano</w:t>
-            </w:r>
-            <w:r>
-              <w:rPr>
-                <w:rStyle w:val="Hiperligao"/>
-                <w:noProof/>
-              </w:rPr>
-              <w:t>)</w:t>
+              <w:t>Sprint 1 (30 de Abril de 2026 a 14 de Maio de 2026)</w:t>
             </w:r>
             <w:r>
               <w:rPr>
@@ -2815,7 +2800,7 @@
                 <w:noProof/>
                 <w:webHidden/>
               </w:rPr>
-              <w:instrText xml:space="preserve"> PAGEREF _Toc232850982 \h </w:instrText>
+              <w:instrText xml:space="preserve"> PAGEREF _Toc232856248 \h </w:instrText>
             </w:r>
             <w:r>
               <w:rPr>
@@ -2835,7 +2820,7 @@
                 <w:noProof/>
                 <w:webHidden/>
               </w:rPr>
-              <w:t>20</w:t>
+              <w:t>19</w:t>
             </w:r>
             <w:r>
               <w:rPr>
@@ -2864,7 +2849,7 @@
               <w14:ligatures w14:val="standardContextual"/>
             </w:rPr>
           </w:pPr>
-          <w:hyperlink w:anchor="_Toc232850983" w:history="1">
+          <w:hyperlink w:anchor="_Toc232856249" w:history="1">
             <w:r>
               <w:rPr>
                 <w:rStyle w:val="Hiperligao"/>
@@ -2890,22 +2875,7 @@
                 <w:rStyle w:val="Hiperligao"/>
                 <w:noProof/>
               </w:rPr>
-              <w:t>Sprint 2 (</w:t>
-            </w:r>
-            <w:r>
-              <w:rPr>
-                <w:rStyle w:val="Hiperligao"/>
-                <w:noProof/>
-                <w:highlight w:val="yellow"/>
-              </w:rPr>
-              <w:t>Dia de Mês de Ano a Dia de Mês de Ano</w:t>
-            </w:r>
-            <w:r>
-              <w:rPr>
-                <w:rStyle w:val="Hiperligao"/>
-                <w:noProof/>
-              </w:rPr>
-              <w:t>)</w:t>
+              <w:t>Sprint 2 (14 de 5 de 2026 a 26 de 5 de 2026)</w:t>
             </w:r>
             <w:r>
               <w:rPr>
@@ -2926,7 +2896,7 @@
                 <w:noProof/>
                 <w:webHidden/>
               </w:rPr>
-              <w:instrText xml:space="preserve"> PAGEREF _Toc232850983 \h </w:instrText>
+              <w:instrText xml:space="preserve"> PAGEREF _Toc232856249 \h </w:instrText>
             </w:r>
             <w:r>
               <w:rPr>
@@ -2946,7 +2916,7 @@
                 <w:noProof/>
                 <w:webHidden/>
               </w:rPr>
-              <w:t>24</w:t>
+              <w:t>21</w:t>
             </w:r>
             <w:r>
               <w:rPr>
@@ -2975,7 +2945,7 @@
               <w14:ligatures w14:val="standardContextual"/>
             </w:rPr>
           </w:pPr>
-          <w:hyperlink w:anchor="_Toc232850984" w:history="1">
+          <w:hyperlink w:anchor="_Toc232856250" w:history="1">
             <w:r>
               <w:rPr>
                 <w:rStyle w:val="Hiperligao"/>
@@ -3001,22 +2971,7 @@
                 <w:rStyle w:val="Hiperligao"/>
                 <w:noProof/>
               </w:rPr>
-              <w:t>Sprint 3 (</w:t>
-            </w:r>
-            <w:r>
-              <w:rPr>
-                <w:rStyle w:val="Hiperligao"/>
-                <w:noProof/>
-                <w:highlight w:val="yellow"/>
-              </w:rPr>
-              <w:t>Dia de Mês de Ano a Dia de Mês de Ano</w:t>
-            </w:r>
-            <w:r>
-              <w:rPr>
-                <w:rStyle w:val="Hiperligao"/>
-                <w:noProof/>
-              </w:rPr>
-              <w:t>)</w:t>
+              <w:t>Sprint 3 (26 de Maio até dia 4 de Junho)</w:t>
             </w:r>
             <w:r>
               <w:rPr>
@@ -3037,7 +2992,7 @@
                 <w:noProof/>
                 <w:webHidden/>
               </w:rPr>
-              <w:instrText xml:space="preserve"> PAGEREF _Toc232850984 \h </w:instrText>
+              <w:instrText xml:space="preserve"> PAGEREF _Toc232856250 \h </w:instrText>
             </w:r>
             <w:r>
               <w:rPr>
@@ -3057,7 +3012,7 @@
                 <w:noProof/>
                 <w:webHidden/>
               </w:rPr>
-              <w:t>26</w:t>
+              <w:t>24</w:t>
             </w:r>
             <w:r>
               <w:rPr>
@@ -3088,7 +3043,7 @@
               <w14:ligatures w14:val="standardContextual"/>
             </w:rPr>
           </w:pPr>
-          <w:hyperlink w:anchor="_Toc232850985" w:history="1">
+          <w:hyperlink w:anchor="_Toc232856251" w:history="1">
             <w:r>
               <w:rPr>
                 <w:rStyle w:val="Hiperligao"/>
@@ -3146,7 +3101,7 @@
                 <w:noProof/>
                 <w:webHidden/>
               </w:rPr>
-              <w:instrText xml:space="preserve"> PAGEREF _Toc232850985 \h </w:instrText>
+              <w:instrText xml:space="preserve"> PAGEREF _Toc232856251 \h </w:instrText>
             </w:r>
             <w:r>
               <w:rPr>
@@ -3166,7 +3121,7 @@
                 <w:noProof/>
                 <w:webHidden/>
               </w:rPr>
-              <w:t>27</w:t>
+              <w:t>26</w:t>
             </w:r>
             <w:r>
               <w:rPr>
@@ -3198,7 +3153,7 @@
               <w14:ligatures w14:val="standardContextual"/>
             </w:rPr>
           </w:pPr>
-          <w:hyperlink w:anchor="_Toc232850986" w:history="1">
+          <w:hyperlink w:anchor="_Toc232856252" w:history="1">
             <w:r>
               <w:rPr>
                 <w:rStyle w:val="Hiperligao"/>
@@ -3248,7 +3203,7 @@
                 <w:noProof/>
                 <w:webHidden/>
               </w:rPr>
-              <w:instrText xml:space="preserve"> PAGEREF _Toc232850986 \h </w:instrText>
+              <w:instrText xml:space="preserve"> PAGEREF _Toc232856252 \h </w:instrText>
             </w:r>
             <w:r>
               <w:rPr>
@@ -3268,7 +3223,7 @@
                 <w:noProof/>
                 <w:webHidden/>
               </w:rPr>
-              <w:t>29</w:t>
+              <w:t>28</w:t>
             </w:r>
             <w:r>
               <w:rPr>
@@ -3323,7 +3278,7 @@
           <w:noProof/>
         </w:rPr>
       </w:pPr>
-      <w:bookmarkStart w:id="0" w:name="_Toc232850964"/>
+      <w:bookmarkStart w:id="0" w:name="_Toc232856230"/>
       <w:r>
         <w:rPr>
           <w:noProof/>
@@ -3343,7 +3298,11 @@
         <w:rPr>
           <w:rFonts w:eastAsiaTheme="minorEastAsia"/>
           <w:noProof/>
+          <w:kern w:val="2"/>
+          <w:sz w:val="24"/>
+          <w:szCs w:val="24"/>
           <w:lang w:eastAsia="pt-PT"/>
+          <w14:ligatures w14:val="standardContextual"/>
         </w:rPr>
       </w:pPr>
       <w:r>
@@ -3355,7 +3314,7 @@
       <w:r>
         <w:fldChar w:fldCharType="separate"/>
       </w:r>
-      <w:hyperlink w:anchor="_Toc231912719" w:history="1">
+      <w:hyperlink w:anchor="_Toc232856217" w:history="1">
         <w:r>
           <w:rPr>
             <w:rStyle w:val="Hiperligao"/>
@@ -3382,7 +3341,155 @@
             <w:noProof/>
             <w:webHidden/>
           </w:rPr>
-          <w:instrText xml:space="preserve"> PAGEREF _Toc231912719 \h </w:instrText>
+          <w:instrText xml:space="preserve"> PAGEREF _Toc232856217 \h </w:instrText>
+        </w:r>
+        <w:r>
+          <w:rPr>
+            <w:noProof/>
+            <w:webHidden/>
+          </w:rPr>
+        </w:r>
+        <w:r>
+          <w:rPr>
+            <w:noProof/>
+            <w:webHidden/>
+          </w:rPr>
+          <w:fldChar w:fldCharType="separate"/>
+        </w:r>
+        <w:r>
+          <w:rPr>
+            <w:noProof/>
+            <w:webHidden/>
+          </w:rPr>
+          <w:t>11</w:t>
+        </w:r>
+        <w:r>
+          <w:rPr>
+            <w:noProof/>
+            <w:webHidden/>
+          </w:rPr>
+          <w:fldChar w:fldCharType="end"/>
+        </w:r>
+      </w:hyperlink>
+    </w:p>
+    <w:p>
+      <w:pPr>
+        <w:pStyle w:val="ndicedeilustraes"/>
+        <w:tabs>
+          <w:tab w:val="right" w:leader="dot" w:pos="9628"/>
+        </w:tabs>
+        <w:rPr>
+          <w:rFonts w:eastAsiaTheme="minorEastAsia"/>
+          <w:noProof/>
+          <w:kern w:val="2"/>
+          <w:sz w:val="24"/>
+          <w:szCs w:val="24"/>
+          <w:lang w:eastAsia="pt-PT"/>
+          <w14:ligatures w14:val="standardContextual"/>
+        </w:rPr>
+      </w:pPr>
+      <w:hyperlink w:anchor="_Toc232856218" w:history="1">
+        <w:r>
+          <w:rPr>
+            <w:rStyle w:val="Hiperligao"/>
+            <w:noProof/>
+          </w:rPr>
+          <w:t>Figura 2 - Página Registrar Mockup/WireFrame</w:t>
+        </w:r>
+        <w:r>
+          <w:rPr>
+            <w:noProof/>
+            <w:webHidden/>
+          </w:rPr>
+          <w:tab/>
+        </w:r>
+        <w:r>
+          <w:rPr>
+            <w:noProof/>
+            <w:webHidden/>
+          </w:rPr>
+          <w:fldChar w:fldCharType="begin"/>
+        </w:r>
+        <w:r>
+          <w:rPr>
+            <w:noProof/>
+            <w:webHidden/>
+          </w:rPr>
+          <w:instrText xml:space="preserve"> PAGEREF _Toc232856218 \h </w:instrText>
+        </w:r>
+        <w:r>
+          <w:rPr>
+            <w:noProof/>
+            <w:webHidden/>
+          </w:rPr>
+        </w:r>
+        <w:r>
+          <w:rPr>
+            <w:noProof/>
+            <w:webHidden/>
+          </w:rPr>
+          <w:fldChar w:fldCharType="separate"/>
+        </w:r>
+        <w:r>
+          <w:rPr>
+            <w:noProof/>
+            <w:webHidden/>
+          </w:rPr>
+          <w:t>11</w:t>
+        </w:r>
+        <w:r>
+          <w:rPr>
+            <w:noProof/>
+            <w:webHidden/>
+          </w:rPr>
+          <w:fldChar w:fldCharType="end"/>
+        </w:r>
+      </w:hyperlink>
+    </w:p>
+    <w:p>
+      <w:pPr>
+        <w:pStyle w:val="ndicedeilustraes"/>
+        <w:tabs>
+          <w:tab w:val="right" w:leader="dot" w:pos="9628"/>
+        </w:tabs>
+        <w:rPr>
+          <w:rFonts w:eastAsiaTheme="minorEastAsia"/>
+          <w:noProof/>
+          <w:kern w:val="2"/>
+          <w:sz w:val="24"/>
+          <w:szCs w:val="24"/>
+          <w:lang w:eastAsia="pt-PT"/>
+          <w14:ligatures w14:val="standardContextual"/>
+        </w:rPr>
+      </w:pPr>
+      <w:hyperlink w:anchor="_Toc232856219" w:history="1">
+        <w:r>
+          <w:rPr>
+            <w:rStyle w:val="Hiperligao"/>
+            <w:noProof/>
+          </w:rPr>
+          <w:t>Figura 3 – Mockup/WireFrame do ecrã principal</w:t>
+        </w:r>
+        <w:r>
+          <w:rPr>
+            <w:noProof/>
+            <w:webHidden/>
+          </w:rPr>
+          <w:tab/>
+        </w:r>
+        <w:r>
+          <w:rPr>
+            <w:noProof/>
+            <w:webHidden/>
+          </w:rPr>
+          <w:fldChar w:fldCharType="begin"/>
+        </w:r>
+        <w:r>
+          <w:rPr>
+            <w:noProof/>
+            <w:webHidden/>
+          </w:rPr>
+          <w:instrText xml:space="preserve"> PAGEREF _Toc232856219 \h </w:instrText>
         </w:r>
         <w:r>
           <w:rPr>
@@ -3422,16 +3529,20 @@
         <w:rPr>
           <w:rFonts w:eastAsiaTheme="minorEastAsia"/>
           <w:noProof/>
+          <w:kern w:val="2"/>
+          <w:sz w:val="24"/>
+          <w:szCs w:val="24"/>
           <w:lang w:eastAsia="pt-PT"/>
+          <w14:ligatures w14:val="standardContextual"/>
         </w:rPr>
       </w:pPr>
-      <w:hyperlink w:anchor="_Toc231912720" w:history="1">
+      <w:hyperlink w:anchor="_Toc232856220" w:history="1">
         <w:r>
           <w:rPr>
             <w:rStyle w:val="Hiperligao"/>
             <w:noProof/>
           </w:rPr>
-          <w:t>Figura 2 - Página Registrar Mockup/WireFrame</w:t>
+          <w:t>Figura 4 - Mockup/WireFrame de FormUtilizadores</w:t>
         </w:r>
         <w:r>
           <w:rPr>
@@ -3452,7 +3563,7 @@
             <w:noProof/>
             <w:webHidden/>
           </w:rPr>
-          <w:instrText xml:space="preserve"> PAGEREF _Toc231912720 \h </w:instrText>
+          <w:instrText xml:space="preserve"> PAGEREF _Toc232856220 \h </w:instrText>
         </w:r>
         <w:r>
           <w:rPr>
@@ -3492,16 +3603,20 @@
         <w:rPr>
           <w:rFonts w:eastAsiaTheme="minorEastAsia"/>
           <w:noProof/>
+          <w:kern w:val="2"/>
+          <w:sz w:val="24"/>
+          <w:szCs w:val="24"/>
           <w:lang w:eastAsia="pt-PT"/>
+          <w14:ligatures w14:val="standardContextual"/>
         </w:rPr>
       </w:pPr>
-      <w:hyperlink w:anchor="_Toc231912721" w:history="1">
+      <w:hyperlink w:anchor="_Toc232856221" w:history="1">
         <w:r>
           <w:rPr>
             <w:rStyle w:val="Hiperligao"/>
             <w:noProof/>
           </w:rPr>
-          <w:t>Figura 3 – Mockup/WireFrame do ecrã principal</w:t>
+          <w:t>Figura 5 Mockup/WireFrame de FormArtigo</w:t>
         </w:r>
         <w:r>
           <w:rPr>
@@ -3522,7 +3637,7 @@
             <w:noProof/>
             <w:webHidden/>
           </w:rPr>
-          <w:instrText xml:space="preserve"> PAGEREF _Toc231912721 \h </w:instrText>
+          <w:instrText xml:space="preserve"> PAGEREF _Toc232856221 \h </w:instrText>
         </w:r>
         <w:r>
           <w:rPr>
@@ -3562,16 +3677,20 @@
         <w:rPr>
           <w:rFonts w:eastAsiaTheme="minorEastAsia"/>
           <w:noProof/>
+          <w:kern w:val="2"/>
+          <w:sz w:val="24"/>
+          <w:szCs w:val="24"/>
           <w:lang w:eastAsia="pt-PT"/>
+          <w14:ligatures w14:val="standardContextual"/>
         </w:rPr>
       </w:pPr>
-      <w:hyperlink w:anchor="_Toc231912722" w:history="1">
+      <w:hyperlink w:anchor="_Toc232856222" w:history="1">
         <w:r>
           <w:rPr>
             <w:rStyle w:val="Hiperligao"/>
             <w:noProof/>
           </w:rPr>
-          <w:t>Figura 4 - Mockup/WireFrame de FormUtilizadores</w:t>
+          <w:t>Figura 6 Mockup/WireFrame de FormTiposArtigo</w:t>
         </w:r>
         <w:r>
           <w:rPr>
@@ -3592,7 +3711,81 @@
             <w:noProof/>
             <w:webHidden/>
           </w:rPr>
-          <w:instrText xml:space="preserve"> PAGEREF _Toc231912722 \h </w:instrText>
+          <w:instrText xml:space="preserve"> PAGEREF _Toc232856222 \h </w:instrText>
+        </w:r>
+        <w:r>
+          <w:rPr>
+            <w:noProof/>
+            <w:webHidden/>
+          </w:rPr>
+        </w:r>
+        <w:r>
+          <w:rPr>
+            <w:noProof/>
+            <w:webHidden/>
+          </w:rPr>
+          <w:fldChar w:fldCharType="separate"/>
+        </w:r>
+        <w:r>
+          <w:rPr>
+            <w:noProof/>
+            <w:webHidden/>
+          </w:rPr>
+          <w:t>12</w:t>
+        </w:r>
+        <w:r>
+          <w:rPr>
+            <w:noProof/>
+            <w:webHidden/>
+          </w:rPr>
+          <w:fldChar w:fldCharType="end"/>
+        </w:r>
+      </w:hyperlink>
+    </w:p>
+    <w:p>
+      <w:pPr>
+        <w:pStyle w:val="ndicedeilustraes"/>
+        <w:tabs>
+          <w:tab w:val="right" w:leader="dot" w:pos="9628"/>
+        </w:tabs>
+        <w:rPr>
+          <w:rFonts w:eastAsiaTheme="minorEastAsia"/>
+          <w:noProof/>
+          <w:kern w:val="2"/>
+          <w:sz w:val="24"/>
+          <w:szCs w:val="24"/>
+          <w:lang w:eastAsia="pt-PT"/>
+          <w14:ligatures w14:val="standardContextual"/>
+        </w:rPr>
+      </w:pPr>
+      <w:hyperlink w:anchor="_Toc232856223" w:history="1">
+        <w:r>
+          <w:rPr>
+            <w:rStyle w:val="Hiperligao"/>
+            <w:noProof/>
+          </w:rPr>
+          <w:t>Figura 7 Mockup/WireFrame de FormOrcamentos</w:t>
+        </w:r>
+        <w:r>
+          <w:rPr>
+            <w:noProof/>
+            <w:webHidden/>
+          </w:rPr>
+          <w:tab/>
+        </w:r>
+        <w:r>
+          <w:rPr>
+            <w:noProof/>
+            <w:webHidden/>
+          </w:rPr>
+          <w:fldChar w:fldCharType="begin"/>
+        </w:r>
+        <w:r>
+          <w:rPr>
+            <w:noProof/>
+            <w:webHidden/>
+          </w:rPr>
+          <w:instrText xml:space="preserve"> PAGEREF _Toc232856223 \h </w:instrText>
         </w:r>
         <w:r>
           <w:rPr>
@@ -3632,16 +3825,20 @@
         <w:rPr>
           <w:rFonts w:eastAsiaTheme="minorEastAsia"/>
           <w:noProof/>
+          <w:kern w:val="2"/>
+          <w:sz w:val="24"/>
+          <w:szCs w:val="24"/>
           <w:lang w:eastAsia="pt-PT"/>
+          <w14:ligatures w14:val="standardContextual"/>
         </w:rPr>
       </w:pPr>
-      <w:hyperlink w:anchor="_Toc231912723" w:history="1">
+      <w:hyperlink w:anchor="_Toc232856224" w:history="1">
         <w:r>
           <w:rPr>
             <w:rStyle w:val="Hiperligao"/>
             <w:noProof/>
           </w:rPr>
-          <w:t>Figura 5 Mockup/WireFrame de FormArtigo</w:t>
+          <w:t>Figura 8 Mockup/WireFrame de FormEstatísticas</w:t>
         </w:r>
         <w:r>
           <w:rPr>
@@ -3662,7 +3859,7 @@
             <w:noProof/>
             <w:webHidden/>
           </w:rPr>
-          <w:instrText xml:space="preserve"> PAGEREF _Toc231912723 \h </w:instrText>
+          <w:instrText xml:space="preserve"> PAGEREF _Toc232856224 \h </w:instrText>
         </w:r>
         <w:r>
           <w:rPr>
@@ -3702,16 +3899,20 @@
         <w:rPr>
           <w:rFonts w:eastAsiaTheme="minorEastAsia"/>
           <w:noProof/>
+          <w:kern w:val="2"/>
+          <w:sz w:val="24"/>
+          <w:szCs w:val="24"/>
           <w:lang w:eastAsia="pt-PT"/>
+          <w14:ligatures w14:val="standardContextual"/>
         </w:rPr>
       </w:pPr>
-      <w:hyperlink w:anchor="_Toc231912724" w:history="1">
+      <w:hyperlink w:anchor="_Toc232856225" w:history="1">
         <w:r>
           <w:rPr>
             <w:rStyle w:val="Hiperligao"/>
             <w:noProof/>
           </w:rPr>
-          <w:t>Figura 6 Mockup/WireFrame de FormTiposArtigo</w:t>
+          <w:t>Figura 9 Mockup/WireFrame de FormEditarCompras</w:t>
         </w:r>
         <w:r>
           <w:rPr>
@@ -3732,7 +3933,7 @@
             <w:noProof/>
             <w:webHidden/>
           </w:rPr>
-          <w:instrText xml:space="preserve"> PAGEREF _Toc231912724 \h </w:instrText>
+          <w:instrText xml:space="preserve"> PAGEREF _Toc232856225 \h </w:instrText>
         </w:r>
         <w:r>
           <w:rPr>
@@ -3772,16 +3973,20 @@
         <w:rPr>
           <w:rFonts w:eastAsiaTheme="minorEastAsia"/>
           <w:noProof/>
+          <w:kern w:val="2"/>
+          <w:sz w:val="24"/>
+          <w:szCs w:val="24"/>
           <w:lang w:eastAsia="pt-PT"/>
+          <w14:ligatures w14:val="standardContextual"/>
         </w:rPr>
       </w:pPr>
-      <w:hyperlink w:anchor="_Toc231912725" w:history="1">
+      <w:hyperlink w:anchor="_Toc232856226" w:history="1">
         <w:r>
           <w:rPr>
             <w:rStyle w:val="Hiperligao"/>
             <w:noProof/>
           </w:rPr>
-          <w:t>Figura 7 Mockup/WireFrame de FormOrcamentos</w:t>
+          <w:t>Figura 10 Mockup/WireFrame de FormModoCompra</w:t>
         </w:r>
         <w:r>
           <w:rPr>
@@ -3802,7 +4007,7 @@
             <w:noProof/>
             <w:webHidden/>
           </w:rPr>
-          <w:instrText xml:space="preserve"> PAGEREF _Toc231912725 \h </w:instrText>
+          <w:instrText xml:space="preserve"> PAGEREF _Toc232856226 \h </w:instrText>
         </w:r>
         <w:r>
           <w:rPr>
@@ -3842,16 +4047,28 @@
         <w:rPr>
           <w:rFonts w:eastAsiaTheme="minorEastAsia"/>
           <w:noProof/>
+          <w:kern w:val="2"/>
+          <w:sz w:val="24"/>
+          <w:szCs w:val="24"/>
           <w:lang w:eastAsia="pt-PT"/>
+          <w14:ligatures w14:val="standardContextual"/>
         </w:rPr>
       </w:pPr>
-      <w:hyperlink w:anchor="_Toc231912726" w:history="1">
+      <w:hyperlink w:anchor="_Toc232856227" w:history="1">
         <w:r>
           <w:rPr>
             <w:rStyle w:val="Hiperligao"/>
             <w:noProof/>
           </w:rPr>
-          <w:t>Figura 8 Mockup/WireFrame de FormEstatísticas</w:t>
+          <w:t xml:space="preserve">Figura 11 – Diagrama de classes </w:t>
+        </w:r>
+        <w:r>
+          <w:rPr>
+            <w:rStyle w:val="Hiperligao"/>
+            <w:noProof/>
+            <w:highlight w:val="yellow"/>
+          </w:rPr>
+          <w:t>do iShopping.</w:t>
         </w:r>
         <w:r>
           <w:rPr>
@@ -3872,7 +4089,7 @@
             <w:noProof/>
             <w:webHidden/>
           </w:rPr>
-          <w:instrText xml:space="preserve"> PAGEREF _Toc231912726 \h </w:instrText>
+          <w:instrText xml:space="preserve"> PAGEREF _Toc232856227 \h </w:instrText>
         </w:r>
         <w:r>
           <w:rPr>
@@ -3904,224 +4121,6 @@
       </w:hyperlink>
     </w:p>
     <w:p>
-      <w:pPr>
-        <w:pStyle w:val="ndicedeilustraes"/>
-        <w:tabs>
-          <w:tab w:val="right" w:leader="dot" w:pos="9628"/>
-        </w:tabs>
-        <w:rPr>
-          <w:rFonts w:eastAsiaTheme="minorEastAsia"/>
-          <w:noProof/>
-          <w:lang w:eastAsia="pt-PT"/>
-        </w:rPr>
-      </w:pPr>
-      <w:hyperlink w:anchor="_Toc231912727" w:history="1">
-        <w:r>
-          <w:rPr>
-            <w:rStyle w:val="Hiperligao"/>
-            <w:noProof/>
-          </w:rPr>
-          <w:t>Figura 9 Mockup/WireFrame de FormEditarCompras</w:t>
-        </w:r>
-        <w:r>
-          <w:rPr>
-            <w:noProof/>
-            <w:webHidden/>
-          </w:rPr>
-          <w:tab/>
-        </w:r>
-        <w:r>
-          <w:rPr>
-            <w:noProof/>
-            <w:webHidden/>
-          </w:rPr>
-          <w:fldChar w:fldCharType="begin"/>
-        </w:r>
-        <w:r>
-          <w:rPr>
-            <w:noProof/>
-            <w:webHidden/>
-          </w:rPr>
-          <w:instrText xml:space="preserve"> PAGEREF _Toc231912727 \h </w:instrText>
-        </w:r>
-        <w:r>
-          <w:rPr>
-            <w:noProof/>
-            <w:webHidden/>
-          </w:rPr>
-        </w:r>
-        <w:r>
-          <w:rPr>
-            <w:noProof/>
-            <w:webHidden/>
-          </w:rPr>
-          <w:fldChar w:fldCharType="separate"/>
-        </w:r>
-        <w:r>
-          <w:rPr>
-            <w:noProof/>
-            <w:webHidden/>
-          </w:rPr>
-          <w:t>14</w:t>
-        </w:r>
-        <w:r>
-          <w:rPr>
-            <w:noProof/>
-            <w:webHidden/>
-          </w:rPr>
-          <w:fldChar w:fldCharType="end"/>
-        </w:r>
-      </w:hyperlink>
-    </w:p>
-    <w:p>
-      <w:pPr>
-        <w:pStyle w:val="ndicedeilustraes"/>
-        <w:tabs>
-          <w:tab w:val="right" w:leader="dot" w:pos="9628"/>
-        </w:tabs>
-        <w:rPr>
-          <w:rFonts w:eastAsiaTheme="minorEastAsia"/>
-          <w:noProof/>
-          <w:lang w:eastAsia="pt-PT"/>
-        </w:rPr>
-      </w:pPr>
-      <w:hyperlink w:anchor="_Toc231912728" w:history="1">
-        <w:r>
-          <w:rPr>
-            <w:rStyle w:val="Hiperligao"/>
-            <w:noProof/>
-          </w:rPr>
-          <w:t>Figura 10 Mockup/WireFrame de FormModoCompra</w:t>
-        </w:r>
-        <w:r>
-          <w:rPr>
-            <w:noProof/>
-            <w:webHidden/>
-          </w:rPr>
-          <w:tab/>
-        </w:r>
-        <w:r>
-          <w:rPr>
-            <w:noProof/>
-            <w:webHidden/>
-          </w:rPr>
-          <w:fldChar w:fldCharType="begin"/>
-        </w:r>
-        <w:r>
-          <w:rPr>
-            <w:noProof/>
-            <w:webHidden/>
-          </w:rPr>
-          <w:instrText xml:space="preserve"> PAGEREF _Toc231912728 \h </w:instrText>
-        </w:r>
-        <w:r>
-          <w:rPr>
-            <w:noProof/>
-            <w:webHidden/>
-          </w:rPr>
-        </w:r>
-        <w:r>
-          <w:rPr>
-            <w:noProof/>
-            <w:webHidden/>
-          </w:rPr>
-          <w:fldChar w:fldCharType="separate"/>
-        </w:r>
-        <w:r>
-          <w:rPr>
-            <w:noProof/>
-            <w:webHidden/>
-          </w:rPr>
-          <w:t>15</w:t>
-        </w:r>
-        <w:r>
-          <w:rPr>
-            <w:noProof/>
-            <w:webHidden/>
-          </w:rPr>
-          <w:fldChar w:fldCharType="end"/>
-        </w:r>
-      </w:hyperlink>
-    </w:p>
-    <w:p>
-      <w:pPr>
-        <w:pStyle w:val="ndicedeilustraes"/>
-        <w:tabs>
-          <w:tab w:val="right" w:leader="dot" w:pos="9628"/>
-        </w:tabs>
-        <w:rPr>
-          <w:rFonts w:eastAsiaTheme="minorEastAsia"/>
-          <w:noProof/>
-          <w:lang w:eastAsia="pt-PT"/>
-        </w:rPr>
-      </w:pPr>
-      <w:hyperlink w:anchor="_Toc231912729" w:history="1">
-        <w:r>
-          <w:rPr>
-            <w:rStyle w:val="Hiperligao"/>
-            <w:noProof/>
-          </w:rPr>
-          <w:t>Figura 11 – Diagrama de classes</w:t>
-        </w:r>
-        <w:r>
-          <w:rPr>
-            <w:rStyle w:val="Hiperligao"/>
-            <w:noProof/>
-            <w:highlight w:val="yellow"/>
-          </w:rPr>
-          <w:t>.</w:t>
-        </w:r>
-        <w:r>
-          <w:rPr>
-            <w:noProof/>
-            <w:webHidden/>
-          </w:rPr>
-          <w:tab/>
-        </w:r>
-        <w:r>
-          <w:rPr>
-            <w:noProof/>
-            <w:webHidden/>
-          </w:rPr>
-          <w:fldChar w:fldCharType="begin"/>
-        </w:r>
-        <w:r>
-          <w:rPr>
-            <w:noProof/>
-            <w:webHidden/>
-          </w:rPr>
-          <w:instrText xml:space="preserve"> PAGEREF _Toc231912729 \h </w:instrText>
-        </w:r>
-        <w:r>
-          <w:rPr>
-            <w:noProof/>
-            <w:webHidden/>
-          </w:rPr>
-        </w:r>
-        <w:r>
-          <w:rPr>
-            <w:noProof/>
-            <w:webHidden/>
-          </w:rPr>
-          <w:fldChar w:fldCharType="separate"/>
-        </w:r>
-        <w:r>
-          <w:rPr>
-            <w:noProof/>
-            <w:webHidden/>
-          </w:rPr>
-          <w:t>15</w:t>
-        </w:r>
-        <w:r>
-          <w:rPr>
-            <w:noProof/>
-            <w:webHidden/>
-          </w:rPr>
-          <w:fldChar w:fldCharType="end"/>
-        </w:r>
-      </w:hyperlink>
-    </w:p>
-    <w:p>
       <w:r>
         <w:fldChar w:fldCharType="end"/>
       </w:r>
@@ -4141,7 +4140,7 @@
         </w:numPr>
         <w:ind w:left="432" w:hanging="432"/>
       </w:pPr>
-      <w:bookmarkStart w:id="1" w:name="_Toc232850965"/>
+      <w:bookmarkStart w:id="1" w:name="_Toc232856231"/>
       <w:r>
         <w:lastRenderedPageBreak/>
         <w:t>Índice de Tabelas</w:t>
@@ -4522,7 +4521,7 @@
       <w:pPr>
         <w:pStyle w:val="Ttulo1"/>
       </w:pPr>
-      <w:bookmarkStart w:id="2" w:name="_Toc232850966"/>
+      <w:bookmarkStart w:id="2" w:name="_Toc232856232"/>
       <w:r>
         <w:lastRenderedPageBreak/>
         <w:t>Introdução</w:t>
@@ -4638,7 +4637,7 @@
           <w:noProof/>
         </w:rPr>
       </w:pPr>
-      <w:bookmarkStart w:id="3" w:name="_Toc232850967"/>
+      <w:bookmarkStart w:id="3" w:name="_Toc232856233"/>
       <w:r>
         <w:rPr>
           <w:noProof/>
@@ -4718,7 +4717,7 @@
       <w:pPr>
         <w:pStyle w:val="Ttulo1"/>
       </w:pPr>
-      <w:bookmarkStart w:id="4" w:name="_Toc232850968"/>
+      <w:bookmarkStart w:id="4" w:name="_Toc232856234"/>
       <w:r>
         <w:lastRenderedPageBreak/>
         <w:t>Especificação do Sistema</w:t>
@@ -4775,7 +4774,7 @@
       <w:pPr>
         <w:pStyle w:val="Ttulo2"/>
       </w:pPr>
-      <w:bookmarkStart w:id="5" w:name="_Toc232850969"/>
+      <w:bookmarkStart w:id="5" w:name="_Toc232856235"/>
       <w:r>
         <w:t>Análise Concorrencial</w:t>
       </w:r>
@@ -4783,28 +4782,19 @@
     </w:p>
     <w:p>
       <w:r>
+        <w:t>An</w:t>
+      </w:r>
+      <w:r>
         <w:rPr>
           <w:highlight w:val="yellow"/>
         </w:rPr>
-        <w:t>&lt;Análise de 3 sistemas relacionados</w:t>
-      </w:r>
-      <w:r>
-        <w:rPr>
-          <w:highlight w:val="yellow"/>
-        </w:rPr>
-        <w:t xml:space="preserve"> </w:t>
-      </w:r>
-      <w:r>
-        <w:rPr>
-          <w:highlight w:val="yellow"/>
-        </w:rPr>
-        <w:t>usados em outras configurações operacionais que disponibilizam funcionalidades idênticas ou relacionadas</w:t>
-      </w:r>
-      <w:r>
-        <w:rPr>
-          <w:highlight w:val="yellow"/>
-        </w:rPr>
-        <w:t xml:space="preserve"> &gt;</w:t>
+        <w:t>á</w:t>
+      </w:r>
+      <w:r>
+        <w:t>lise concorrencial permite-nos ter uma ideia sobre as utilidades que estão disponíveis nas plataformas dos nossos rivais. Este processo permite-nos avaliar e monitorar os pontos fortes, fracos e as suas estratégias de forma a conseguir melhorar a nossa própria plataforma.</w:t>
+      </w:r>
+      <w:r>
+        <w:t xml:space="preserve"> Nesta secção está apresentado as descrições de 3 rivais.</w:t>
       </w:r>
     </w:p>
     <w:p/>
@@ -4812,7 +4802,7 @@
       <w:pPr>
         <w:pStyle w:val="Ttulo3"/>
       </w:pPr>
-      <w:bookmarkStart w:id="6" w:name="_Toc232850970"/>
+      <w:bookmarkStart w:id="6" w:name="_Toc232856236"/>
       <w:proofErr w:type="spellStart"/>
       <w:r>
         <w:t>Bring</w:t>
@@ -5030,6 +5020,7 @@
                 <w:i w:val="0"/>
                 <w:iCs w:val="0"/>
               </w:rPr>
+              <w:lastRenderedPageBreak/>
               <w:t>Site:</w:t>
             </w:r>
           </w:p>
@@ -5075,7 +5066,6 @@
                 <w:i w:val="0"/>
                 <w:iCs w:val="0"/>
               </w:rPr>
-              <w:lastRenderedPageBreak/>
               <w:t>Descrição</w:t>
             </w:r>
             <w:r>
@@ -5365,7 +5355,7 @@
       <w:pPr>
         <w:pStyle w:val="Ttulo3"/>
       </w:pPr>
-      <w:bookmarkStart w:id="8" w:name="_Toc232850971"/>
+      <w:bookmarkStart w:id="8" w:name="_Toc232856237"/>
       <w:proofErr w:type="spellStart"/>
       <w:r>
         <w:t>Listonic</w:t>
@@ -5700,6 +5690,7 @@
                 <w:i w:val="0"/>
                 <w:iCs w:val="0"/>
               </w:rPr>
+              <w:lastRenderedPageBreak/>
               <w:t>Desvantagens:</w:t>
             </w:r>
           </w:p>
@@ -5742,7 +5733,6 @@
                 <w:i w:val="0"/>
                 <w:iCs w:val="0"/>
               </w:rPr>
-              <w:lastRenderedPageBreak/>
               <w:t>O que falta:</w:t>
             </w:r>
           </w:p>
@@ -5769,7 +5759,7 @@
       <w:pPr>
         <w:pStyle w:val="Ttulo3"/>
       </w:pPr>
-      <w:bookmarkStart w:id="10" w:name="_Toc232850972"/>
+      <w:bookmarkStart w:id="10" w:name="_Toc232856238"/>
       <w:proofErr w:type="spellStart"/>
       <w:r>
         <w:t>HomeBudget</w:t>
@@ -6245,7 +6235,7 @@
       <w:pPr>
         <w:pStyle w:val="Ttulo3"/>
       </w:pPr>
-      <w:bookmarkStart w:id="12" w:name="_Toc232850973"/>
+      <w:bookmarkStart w:id="12" w:name="_Toc232856239"/>
       <w:r>
         <w:t>Comparação dos Sistemas</w:t>
       </w:r>
@@ -6937,7 +6927,7 @@
       <w:pPr>
         <w:pStyle w:val="Ttulo3"/>
       </w:pPr>
-      <w:bookmarkStart w:id="14" w:name="_Toc232850974"/>
+      <w:bookmarkStart w:id="14" w:name="_Toc232856240"/>
       <w:r>
         <w:t>Enquadramento da análise concorrencial no SI</w:t>
       </w:r>
@@ -7012,7 +7002,7 @@
       <w:pPr>
         <w:pStyle w:val="Ttulo2"/>
       </w:pPr>
-      <w:bookmarkStart w:id="15" w:name="_Toc232850975"/>
+      <w:bookmarkStart w:id="15" w:name="_Toc232856241"/>
       <w:proofErr w:type="spellStart"/>
       <w:r>
         <w:lastRenderedPageBreak/>
@@ -7180,7 +7170,7 @@
         <w:pStyle w:val="Legenda"/>
         <w:jc w:val="center"/>
       </w:pPr>
-      <w:bookmarkStart w:id="16" w:name="_Toc231912719"/>
+      <w:bookmarkStart w:id="16" w:name="_Toc232856217"/>
       <w:r>
         <w:t xml:space="preserve">Figura </w:t>
       </w:r>
@@ -7332,7 +7322,7 @@
           <w:noProof/>
         </w:rPr>
       </w:pPr>
-      <w:bookmarkStart w:id="17" w:name="_Toc231912720"/>
+      <w:bookmarkStart w:id="17" w:name="_Toc232856218"/>
       <w:r>
         <w:t xml:space="preserve">Figura </w:t>
       </w:r>
@@ -7488,8 +7478,8 @@
         <w:pStyle w:val="Legenda"/>
         <w:jc w:val="center"/>
       </w:pPr>
-      <w:bookmarkStart w:id="18" w:name="_Toc231912721"/>
-      <w:bookmarkStart w:id="19" w:name="_Hlk231911393"/>
+      <w:bookmarkStart w:id="18" w:name="_Hlk231911393"/>
+      <w:bookmarkStart w:id="19" w:name="_Toc232856219"/>
       <w:r>
         <w:t xml:space="preserve">Figura </w:t>
       </w:r>
@@ -7520,9 +7510,9 @@
       <w:r>
         <w:t xml:space="preserve"> do ecrã principal</w:t>
       </w:r>
-      <w:bookmarkEnd w:id="18"/>
+      <w:bookmarkEnd w:id="19"/>
     </w:p>
-    <w:bookmarkEnd w:id="19"/>
+    <w:bookmarkEnd w:id="18"/>
     <w:p>
       <w:r>
         <w:rPr>
@@ -7639,7 +7629,7 @@
         <w:pStyle w:val="Legenda"/>
         <w:jc w:val="center"/>
       </w:pPr>
-      <w:bookmarkStart w:id="20" w:name="_Toc231912722"/>
+      <w:bookmarkStart w:id="20" w:name="_Toc232856220"/>
       <w:r>
         <w:t xml:space="preserve">Figura </w:t>
       </w:r>
@@ -7793,7 +7783,7 @@
       <w:pPr>
         <w:pStyle w:val="Legenda"/>
       </w:pPr>
-      <w:bookmarkStart w:id="21" w:name="_Toc231912723"/>
+      <w:bookmarkStart w:id="21" w:name="_Toc232856221"/>
       <w:r>
         <w:t xml:space="preserve">Figura </w:t>
       </w:r>
@@ -7947,7 +7937,7 @@
       <w:pPr>
         <w:pStyle w:val="Legenda"/>
       </w:pPr>
-      <w:bookmarkStart w:id="22" w:name="_Toc231912724"/>
+      <w:bookmarkStart w:id="22" w:name="_Toc232856222"/>
       <w:r>
         <w:t xml:space="preserve">Figura </w:t>
       </w:r>
@@ -8102,7 +8092,7 @@
       <w:pPr>
         <w:pStyle w:val="Legenda"/>
       </w:pPr>
-      <w:bookmarkStart w:id="23" w:name="_Toc231912725"/>
+      <w:bookmarkStart w:id="23" w:name="_Toc232856223"/>
       <w:r>
         <w:t xml:space="preserve">Figura </w:t>
       </w:r>
@@ -8258,7 +8248,7 @@
       <w:pPr>
         <w:pStyle w:val="Legenda"/>
       </w:pPr>
-      <w:bookmarkStart w:id="24" w:name="_Toc231912726"/>
+      <w:bookmarkStart w:id="24" w:name="_Toc232856224"/>
       <w:r>
         <w:t xml:space="preserve">Figura </w:t>
       </w:r>
@@ -8412,7 +8402,7 @@
       <w:pPr>
         <w:pStyle w:val="Legenda"/>
       </w:pPr>
-      <w:bookmarkStart w:id="25" w:name="_Toc231912727"/>
+      <w:bookmarkStart w:id="25" w:name="_Toc232856225"/>
       <w:r>
         <w:t xml:space="preserve">Figura </w:t>
       </w:r>
@@ -8570,7 +8560,7 @@
       <w:pPr>
         <w:pStyle w:val="Legenda"/>
       </w:pPr>
-      <w:bookmarkStart w:id="26" w:name="_Toc231912728"/>
+      <w:bookmarkStart w:id="26" w:name="_Toc232856226"/>
       <w:r>
         <w:t xml:space="preserve">Figura </w:t>
       </w:r>
@@ -8617,7 +8607,7 @@
         <w:pStyle w:val="Ttulo2"/>
       </w:pPr>
       <w:bookmarkStart w:id="27" w:name="_Toc102664379"/>
-      <w:bookmarkStart w:id="28" w:name="_Toc232850976"/>
+      <w:bookmarkStart w:id="28" w:name="_Toc232856242"/>
       <w:r>
         <w:t>Diagrama de Classes</w:t>
       </w:r>
@@ -8695,7 +8685,7 @@
         <w:jc w:val="center"/>
       </w:pPr>
       <w:bookmarkStart w:id="29" w:name="_Toc70951687"/>
-      <w:bookmarkStart w:id="30" w:name="_Toc231912729"/>
+      <w:bookmarkStart w:id="30" w:name="_Toc232856227"/>
       <w:r>
         <w:t xml:space="preserve">Figura </w:t>
       </w:r>
@@ -8711,29 +8701,17 @@
         <w:t xml:space="preserve"> – Diagrama de classes </w:t>
       </w:r>
       <w:r>
-        <w:rPr>
-          <w:highlight w:val="yellow"/>
-        </w:rPr>
         <w:t>do</w:t>
       </w:r>
       <w:r>
-        <w:rPr>
-          <w:highlight w:val="yellow"/>
-        </w:rPr>
         <w:t xml:space="preserve"> </w:t>
       </w:r>
       <w:proofErr w:type="spellStart"/>
       <w:r>
-        <w:rPr>
-          <w:highlight w:val="yellow"/>
-        </w:rPr>
         <w:t>iShopping</w:t>
       </w:r>
       <w:proofErr w:type="spellEnd"/>
       <w:r>
-        <w:rPr>
-          <w:highlight w:val="yellow"/>
-        </w:rPr>
         <w:t>.</w:t>
       </w:r>
       <w:bookmarkEnd w:id="29"/>
@@ -8744,7 +8722,7 @@
       <w:pPr>
         <w:pStyle w:val="Ttulo1"/>
       </w:pPr>
-      <w:bookmarkStart w:id="31" w:name="_Toc232850977"/>
+      <w:bookmarkStart w:id="31" w:name="_Toc232856243"/>
       <w:proofErr w:type="spellStart"/>
       <w:r>
         <w:lastRenderedPageBreak/>
@@ -8766,7 +8744,7 @@
       <w:pPr>
         <w:pStyle w:val="Ttulo2"/>
       </w:pPr>
-      <w:bookmarkStart w:id="32" w:name="_Toc232850978"/>
+      <w:bookmarkStart w:id="32" w:name="_Toc232856244"/>
       <w:r>
         <w:t xml:space="preserve">Aplicação do </w:t>
       </w:r>
@@ -8902,7 +8880,7 @@
       <w:pPr>
         <w:pStyle w:val="Ttulo2"/>
       </w:pPr>
-      <w:bookmarkStart w:id="33" w:name="_Toc232850979"/>
+      <w:bookmarkStart w:id="33" w:name="_Toc232856245"/>
       <w:proofErr w:type="spellStart"/>
       <w:r>
         <w:t>Stakeholders</w:t>
@@ -9453,7 +9431,7 @@
       <w:pPr>
         <w:pStyle w:val="Ttulo2"/>
       </w:pPr>
-      <w:bookmarkStart w:id="35" w:name="_Toc232850980"/>
+      <w:bookmarkStart w:id="35" w:name="_Toc232856246"/>
       <w:r>
         <w:lastRenderedPageBreak/>
         <w:t xml:space="preserve">User </w:t>
@@ -12545,7 +12523,7 @@
       <w:pPr>
         <w:pStyle w:val="Ttulo2"/>
       </w:pPr>
-      <w:bookmarkStart w:id="36" w:name="_Toc232850981"/>
+      <w:bookmarkStart w:id="36" w:name="_Toc232856247"/>
       <w:r>
         <w:t>Execução do projeto</w:t>
       </w:r>
@@ -12923,7 +12901,7 @@
       <w:pPr>
         <w:pStyle w:val="Ttulo3"/>
       </w:pPr>
-      <w:bookmarkStart w:id="37" w:name="_Toc232850982"/>
+      <w:bookmarkStart w:id="37" w:name="_Toc232856248"/>
       <w:r>
         <w:t>Sprint 1 (</w:t>
       </w:r>
@@ -13074,32 +13052,6 @@
             <w:proofErr w:type="spellEnd"/>
             <w:r>
               <w:t xml:space="preserve">: </w:t>
-            </w:r>
-            <w:r>
-              <w:rPr>
-                <w:b w:val="0"/>
-                <w:bCs w:val="0"/>
-                <w:highlight w:val="yellow"/>
-              </w:rPr>
-              <w:t xml:space="preserve">&lt;retirar do </w:t>
-            </w:r>
-            <w:proofErr w:type="spellStart"/>
-            <w:r>
-              <w:rPr>
-                <w:b w:val="0"/>
-                <w:bCs w:val="0"/>
-                <w:highlight w:val="yellow"/>
-              </w:rPr>
-              <w:t>jira</w:t>
-            </w:r>
-            <w:proofErr w:type="spellEnd"/>
-            <w:r>
-              <w:rPr>
-                <w:b w:val="0"/>
-                <w:bCs w:val="0"/>
-                <w:highlight w:val="yellow"/>
-              </w:rPr>
-              <w:t xml:space="preserve"> tal como na imagem:&gt;</w:t>
             </w:r>
           </w:p>
           <w:p>
@@ -13986,21 +13938,12 @@
               </w:rPr>
               <w:t>O que vai fazer esta semana</w:t>
             </w:r>
-            <w:proofErr w:type="gramStart"/>
-            <w:r>
-              <w:rPr>
-                <w:b w:val="0"/>
-                <w:bCs w:val="0"/>
-              </w:rPr>
-              <w:t>: :</w:t>
-            </w:r>
-            <w:proofErr w:type="gramEnd"/>
-            <w:r>
-              <w:rPr>
-                <w:b w:val="0"/>
-                <w:bCs w:val="0"/>
-              </w:rPr>
-              <w:t xml:space="preserve"> </w:t>
+            <w:r>
+              <w:rPr>
+                <w:b w:val="0"/>
+                <w:bCs w:val="0"/>
+              </w:rPr>
+              <w:t xml:space="preserve">: </w:t>
             </w:r>
             <w:proofErr w:type="spellStart"/>
             <w:r>
@@ -14188,115 +14131,6 @@
               </w:numPr>
               <w:contextualSpacing w:val="0"/>
               <w:jc w:val="left"/>
-              <w:rPr>
-                <w:b w:val="0"/>
-                <w:bCs w:val="0"/>
-              </w:rPr>
-            </w:pPr>
-            <w:r>
-              <w:rPr>
-                <w:b w:val="0"/>
-                <w:bCs w:val="0"/>
-                <w:u w:val="single"/>
-              </w:rPr>
-              <w:t>Dificuldades que prevê</w:t>
-            </w:r>
-            <w:r>
-              <w:rPr>
-                <w:b w:val="0"/>
-                <w:bCs w:val="0"/>
-              </w:rPr>
-              <w:t>:</w:t>
-            </w:r>
-          </w:p>
-          <w:p>
-            <w:pPr>
-              <w:jc w:val="left"/>
-              <w:rPr>
-                <w:b w:val="0"/>
-                <w:bCs w:val="0"/>
-              </w:rPr>
-            </w:pPr>
-            <w:r>
-              <w:rPr>
-                <w:highlight w:val="yellow"/>
-              </w:rPr>
-              <w:t>&lt;nome do membro 3 da equipa&gt;</w:t>
-            </w:r>
-          </w:p>
-          <w:p>
-            <w:pPr>
-              <w:pStyle w:val="PargrafodaLista"/>
-              <w:numPr>
-                <w:ilvl w:val="0"/>
-                <w:numId w:val="17"/>
-              </w:numPr>
-              <w:contextualSpacing w:val="0"/>
-              <w:jc w:val="left"/>
-              <w:rPr>
-                <w:b w:val="0"/>
-                <w:bCs w:val="0"/>
-              </w:rPr>
-            </w:pPr>
-            <w:r>
-              <w:rPr>
-                <w:b w:val="0"/>
-                <w:bCs w:val="0"/>
-                <w:u w:val="single"/>
-              </w:rPr>
-              <w:t>O que fez na semana anterior</w:t>
-            </w:r>
-            <w:r>
-              <w:rPr>
-                <w:b w:val="0"/>
-                <w:bCs w:val="0"/>
-              </w:rPr>
-              <w:t xml:space="preserve">: </w:t>
-            </w:r>
-          </w:p>
-          <w:p>
-            <w:pPr>
-              <w:pStyle w:val="PargrafodaLista"/>
-              <w:numPr>
-                <w:ilvl w:val="0"/>
-                <w:numId w:val="17"/>
-              </w:numPr>
-              <w:contextualSpacing w:val="0"/>
-              <w:jc w:val="left"/>
-              <w:rPr>
-                <w:b w:val="0"/>
-                <w:bCs w:val="0"/>
-              </w:rPr>
-            </w:pPr>
-            <w:r>
-              <w:rPr>
-                <w:b w:val="0"/>
-                <w:bCs w:val="0"/>
-                <w:u w:val="single"/>
-              </w:rPr>
-              <w:t>O que vai fazer esta semana</w:t>
-            </w:r>
-            <w:r>
-              <w:rPr>
-                <w:b w:val="0"/>
-                <w:bCs w:val="0"/>
-              </w:rPr>
-              <w:t>:</w:t>
-            </w:r>
-          </w:p>
-          <w:p>
-            <w:pPr>
-              <w:pStyle w:val="PargrafodaLista"/>
-              <w:numPr>
-                <w:ilvl w:val="0"/>
-                <w:numId w:val="17"/>
-              </w:numPr>
-              <w:contextualSpacing w:val="0"/>
-              <w:jc w:val="left"/>
-              <w:rPr>
-                <w:b w:val="0"/>
-                <w:bCs w:val="0"/>
-              </w:rPr>
             </w:pPr>
             <w:r>
               <w:rPr>
@@ -14612,7 +14446,7 @@
       <w:pPr>
         <w:pStyle w:val="Ttulo3"/>
       </w:pPr>
-      <w:bookmarkStart w:id="38" w:name="_Toc232850983"/>
+      <w:bookmarkStart w:id="38" w:name="_Toc232856249"/>
       <w:r>
         <w:t>Sprint 2 (</w:t>
       </w:r>
@@ -14654,6 +14488,7 @@
         <w:pStyle w:val="Ttulo4"/>
       </w:pPr>
       <w:r>
+        <w:lastRenderedPageBreak/>
         <w:t xml:space="preserve">Sprint </w:t>
       </w:r>
       <w:proofErr w:type="spellStart"/>
@@ -15218,15 +15053,7 @@
                 <w:b w:val="0"/>
                 <w:bCs w:val="0"/>
               </w:rPr>
-              <w:t xml:space="preserve">, US fechar compra, US adicionar item previsto, US adicionar item não previsto, US filtrar artigos por tipo, US exportar compras para CSV, US obter </w:t>
-            </w:r>
-            <w:r>
-              <w:rPr>
-                <w:b w:val="0"/>
-                <w:bCs w:val="0"/>
-              </w:rPr>
-              <w:lastRenderedPageBreak/>
-              <w:t>sugestões de lista de compras, US Receber alerta de orçamento excedido, US consultar estatísticas mensais, US obter sugestão de orçamento, US consultar percentagem de compras previstas.</w:t>
+              <w:t>, US fechar compra, US adicionar item previsto, US adicionar item não previsto, US filtrar artigos por tipo, US exportar compras para CSV, US obter sugestões de lista de compras, US Receber alerta de orçamento excedido, US consultar estatísticas mensais, US obter sugestão de orçamento, US consultar percentagem de compras previstas.</w:t>
             </w:r>
           </w:p>
           <w:p>
@@ -15298,6 +15125,7 @@
                 <w:bCs w:val="0"/>
                 <w:u w:val="single"/>
               </w:rPr>
+              <w:lastRenderedPageBreak/>
               <w:t>O que fez na semana anterior</w:t>
             </w:r>
             <w:r>
@@ -15393,115 +15221,6 @@
               </w:numPr>
               <w:contextualSpacing w:val="0"/>
               <w:jc w:val="left"/>
-              <w:rPr>
-                <w:b w:val="0"/>
-                <w:bCs w:val="0"/>
-              </w:rPr>
-            </w:pPr>
-            <w:r>
-              <w:rPr>
-                <w:b w:val="0"/>
-                <w:bCs w:val="0"/>
-                <w:u w:val="single"/>
-              </w:rPr>
-              <w:t>Dificuldades que prevê</w:t>
-            </w:r>
-            <w:r>
-              <w:rPr>
-                <w:b w:val="0"/>
-                <w:bCs w:val="0"/>
-              </w:rPr>
-              <w:t>:</w:t>
-            </w:r>
-          </w:p>
-          <w:p>
-            <w:pPr>
-              <w:jc w:val="left"/>
-              <w:rPr>
-                <w:b w:val="0"/>
-                <w:bCs w:val="0"/>
-              </w:rPr>
-            </w:pPr>
-            <w:r>
-              <w:rPr>
-                <w:highlight w:val="yellow"/>
-              </w:rPr>
-              <w:t>&lt;nome do membro 3 da equipa&gt;</w:t>
-            </w:r>
-          </w:p>
-          <w:p>
-            <w:pPr>
-              <w:pStyle w:val="PargrafodaLista"/>
-              <w:numPr>
-                <w:ilvl w:val="0"/>
-                <w:numId w:val="11"/>
-              </w:numPr>
-              <w:contextualSpacing w:val="0"/>
-              <w:jc w:val="left"/>
-              <w:rPr>
-                <w:b w:val="0"/>
-                <w:bCs w:val="0"/>
-              </w:rPr>
-            </w:pPr>
-            <w:r>
-              <w:rPr>
-                <w:b w:val="0"/>
-                <w:bCs w:val="0"/>
-                <w:u w:val="single"/>
-              </w:rPr>
-              <w:t>O que fez na semana anterior</w:t>
-            </w:r>
-            <w:r>
-              <w:rPr>
-                <w:b w:val="0"/>
-                <w:bCs w:val="0"/>
-              </w:rPr>
-              <w:t xml:space="preserve">: </w:t>
-            </w:r>
-          </w:p>
-          <w:p>
-            <w:pPr>
-              <w:pStyle w:val="PargrafodaLista"/>
-              <w:numPr>
-                <w:ilvl w:val="0"/>
-                <w:numId w:val="11"/>
-              </w:numPr>
-              <w:contextualSpacing w:val="0"/>
-              <w:jc w:val="left"/>
-              <w:rPr>
-                <w:b w:val="0"/>
-                <w:bCs w:val="0"/>
-              </w:rPr>
-            </w:pPr>
-            <w:r>
-              <w:rPr>
-                <w:b w:val="0"/>
-                <w:bCs w:val="0"/>
-                <w:u w:val="single"/>
-              </w:rPr>
-              <w:t>O que vai fazer esta semana</w:t>
-            </w:r>
-            <w:r>
-              <w:rPr>
-                <w:b w:val="0"/>
-                <w:bCs w:val="0"/>
-              </w:rPr>
-              <w:t>:</w:t>
-            </w:r>
-          </w:p>
-          <w:p>
-            <w:pPr>
-              <w:pStyle w:val="PargrafodaLista"/>
-              <w:numPr>
-                <w:ilvl w:val="0"/>
-                <w:numId w:val="11"/>
-              </w:numPr>
-              <w:contextualSpacing w:val="0"/>
-              <w:jc w:val="left"/>
-              <w:rPr>
-                <w:b w:val="0"/>
-                <w:bCs w:val="0"/>
-              </w:rPr>
             </w:pPr>
             <w:r>
               <w:rPr>
@@ -15982,115 +15701,6 @@
               </w:numPr>
               <w:contextualSpacing w:val="0"/>
               <w:jc w:val="left"/>
-              <w:rPr>
-                <w:b w:val="0"/>
-                <w:bCs w:val="0"/>
-              </w:rPr>
-            </w:pPr>
-            <w:r>
-              <w:rPr>
-                <w:b w:val="0"/>
-                <w:bCs w:val="0"/>
-                <w:u w:val="single"/>
-              </w:rPr>
-              <w:t>Dificuldades que prevê</w:t>
-            </w:r>
-            <w:r>
-              <w:rPr>
-                <w:b w:val="0"/>
-                <w:bCs w:val="0"/>
-              </w:rPr>
-              <w:t>:</w:t>
-            </w:r>
-          </w:p>
-          <w:p>
-            <w:pPr>
-              <w:jc w:val="left"/>
-              <w:rPr>
-                <w:b w:val="0"/>
-                <w:bCs w:val="0"/>
-              </w:rPr>
-            </w:pPr>
-            <w:r>
-              <w:rPr>
-                <w:highlight w:val="yellow"/>
-              </w:rPr>
-              <w:t>&lt;nome do membro 3 da equipa&gt;</w:t>
-            </w:r>
-          </w:p>
-          <w:p>
-            <w:pPr>
-              <w:pStyle w:val="PargrafodaLista"/>
-              <w:numPr>
-                <w:ilvl w:val="0"/>
-                <w:numId w:val="20"/>
-              </w:numPr>
-              <w:contextualSpacing w:val="0"/>
-              <w:jc w:val="left"/>
-              <w:rPr>
-                <w:b w:val="0"/>
-                <w:bCs w:val="0"/>
-              </w:rPr>
-            </w:pPr>
-            <w:r>
-              <w:rPr>
-                <w:b w:val="0"/>
-                <w:bCs w:val="0"/>
-                <w:u w:val="single"/>
-              </w:rPr>
-              <w:t>O que fez na semana anterior</w:t>
-            </w:r>
-            <w:r>
-              <w:rPr>
-                <w:b w:val="0"/>
-                <w:bCs w:val="0"/>
-              </w:rPr>
-              <w:t xml:space="preserve">: </w:t>
-            </w:r>
-          </w:p>
-          <w:p>
-            <w:pPr>
-              <w:pStyle w:val="PargrafodaLista"/>
-              <w:numPr>
-                <w:ilvl w:val="0"/>
-                <w:numId w:val="20"/>
-              </w:numPr>
-              <w:contextualSpacing w:val="0"/>
-              <w:jc w:val="left"/>
-              <w:rPr>
-                <w:b w:val="0"/>
-                <w:bCs w:val="0"/>
-              </w:rPr>
-            </w:pPr>
-            <w:r>
-              <w:rPr>
-                <w:b w:val="0"/>
-                <w:bCs w:val="0"/>
-                <w:u w:val="single"/>
-              </w:rPr>
-              <w:t>O que vai fazer esta semana</w:t>
-            </w:r>
-            <w:r>
-              <w:rPr>
-                <w:b w:val="0"/>
-                <w:bCs w:val="0"/>
-              </w:rPr>
-              <w:t>:</w:t>
-            </w:r>
-          </w:p>
-          <w:p>
-            <w:pPr>
-              <w:pStyle w:val="PargrafodaLista"/>
-              <w:numPr>
-                <w:ilvl w:val="0"/>
-                <w:numId w:val="20"/>
-              </w:numPr>
-              <w:contextualSpacing w:val="0"/>
-              <w:jc w:val="left"/>
-              <w:rPr>
-                <w:b w:val="0"/>
-                <w:bCs w:val="0"/>
-              </w:rPr>
             </w:pPr>
             <w:r>
               <w:rPr>
@@ -16234,7 +15844,6 @@
                 <w:i/>
                 <w:iCs/>
               </w:rPr>
-              <w:lastRenderedPageBreak/>
               <w:t>Conclusões</w:t>
             </w:r>
             <w:r>
@@ -16354,6 +15963,7 @@
               <w:rPr>
                 <w:noProof/>
               </w:rPr>
+              <w:lastRenderedPageBreak/>
               <w:drawing>
                 <wp:inline distT="0" distB="0" distL="0" distR="0" wp14:anchorId="52BCB3EA" wp14:editId="2CE4E812">
                   <wp:extent cx="6111240" cy="2453640"/>
@@ -16413,7 +16023,7 @@
       <w:pPr>
         <w:pStyle w:val="Ttulo3"/>
       </w:pPr>
-      <w:bookmarkStart w:id="39" w:name="_Toc232850984"/>
+      <w:bookmarkStart w:id="39" w:name="_Toc232856250"/>
       <w:r>
         <w:t>Sprint 3 (</w:t>
       </w:r>
@@ -16592,6 +16202,7 @@
               <w:rPr>
                 <w:noProof/>
               </w:rPr>
+              <w:lastRenderedPageBreak/>
               <w:drawing>
                 <wp:inline distT="0" distB="0" distL="0" distR="0" wp14:anchorId="2DB18D96" wp14:editId="08DAEB79">
                   <wp:extent cx="6111240" cy="2026920"/>
@@ -17140,7 +16751,6 @@
               </w:rPr>
             </w:pPr>
             <w:r>
-              <w:lastRenderedPageBreak/>
               <w:t>Kelly Ferreira</w:t>
             </w:r>
           </w:p>
@@ -17245,6 +16855,7 @@
                 <w:bCs w:val="0"/>
                 <w:u w:val="single"/>
               </w:rPr>
+              <w:lastRenderedPageBreak/>
               <w:t>Dificuldades que prevê</w:t>
             </w:r>
             <w:r>
@@ -17664,7 +17275,7 @@
       <w:pPr>
         <w:pStyle w:val="Ttulo2"/>
       </w:pPr>
-      <w:bookmarkStart w:id="40" w:name="_Toc232850985"/>
+      <w:bookmarkStart w:id="40" w:name="_Toc232856251"/>
       <w:proofErr w:type="spellStart"/>
       <w:r>
         <w:rPr>
@@ -17897,7 +17508,6 @@
                 <w:b w:val="0"/>
                 <w:bCs w:val="0"/>
               </w:rPr>
-              <w:lastRenderedPageBreak/>
               <w:t>As implementações</w:t>
             </w:r>
             <w:r>
@@ -17932,7 +17542,6 @@
                 <w:iCs/>
                 <w:lang w:val="en-US"/>
               </w:rPr>
-              <w:lastRenderedPageBreak/>
               <w:t>Things that could have gone better</w:t>
             </w:r>
           </w:p>
@@ -18041,6 +17650,7 @@
                 <w:b w:val="0"/>
                 <w:bCs w:val="0"/>
               </w:rPr>
+              <w:lastRenderedPageBreak/>
               <w:t>Gestão do projeto</w:t>
             </w:r>
           </w:p>
@@ -18068,6 +17678,7 @@
                 <w:iCs/>
                 <w:lang w:val="en-US"/>
               </w:rPr>
+              <w:lastRenderedPageBreak/>
               <w:t>Things that surprised us</w:t>
             </w:r>
           </w:p>
@@ -18449,7 +18060,7 @@
       <w:pPr>
         <w:pStyle w:val="Ttulo1"/>
       </w:pPr>
-      <w:bookmarkStart w:id="41" w:name="_Toc232850986"/>
+      <w:bookmarkStart w:id="41" w:name="_Toc232856252"/>
       <w:r>
         <w:lastRenderedPageBreak/>
         <w:t>Conclus</w:t>

</xml_diff>

<commit_message>
Commit Capitulo 3 e 3.2
</commit_message>
<xml_diff>
--- a/MDS-2026-Relatorio.docx
+++ b/MDS-2026-Relatorio.docx
@@ -4834,14 +4834,27 @@
       <w:r>
         <w:t xml:space="preserve">Tabela </w:t>
       </w:r>
-      <w:fldSimple w:instr=" SEQ Tabela \* ARABIC ">
-        <w:r>
-          <w:rPr>
-            <w:noProof/>
-          </w:rPr>
-          <w:t>1</w:t>
-        </w:r>
-      </w:fldSimple>
+      <w:r>
+        <w:fldChar w:fldCharType="begin"/>
+      </w:r>
+      <w:r>
+        <w:instrText xml:space="preserve"> SEQ Tabela \* ARABIC </w:instrText>
+      </w:r>
+      <w:r>
+        <w:fldChar w:fldCharType="separate"/>
+      </w:r>
+      <w:r>
+        <w:rPr>
+          <w:noProof/>
+        </w:rPr>
+        <w:t>1</w:t>
+      </w:r>
+      <w:r>
+        <w:rPr>
+          <w:noProof/>
+        </w:rPr>
+        <w:fldChar w:fldCharType="end"/>
+      </w:r>
       <w:r>
         <w:t xml:space="preserve"> – Descrição do </w:t>
       </w:r>
@@ -5373,14 +5386,27 @@
       <w:r>
         <w:t xml:space="preserve">Tabela </w:t>
       </w:r>
-      <w:fldSimple w:instr=" SEQ Tabela \* ARABIC ">
-        <w:r>
-          <w:rPr>
-            <w:noProof/>
-          </w:rPr>
-          <w:t>2</w:t>
-        </w:r>
-      </w:fldSimple>
+      <w:r>
+        <w:fldChar w:fldCharType="begin"/>
+      </w:r>
+      <w:r>
+        <w:instrText xml:space="preserve"> SEQ Tabela \* ARABIC </w:instrText>
+      </w:r>
+      <w:r>
+        <w:fldChar w:fldCharType="separate"/>
+      </w:r>
+      <w:r>
+        <w:rPr>
+          <w:noProof/>
+        </w:rPr>
+        <w:t>2</w:t>
+      </w:r>
+      <w:r>
+        <w:rPr>
+          <w:noProof/>
+        </w:rPr>
+        <w:fldChar w:fldCharType="end"/>
+      </w:r>
       <w:r>
         <w:t xml:space="preserve"> – Descrição do </w:t>
       </w:r>
@@ -5777,14 +5803,27 @@
       <w:r>
         <w:t xml:space="preserve">Tabela </w:t>
       </w:r>
-      <w:fldSimple w:instr=" SEQ Tabela \* ARABIC ">
-        <w:r>
-          <w:rPr>
-            <w:noProof/>
-          </w:rPr>
-          <w:t>3</w:t>
-        </w:r>
-      </w:fldSimple>
+      <w:r>
+        <w:fldChar w:fldCharType="begin"/>
+      </w:r>
+      <w:r>
+        <w:instrText xml:space="preserve"> SEQ Tabela \* ARABIC </w:instrText>
+      </w:r>
+      <w:r>
+        <w:fldChar w:fldCharType="separate"/>
+      </w:r>
+      <w:r>
+        <w:rPr>
+          <w:noProof/>
+        </w:rPr>
+        <w:t>3</w:t>
+      </w:r>
+      <w:r>
+        <w:rPr>
+          <w:noProof/>
+        </w:rPr>
+        <w:fldChar w:fldCharType="end"/>
+      </w:r>
       <w:r>
         <w:t xml:space="preserve"> – Descrição do </w:t>
       </w:r>
@@ -6261,14 +6300,27 @@
         <w:lastRenderedPageBreak/>
         <w:t xml:space="preserve">Tabela </w:t>
       </w:r>
-      <w:fldSimple w:instr=" SEQ Tabela \* ARABIC ">
-        <w:r>
-          <w:rPr>
-            <w:noProof/>
-          </w:rPr>
-          <w:t>4</w:t>
-        </w:r>
-      </w:fldSimple>
+      <w:r>
+        <w:fldChar w:fldCharType="begin"/>
+      </w:r>
+      <w:r>
+        <w:instrText xml:space="preserve"> SEQ Tabela \* ARABIC </w:instrText>
+      </w:r>
+      <w:r>
+        <w:fldChar w:fldCharType="separate"/>
+      </w:r>
+      <w:r>
+        <w:rPr>
+          <w:noProof/>
+        </w:rPr>
+        <w:t>4</w:t>
+      </w:r>
+      <w:r>
+        <w:rPr>
+          <w:noProof/>
+        </w:rPr>
+        <w:fldChar w:fldCharType="end"/>
+      </w:r>
       <w:r>
         <w:t xml:space="preserve"> – Resumo das características dos Sistemas concorrenciais</w:t>
       </w:r>
@@ -7174,14 +7226,27 @@
       <w:r>
         <w:t xml:space="preserve">Figura </w:t>
       </w:r>
-      <w:fldSimple w:instr=" SEQ Figura \* ARABIC ">
-        <w:r>
-          <w:rPr>
-            <w:noProof/>
-          </w:rPr>
-          <w:t>1</w:t>
-        </w:r>
-      </w:fldSimple>
+      <w:r>
+        <w:fldChar w:fldCharType="begin"/>
+      </w:r>
+      <w:r>
+        <w:instrText xml:space="preserve"> SEQ Figura \* ARABIC </w:instrText>
+      </w:r>
+      <w:r>
+        <w:fldChar w:fldCharType="separate"/>
+      </w:r>
+      <w:r>
+        <w:rPr>
+          <w:noProof/>
+        </w:rPr>
+        <w:t>1</w:t>
+      </w:r>
+      <w:r>
+        <w:rPr>
+          <w:noProof/>
+        </w:rPr>
+        <w:fldChar w:fldCharType="end"/>
+      </w:r>
       <w:r>
         <w:t xml:space="preserve">- </w:t>
       </w:r>
@@ -7326,14 +7391,27 @@
       <w:r>
         <w:t xml:space="preserve">Figura </w:t>
       </w:r>
-      <w:fldSimple w:instr=" SEQ Figura \* ARABIC ">
-        <w:r>
-          <w:rPr>
-            <w:noProof/>
-          </w:rPr>
-          <w:t>2</w:t>
-        </w:r>
-      </w:fldSimple>
+      <w:r>
+        <w:fldChar w:fldCharType="begin"/>
+      </w:r>
+      <w:r>
+        <w:instrText xml:space="preserve"> SEQ Figura \* ARABIC </w:instrText>
+      </w:r>
+      <w:r>
+        <w:fldChar w:fldCharType="separate"/>
+      </w:r>
+      <w:r>
+        <w:rPr>
+          <w:noProof/>
+        </w:rPr>
+        <w:t>2</w:t>
+      </w:r>
+      <w:r>
+        <w:rPr>
+          <w:noProof/>
+        </w:rPr>
+        <w:fldChar w:fldCharType="end"/>
+      </w:r>
       <w:r>
         <w:t xml:space="preserve"> - Página </w:t>
       </w:r>
@@ -7483,14 +7561,27 @@
       <w:r>
         <w:t xml:space="preserve">Figura </w:t>
       </w:r>
-      <w:fldSimple w:instr=" SEQ Figura \* ARABIC ">
-        <w:r>
-          <w:rPr>
-            <w:noProof/>
-          </w:rPr>
-          <w:t>3</w:t>
-        </w:r>
-      </w:fldSimple>
+      <w:r>
+        <w:fldChar w:fldCharType="begin"/>
+      </w:r>
+      <w:r>
+        <w:instrText xml:space="preserve"> SEQ Figura \* ARABIC </w:instrText>
+      </w:r>
+      <w:r>
+        <w:fldChar w:fldCharType="separate"/>
+      </w:r>
+      <w:r>
+        <w:rPr>
+          <w:noProof/>
+        </w:rPr>
+        <w:t>3</w:t>
+      </w:r>
+      <w:r>
+        <w:rPr>
+          <w:noProof/>
+        </w:rPr>
+        <w:fldChar w:fldCharType="end"/>
+      </w:r>
       <w:r>
         <w:t xml:space="preserve"> – </w:t>
       </w:r>
@@ -7633,14 +7724,27 @@
       <w:r>
         <w:t xml:space="preserve">Figura </w:t>
       </w:r>
-      <w:fldSimple w:instr=" SEQ Figura \* ARABIC ">
-        <w:r>
-          <w:rPr>
-            <w:noProof/>
-          </w:rPr>
-          <w:t>4</w:t>
-        </w:r>
-      </w:fldSimple>
+      <w:r>
+        <w:fldChar w:fldCharType="begin"/>
+      </w:r>
+      <w:r>
+        <w:instrText xml:space="preserve"> SEQ Figura \* ARABIC </w:instrText>
+      </w:r>
+      <w:r>
+        <w:fldChar w:fldCharType="separate"/>
+      </w:r>
+      <w:r>
+        <w:rPr>
+          <w:noProof/>
+        </w:rPr>
+        <w:t>4</w:t>
+      </w:r>
+      <w:r>
+        <w:rPr>
+          <w:noProof/>
+        </w:rPr>
+        <w:fldChar w:fldCharType="end"/>
+      </w:r>
       <w:r>
         <w:t xml:space="preserve"> - </w:t>
       </w:r>
@@ -7787,14 +7891,27 @@
       <w:r>
         <w:t xml:space="preserve">Figura </w:t>
       </w:r>
-      <w:fldSimple w:instr=" SEQ Figura \* ARABIC ">
-        <w:r>
-          <w:rPr>
-            <w:noProof/>
-          </w:rPr>
-          <w:t>5</w:t>
-        </w:r>
-      </w:fldSimple>
+      <w:r>
+        <w:fldChar w:fldCharType="begin"/>
+      </w:r>
+      <w:r>
+        <w:instrText xml:space="preserve"> SEQ Figura \* ARABIC </w:instrText>
+      </w:r>
+      <w:r>
+        <w:fldChar w:fldCharType="separate"/>
+      </w:r>
+      <w:r>
+        <w:rPr>
+          <w:noProof/>
+        </w:rPr>
+        <w:t>5</w:t>
+      </w:r>
+      <w:r>
+        <w:rPr>
+          <w:noProof/>
+        </w:rPr>
+        <w:fldChar w:fldCharType="end"/>
+      </w:r>
       <w:r>
         <w:t xml:space="preserve"> </w:t>
       </w:r>
@@ -7941,14 +8058,27 @@
       <w:r>
         <w:t xml:space="preserve">Figura </w:t>
       </w:r>
-      <w:fldSimple w:instr=" SEQ Figura \* ARABIC ">
-        <w:r>
-          <w:rPr>
-            <w:noProof/>
-          </w:rPr>
-          <w:t>6</w:t>
-        </w:r>
-      </w:fldSimple>
+      <w:r>
+        <w:fldChar w:fldCharType="begin"/>
+      </w:r>
+      <w:r>
+        <w:instrText xml:space="preserve"> SEQ Figura \* ARABIC </w:instrText>
+      </w:r>
+      <w:r>
+        <w:fldChar w:fldCharType="separate"/>
+      </w:r>
+      <w:r>
+        <w:rPr>
+          <w:noProof/>
+        </w:rPr>
+        <w:t>6</w:t>
+      </w:r>
+      <w:r>
+        <w:rPr>
+          <w:noProof/>
+        </w:rPr>
+        <w:fldChar w:fldCharType="end"/>
+      </w:r>
       <w:r>
         <w:t xml:space="preserve"> </w:t>
       </w:r>
@@ -8096,14 +8226,27 @@
       <w:r>
         <w:t xml:space="preserve">Figura </w:t>
       </w:r>
-      <w:fldSimple w:instr=" SEQ Figura \* ARABIC ">
-        <w:r>
-          <w:rPr>
-            <w:noProof/>
-          </w:rPr>
-          <w:t>7</w:t>
-        </w:r>
-      </w:fldSimple>
+      <w:r>
+        <w:fldChar w:fldCharType="begin"/>
+      </w:r>
+      <w:r>
+        <w:instrText xml:space="preserve"> SEQ Figura \* ARABIC </w:instrText>
+      </w:r>
+      <w:r>
+        <w:fldChar w:fldCharType="separate"/>
+      </w:r>
+      <w:r>
+        <w:rPr>
+          <w:noProof/>
+        </w:rPr>
+        <w:t>7</w:t>
+      </w:r>
+      <w:r>
+        <w:rPr>
+          <w:noProof/>
+        </w:rPr>
+        <w:fldChar w:fldCharType="end"/>
+      </w:r>
       <w:r>
         <w:t xml:space="preserve"> </w:t>
       </w:r>
@@ -8252,14 +8395,27 @@
       <w:r>
         <w:t xml:space="preserve">Figura </w:t>
       </w:r>
-      <w:fldSimple w:instr=" SEQ Figura \* ARABIC ">
-        <w:r>
-          <w:rPr>
-            <w:noProof/>
-          </w:rPr>
-          <w:t>8</w:t>
-        </w:r>
-      </w:fldSimple>
+      <w:r>
+        <w:fldChar w:fldCharType="begin"/>
+      </w:r>
+      <w:r>
+        <w:instrText xml:space="preserve"> SEQ Figura \* ARABIC </w:instrText>
+      </w:r>
+      <w:r>
+        <w:fldChar w:fldCharType="separate"/>
+      </w:r>
+      <w:r>
+        <w:rPr>
+          <w:noProof/>
+        </w:rPr>
+        <w:t>8</w:t>
+      </w:r>
+      <w:r>
+        <w:rPr>
+          <w:noProof/>
+        </w:rPr>
+        <w:fldChar w:fldCharType="end"/>
+      </w:r>
       <w:r>
         <w:t xml:space="preserve"> </w:t>
       </w:r>
@@ -8406,14 +8562,27 @@
       <w:r>
         <w:t xml:space="preserve">Figura </w:t>
       </w:r>
-      <w:fldSimple w:instr=" SEQ Figura \* ARABIC ">
-        <w:r>
-          <w:rPr>
-            <w:noProof/>
-          </w:rPr>
-          <w:t>9</w:t>
-        </w:r>
-      </w:fldSimple>
+      <w:r>
+        <w:fldChar w:fldCharType="begin"/>
+      </w:r>
+      <w:r>
+        <w:instrText xml:space="preserve"> SEQ Figura \* ARABIC </w:instrText>
+      </w:r>
+      <w:r>
+        <w:fldChar w:fldCharType="separate"/>
+      </w:r>
+      <w:r>
+        <w:rPr>
+          <w:noProof/>
+        </w:rPr>
+        <w:t>9</w:t>
+      </w:r>
+      <w:r>
+        <w:rPr>
+          <w:noProof/>
+        </w:rPr>
+        <w:fldChar w:fldCharType="end"/>
+      </w:r>
       <w:r>
         <w:t xml:space="preserve"> </w:t>
       </w:r>
@@ -8564,14 +8733,27 @@
       <w:r>
         <w:t xml:space="preserve">Figura </w:t>
       </w:r>
-      <w:fldSimple w:instr=" SEQ Figura \* ARABIC ">
-        <w:r>
-          <w:rPr>
-            <w:noProof/>
-          </w:rPr>
-          <w:t>10</w:t>
-        </w:r>
-      </w:fldSimple>
+      <w:r>
+        <w:fldChar w:fldCharType="begin"/>
+      </w:r>
+      <w:r>
+        <w:instrText xml:space="preserve"> SEQ Figura \* ARABIC </w:instrText>
+      </w:r>
+      <w:r>
+        <w:fldChar w:fldCharType="separate"/>
+      </w:r>
+      <w:r>
+        <w:rPr>
+          <w:noProof/>
+        </w:rPr>
+        <w:t>10</w:t>
+      </w:r>
+      <w:r>
+        <w:rPr>
+          <w:noProof/>
+        </w:rPr>
+        <w:fldChar w:fldCharType="end"/>
+      </w:r>
       <w:r>
         <w:t xml:space="preserve"> </w:t>
       </w:r>
@@ -8689,14 +8871,27 @@
       <w:r>
         <w:t xml:space="preserve">Figura </w:t>
       </w:r>
-      <w:fldSimple w:instr=" SEQ Figura \* ARABIC ">
-        <w:r>
-          <w:rPr>
-            <w:noProof/>
-          </w:rPr>
-          <w:t>11</w:t>
-        </w:r>
-      </w:fldSimple>
+      <w:r>
+        <w:fldChar w:fldCharType="begin"/>
+      </w:r>
+      <w:r>
+        <w:instrText xml:space="preserve"> SEQ Figura \* ARABIC </w:instrText>
+      </w:r>
+      <w:r>
+        <w:fldChar w:fldCharType="separate"/>
+      </w:r>
+      <w:r>
+        <w:rPr>
+          <w:noProof/>
+        </w:rPr>
+        <w:t>11</w:t>
+      </w:r>
+      <w:r>
+        <w:rPr>
+          <w:noProof/>
+        </w:rPr>
+        <w:fldChar w:fldCharType="end"/>
+      </w:r>
       <w:r>
         <w:t xml:space="preserve"> – Diagrama de classes </w:t>
       </w:r>
@@ -8733,10 +8928,209 @@
     </w:p>
     <w:p>
       <w:r>
-        <w:rPr>
-          <w:highlight w:val="yellow"/>
-        </w:rPr>
-        <w:t>Nesta secção...</w:t>
+        <w:t>De acordo com o ficheiro da aula “</w:t>
+      </w:r>
+      <w:r>
+        <w:t>Cap. 3</w:t>
+      </w:r>
+      <w:r>
+        <w:t xml:space="preserve"> </w:t>
+      </w:r>
+      <w:proofErr w:type="spellStart"/>
+      <w:r>
+        <w:t>Scrum</w:t>
+      </w:r>
+      <w:proofErr w:type="spellEnd"/>
+      <w:r>
+        <w:t xml:space="preserve">” partilhado na aula de </w:t>
+      </w:r>
+      <w:r>
+        <w:t>Metodologias de Desenvolvimento de Software</w:t>
+      </w:r>
+      <w:r>
+        <w:t xml:space="preserve">, a identificação do </w:t>
+      </w:r>
+      <w:proofErr w:type="spellStart"/>
+      <w:r>
+        <w:t>scrum</w:t>
+      </w:r>
+      <w:proofErr w:type="spellEnd"/>
+      <w:r>
+        <w:t xml:space="preserve"> team é fundamental para o sucesso de um projeto desenvolvido com SCRUM, pois assim poderemos definir as responsabilidades, melhorar a comunicação e garantir que as necessidades do produto são satisfeitas. O </w:t>
+      </w:r>
+      <w:proofErr w:type="spellStart"/>
+      <w:r>
+        <w:t>Scrum</w:t>
+      </w:r>
+      <w:proofErr w:type="spellEnd"/>
+      <w:r>
+        <w:t xml:space="preserve"> team é composto pelo </w:t>
+      </w:r>
+      <w:proofErr w:type="spellStart"/>
+      <w:r>
+        <w:t>product</w:t>
+      </w:r>
+      <w:proofErr w:type="spellEnd"/>
+      <w:r>
+        <w:t xml:space="preserve"> </w:t>
+      </w:r>
+      <w:proofErr w:type="spellStart"/>
+      <w:r>
+        <w:t>owner</w:t>
+      </w:r>
+      <w:proofErr w:type="spellEnd"/>
+      <w:r>
+        <w:t xml:space="preserve">, o </w:t>
+      </w:r>
+      <w:proofErr w:type="spellStart"/>
+      <w:r>
+        <w:t>scrum</w:t>
+      </w:r>
+      <w:proofErr w:type="spellEnd"/>
+      <w:r>
+        <w:t xml:space="preserve"> </w:t>
+      </w:r>
+      <w:proofErr w:type="spellStart"/>
+      <w:r>
+        <w:t>master</w:t>
+      </w:r>
+      <w:proofErr w:type="spellEnd"/>
+      <w:r>
+        <w:t xml:space="preserve">, e o </w:t>
+      </w:r>
+      <w:proofErr w:type="spellStart"/>
+      <w:r>
+        <w:t>development</w:t>
+      </w:r>
+      <w:proofErr w:type="spellEnd"/>
+      <w:r>
+        <w:t xml:space="preserve"> team. O </w:t>
+      </w:r>
+      <w:proofErr w:type="spellStart"/>
+      <w:r>
+        <w:t>product</w:t>
+      </w:r>
+      <w:proofErr w:type="spellEnd"/>
+      <w:r>
+        <w:t xml:space="preserve"> </w:t>
+      </w:r>
+      <w:proofErr w:type="spellStart"/>
+      <w:r>
+        <w:t>owner</w:t>
+      </w:r>
+      <w:proofErr w:type="spellEnd"/>
+      <w:r>
+        <w:t xml:space="preserve"> irá garantir o tipo, a qualidade do produto final e do trabalho da equipa de desenvolvimento, ele representa os </w:t>
+      </w:r>
+      <w:proofErr w:type="spellStart"/>
+      <w:r>
+        <w:t>stakeholders</w:t>
+      </w:r>
+      <w:proofErr w:type="spellEnd"/>
+      <w:r>
+        <w:t xml:space="preserve"> dentro do </w:t>
+      </w:r>
+      <w:proofErr w:type="spellStart"/>
+      <w:r>
+        <w:t>scrum</w:t>
+      </w:r>
+      <w:proofErr w:type="spellEnd"/>
+      <w:r>
+        <w:t xml:space="preserve"> e gere o produto </w:t>
+      </w:r>
+      <w:proofErr w:type="spellStart"/>
+      <w:r>
+        <w:t>backlog</w:t>
+      </w:r>
+      <w:proofErr w:type="spellEnd"/>
+      <w:r>
+        <w:t xml:space="preserve">. O </w:t>
+      </w:r>
+      <w:proofErr w:type="spellStart"/>
+      <w:r>
+        <w:t>Scrum</w:t>
+      </w:r>
+      <w:proofErr w:type="spellEnd"/>
+      <w:r>
+        <w:t xml:space="preserve"> </w:t>
+      </w:r>
+      <w:proofErr w:type="spellStart"/>
+      <w:r>
+        <w:t>master</w:t>
+      </w:r>
+      <w:proofErr w:type="spellEnd"/>
+      <w:r>
+        <w:t xml:space="preserve"> irá certificar o cumprimento do </w:t>
+      </w:r>
+      <w:proofErr w:type="spellStart"/>
+      <w:r>
+        <w:t>Scrum</w:t>
+      </w:r>
+      <w:proofErr w:type="spellEnd"/>
+      <w:r>
+        <w:t xml:space="preserve">, que neste projeto é o papel representado pelo professor </w:t>
+      </w:r>
+      <w:r>
+        <w:t>José Peça de Sousa Francisco</w:t>
+      </w:r>
+      <w:r>
+        <w:t xml:space="preserve">. O </w:t>
+      </w:r>
+      <w:proofErr w:type="spellStart"/>
+      <w:r>
+        <w:t>development</w:t>
+      </w:r>
+      <w:proofErr w:type="spellEnd"/>
+      <w:r>
+        <w:t xml:space="preserve"> team é quem acrescenta a funcionalidade ao produto, uma equipa que se auto-organiza é multifuncional, e é responsável por acrescentar funcionalidade ao produto. Esta equipa é </w:t>
+      </w:r>
+      <w:proofErr w:type="spellStart"/>
+      <w:r>
+        <w:t>represantada</w:t>
+      </w:r>
+      <w:proofErr w:type="spellEnd"/>
+      <w:r>
+        <w:t xml:space="preserve"> por: Kelly Ferreira e João Moreira.</w:t>
+      </w:r>
+    </w:p>
+    <w:p>
+      <w:r>
+        <w:t xml:space="preserve">Nesta secção iremos elaborar como a aplicação do </w:t>
+      </w:r>
+      <w:proofErr w:type="spellStart"/>
+      <w:r>
+        <w:t>scrum</w:t>
+      </w:r>
+      <w:proofErr w:type="spellEnd"/>
+      <w:r>
+        <w:t xml:space="preserve"> foi utilizada no projeto, quem representa cada papel, os </w:t>
+      </w:r>
+      <w:proofErr w:type="spellStart"/>
+      <w:r>
+        <w:t>user</w:t>
+      </w:r>
+      <w:proofErr w:type="spellEnd"/>
+      <w:r>
+        <w:t xml:space="preserve"> </w:t>
+      </w:r>
+      <w:proofErr w:type="spellStart"/>
+      <w:r>
+        <w:t>stories</w:t>
+      </w:r>
+      <w:proofErr w:type="spellEnd"/>
+      <w:r>
+        <w:t xml:space="preserve"> utilizados para orientar o projeto, </w:t>
+      </w:r>
+      <w:r>
+        <w:t xml:space="preserve">a definição das tarefas de cada membro da equipa ao longo das semanas, as estatísticas do cumprimento do projeto de acordo com </w:t>
+      </w:r>
+      <w:proofErr w:type="spellStart"/>
+      <w:r>
+        <w:t>Jira</w:t>
+      </w:r>
+      <w:proofErr w:type="spellEnd"/>
+      <w:r>
+        <w:t xml:space="preserve"> e uma retrospetiva do que correu bem no trabalho, o que foi inesperado e o que se pretende melhorar no futuro. </w:t>
       </w:r>
     </w:p>
     <w:p/>
@@ -8901,38 +9295,95 @@
     </w:p>
     <w:p>
       <w:r>
-        <w:rPr>
-          <w:highlight w:val="yellow"/>
-        </w:rPr>
-        <w:t xml:space="preserve">&lt;Identificação dos </w:t>
+        <w:t xml:space="preserve">Nesta secção vamos descrever a identificação e as funções dos </w:t>
       </w:r>
       <w:proofErr w:type="spellStart"/>
       <w:r>
-        <w:rPr>
-          <w:highlight w:val="yellow"/>
-        </w:rPr>
         <w:t>stakeholders</w:t>
       </w:r>
       <w:proofErr w:type="spellEnd"/>
       <w:r>
-        <w:rPr>
-          <w:highlight w:val="yellow"/>
-        </w:rPr>
-        <w:t xml:space="preserve"> e da </w:t>
+        <w:t xml:space="preserve"> e do </w:t>
       </w:r>
       <w:proofErr w:type="spellStart"/>
       <w:r>
-        <w:rPr>
-          <w:highlight w:val="yellow"/>
-        </w:rPr>
+        <w:t>scrum</w:t>
+      </w:r>
+      <w:proofErr w:type="spellEnd"/>
+      <w:r>
+        <w:t xml:space="preserve"> team. Os </w:t>
+      </w:r>
+      <w:proofErr w:type="spellStart"/>
+      <w:r>
+        <w:t>stakeholders</w:t>
+      </w:r>
+      <w:proofErr w:type="spellEnd"/>
+      <w:r>
+        <w:t xml:space="preserve"> são qualquer pessoa com influência no produto que não faz parte do </w:t>
+      </w:r>
+      <w:proofErr w:type="spellStart"/>
+      <w:r>
         <w:t>Scrum</w:t>
       </w:r>
       <w:proofErr w:type="spellEnd"/>
       <w:r>
-        <w:rPr>
-          <w:highlight w:val="yellow"/>
-        </w:rPr>
-        <w:t xml:space="preserve"> Team (Roles) no projeto, bem como quais as suas funções&gt;</w:t>
+        <w:t xml:space="preserve"> Team, isso pode incluir clientes, gestores </w:t>
+      </w:r>
+      <w:proofErr w:type="spellStart"/>
+      <w:r>
+        <w:t>seriores</w:t>
+      </w:r>
+      <w:proofErr w:type="spellEnd"/>
+      <w:r>
+        <w:t xml:space="preserve"> dentro da organização, patrocinadores do projeto, entre outros. O </w:t>
+      </w:r>
+      <w:proofErr w:type="spellStart"/>
+      <w:r>
+        <w:t>Scrum</w:t>
+      </w:r>
+      <w:proofErr w:type="spellEnd"/>
+      <w:r>
+        <w:t xml:space="preserve"> team será os </w:t>
+      </w:r>
+      <w:proofErr w:type="spellStart"/>
+      <w:r>
+        <w:t>product</w:t>
+      </w:r>
+      <w:proofErr w:type="spellEnd"/>
+      <w:r>
+        <w:t xml:space="preserve"> </w:t>
+      </w:r>
+      <w:proofErr w:type="spellStart"/>
+      <w:r>
+        <w:t>owner</w:t>
+      </w:r>
+      <w:proofErr w:type="spellEnd"/>
+      <w:r>
+        <w:t xml:space="preserve">, </w:t>
+      </w:r>
+      <w:proofErr w:type="spellStart"/>
+      <w:r>
+        <w:t>scrum</w:t>
+      </w:r>
+      <w:proofErr w:type="spellEnd"/>
+      <w:r>
+        <w:t xml:space="preserve"> </w:t>
+      </w:r>
+      <w:proofErr w:type="spellStart"/>
+      <w:r>
+        <w:t>master</w:t>
+      </w:r>
+      <w:proofErr w:type="spellEnd"/>
+      <w:r>
+        <w:t xml:space="preserve">, e o </w:t>
+      </w:r>
+      <w:proofErr w:type="spellStart"/>
+      <w:r>
+        <w:t>development</w:t>
+      </w:r>
+      <w:proofErr w:type="spellEnd"/>
+      <w:r>
+        <w:t xml:space="preserve"> team. Estes estão organizados na seguinte tabela:</w:t>
       </w:r>
     </w:p>
     <w:p/>
@@ -8946,14 +9397,27 @@
       <w:r>
         <w:t xml:space="preserve">Tabela </w:t>
       </w:r>
-      <w:fldSimple w:instr=" SEQ Tabela \* ARABIC ">
-        <w:r>
-          <w:rPr>
-            <w:noProof/>
-          </w:rPr>
-          <w:t>5</w:t>
-        </w:r>
-      </w:fldSimple>
+      <w:r>
+        <w:fldChar w:fldCharType="begin"/>
+      </w:r>
+      <w:r>
+        <w:instrText xml:space="preserve"> SEQ Tabela \* ARABIC </w:instrText>
+      </w:r>
+      <w:r>
+        <w:fldChar w:fldCharType="separate"/>
+      </w:r>
+      <w:r>
+        <w:rPr>
+          <w:noProof/>
+        </w:rPr>
+        <w:t>5</w:t>
+      </w:r>
+      <w:r>
+        <w:rPr>
+          <w:noProof/>
+        </w:rPr>
+        <w:fldChar w:fldCharType="end"/>
+      </w:r>
       <w:r>
         <w:t xml:space="preserve"> – Identificação e funções dos </w:t>
       </w:r>
@@ -9086,6 +9550,7 @@
               <w:cnfStyle w:val="000000100000" w:firstRow="0" w:lastRow="0" w:firstColumn="0" w:lastColumn="0" w:oddVBand="0" w:evenVBand="0" w:oddHBand="1" w:evenHBand="0" w:firstRowFirstColumn="0" w:firstRowLastColumn="0" w:lastRowFirstColumn="0" w:lastRowLastColumn="0"/>
             </w:pPr>
             <w:r>
+              <w:lastRenderedPageBreak/>
               <w:t>Verificar se a aplicação responde às suas necessidades.</w:t>
             </w:r>
           </w:p>
@@ -9100,6 +9565,7 @@
           <w:p>
             <w:proofErr w:type="spellStart"/>
             <w:r>
+              <w:lastRenderedPageBreak/>
               <w:t>Product</w:t>
             </w:r>
             <w:proofErr w:type="spellEnd"/>
@@ -9433,7 +9899,6 @@
       </w:pPr>
       <w:bookmarkStart w:id="35" w:name="_Toc232856246"/>
       <w:r>
-        <w:lastRenderedPageBreak/>
         <w:t xml:space="preserve">User </w:t>
       </w:r>
       <w:proofErr w:type="spellStart"/>
@@ -9966,6 +10431,7 @@
                 <w:b w:val="0"/>
                 <w:bCs w:val="0"/>
               </w:rPr>
+              <w:lastRenderedPageBreak/>
               <w:t xml:space="preserve">Devem ser preenchidos </w:t>
             </w:r>
             <w:proofErr w:type="spellStart"/>
@@ -10020,6 +10486,7 @@
           </w:tcPr>
           <w:p>
             <w:r>
+              <w:lastRenderedPageBreak/>
               <w:t>Título</w:t>
             </w:r>
             <w:r>
@@ -10383,7 +10850,6 @@
               </w:rPr>
             </w:pPr>
             <w:r>
-              <w:lastRenderedPageBreak/>
               <w:t>Título</w:t>
             </w:r>
             <w:r>
@@ -13173,6 +13639,7 @@
       </w:pPr>
       <w:proofErr w:type="spellStart"/>
       <w:r>
+        <w:lastRenderedPageBreak/>
         <w:t>Daily</w:t>
       </w:r>
       <w:proofErr w:type="spellEnd"/>
@@ -14385,6 +14852,7 @@
                 <w:b w:val="0"/>
                 <w:bCs w:val="0"/>
               </w:rPr>
+              <w:lastRenderedPageBreak/>
               <w:t>Evitar novamente adicionamento de novas tarefas no meio da sprint</w:t>
             </w:r>
           </w:p>
@@ -14488,7 +14956,6 @@
         <w:pStyle w:val="Ttulo4"/>
       </w:pPr>
       <w:r>
-        <w:lastRenderedPageBreak/>
         <w:t xml:space="preserve">Sprint </w:t>
       </w:r>
       <w:proofErr w:type="spellStart"/>
@@ -14674,6 +15141,7 @@
               <w:rPr>
                 <w:noProof/>
               </w:rPr>
+              <w:lastRenderedPageBreak/>
               <w:drawing>
                 <wp:inline distT="0" distB="0" distL="0" distR="0" wp14:anchorId="7C3AF47F" wp14:editId="6C9D5C98">
                   <wp:extent cx="6111240" cy="2011046"/>
@@ -15125,7 +15593,6 @@
                 <w:bCs w:val="0"/>
                 <w:u w:val="single"/>
               </w:rPr>
-              <w:lastRenderedPageBreak/>
               <w:t>O que fez na semana anterior</w:t>
             </w:r>
             <w:r>
@@ -15573,6 +16040,7 @@
                 <w:bCs w:val="0"/>
                 <w:u w:val="single"/>
               </w:rPr>
+              <w:lastRenderedPageBreak/>
               <w:t>Dificuldades que prevê</w:t>
             </w:r>
             <w:r>
@@ -15963,7 +16431,6 @@
               <w:rPr>
                 <w:noProof/>
               </w:rPr>
-              <w:lastRenderedPageBreak/>
               <w:drawing>
                 <wp:inline distT="0" distB="0" distL="0" distR="0" wp14:anchorId="52BCB3EA" wp14:editId="2CE4E812">
                   <wp:extent cx="6111240" cy="2453640"/>
@@ -16202,7 +16669,6 @@
               <w:rPr>
                 <w:noProof/>
               </w:rPr>
-              <w:lastRenderedPageBreak/>
               <w:drawing>
                 <wp:inline distT="0" distB="0" distL="0" distR="0" wp14:anchorId="2DB18D96" wp14:editId="08DAEB79">
                   <wp:extent cx="6111240" cy="2026920"/>
@@ -16389,6 +16855,7 @@
               </w:rPr>
             </w:pPr>
             <w:r>
+              <w:lastRenderedPageBreak/>
               <w:t>Data:</w:t>
             </w:r>
           </w:p>
@@ -16855,7 +17322,6 @@
                 <w:bCs w:val="0"/>
                 <w:u w:val="single"/>
               </w:rPr>
-              <w:lastRenderedPageBreak/>
               <w:t>Dificuldades que prevê</w:t>
             </w:r>
             <w:r>
@@ -17215,6 +17681,7 @@
               <w:rPr>
                 <w:noProof/>
               </w:rPr>
+              <w:lastRenderedPageBreak/>
               <w:drawing>
                 <wp:inline distT="0" distB="0" distL="0" distR="0" wp14:anchorId="110E100B" wp14:editId="166DE250">
                   <wp:extent cx="6111240" cy="2499360"/>
@@ -17650,7 +18117,6 @@
                 <w:b w:val="0"/>
                 <w:bCs w:val="0"/>
               </w:rPr>
-              <w:lastRenderedPageBreak/>
               <w:t>Gestão do projeto</w:t>
             </w:r>
           </w:p>
@@ -17678,7 +18144,6 @@
                 <w:iCs/>
                 <w:lang w:val="en-US"/>
               </w:rPr>
-              <w:lastRenderedPageBreak/>
               <w:t>Things that surprised us</w:t>
             </w:r>
           </w:p>
@@ -18049,6 +18514,7 @@
                 <w:b w:val="0"/>
                 <w:bCs w:val="0"/>
               </w:rPr>
+              <w:lastRenderedPageBreak/>
               <w:t>A nossa dedicação com o projeto</w:t>
             </w:r>
           </w:p>
@@ -22684,7 +23150,6 @@
   <w:style w:type="character" w:default="1" w:styleId="Tipodeletrapredefinidodopargrafo">
     <w:name w:val="Default Paragraph Font"/>
     <w:uiPriority w:val="1"/>
-    <w:semiHidden/>
     <w:unhideWhenUsed/>
   </w:style>
   <w:style w:type="table" w:default="1" w:styleId="Tabelanormal">

</xml_diff>

<commit_message>
commit correção de resumos anteriores
</commit_message>
<xml_diff>
--- a/MDS-2026-Relatorio.docx
+++ b/MDS-2026-Relatorio.docx
@@ -4538,7 +4538,61 @@
         <w:rPr>
           <w:noProof/>
         </w:rPr>
-        <w:t>O presente relatório foi desenvolvido na disciplina de MDS junto com o projeto que tem como objetivo criar uma aplicação para ajudar as pessoas a gerir o seu orçamento familiar, planear compras e controlar os artigos domésticos.</w:t>
+        <w:t xml:space="preserve">O relatório foi desenvolvido na disciplina de </w:t>
+      </w:r>
+      <w:r>
+        <w:rPr>
+          <w:noProof/>
+        </w:rPr>
+        <w:t>Metodologias de Desenvolvimento de Software</w:t>
+      </w:r>
+      <w:r>
+        <w:rPr>
+          <w:noProof/>
+        </w:rPr>
+        <w:t xml:space="preserve"> </w:t>
+      </w:r>
+      <w:r>
+        <w:rPr>
+          <w:noProof/>
+        </w:rPr>
+        <w:t xml:space="preserve">junto com o projeto </w:t>
+      </w:r>
+      <w:r>
+        <w:rPr>
+          <w:noProof/>
+        </w:rPr>
+        <w:t xml:space="preserve">da aula </w:t>
+      </w:r>
+      <w:r>
+        <w:rPr>
+          <w:noProof/>
+        </w:rPr>
+        <w:t xml:space="preserve">Desenvolvimento de </w:t>
+      </w:r>
+      <w:r>
+        <w:rPr>
+          <w:noProof/>
+        </w:rPr>
+        <w:t>A</w:t>
+      </w:r>
+      <w:r>
+        <w:rPr>
+          <w:noProof/>
+        </w:rPr>
+        <w:t>plicações</w:t>
+      </w:r>
+      <w:r>
+        <w:rPr>
+          <w:noProof/>
+        </w:rPr>
+        <w:t xml:space="preserve"> </w:t>
+      </w:r>
+      <w:r>
+        <w:rPr>
+          <w:noProof/>
+        </w:rPr>
+        <w:t>que tem como objetivo criar uma aplicação para ajudar as pessoas a gerir o seu orçamento familiar, planear compras e controlar os artigos domésticos.</w:t>
       </w:r>
     </w:p>
     <w:p>

</xml_diff>